<commit_message>
Adding Activity Selection Greedy Algo
</commit_message>
<xml_diff>
--- a/Greedy Algorithms/Greedy.docx
+++ b/Greedy Algorithms/Greedy.docx
@@ -885,9 +885,8 @@
       <w:pPr>
         <w:spacing w:before="100" w:beforeAutospacing="1" w:after="100" w:afterAutospacing="1" w:line="240" w:lineRule="auto"/>
         <w:rPr>
-          <w:rFonts w:ascii="Times New Roman" w:eastAsia="Times New Roman" w:hAnsi="Times New Roman" w:cs="Times New Roman"/>
-          <w:sz w:val="24"/>
-          <w:szCs w:val="24"/>
+          <w:rFonts w:ascii="Courier New" w:eastAsia="Times New Roman" w:hAnsi="Courier New" w:cs="Courier New"/>
+          <w:sz w:val="20"/>
         </w:rPr>
       </w:pPr>
       <w:r>
@@ -927,6 +926,2244 @@
         </w:rPr>
         <w:t xml:space="preserve"> element will come again and again</w:t>
       </w:r>
+    </w:p>
+    <w:p>
+      <w:pPr>
+        <w:pStyle w:val="NoSpacing"/>
+        <w:rPr>
+          <w:rFonts w:eastAsia="Times New Roman"/>
+        </w:rPr>
+      </w:pPr>
+      <w:r>
+        <w:rPr>
+          <w:rFonts w:eastAsia="Times New Roman"/>
+        </w:rPr>
+        <w:t>As like coins= 8</w:t>
+      </w:r>
+      <w:proofErr w:type="gramStart"/>
+      <w:r>
+        <w:rPr>
+          <w:rFonts w:eastAsia="Times New Roman"/>
+        </w:rPr>
+        <w:t>,5,3,2,1</w:t>
+      </w:r>
+      <w:proofErr w:type="gramEnd"/>
+      <w:r>
+        <w:rPr>
+          <w:rFonts w:eastAsia="Times New Roman"/>
+        </w:rPr>
+        <w:t xml:space="preserve">  target is 18 </w:t>
+      </w:r>
+    </w:p>
+    <w:p>
+      <w:pPr>
+        <w:pStyle w:val="NoSpacing"/>
+        <w:rPr>
+          <w:rFonts w:eastAsia="Times New Roman"/>
+        </w:rPr>
+      </w:pPr>
+      <w:r>
+        <w:rPr>
+          <w:rFonts w:eastAsia="Times New Roman"/>
+        </w:rPr>
+        <w:t>Output= 8</w:t>
+      </w:r>
+      <w:proofErr w:type="gramStart"/>
+      <w:r>
+        <w:rPr>
+          <w:rFonts w:eastAsia="Times New Roman"/>
+        </w:rPr>
+        <w:t>,8,2</w:t>
+      </w:r>
+      <w:proofErr w:type="gramEnd"/>
+    </w:p>
+    <w:p>
+      <w:pPr>
+        <w:pStyle w:val="NoSpacing"/>
+        <w:rPr>
+          <w:rFonts w:eastAsia="Times New Roman"/>
+        </w:rPr>
+      </w:pPr>
+    </w:p>
+    <w:p>
+      <w:pPr>
+        <w:pStyle w:val="NoSpacing"/>
+        <w:rPr>
+          <w:rFonts w:eastAsia="Times New Roman"/>
+        </w:rPr>
+      </w:pPr>
+    </w:p>
+    <w:p>
+      <w:pPr>
+        <w:pStyle w:val="NoSpacing"/>
+        <w:rPr>
+          <w:rFonts w:eastAsia="Times New Roman"/>
+        </w:rPr>
+      </w:pPr>
+    </w:p>
+    <w:p>
+      <w:pPr>
+        <w:pStyle w:val="NoSpacing"/>
+        <w:rPr>
+          <w:rFonts w:eastAsia="Times New Roman"/>
+        </w:rPr>
+      </w:pPr>
+    </w:p>
+    <w:p>
+      <w:pPr>
+        <w:pStyle w:val="NoSpacing"/>
+        <w:rPr>
+          <w:rFonts w:eastAsia="Times New Roman"/>
+        </w:rPr>
+      </w:pPr>
+    </w:p>
+    <w:p>
+      <w:pPr>
+        <w:pStyle w:val="NoSpacing"/>
+        <w:rPr>
+          <w:rFonts w:eastAsia="Times New Roman"/>
+        </w:rPr>
+      </w:pPr>
+    </w:p>
+    <w:p>
+      <w:pPr>
+        <w:pStyle w:val="NoSpacing"/>
+        <w:rPr>
+          <w:rFonts w:eastAsia="Times New Roman"/>
+        </w:rPr>
+      </w:pPr>
+    </w:p>
+    <w:p>
+      <w:pPr>
+        <w:pStyle w:val="NoSpacing"/>
+        <w:rPr>
+          <w:rFonts w:eastAsia="Times New Roman"/>
+        </w:rPr>
+      </w:pPr>
+    </w:p>
+    <w:p>
+      <w:pPr>
+        <w:pStyle w:val="NoSpacing"/>
+        <w:rPr>
+          <w:rFonts w:eastAsia="Times New Roman"/>
+        </w:rPr>
+      </w:pPr>
+    </w:p>
+    <w:p>
+      <w:pPr>
+        <w:pStyle w:val="NoSpacing"/>
+        <w:rPr>
+          <w:rFonts w:eastAsia="Times New Roman"/>
+        </w:rPr>
+      </w:pPr>
+    </w:p>
+    <w:p>
+      <w:pPr>
+        <w:pStyle w:val="NoSpacing"/>
+        <w:rPr>
+          <w:rFonts w:eastAsia="Times New Roman"/>
+        </w:rPr>
+      </w:pPr>
+    </w:p>
+    <w:p>
+      <w:pPr>
+        <w:pStyle w:val="NoSpacing"/>
+        <w:rPr>
+          <w:rFonts w:eastAsia="Times New Roman"/>
+        </w:rPr>
+      </w:pPr>
+    </w:p>
+    <w:p>
+      <w:pPr>
+        <w:pStyle w:val="NoSpacing"/>
+        <w:rPr>
+          <w:rFonts w:eastAsia="Times New Roman"/>
+        </w:rPr>
+      </w:pPr>
+    </w:p>
+    <w:p>
+      <w:pPr>
+        <w:pStyle w:val="NoSpacing"/>
+        <w:rPr>
+          <w:rFonts w:eastAsia="Times New Roman"/>
+        </w:rPr>
+      </w:pPr>
+    </w:p>
+    <w:p>
+      <w:pPr>
+        <w:pStyle w:val="NoSpacing"/>
+        <w:rPr>
+          <w:rFonts w:eastAsia="Times New Roman"/>
+        </w:rPr>
+      </w:pPr>
+    </w:p>
+    <w:p>
+      <w:pPr>
+        <w:pStyle w:val="NoSpacing"/>
+        <w:rPr>
+          <w:rFonts w:eastAsia="Times New Roman"/>
+        </w:rPr>
+      </w:pPr>
+    </w:p>
+    <w:p>
+      <w:pPr>
+        <w:pStyle w:val="NoSpacing"/>
+        <w:rPr>
+          <w:rFonts w:eastAsia="Times New Roman"/>
+        </w:rPr>
+      </w:pPr>
+    </w:p>
+    <w:p>
+      <w:pPr>
+        <w:pStyle w:val="NoSpacing"/>
+        <w:rPr>
+          <w:rFonts w:eastAsia="Times New Roman"/>
+        </w:rPr>
+      </w:pPr>
+    </w:p>
+    <w:p>
+      <w:pPr>
+        <w:pStyle w:val="NoSpacing"/>
+        <w:rPr>
+          <w:rFonts w:eastAsia="Times New Roman"/>
+        </w:rPr>
+      </w:pPr>
+    </w:p>
+    <w:p>
+      <w:pPr>
+        <w:pStyle w:val="NoSpacing"/>
+        <w:rPr>
+          <w:rFonts w:eastAsia="Times New Roman"/>
+        </w:rPr>
+      </w:pPr>
+    </w:p>
+    <w:p>
+      <w:pPr>
+        <w:pStyle w:val="NoSpacing"/>
+        <w:rPr>
+          <w:rFonts w:eastAsia="Times New Roman"/>
+        </w:rPr>
+      </w:pPr>
+    </w:p>
+    <w:p>
+      <w:pPr>
+        <w:spacing w:before="100" w:beforeAutospacing="1" w:after="100" w:afterAutospacing="1" w:line="240" w:lineRule="auto"/>
+        <w:jc w:val="center"/>
+        <w:rPr>
+          <w:rFonts w:ascii="Times New Roman" w:eastAsia="Times New Roman" w:hAnsi="Times New Roman" w:cs="Times New Roman"/>
+          <w:b/>
+          <w:sz w:val="36"/>
+          <w:szCs w:val="36"/>
+        </w:rPr>
+      </w:pPr>
+      <w:r>
+        <w:rPr>
+          <w:rFonts w:ascii="Times New Roman" w:eastAsia="Times New Roman" w:hAnsi="Times New Roman" w:cs="Times New Roman"/>
+          <w:b/>
+          <w:sz w:val="36"/>
+          <w:szCs w:val="36"/>
+        </w:rPr>
+        <w:lastRenderedPageBreak/>
+        <w:t>Activity Selection</w:t>
+      </w:r>
+    </w:p>
+    <w:p>
+      <w:pPr>
+        <w:spacing w:before="100" w:beforeAutospacing="1" w:after="100" w:afterAutospacing="1" w:line="240" w:lineRule="auto"/>
+        <w:rPr>
+          <w:rFonts w:ascii="Times New Roman" w:eastAsia="Times New Roman" w:hAnsi="Times New Roman" w:cs="Times New Roman"/>
+          <w:sz w:val="24"/>
+          <w:szCs w:val="24"/>
+        </w:rPr>
+      </w:pPr>
+      <w:r>
+        <w:rPr>
+          <w:rFonts w:ascii="Times New Roman" w:eastAsia="Times New Roman" w:hAnsi="Times New Roman" w:cs="Times New Roman"/>
+          <w:sz w:val="24"/>
+          <w:szCs w:val="24"/>
+        </w:rPr>
+        <w:t xml:space="preserve">The </w:t>
+      </w:r>
+      <w:r>
+        <w:rPr>
+          <w:rFonts w:ascii="Times New Roman" w:eastAsia="Times New Roman" w:hAnsi="Times New Roman" w:cs="Times New Roman"/>
+          <w:b/>
+          <w:bCs/>
+          <w:sz w:val="24"/>
+          <w:szCs w:val="24"/>
+        </w:rPr>
+        <w:t>Activity Selection Problem</w:t>
+      </w:r>
+      <w:r>
+        <w:rPr>
+          <w:rFonts w:ascii="Times New Roman" w:eastAsia="Times New Roman" w:hAnsi="Times New Roman" w:cs="Times New Roman"/>
+          <w:sz w:val="24"/>
+          <w:szCs w:val="24"/>
+        </w:rPr>
+        <w:t xml:space="preserve"> is another classic problem that perfectly showcases the power of a greedy algorithm.</w:t>
+      </w:r>
+    </w:p>
+    <w:p>
+      <w:pPr>
+        <w:spacing w:before="100" w:beforeAutospacing="1" w:after="100" w:afterAutospacing="1" w:line="240" w:lineRule="auto"/>
+        <w:rPr>
+          <w:rFonts w:ascii="Times New Roman" w:eastAsia="Times New Roman" w:hAnsi="Times New Roman" w:cs="Times New Roman"/>
+          <w:sz w:val="24"/>
+          <w:szCs w:val="24"/>
+        </w:rPr>
+      </w:pPr>
+      <w:r>
+        <w:rPr>
+          <w:rFonts w:ascii="Times New Roman" w:eastAsia="Times New Roman" w:hAnsi="Times New Roman" w:cs="Times New Roman"/>
+          <w:sz w:val="24"/>
+          <w:szCs w:val="24"/>
+        </w:rPr>
+        <w:t xml:space="preserve">Imagine you are managing a single university lecture hall or a meeting room. You have a list of proposed activities (like classes, presentations, or meetings), each with a specific </w:t>
+      </w:r>
+      <w:r>
+        <w:rPr>
+          <w:rFonts w:ascii="Times New Roman" w:eastAsia="Times New Roman" w:hAnsi="Times New Roman" w:cs="Times New Roman"/>
+          <w:b/>
+          <w:bCs/>
+          <w:sz w:val="24"/>
+          <w:szCs w:val="24"/>
+        </w:rPr>
+        <w:t>start time</w:t>
+      </w:r>
+      <w:r>
+        <w:rPr>
+          <w:rFonts w:ascii="Times New Roman" w:eastAsia="Times New Roman" w:hAnsi="Times New Roman" w:cs="Times New Roman"/>
+          <w:sz w:val="24"/>
+          <w:szCs w:val="24"/>
+        </w:rPr>
+        <w:t xml:space="preserve"> and </w:t>
+      </w:r>
+      <w:r>
+        <w:rPr>
+          <w:rFonts w:ascii="Times New Roman" w:eastAsia="Times New Roman" w:hAnsi="Times New Roman" w:cs="Times New Roman"/>
+          <w:b/>
+          <w:bCs/>
+          <w:sz w:val="24"/>
+          <w:szCs w:val="24"/>
+        </w:rPr>
+        <w:t>finish time</w:t>
+      </w:r>
+      <w:r>
+        <w:rPr>
+          <w:rFonts w:ascii="Times New Roman" w:eastAsia="Times New Roman" w:hAnsi="Times New Roman" w:cs="Times New Roman"/>
+          <w:sz w:val="24"/>
+          <w:szCs w:val="24"/>
+        </w:rPr>
+        <w:t>. Because there is only one room, only one activity can happen at a time.</w:t>
+      </w:r>
+    </w:p>
+    <w:p>
+      <w:pPr>
+        <w:spacing w:before="100" w:beforeAutospacing="1" w:after="100" w:afterAutospacing="1" w:line="240" w:lineRule="auto"/>
+        <w:rPr>
+          <w:rFonts w:ascii="Times New Roman" w:eastAsia="Times New Roman" w:hAnsi="Times New Roman" w:cs="Times New Roman"/>
+          <w:sz w:val="24"/>
+          <w:szCs w:val="24"/>
+        </w:rPr>
+      </w:pPr>
+      <w:r>
+        <w:rPr>
+          <w:rFonts w:ascii="Times New Roman" w:eastAsia="Times New Roman" w:hAnsi="Times New Roman" w:cs="Times New Roman"/>
+          <w:sz w:val="24"/>
+          <w:szCs w:val="24"/>
+        </w:rPr>
+        <w:t xml:space="preserve">Your goal is to </w:t>
+      </w:r>
+      <w:r>
+        <w:rPr>
+          <w:rFonts w:ascii="Times New Roman" w:eastAsia="Times New Roman" w:hAnsi="Times New Roman" w:cs="Times New Roman"/>
+          <w:b/>
+          <w:bCs/>
+          <w:sz w:val="24"/>
+          <w:szCs w:val="24"/>
+        </w:rPr>
+        <w:t>maximize the total number of activities</w:t>
+      </w:r>
+      <w:r>
+        <w:rPr>
+          <w:rFonts w:ascii="Times New Roman" w:eastAsia="Times New Roman" w:hAnsi="Times New Roman" w:cs="Times New Roman"/>
+          <w:sz w:val="24"/>
+          <w:szCs w:val="24"/>
+        </w:rPr>
+        <w:t xml:space="preserve"> that can be held in that single room.</w:t>
+      </w:r>
+    </w:p>
+    <w:p>
+      <w:pPr>
+        <w:spacing w:before="100" w:beforeAutospacing="1" w:after="100" w:afterAutospacing="1" w:line="240" w:lineRule="auto"/>
+        <w:outlineLvl w:val="1"/>
+        <w:rPr>
+          <w:rFonts w:ascii="Times New Roman" w:eastAsia="Times New Roman" w:hAnsi="Times New Roman" w:cs="Times New Roman"/>
+          <w:b/>
+          <w:bCs/>
+          <w:sz w:val="36"/>
+          <w:szCs w:val="36"/>
+        </w:rPr>
+      </w:pPr>
+      <w:r>
+        <w:rPr>
+          <w:rFonts w:ascii="Times New Roman" w:eastAsia="Times New Roman" w:hAnsi="Times New Roman" w:cs="Times New Roman"/>
+          <w:b/>
+          <w:bCs/>
+          <w:sz w:val="36"/>
+          <w:szCs w:val="36"/>
+        </w:rPr>
+        <w:t>The Greedy Strategy: Finish First</w:t>
+      </w:r>
+    </w:p>
+    <w:p>
+      <w:pPr>
+        <w:spacing w:before="100" w:beforeAutospacing="1" w:after="100" w:afterAutospacing="1" w:line="240" w:lineRule="auto"/>
+        <w:rPr>
+          <w:rFonts w:ascii="Times New Roman" w:eastAsia="Times New Roman" w:hAnsi="Times New Roman" w:cs="Times New Roman"/>
+          <w:sz w:val="24"/>
+          <w:szCs w:val="24"/>
+        </w:rPr>
+      </w:pPr>
+      <w:r>
+        <w:rPr>
+          <w:rFonts w:ascii="Times New Roman" w:eastAsia="Times New Roman" w:hAnsi="Times New Roman" w:cs="Times New Roman"/>
+          <w:sz w:val="24"/>
+          <w:szCs w:val="24"/>
+        </w:rPr>
+        <w:t>If you want to fit as many meetings as possible into a single day, what should your selection rule be?</w:t>
+      </w:r>
+    </w:p>
+    <w:p>
+      <w:pPr>
+        <w:numPr>
+          <w:ilvl w:val="0"/>
+          <w:numId w:val="5"/>
+        </w:numPr>
+        <w:spacing w:before="100" w:beforeAutospacing="1" w:after="100" w:afterAutospacing="1" w:line="240" w:lineRule="auto"/>
+        <w:rPr>
+          <w:rFonts w:ascii="Times New Roman" w:eastAsia="Times New Roman" w:hAnsi="Times New Roman" w:cs="Times New Roman"/>
+          <w:sz w:val="24"/>
+          <w:szCs w:val="24"/>
+        </w:rPr>
+      </w:pPr>
+      <w:r>
+        <w:rPr>
+          <w:rFonts w:ascii="Times New Roman" w:eastAsia="Times New Roman" w:hAnsi="Times New Roman" w:cs="Times New Roman"/>
+          <w:sz w:val="24"/>
+          <w:szCs w:val="24"/>
+        </w:rPr>
+        <w:t xml:space="preserve">Do you pick the shortest meeting? </w:t>
+      </w:r>
+      <w:r>
+        <w:rPr>
+          <w:rFonts w:ascii="Times New Roman" w:eastAsia="Times New Roman" w:hAnsi="Times New Roman" w:cs="Times New Roman"/>
+          <w:i/>
+          <w:iCs/>
+          <w:sz w:val="24"/>
+          <w:szCs w:val="24"/>
+        </w:rPr>
+        <w:t>(No, a short meeting starting late could block three others).</w:t>
+      </w:r>
+    </w:p>
+    <w:p>
+      <w:pPr>
+        <w:numPr>
+          <w:ilvl w:val="0"/>
+          <w:numId w:val="5"/>
+        </w:numPr>
+        <w:spacing w:before="100" w:beforeAutospacing="1" w:after="100" w:afterAutospacing="1" w:line="240" w:lineRule="auto"/>
+        <w:rPr>
+          <w:rFonts w:ascii="Times New Roman" w:eastAsia="Times New Roman" w:hAnsi="Times New Roman" w:cs="Times New Roman"/>
+          <w:sz w:val="24"/>
+          <w:szCs w:val="24"/>
+        </w:rPr>
+      </w:pPr>
+      <w:r>
+        <w:rPr>
+          <w:rFonts w:ascii="Times New Roman" w:eastAsia="Times New Roman" w:hAnsi="Times New Roman" w:cs="Times New Roman"/>
+          <w:sz w:val="24"/>
+          <w:szCs w:val="24"/>
+        </w:rPr>
+        <w:t xml:space="preserve">Do you pick the one that starts earliest? </w:t>
+      </w:r>
+      <w:r>
+        <w:rPr>
+          <w:rFonts w:ascii="Times New Roman" w:eastAsia="Times New Roman" w:hAnsi="Times New Roman" w:cs="Times New Roman"/>
+          <w:i/>
+          <w:iCs/>
+          <w:sz w:val="24"/>
+          <w:szCs w:val="24"/>
+        </w:rPr>
+        <w:t>(No, an early meeting could last all day).</w:t>
+      </w:r>
+    </w:p>
+    <w:p>
+      <w:pPr>
+        <w:spacing w:before="100" w:beforeAutospacing="1" w:after="100" w:afterAutospacing="1" w:line="240" w:lineRule="auto"/>
+        <w:rPr>
+          <w:rFonts w:ascii="Times New Roman" w:eastAsia="Times New Roman" w:hAnsi="Times New Roman" w:cs="Times New Roman"/>
+          <w:sz w:val="24"/>
+          <w:szCs w:val="24"/>
+        </w:rPr>
+      </w:pPr>
+      <w:r>
+        <w:rPr>
+          <w:rFonts w:ascii="Times New Roman" w:eastAsia="Times New Roman" w:hAnsi="Times New Roman" w:cs="Times New Roman"/>
+          <w:sz w:val="24"/>
+          <w:szCs w:val="24"/>
+        </w:rPr>
+        <w:t xml:space="preserve">The optimal greedy rule is: </w:t>
+      </w:r>
+      <w:r>
+        <w:rPr>
+          <w:rFonts w:ascii="Times New Roman" w:eastAsia="Times New Roman" w:hAnsi="Times New Roman" w:cs="Times New Roman"/>
+          <w:b/>
+          <w:bCs/>
+          <w:sz w:val="24"/>
+          <w:szCs w:val="24"/>
+        </w:rPr>
+        <w:t>Always pick the activity that finishes earliest.</w:t>
+      </w:r>
+    </w:p>
+    <w:p>
+      <w:pPr>
+        <w:spacing w:before="100" w:beforeAutospacing="1" w:after="100" w:afterAutospacing="1" w:line="240" w:lineRule="auto"/>
+        <w:rPr>
+          <w:rFonts w:ascii="Times New Roman" w:eastAsia="Times New Roman" w:hAnsi="Times New Roman" w:cs="Times New Roman"/>
+          <w:sz w:val="24"/>
+          <w:szCs w:val="24"/>
+        </w:rPr>
+      </w:pPr>
+      <w:r>
+        <w:rPr>
+          <w:rFonts w:ascii="Times New Roman" w:eastAsia="Times New Roman" w:hAnsi="Times New Roman" w:cs="Times New Roman"/>
+          <w:sz w:val="24"/>
+          <w:szCs w:val="24"/>
+        </w:rPr>
+        <w:t>By picking the activity that wraps up first, you leave the room free as early as possible, maximizing the remaining time available for other activities.</w:t>
+      </w:r>
+    </w:p>
+    <w:p>
+      <w:pPr>
+        <w:spacing w:before="100" w:beforeAutospacing="1" w:after="100" w:afterAutospacing="1" w:line="240" w:lineRule="auto"/>
+        <w:outlineLvl w:val="1"/>
+        <w:rPr>
+          <w:rFonts w:ascii="Times New Roman" w:eastAsia="Times New Roman" w:hAnsi="Times New Roman" w:cs="Times New Roman"/>
+          <w:b/>
+          <w:bCs/>
+          <w:sz w:val="36"/>
+          <w:szCs w:val="36"/>
+        </w:rPr>
+      </w:pPr>
+      <w:r>
+        <w:rPr>
+          <w:rFonts w:ascii="Times New Roman" w:eastAsia="Times New Roman" w:hAnsi="Times New Roman" w:cs="Times New Roman"/>
+          <w:b/>
+          <w:bCs/>
+          <w:sz w:val="36"/>
+          <w:szCs w:val="36"/>
+        </w:rPr>
+        <w:t>Step-by-Step Walkthrough</w:t>
+      </w:r>
+    </w:p>
+    <w:p>
+      <w:pPr>
+        <w:spacing w:before="100" w:beforeAutospacing="1" w:after="100" w:afterAutospacing="1" w:line="240" w:lineRule="auto"/>
+        <w:rPr>
+          <w:rFonts w:ascii="Times New Roman" w:eastAsia="Times New Roman" w:hAnsi="Times New Roman" w:cs="Times New Roman"/>
+          <w:sz w:val="24"/>
+          <w:szCs w:val="24"/>
+        </w:rPr>
+      </w:pPr>
+      <w:r>
+        <w:rPr>
+          <w:rFonts w:ascii="Times New Roman" w:eastAsia="Times New Roman" w:hAnsi="Times New Roman" w:cs="Times New Roman"/>
+          <w:sz w:val="24"/>
+          <w:szCs w:val="24"/>
+        </w:rPr>
+        <w:t>Let’s look at how the algorithm handles a concrete dataset. Suppose we have 6 activities with the following timelines:</w:t>
+      </w:r>
+    </w:p>
+    <w:tbl>
+      <w:tblPr>
+        <w:tblW w:w="0" w:type="auto"/>
+        <w:tblCellSpacing w:w="15" w:type="dxa"/>
+        <w:tblCellMar>
+          <w:top w:w="15" w:type="dxa"/>
+          <w:left w:w="15" w:type="dxa"/>
+          <w:bottom w:w="15" w:type="dxa"/>
+          <w:right w:w="15" w:type="dxa"/>
+        </w:tblCellMar>
+        <w:tblLook w:val="04A0"/>
+      </w:tblPr>
+      <w:tblGrid>
+        <w:gridCol w:w="1119"/>
+        <w:gridCol w:w="1404"/>
+        <w:gridCol w:w="1539"/>
+      </w:tblGrid>
+      <w:tr>
+        <w:trPr>
+          <w:tblHeader/>
+          <w:tblCellSpacing w:w="15" w:type="dxa"/>
+        </w:trPr>
+        <w:tc>
+          <w:tcPr>
+            <w:tcW w:w="0" w:type="auto"/>
+            <w:tcBorders>
+              <w:top w:val="single" w:sz="4" w:space="0" w:color="C4C7C5"/>
+              <w:left w:val="single" w:sz="4" w:space="0" w:color="C4C7C5"/>
+              <w:bottom w:val="single" w:sz="4" w:space="0" w:color="C4C7C5"/>
+              <w:right w:val="single" w:sz="4" w:space="0" w:color="C4C7C5"/>
+            </w:tcBorders>
+            <w:tcMar>
+              <w:top w:w="80" w:type="dxa"/>
+              <w:left w:w="120" w:type="dxa"/>
+              <w:bottom w:w="80" w:type="dxa"/>
+              <w:right w:w="120" w:type="dxa"/>
+            </w:tcMar>
+            <w:vAlign w:val="center"/>
+            <w:hideMark/>
+          </w:tcPr>
+          <w:p>
+            <w:pPr>
+              <w:spacing w:after="320" w:line="240" w:lineRule="auto"/>
+              <w:rPr>
+                <w:rFonts w:ascii="Times New Roman" w:eastAsia="Times New Roman" w:hAnsi="Times New Roman" w:cs="Times New Roman"/>
+                <w:sz w:val="24"/>
+                <w:szCs w:val="24"/>
+              </w:rPr>
+            </w:pPr>
+            <w:r>
+              <w:rPr>
+                <w:rFonts w:ascii="Times New Roman" w:eastAsia="Times New Roman" w:hAnsi="Times New Roman" w:cs="Times New Roman"/>
+                <w:b/>
+                <w:bCs/>
+                <w:sz w:val="24"/>
+                <w:szCs w:val="24"/>
+              </w:rPr>
+              <w:t>Activity</w:t>
+            </w:r>
+          </w:p>
+        </w:tc>
+        <w:tc>
+          <w:tcPr>
+            <w:tcW w:w="0" w:type="auto"/>
+            <w:tcBorders>
+              <w:top w:val="single" w:sz="4" w:space="0" w:color="C4C7C5"/>
+              <w:left w:val="single" w:sz="4" w:space="0" w:color="C4C7C5"/>
+              <w:bottom w:val="single" w:sz="4" w:space="0" w:color="C4C7C5"/>
+              <w:right w:val="single" w:sz="4" w:space="0" w:color="C4C7C5"/>
+            </w:tcBorders>
+            <w:tcMar>
+              <w:top w:w="80" w:type="dxa"/>
+              <w:left w:w="120" w:type="dxa"/>
+              <w:bottom w:w="80" w:type="dxa"/>
+              <w:right w:w="120" w:type="dxa"/>
+            </w:tcMar>
+            <w:vAlign w:val="center"/>
+            <w:hideMark/>
+          </w:tcPr>
+          <w:p>
+            <w:pPr>
+              <w:spacing w:after="320" w:line="240" w:lineRule="auto"/>
+              <w:rPr>
+                <w:rFonts w:ascii="Times New Roman" w:eastAsia="Times New Roman" w:hAnsi="Times New Roman" w:cs="Times New Roman"/>
+                <w:sz w:val="24"/>
+                <w:szCs w:val="24"/>
+              </w:rPr>
+            </w:pPr>
+            <w:r>
+              <w:rPr>
+                <w:rFonts w:ascii="Times New Roman" w:eastAsia="Times New Roman" w:hAnsi="Times New Roman" w:cs="Times New Roman"/>
+                <w:b/>
+                <w:bCs/>
+                <w:sz w:val="24"/>
+                <w:szCs w:val="24"/>
+              </w:rPr>
+              <w:t>Start Time</w:t>
+            </w:r>
+          </w:p>
+        </w:tc>
+        <w:tc>
+          <w:tcPr>
+            <w:tcW w:w="0" w:type="auto"/>
+            <w:tcBorders>
+              <w:top w:val="single" w:sz="4" w:space="0" w:color="C4C7C5"/>
+              <w:left w:val="single" w:sz="4" w:space="0" w:color="C4C7C5"/>
+              <w:bottom w:val="single" w:sz="4" w:space="0" w:color="C4C7C5"/>
+              <w:right w:val="single" w:sz="4" w:space="0" w:color="C4C7C5"/>
+            </w:tcBorders>
+            <w:tcMar>
+              <w:top w:w="80" w:type="dxa"/>
+              <w:left w:w="120" w:type="dxa"/>
+              <w:bottom w:w="80" w:type="dxa"/>
+              <w:right w:w="120" w:type="dxa"/>
+            </w:tcMar>
+            <w:vAlign w:val="center"/>
+            <w:hideMark/>
+          </w:tcPr>
+          <w:p>
+            <w:pPr>
+              <w:spacing w:after="320" w:line="240" w:lineRule="auto"/>
+              <w:rPr>
+                <w:rFonts w:ascii="Times New Roman" w:eastAsia="Times New Roman" w:hAnsi="Times New Roman" w:cs="Times New Roman"/>
+                <w:sz w:val="24"/>
+                <w:szCs w:val="24"/>
+              </w:rPr>
+            </w:pPr>
+            <w:r>
+              <w:rPr>
+                <w:rFonts w:ascii="Times New Roman" w:eastAsia="Times New Roman" w:hAnsi="Times New Roman" w:cs="Times New Roman"/>
+                <w:b/>
+                <w:bCs/>
+                <w:sz w:val="24"/>
+                <w:szCs w:val="24"/>
+              </w:rPr>
+              <w:t>Finish Time</w:t>
+            </w:r>
+          </w:p>
+        </w:tc>
+      </w:tr>
+      <w:tr>
+        <w:trPr>
+          <w:tblCellSpacing w:w="15" w:type="dxa"/>
+        </w:trPr>
+        <w:tc>
+          <w:tcPr>
+            <w:tcW w:w="0" w:type="auto"/>
+            <w:tcBorders>
+              <w:top w:val="single" w:sz="4" w:space="0" w:color="C4C7C5"/>
+              <w:left w:val="single" w:sz="4" w:space="0" w:color="C4C7C5"/>
+              <w:bottom w:val="single" w:sz="4" w:space="0" w:color="C4C7C5"/>
+              <w:right w:val="single" w:sz="4" w:space="0" w:color="C4C7C5"/>
+            </w:tcBorders>
+            <w:tcMar>
+              <w:top w:w="80" w:type="dxa"/>
+              <w:left w:w="120" w:type="dxa"/>
+              <w:bottom w:w="80" w:type="dxa"/>
+              <w:right w:w="120" w:type="dxa"/>
+            </w:tcMar>
+            <w:vAlign w:val="center"/>
+            <w:hideMark/>
+          </w:tcPr>
+          <w:p>
+            <w:pPr>
+              <w:spacing w:after="320" w:line="240" w:lineRule="auto"/>
+              <w:rPr>
+                <w:rFonts w:ascii="Times New Roman" w:eastAsia="Times New Roman" w:hAnsi="Times New Roman" w:cs="Times New Roman"/>
+                <w:sz w:val="24"/>
+                <w:szCs w:val="24"/>
+              </w:rPr>
+            </w:pPr>
+            <w:r>
+              <w:rPr>
+                <w:rFonts w:ascii="Times New Roman" w:eastAsia="Times New Roman" w:hAnsi="Times New Roman" w:cs="Times New Roman"/>
+                <w:b/>
+                <w:bCs/>
+                <w:sz w:val="24"/>
+                <w:szCs w:val="24"/>
+              </w:rPr>
+              <w:t>A1</w:t>
+            </w:r>
+          </w:p>
+        </w:tc>
+        <w:tc>
+          <w:tcPr>
+            <w:tcW w:w="0" w:type="auto"/>
+            <w:tcBorders>
+              <w:top w:val="single" w:sz="4" w:space="0" w:color="C4C7C5"/>
+              <w:left w:val="single" w:sz="4" w:space="0" w:color="C4C7C5"/>
+              <w:bottom w:val="single" w:sz="4" w:space="0" w:color="C4C7C5"/>
+              <w:right w:val="single" w:sz="4" w:space="0" w:color="C4C7C5"/>
+            </w:tcBorders>
+            <w:tcMar>
+              <w:top w:w="80" w:type="dxa"/>
+              <w:left w:w="120" w:type="dxa"/>
+              <w:bottom w:w="80" w:type="dxa"/>
+              <w:right w:w="120" w:type="dxa"/>
+            </w:tcMar>
+            <w:vAlign w:val="center"/>
+            <w:hideMark/>
+          </w:tcPr>
+          <w:p>
+            <w:pPr>
+              <w:spacing w:after="320" w:line="240" w:lineRule="auto"/>
+              <w:rPr>
+                <w:rFonts w:ascii="Times New Roman" w:eastAsia="Times New Roman" w:hAnsi="Times New Roman" w:cs="Times New Roman"/>
+                <w:sz w:val="24"/>
+                <w:szCs w:val="24"/>
+              </w:rPr>
+            </w:pPr>
+            <w:r>
+              <w:rPr>
+                <w:rFonts w:ascii="Times New Roman" w:eastAsia="Times New Roman" w:hAnsi="Times New Roman" w:cs="Times New Roman"/>
+                <w:sz w:val="24"/>
+                <w:szCs w:val="24"/>
+              </w:rPr>
+              <w:t>1:00</w:t>
+            </w:r>
+          </w:p>
+        </w:tc>
+        <w:tc>
+          <w:tcPr>
+            <w:tcW w:w="0" w:type="auto"/>
+            <w:tcBorders>
+              <w:top w:val="single" w:sz="4" w:space="0" w:color="C4C7C5"/>
+              <w:left w:val="single" w:sz="4" w:space="0" w:color="C4C7C5"/>
+              <w:bottom w:val="single" w:sz="4" w:space="0" w:color="C4C7C5"/>
+              <w:right w:val="single" w:sz="4" w:space="0" w:color="C4C7C5"/>
+            </w:tcBorders>
+            <w:tcMar>
+              <w:top w:w="80" w:type="dxa"/>
+              <w:left w:w="120" w:type="dxa"/>
+              <w:bottom w:w="80" w:type="dxa"/>
+              <w:right w:w="120" w:type="dxa"/>
+            </w:tcMar>
+            <w:vAlign w:val="center"/>
+            <w:hideMark/>
+          </w:tcPr>
+          <w:p>
+            <w:pPr>
+              <w:spacing w:after="320" w:line="240" w:lineRule="auto"/>
+              <w:rPr>
+                <w:rFonts w:ascii="Times New Roman" w:eastAsia="Times New Roman" w:hAnsi="Times New Roman" w:cs="Times New Roman"/>
+                <w:sz w:val="24"/>
+                <w:szCs w:val="24"/>
+              </w:rPr>
+            </w:pPr>
+            <w:r>
+              <w:rPr>
+                <w:rFonts w:ascii="Times New Roman" w:eastAsia="Times New Roman" w:hAnsi="Times New Roman" w:cs="Times New Roman"/>
+                <w:sz w:val="24"/>
+                <w:szCs w:val="24"/>
+              </w:rPr>
+              <w:t>4:00</w:t>
+            </w:r>
+          </w:p>
+        </w:tc>
+      </w:tr>
+      <w:tr>
+        <w:trPr>
+          <w:tblCellSpacing w:w="15" w:type="dxa"/>
+        </w:trPr>
+        <w:tc>
+          <w:tcPr>
+            <w:tcW w:w="0" w:type="auto"/>
+            <w:tcBorders>
+              <w:top w:val="single" w:sz="4" w:space="0" w:color="C4C7C5"/>
+              <w:left w:val="single" w:sz="4" w:space="0" w:color="C4C7C5"/>
+              <w:bottom w:val="single" w:sz="4" w:space="0" w:color="C4C7C5"/>
+              <w:right w:val="single" w:sz="4" w:space="0" w:color="C4C7C5"/>
+            </w:tcBorders>
+            <w:tcMar>
+              <w:top w:w="80" w:type="dxa"/>
+              <w:left w:w="120" w:type="dxa"/>
+              <w:bottom w:w="80" w:type="dxa"/>
+              <w:right w:w="120" w:type="dxa"/>
+            </w:tcMar>
+            <w:vAlign w:val="center"/>
+            <w:hideMark/>
+          </w:tcPr>
+          <w:p>
+            <w:pPr>
+              <w:spacing w:after="320" w:line="240" w:lineRule="auto"/>
+              <w:rPr>
+                <w:rFonts w:ascii="Times New Roman" w:eastAsia="Times New Roman" w:hAnsi="Times New Roman" w:cs="Times New Roman"/>
+                <w:sz w:val="24"/>
+                <w:szCs w:val="24"/>
+              </w:rPr>
+            </w:pPr>
+            <w:r>
+              <w:rPr>
+                <w:rFonts w:ascii="Times New Roman" w:eastAsia="Times New Roman" w:hAnsi="Times New Roman" w:cs="Times New Roman"/>
+                <w:b/>
+                <w:bCs/>
+                <w:sz w:val="24"/>
+                <w:szCs w:val="24"/>
+              </w:rPr>
+              <w:t>A2</w:t>
+            </w:r>
+          </w:p>
+        </w:tc>
+        <w:tc>
+          <w:tcPr>
+            <w:tcW w:w="0" w:type="auto"/>
+            <w:tcBorders>
+              <w:top w:val="single" w:sz="4" w:space="0" w:color="C4C7C5"/>
+              <w:left w:val="single" w:sz="4" w:space="0" w:color="C4C7C5"/>
+              <w:bottom w:val="single" w:sz="4" w:space="0" w:color="C4C7C5"/>
+              <w:right w:val="single" w:sz="4" w:space="0" w:color="C4C7C5"/>
+            </w:tcBorders>
+            <w:tcMar>
+              <w:top w:w="80" w:type="dxa"/>
+              <w:left w:w="120" w:type="dxa"/>
+              <w:bottom w:w="80" w:type="dxa"/>
+              <w:right w:w="120" w:type="dxa"/>
+            </w:tcMar>
+            <w:vAlign w:val="center"/>
+            <w:hideMark/>
+          </w:tcPr>
+          <w:p>
+            <w:pPr>
+              <w:spacing w:after="320" w:line="240" w:lineRule="auto"/>
+              <w:rPr>
+                <w:rFonts w:ascii="Times New Roman" w:eastAsia="Times New Roman" w:hAnsi="Times New Roman" w:cs="Times New Roman"/>
+                <w:sz w:val="24"/>
+                <w:szCs w:val="24"/>
+              </w:rPr>
+            </w:pPr>
+            <w:r>
+              <w:rPr>
+                <w:rFonts w:ascii="Times New Roman" w:eastAsia="Times New Roman" w:hAnsi="Times New Roman" w:cs="Times New Roman"/>
+                <w:sz w:val="24"/>
+                <w:szCs w:val="24"/>
+              </w:rPr>
+              <w:t>3:00</w:t>
+            </w:r>
+          </w:p>
+        </w:tc>
+        <w:tc>
+          <w:tcPr>
+            <w:tcW w:w="0" w:type="auto"/>
+            <w:tcBorders>
+              <w:top w:val="single" w:sz="4" w:space="0" w:color="C4C7C5"/>
+              <w:left w:val="single" w:sz="4" w:space="0" w:color="C4C7C5"/>
+              <w:bottom w:val="single" w:sz="4" w:space="0" w:color="C4C7C5"/>
+              <w:right w:val="single" w:sz="4" w:space="0" w:color="C4C7C5"/>
+            </w:tcBorders>
+            <w:tcMar>
+              <w:top w:w="80" w:type="dxa"/>
+              <w:left w:w="120" w:type="dxa"/>
+              <w:bottom w:w="80" w:type="dxa"/>
+              <w:right w:w="120" w:type="dxa"/>
+            </w:tcMar>
+            <w:vAlign w:val="center"/>
+            <w:hideMark/>
+          </w:tcPr>
+          <w:p>
+            <w:pPr>
+              <w:spacing w:after="320" w:line="240" w:lineRule="auto"/>
+              <w:rPr>
+                <w:rFonts w:ascii="Times New Roman" w:eastAsia="Times New Roman" w:hAnsi="Times New Roman" w:cs="Times New Roman"/>
+                <w:sz w:val="24"/>
+                <w:szCs w:val="24"/>
+              </w:rPr>
+            </w:pPr>
+            <w:r>
+              <w:rPr>
+                <w:rFonts w:ascii="Times New Roman" w:eastAsia="Times New Roman" w:hAnsi="Times New Roman" w:cs="Times New Roman"/>
+                <w:sz w:val="24"/>
+                <w:szCs w:val="24"/>
+              </w:rPr>
+              <w:t>5:00</w:t>
+            </w:r>
+          </w:p>
+        </w:tc>
+      </w:tr>
+      <w:tr>
+        <w:trPr>
+          <w:tblCellSpacing w:w="15" w:type="dxa"/>
+        </w:trPr>
+        <w:tc>
+          <w:tcPr>
+            <w:tcW w:w="0" w:type="auto"/>
+            <w:tcBorders>
+              <w:top w:val="single" w:sz="4" w:space="0" w:color="C4C7C5"/>
+              <w:left w:val="single" w:sz="4" w:space="0" w:color="C4C7C5"/>
+              <w:bottom w:val="single" w:sz="4" w:space="0" w:color="C4C7C5"/>
+              <w:right w:val="single" w:sz="4" w:space="0" w:color="C4C7C5"/>
+            </w:tcBorders>
+            <w:tcMar>
+              <w:top w:w="80" w:type="dxa"/>
+              <w:left w:w="120" w:type="dxa"/>
+              <w:bottom w:w="80" w:type="dxa"/>
+              <w:right w:w="120" w:type="dxa"/>
+            </w:tcMar>
+            <w:vAlign w:val="center"/>
+            <w:hideMark/>
+          </w:tcPr>
+          <w:p>
+            <w:pPr>
+              <w:spacing w:after="320" w:line="240" w:lineRule="auto"/>
+              <w:rPr>
+                <w:rFonts w:ascii="Times New Roman" w:eastAsia="Times New Roman" w:hAnsi="Times New Roman" w:cs="Times New Roman"/>
+                <w:sz w:val="24"/>
+                <w:szCs w:val="24"/>
+              </w:rPr>
+            </w:pPr>
+            <w:r>
+              <w:rPr>
+                <w:rFonts w:ascii="Times New Roman" w:eastAsia="Times New Roman" w:hAnsi="Times New Roman" w:cs="Times New Roman"/>
+                <w:b/>
+                <w:bCs/>
+                <w:sz w:val="24"/>
+                <w:szCs w:val="24"/>
+              </w:rPr>
+              <w:t>A3</w:t>
+            </w:r>
+          </w:p>
+        </w:tc>
+        <w:tc>
+          <w:tcPr>
+            <w:tcW w:w="0" w:type="auto"/>
+            <w:tcBorders>
+              <w:top w:val="single" w:sz="4" w:space="0" w:color="C4C7C5"/>
+              <w:left w:val="single" w:sz="4" w:space="0" w:color="C4C7C5"/>
+              <w:bottom w:val="single" w:sz="4" w:space="0" w:color="C4C7C5"/>
+              <w:right w:val="single" w:sz="4" w:space="0" w:color="C4C7C5"/>
+            </w:tcBorders>
+            <w:tcMar>
+              <w:top w:w="80" w:type="dxa"/>
+              <w:left w:w="120" w:type="dxa"/>
+              <w:bottom w:w="80" w:type="dxa"/>
+              <w:right w:w="120" w:type="dxa"/>
+            </w:tcMar>
+            <w:vAlign w:val="center"/>
+            <w:hideMark/>
+          </w:tcPr>
+          <w:p>
+            <w:pPr>
+              <w:spacing w:after="320" w:line="240" w:lineRule="auto"/>
+              <w:rPr>
+                <w:rFonts w:ascii="Times New Roman" w:eastAsia="Times New Roman" w:hAnsi="Times New Roman" w:cs="Times New Roman"/>
+                <w:sz w:val="24"/>
+                <w:szCs w:val="24"/>
+              </w:rPr>
+            </w:pPr>
+            <w:r>
+              <w:rPr>
+                <w:rFonts w:ascii="Times New Roman" w:eastAsia="Times New Roman" w:hAnsi="Times New Roman" w:cs="Times New Roman"/>
+                <w:sz w:val="24"/>
+                <w:szCs w:val="24"/>
+              </w:rPr>
+              <w:t>0:00</w:t>
+            </w:r>
+          </w:p>
+        </w:tc>
+        <w:tc>
+          <w:tcPr>
+            <w:tcW w:w="0" w:type="auto"/>
+            <w:tcBorders>
+              <w:top w:val="single" w:sz="4" w:space="0" w:color="C4C7C5"/>
+              <w:left w:val="single" w:sz="4" w:space="0" w:color="C4C7C5"/>
+              <w:bottom w:val="single" w:sz="4" w:space="0" w:color="C4C7C5"/>
+              <w:right w:val="single" w:sz="4" w:space="0" w:color="C4C7C5"/>
+            </w:tcBorders>
+            <w:tcMar>
+              <w:top w:w="80" w:type="dxa"/>
+              <w:left w:w="120" w:type="dxa"/>
+              <w:bottom w:w="80" w:type="dxa"/>
+              <w:right w:w="120" w:type="dxa"/>
+            </w:tcMar>
+            <w:vAlign w:val="center"/>
+            <w:hideMark/>
+          </w:tcPr>
+          <w:p>
+            <w:pPr>
+              <w:spacing w:after="320" w:line="240" w:lineRule="auto"/>
+              <w:rPr>
+                <w:rFonts w:ascii="Times New Roman" w:eastAsia="Times New Roman" w:hAnsi="Times New Roman" w:cs="Times New Roman"/>
+                <w:sz w:val="24"/>
+                <w:szCs w:val="24"/>
+              </w:rPr>
+            </w:pPr>
+            <w:r>
+              <w:rPr>
+                <w:rFonts w:ascii="Times New Roman" w:eastAsia="Times New Roman" w:hAnsi="Times New Roman" w:cs="Times New Roman"/>
+                <w:sz w:val="24"/>
+                <w:szCs w:val="24"/>
+              </w:rPr>
+              <w:t>6:00</w:t>
+            </w:r>
+          </w:p>
+        </w:tc>
+      </w:tr>
+      <w:tr>
+        <w:trPr>
+          <w:tblCellSpacing w:w="15" w:type="dxa"/>
+        </w:trPr>
+        <w:tc>
+          <w:tcPr>
+            <w:tcW w:w="0" w:type="auto"/>
+            <w:tcBorders>
+              <w:top w:val="single" w:sz="4" w:space="0" w:color="C4C7C5"/>
+              <w:left w:val="single" w:sz="4" w:space="0" w:color="C4C7C5"/>
+              <w:bottom w:val="single" w:sz="4" w:space="0" w:color="C4C7C5"/>
+              <w:right w:val="single" w:sz="4" w:space="0" w:color="C4C7C5"/>
+            </w:tcBorders>
+            <w:tcMar>
+              <w:top w:w="80" w:type="dxa"/>
+              <w:left w:w="120" w:type="dxa"/>
+              <w:bottom w:w="80" w:type="dxa"/>
+              <w:right w:w="120" w:type="dxa"/>
+            </w:tcMar>
+            <w:vAlign w:val="center"/>
+            <w:hideMark/>
+          </w:tcPr>
+          <w:p>
+            <w:pPr>
+              <w:spacing w:after="320" w:line="240" w:lineRule="auto"/>
+              <w:rPr>
+                <w:rFonts w:ascii="Times New Roman" w:eastAsia="Times New Roman" w:hAnsi="Times New Roman" w:cs="Times New Roman"/>
+                <w:sz w:val="24"/>
+                <w:szCs w:val="24"/>
+              </w:rPr>
+            </w:pPr>
+            <w:r>
+              <w:rPr>
+                <w:rFonts w:ascii="Times New Roman" w:eastAsia="Times New Roman" w:hAnsi="Times New Roman" w:cs="Times New Roman"/>
+                <w:b/>
+                <w:bCs/>
+                <w:sz w:val="24"/>
+                <w:szCs w:val="24"/>
+              </w:rPr>
+              <w:t>A4</w:t>
+            </w:r>
+          </w:p>
+        </w:tc>
+        <w:tc>
+          <w:tcPr>
+            <w:tcW w:w="0" w:type="auto"/>
+            <w:tcBorders>
+              <w:top w:val="single" w:sz="4" w:space="0" w:color="C4C7C5"/>
+              <w:left w:val="single" w:sz="4" w:space="0" w:color="C4C7C5"/>
+              <w:bottom w:val="single" w:sz="4" w:space="0" w:color="C4C7C5"/>
+              <w:right w:val="single" w:sz="4" w:space="0" w:color="C4C7C5"/>
+            </w:tcBorders>
+            <w:tcMar>
+              <w:top w:w="80" w:type="dxa"/>
+              <w:left w:w="120" w:type="dxa"/>
+              <w:bottom w:w="80" w:type="dxa"/>
+              <w:right w:w="120" w:type="dxa"/>
+            </w:tcMar>
+            <w:vAlign w:val="center"/>
+            <w:hideMark/>
+          </w:tcPr>
+          <w:p>
+            <w:pPr>
+              <w:spacing w:after="320" w:line="240" w:lineRule="auto"/>
+              <w:rPr>
+                <w:rFonts w:ascii="Times New Roman" w:eastAsia="Times New Roman" w:hAnsi="Times New Roman" w:cs="Times New Roman"/>
+                <w:sz w:val="24"/>
+                <w:szCs w:val="24"/>
+              </w:rPr>
+            </w:pPr>
+            <w:r>
+              <w:rPr>
+                <w:rFonts w:ascii="Times New Roman" w:eastAsia="Times New Roman" w:hAnsi="Times New Roman" w:cs="Times New Roman"/>
+                <w:sz w:val="24"/>
+                <w:szCs w:val="24"/>
+              </w:rPr>
+              <w:t>5:00</w:t>
+            </w:r>
+          </w:p>
+        </w:tc>
+        <w:tc>
+          <w:tcPr>
+            <w:tcW w:w="0" w:type="auto"/>
+            <w:tcBorders>
+              <w:top w:val="single" w:sz="4" w:space="0" w:color="C4C7C5"/>
+              <w:left w:val="single" w:sz="4" w:space="0" w:color="C4C7C5"/>
+              <w:bottom w:val="single" w:sz="4" w:space="0" w:color="C4C7C5"/>
+              <w:right w:val="single" w:sz="4" w:space="0" w:color="C4C7C5"/>
+            </w:tcBorders>
+            <w:tcMar>
+              <w:top w:w="80" w:type="dxa"/>
+              <w:left w:w="120" w:type="dxa"/>
+              <w:bottom w:w="80" w:type="dxa"/>
+              <w:right w:w="120" w:type="dxa"/>
+            </w:tcMar>
+            <w:vAlign w:val="center"/>
+            <w:hideMark/>
+          </w:tcPr>
+          <w:p>
+            <w:pPr>
+              <w:spacing w:after="320" w:line="240" w:lineRule="auto"/>
+              <w:rPr>
+                <w:rFonts w:ascii="Times New Roman" w:eastAsia="Times New Roman" w:hAnsi="Times New Roman" w:cs="Times New Roman"/>
+                <w:sz w:val="24"/>
+                <w:szCs w:val="24"/>
+              </w:rPr>
+            </w:pPr>
+            <w:r>
+              <w:rPr>
+                <w:rFonts w:ascii="Times New Roman" w:eastAsia="Times New Roman" w:hAnsi="Times New Roman" w:cs="Times New Roman"/>
+                <w:sz w:val="24"/>
+                <w:szCs w:val="24"/>
+              </w:rPr>
+              <w:t>7:00</w:t>
+            </w:r>
+          </w:p>
+        </w:tc>
+      </w:tr>
+      <w:tr>
+        <w:trPr>
+          <w:tblCellSpacing w:w="15" w:type="dxa"/>
+        </w:trPr>
+        <w:tc>
+          <w:tcPr>
+            <w:tcW w:w="0" w:type="auto"/>
+            <w:tcBorders>
+              <w:top w:val="single" w:sz="4" w:space="0" w:color="C4C7C5"/>
+              <w:left w:val="single" w:sz="4" w:space="0" w:color="C4C7C5"/>
+              <w:bottom w:val="single" w:sz="4" w:space="0" w:color="C4C7C5"/>
+              <w:right w:val="single" w:sz="4" w:space="0" w:color="C4C7C5"/>
+            </w:tcBorders>
+            <w:tcMar>
+              <w:top w:w="80" w:type="dxa"/>
+              <w:left w:w="120" w:type="dxa"/>
+              <w:bottom w:w="80" w:type="dxa"/>
+              <w:right w:w="120" w:type="dxa"/>
+            </w:tcMar>
+            <w:vAlign w:val="center"/>
+            <w:hideMark/>
+          </w:tcPr>
+          <w:p>
+            <w:pPr>
+              <w:spacing w:after="320" w:line="240" w:lineRule="auto"/>
+              <w:rPr>
+                <w:rFonts w:ascii="Times New Roman" w:eastAsia="Times New Roman" w:hAnsi="Times New Roman" w:cs="Times New Roman"/>
+                <w:sz w:val="24"/>
+                <w:szCs w:val="24"/>
+              </w:rPr>
+            </w:pPr>
+            <w:r>
+              <w:rPr>
+                <w:rFonts w:ascii="Times New Roman" w:eastAsia="Times New Roman" w:hAnsi="Times New Roman" w:cs="Times New Roman"/>
+                <w:b/>
+                <w:bCs/>
+                <w:sz w:val="24"/>
+                <w:szCs w:val="24"/>
+              </w:rPr>
+              <w:lastRenderedPageBreak/>
+              <w:t>A5</w:t>
+            </w:r>
+          </w:p>
+        </w:tc>
+        <w:tc>
+          <w:tcPr>
+            <w:tcW w:w="0" w:type="auto"/>
+            <w:tcBorders>
+              <w:top w:val="single" w:sz="4" w:space="0" w:color="C4C7C5"/>
+              <w:left w:val="single" w:sz="4" w:space="0" w:color="C4C7C5"/>
+              <w:bottom w:val="single" w:sz="4" w:space="0" w:color="C4C7C5"/>
+              <w:right w:val="single" w:sz="4" w:space="0" w:color="C4C7C5"/>
+            </w:tcBorders>
+            <w:tcMar>
+              <w:top w:w="80" w:type="dxa"/>
+              <w:left w:w="120" w:type="dxa"/>
+              <w:bottom w:w="80" w:type="dxa"/>
+              <w:right w:w="120" w:type="dxa"/>
+            </w:tcMar>
+            <w:vAlign w:val="center"/>
+            <w:hideMark/>
+          </w:tcPr>
+          <w:p>
+            <w:pPr>
+              <w:spacing w:after="320" w:line="240" w:lineRule="auto"/>
+              <w:rPr>
+                <w:rFonts w:ascii="Times New Roman" w:eastAsia="Times New Roman" w:hAnsi="Times New Roman" w:cs="Times New Roman"/>
+                <w:sz w:val="24"/>
+                <w:szCs w:val="24"/>
+              </w:rPr>
+            </w:pPr>
+            <w:r>
+              <w:rPr>
+                <w:rFonts w:ascii="Times New Roman" w:eastAsia="Times New Roman" w:hAnsi="Times New Roman" w:cs="Times New Roman"/>
+                <w:sz w:val="24"/>
+                <w:szCs w:val="24"/>
+              </w:rPr>
+              <w:t>3:00</w:t>
+            </w:r>
+          </w:p>
+        </w:tc>
+        <w:tc>
+          <w:tcPr>
+            <w:tcW w:w="0" w:type="auto"/>
+            <w:tcBorders>
+              <w:top w:val="single" w:sz="4" w:space="0" w:color="C4C7C5"/>
+              <w:left w:val="single" w:sz="4" w:space="0" w:color="C4C7C5"/>
+              <w:bottom w:val="single" w:sz="4" w:space="0" w:color="C4C7C5"/>
+              <w:right w:val="single" w:sz="4" w:space="0" w:color="C4C7C5"/>
+            </w:tcBorders>
+            <w:tcMar>
+              <w:top w:w="80" w:type="dxa"/>
+              <w:left w:w="120" w:type="dxa"/>
+              <w:bottom w:w="80" w:type="dxa"/>
+              <w:right w:w="120" w:type="dxa"/>
+            </w:tcMar>
+            <w:vAlign w:val="center"/>
+            <w:hideMark/>
+          </w:tcPr>
+          <w:p>
+            <w:pPr>
+              <w:spacing w:after="320" w:line="240" w:lineRule="auto"/>
+              <w:rPr>
+                <w:rFonts w:ascii="Times New Roman" w:eastAsia="Times New Roman" w:hAnsi="Times New Roman" w:cs="Times New Roman"/>
+                <w:sz w:val="24"/>
+                <w:szCs w:val="24"/>
+              </w:rPr>
+            </w:pPr>
+            <w:r>
+              <w:rPr>
+                <w:rFonts w:ascii="Times New Roman" w:eastAsia="Times New Roman" w:hAnsi="Times New Roman" w:cs="Times New Roman"/>
+                <w:sz w:val="24"/>
+                <w:szCs w:val="24"/>
+              </w:rPr>
+              <w:t>9:00</w:t>
+            </w:r>
+          </w:p>
+        </w:tc>
+      </w:tr>
+      <w:tr>
+        <w:trPr>
+          <w:tblCellSpacing w:w="15" w:type="dxa"/>
+        </w:trPr>
+        <w:tc>
+          <w:tcPr>
+            <w:tcW w:w="0" w:type="auto"/>
+            <w:tcBorders>
+              <w:top w:val="single" w:sz="4" w:space="0" w:color="C4C7C5"/>
+              <w:left w:val="single" w:sz="4" w:space="0" w:color="C4C7C5"/>
+              <w:bottom w:val="single" w:sz="4" w:space="0" w:color="C4C7C5"/>
+              <w:right w:val="single" w:sz="4" w:space="0" w:color="C4C7C5"/>
+            </w:tcBorders>
+            <w:tcMar>
+              <w:top w:w="80" w:type="dxa"/>
+              <w:left w:w="120" w:type="dxa"/>
+              <w:bottom w:w="80" w:type="dxa"/>
+              <w:right w:w="120" w:type="dxa"/>
+            </w:tcMar>
+            <w:vAlign w:val="center"/>
+            <w:hideMark/>
+          </w:tcPr>
+          <w:p>
+            <w:pPr>
+              <w:spacing w:after="320" w:line="240" w:lineRule="auto"/>
+              <w:rPr>
+                <w:rFonts w:ascii="Times New Roman" w:eastAsia="Times New Roman" w:hAnsi="Times New Roman" w:cs="Times New Roman"/>
+                <w:sz w:val="24"/>
+                <w:szCs w:val="24"/>
+              </w:rPr>
+            </w:pPr>
+            <w:r>
+              <w:rPr>
+                <w:rFonts w:ascii="Times New Roman" w:eastAsia="Times New Roman" w:hAnsi="Times New Roman" w:cs="Times New Roman"/>
+                <w:b/>
+                <w:bCs/>
+                <w:sz w:val="24"/>
+                <w:szCs w:val="24"/>
+              </w:rPr>
+              <w:t>A6</w:t>
+            </w:r>
+          </w:p>
+        </w:tc>
+        <w:tc>
+          <w:tcPr>
+            <w:tcW w:w="0" w:type="auto"/>
+            <w:tcBorders>
+              <w:top w:val="single" w:sz="4" w:space="0" w:color="C4C7C5"/>
+              <w:left w:val="single" w:sz="4" w:space="0" w:color="C4C7C5"/>
+              <w:bottom w:val="single" w:sz="4" w:space="0" w:color="C4C7C5"/>
+              <w:right w:val="single" w:sz="4" w:space="0" w:color="C4C7C5"/>
+            </w:tcBorders>
+            <w:tcMar>
+              <w:top w:w="80" w:type="dxa"/>
+              <w:left w:w="120" w:type="dxa"/>
+              <w:bottom w:w="80" w:type="dxa"/>
+              <w:right w:w="120" w:type="dxa"/>
+            </w:tcMar>
+            <w:vAlign w:val="center"/>
+            <w:hideMark/>
+          </w:tcPr>
+          <w:p>
+            <w:pPr>
+              <w:spacing w:after="320" w:line="240" w:lineRule="auto"/>
+              <w:rPr>
+                <w:rFonts w:ascii="Times New Roman" w:eastAsia="Times New Roman" w:hAnsi="Times New Roman" w:cs="Times New Roman"/>
+                <w:sz w:val="24"/>
+                <w:szCs w:val="24"/>
+              </w:rPr>
+            </w:pPr>
+            <w:r>
+              <w:rPr>
+                <w:rFonts w:ascii="Times New Roman" w:eastAsia="Times New Roman" w:hAnsi="Times New Roman" w:cs="Times New Roman"/>
+                <w:sz w:val="24"/>
+                <w:szCs w:val="24"/>
+              </w:rPr>
+              <w:t>5:00</w:t>
+            </w:r>
+          </w:p>
+        </w:tc>
+        <w:tc>
+          <w:tcPr>
+            <w:tcW w:w="0" w:type="auto"/>
+            <w:tcBorders>
+              <w:top w:val="single" w:sz="4" w:space="0" w:color="C4C7C5"/>
+              <w:left w:val="single" w:sz="4" w:space="0" w:color="C4C7C5"/>
+              <w:bottom w:val="single" w:sz="4" w:space="0" w:color="C4C7C5"/>
+              <w:right w:val="single" w:sz="4" w:space="0" w:color="C4C7C5"/>
+            </w:tcBorders>
+            <w:tcMar>
+              <w:top w:w="80" w:type="dxa"/>
+              <w:left w:w="120" w:type="dxa"/>
+              <w:bottom w:w="80" w:type="dxa"/>
+              <w:right w:w="120" w:type="dxa"/>
+            </w:tcMar>
+            <w:vAlign w:val="center"/>
+            <w:hideMark/>
+          </w:tcPr>
+          <w:p>
+            <w:pPr>
+              <w:spacing w:after="320" w:line="240" w:lineRule="auto"/>
+              <w:rPr>
+                <w:rFonts w:ascii="Times New Roman" w:eastAsia="Times New Roman" w:hAnsi="Times New Roman" w:cs="Times New Roman"/>
+                <w:sz w:val="24"/>
+                <w:szCs w:val="24"/>
+              </w:rPr>
+            </w:pPr>
+            <w:r>
+              <w:rPr>
+                <w:rFonts w:ascii="Times New Roman" w:eastAsia="Times New Roman" w:hAnsi="Times New Roman" w:cs="Times New Roman"/>
+                <w:sz w:val="24"/>
+                <w:szCs w:val="24"/>
+              </w:rPr>
+              <w:t>9:00</w:t>
+            </w:r>
+          </w:p>
+        </w:tc>
+      </w:tr>
+    </w:tbl>
+    <w:p>
+      <w:pPr>
+        <w:spacing w:before="100" w:beforeAutospacing="1" w:after="100" w:afterAutospacing="1" w:line="240" w:lineRule="auto"/>
+        <w:outlineLvl w:val="2"/>
+        <w:rPr>
+          <w:rFonts w:ascii="Times New Roman" w:eastAsia="Times New Roman" w:hAnsi="Times New Roman" w:cs="Times New Roman"/>
+          <w:b/>
+          <w:bCs/>
+          <w:sz w:val="27"/>
+          <w:szCs w:val="27"/>
+        </w:rPr>
+      </w:pPr>
+      <w:r>
+        <w:rPr>
+          <w:rFonts w:ascii="Times New Roman" w:eastAsia="Times New Roman" w:hAnsi="Times New Roman" w:cs="Times New Roman"/>
+          <w:b/>
+          <w:bCs/>
+          <w:sz w:val="27"/>
+          <w:szCs w:val="27"/>
+        </w:rPr>
+        <w:t>Step 1: Sort by Finish Time</w:t>
+      </w:r>
+    </w:p>
+    <w:p>
+      <w:pPr>
+        <w:spacing w:before="100" w:beforeAutospacing="1" w:after="100" w:afterAutospacing="1" w:line="240" w:lineRule="auto"/>
+        <w:rPr>
+          <w:rFonts w:ascii="Times New Roman" w:eastAsia="Times New Roman" w:hAnsi="Times New Roman" w:cs="Times New Roman"/>
+          <w:sz w:val="24"/>
+          <w:szCs w:val="24"/>
+        </w:rPr>
+      </w:pPr>
+      <w:r>
+        <w:rPr>
+          <w:rFonts w:ascii="Times New Roman" w:eastAsia="Times New Roman" w:hAnsi="Times New Roman" w:cs="Times New Roman"/>
+          <w:sz w:val="24"/>
+          <w:szCs w:val="24"/>
+        </w:rPr>
+        <w:t xml:space="preserve">To make greedy choices efficiently, we must first sort the activities in ascending order of their </w:t>
+      </w:r>
+      <w:r>
+        <w:rPr>
+          <w:rFonts w:ascii="Times New Roman" w:eastAsia="Times New Roman" w:hAnsi="Times New Roman" w:cs="Times New Roman"/>
+          <w:b/>
+          <w:bCs/>
+          <w:sz w:val="24"/>
+          <w:szCs w:val="24"/>
+        </w:rPr>
+        <w:t>finish times</w:t>
+      </w:r>
+      <w:r>
+        <w:rPr>
+          <w:rFonts w:ascii="Times New Roman" w:eastAsia="Times New Roman" w:hAnsi="Times New Roman" w:cs="Times New Roman"/>
+          <w:sz w:val="24"/>
+          <w:szCs w:val="24"/>
+        </w:rPr>
+        <w:t>. (Conveniently, our table above is already sorted this way!).</w:t>
+      </w:r>
+    </w:p>
+    <w:p>
+      <w:pPr>
+        <w:spacing w:before="100" w:beforeAutospacing="1" w:after="100" w:afterAutospacing="1" w:line="240" w:lineRule="auto"/>
+        <w:outlineLvl w:val="2"/>
+        <w:rPr>
+          <w:rFonts w:ascii="Times New Roman" w:eastAsia="Times New Roman" w:hAnsi="Times New Roman" w:cs="Times New Roman"/>
+          <w:b/>
+          <w:bCs/>
+          <w:sz w:val="27"/>
+          <w:szCs w:val="27"/>
+        </w:rPr>
+      </w:pPr>
+      <w:r>
+        <w:rPr>
+          <w:rFonts w:ascii="Times New Roman" w:eastAsia="Times New Roman" w:hAnsi="Times New Roman" w:cs="Times New Roman"/>
+          <w:b/>
+          <w:bCs/>
+          <w:sz w:val="27"/>
+          <w:szCs w:val="27"/>
+        </w:rPr>
+        <w:t>Step 2: Make the Greedy Choices</w:t>
+      </w:r>
+    </w:p>
+    <w:p>
+      <w:pPr>
+        <w:spacing w:after="0" w:line="240" w:lineRule="auto"/>
+        <w:rPr>
+          <w:rFonts w:ascii="Times New Roman" w:eastAsia="Times New Roman" w:hAnsi="Times New Roman" w:cs="Times New Roman"/>
+          <w:sz w:val="24"/>
+          <w:szCs w:val="24"/>
+        </w:rPr>
+      </w:pPr>
+      <w:proofErr w:type="gramStart"/>
+      <w:r>
+        <w:rPr>
+          <w:rFonts w:ascii="Times New Roman" w:eastAsia="Times New Roman" w:hAnsi="Times New Roman" w:cs="Times New Roman"/>
+          <w:b/>
+          <w:bCs/>
+          <w:sz w:val="24"/>
+          <w:szCs w:val="24"/>
+        </w:rPr>
+        <w:t>1.Select</w:t>
+      </w:r>
+      <w:proofErr w:type="gramEnd"/>
+      <w:r>
+        <w:rPr>
+          <w:rFonts w:ascii="Times New Roman" w:eastAsia="Times New Roman" w:hAnsi="Times New Roman" w:cs="Times New Roman"/>
+          <w:b/>
+          <w:bCs/>
+          <w:sz w:val="24"/>
+          <w:szCs w:val="24"/>
+        </w:rPr>
+        <w:t xml:space="preserve"> the first </w:t>
+      </w:r>
+      <w:proofErr w:type="spellStart"/>
+      <w:r>
+        <w:rPr>
+          <w:rFonts w:ascii="Times New Roman" w:eastAsia="Times New Roman" w:hAnsi="Times New Roman" w:cs="Times New Roman"/>
+          <w:b/>
+          <w:bCs/>
+          <w:sz w:val="24"/>
+          <w:szCs w:val="24"/>
+        </w:rPr>
+        <w:t>activity:</w:t>
+      </w:r>
+      <w:r>
+        <w:rPr>
+          <w:rFonts w:ascii="Times New Roman" w:eastAsia="Times New Roman" w:hAnsi="Times New Roman" w:cs="Times New Roman"/>
+          <w:sz w:val="24"/>
+          <w:szCs w:val="24"/>
+        </w:rPr>
+        <w:t>Room</w:t>
+      </w:r>
+      <w:proofErr w:type="spellEnd"/>
+      <w:r>
+        <w:rPr>
+          <w:rFonts w:ascii="Times New Roman" w:eastAsia="Times New Roman" w:hAnsi="Times New Roman" w:cs="Times New Roman"/>
+          <w:sz w:val="24"/>
+          <w:szCs w:val="24"/>
+        </w:rPr>
+        <w:t xml:space="preserve"> is completely open.</w:t>
+      </w:r>
+    </w:p>
+    <w:p>
+      <w:pPr>
+        <w:spacing w:before="100" w:beforeAutospacing="1" w:after="100" w:afterAutospacing="1" w:line="240" w:lineRule="auto"/>
+        <w:rPr>
+          <w:rFonts w:ascii="Times New Roman" w:eastAsia="Times New Roman" w:hAnsi="Times New Roman" w:cs="Times New Roman"/>
+          <w:sz w:val="24"/>
+          <w:szCs w:val="24"/>
+        </w:rPr>
+      </w:pPr>
+      <w:r>
+        <w:rPr>
+          <w:rFonts w:ascii="Times New Roman" w:eastAsia="Times New Roman" w:hAnsi="Times New Roman" w:cs="Times New Roman"/>
+          <w:sz w:val="24"/>
+          <w:szCs w:val="24"/>
+        </w:rPr>
+        <w:t>Always select the first activity in the sorted list.</w:t>
+      </w:r>
+    </w:p>
+    <w:p>
+      <w:pPr>
+        <w:numPr>
+          <w:ilvl w:val="0"/>
+          <w:numId w:val="6"/>
+        </w:numPr>
+        <w:spacing w:before="100" w:beforeAutospacing="1" w:after="100" w:afterAutospacing="1" w:line="240" w:lineRule="auto"/>
+        <w:rPr>
+          <w:rFonts w:ascii="Times New Roman" w:eastAsia="Times New Roman" w:hAnsi="Times New Roman" w:cs="Times New Roman"/>
+          <w:sz w:val="24"/>
+          <w:szCs w:val="24"/>
+        </w:rPr>
+      </w:pPr>
+      <w:r>
+        <w:rPr>
+          <w:rFonts w:ascii="Times New Roman" w:eastAsia="Times New Roman" w:hAnsi="Times New Roman" w:cs="Times New Roman"/>
+          <w:b/>
+          <w:bCs/>
+          <w:sz w:val="24"/>
+          <w:szCs w:val="24"/>
+        </w:rPr>
+        <w:t>Select A1</w:t>
+      </w:r>
+      <w:r>
+        <w:rPr>
+          <w:rFonts w:ascii="Times New Roman" w:eastAsia="Times New Roman" w:hAnsi="Times New Roman" w:cs="Times New Roman"/>
+          <w:sz w:val="24"/>
+          <w:szCs w:val="24"/>
+        </w:rPr>
+        <w:t xml:space="preserve"> (1:00 to 4:00).</w:t>
+      </w:r>
+    </w:p>
+    <w:p>
+      <w:pPr>
+        <w:numPr>
+          <w:ilvl w:val="0"/>
+          <w:numId w:val="6"/>
+        </w:numPr>
+        <w:spacing w:before="100" w:beforeAutospacing="1" w:after="100" w:afterAutospacing="1" w:line="240" w:lineRule="auto"/>
+        <w:rPr>
+          <w:rFonts w:ascii="Times New Roman" w:eastAsia="Times New Roman" w:hAnsi="Times New Roman" w:cs="Times New Roman"/>
+          <w:sz w:val="24"/>
+          <w:szCs w:val="24"/>
+        </w:rPr>
+      </w:pPr>
+      <w:r>
+        <w:rPr>
+          <w:rFonts w:ascii="Times New Roman" w:eastAsia="Times New Roman" w:hAnsi="Times New Roman" w:cs="Times New Roman"/>
+          <w:i/>
+          <w:iCs/>
+          <w:sz w:val="24"/>
+          <w:szCs w:val="24"/>
+        </w:rPr>
+        <w:t>Next available room time:</w:t>
+      </w:r>
+      <w:r>
+        <w:rPr>
+          <w:rFonts w:ascii="Times New Roman" w:eastAsia="Times New Roman" w:hAnsi="Times New Roman" w:cs="Times New Roman"/>
+          <w:sz w:val="24"/>
+          <w:szCs w:val="24"/>
+        </w:rPr>
+        <w:t xml:space="preserve"> </w:t>
+      </w:r>
+      <w:r>
+        <w:rPr>
+          <w:rFonts w:ascii="Times New Roman" w:eastAsia="Times New Roman" w:hAnsi="Times New Roman" w:cs="Times New Roman"/>
+          <w:b/>
+          <w:bCs/>
+          <w:sz w:val="24"/>
+          <w:szCs w:val="24"/>
+        </w:rPr>
+        <w:t>4:00</w:t>
+      </w:r>
+      <w:r>
+        <w:rPr>
+          <w:rFonts w:ascii="Times New Roman" w:eastAsia="Times New Roman" w:hAnsi="Times New Roman" w:cs="Times New Roman"/>
+          <w:sz w:val="24"/>
+          <w:szCs w:val="24"/>
+        </w:rPr>
+        <w:t>.</w:t>
+      </w:r>
+    </w:p>
+    <w:p>
+      <w:pPr>
+        <w:spacing w:after="0" w:line="240" w:lineRule="auto"/>
+        <w:rPr>
+          <w:rFonts w:ascii="Times New Roman" w:eastAsia="Times New Roman" w:hAnsi="Times New Roman" w:cs="Times New Roman"/>
+          <w:sz w:val="24"/>
+          <w:szCs w:val="24"/>
+        </w:rPr>
+      </w:pPr>
+      <w:proofErr w:type="gramStart"/>
+      <w:r>
+        <w:rPr>
+          <w:rFonts w:ascii="Times New Roman" w:eastAsia="Times New Roman" w:hAnsi="Times New Roman" w:cs="Times New Roman"/>
+          <w:b/>
+          <w:bCs/>
+          <w:sz w:val="24"/>
+          <w:szCs w:val="24"/>
+        </w:rPr>
+        <w:t>2.Evaluate</w:t>
+      </w:r>
+      <w:proofErr w:type="gramEnd"/>
+      <w:r>
+        <w:rPr>
+          <w:rFonts w:ascii="Times New Roman" w:eastAsia="Times New Roman" w:hAnsi="Times New Roman" w:cs="Times New Roman"/>
+          <w:b/>
+          <w:bCs/>
+          <w:sz w:val="24"/>
+          <w:szCs w:val="24"/>
+        </w:rPr>
+        <w:t xml:space="preserve"> A2 &amp; A3:</w:t>
+      </w:r>
+      <w:r>
+        <w:rPr>
+          <w:rFonts w:ascii="Times New Roman" w:eastAsia="Times New Roman" w:hAnsi="Times New Roman" w:cs="Times New Roman"/>
+          <w:sz w:val="24"/>
+          <w:szCs w:val="24"/>
+        </w:rPr>
+        <w:t>Next available: 4:00.</w:t>
+      </w:r>
+    </w:p>
+    <w:p>
+      <w:pPr>
+        <w:numPr>
+          <w:ilvl w:val="0"/>
+          <w:numId w:val="7"/>
+        </w:numPr>
+        <w:spacing w:before="100" w:beforeAutospacing="1" w:after="100" w:afterAutospacing="1" w:line="240" w:lineRule="auto"/>
+        <w:rPr>
+          <w:rFonts w:ascii="Times New Roman" w:eastAsia="Times New Roman" w:hAnsi="Times New Roman" w:cs="Times New Roman"/>
+          <w:sz w:val="24"/>
+          <w:szCs w:val="24"/>
+        </w:rPr>
+      </w:pPr>
+      <w:r>
+        <w:rPr>
+          <w:rFonts w:ascii="Times New Roman" w:eastAsia="Times New Roman" w:hAnsi="Times New Roman" w:cs="Times New Roman"/>
+          <w:b/>
+          <w:bCs/>
+          <w:sz w:val="24"/>
+          <w:szCs w:val="24"/>
+        </w:rPr>
+        <w:t>A2</w:t>
+      </w:r>
+      <w:r>
+        <w:rPr>
+          <w:rFonts w:ascii="Times New Roman" w:eastAsia="Times New Roman" w:hAnsi="Times New Roman" w:cs="Times New Roman"/>
+          <w:sz w:val="24"/>
+          <w:szCs w:val="24"/>
+        </w:rPr>
+        <w:t xml:space="preserve"> (3:00 to 5:00): Starts at 3:00. This conflicts with A1 (which runs until 4:00). </w:t>
+      </w:r>
+      <w:r>
+        <w:rPr>
+          <w:rFonts w:ascii="Times New Roman" w:eastAsia="Times New Roman" w:hAnsi="Times New Roman" w:cs="Times New Roman"/>
+          <w:b/>
+          <w:bCs/>
+          <w:sz w:val="24"/>
+          <w:szCs w:val="24"/>
+        </w:rPr>
+        <w:t>Skip it.</w:t>
+      </w:r>
+    </w:p>
+    <w:p>
+      <w:pPr>
+        <w:numPr>
+          <w:ilvl w:val="0"/>
+          <w:numId w:val="7"/>
+        </w:numPr>
+        <w:spacing w:before="100" w:beforeAutospacing="1" w:after="100" w:afterAutospacing="1" w:line="240" w:lineRule="auto"/>
+        <w:rPr>
+          <w:rFonts w:ascii="Times New Roman" w:eastAsia="Times New Roman" w:hAnsi="Times New Roman" w:cs="Times New Roman"/>
+          <w:sz w:val="24"/>
+          <w:szCs w:val="24"/>
+        </w:rPr>
+      </w:pPr>
+      <w:r>
+        <w:rPr>
+          <w:rFonts w:ascii="Times New Roman" w:eastAsia="Times New Roman" w:hAnsi="Times New Roman" w:cs="Times New Roman"/>
+          <w:b/>
+          <w:bCs/>
+          <w:sz w:val="24"/>
+          <w:szCs w:val="24"/>
+        </w:rPr>
+        <w:t>A3</w:t>
+      </w:r>
+      <w:r>
+        <w:rPr>
+          <w:rFonts w:ascii="Times New Roman" w:eastAsia="Times New Roman" w:hAnsi="Times New Roman" w:cs="Times New Roman"/>
+          <w:sz w:val="24"/>
+          <w:szCs w:val="24"/>
+        </w:rPr>
+        <w:t xml:space="preserve"> (0:00 to 6:00): Starts at 0:00. Conflicts with A1. </w:t>
+      </w:r>
+      <w:r>
+        <w:rPr>
+          <w:rFonts w:ascii="Times New Roman" w:eastAsia="Times New Roman" w:hAnsi="Times New Roman" w:cs="Times New Roman"/>
+          <w:b/>
+          <w:bCs/>
+          <w:sz w:val="24"/>
+          <w:szCs w:val="24"/>
+        </w:rPr>
+        <w:t>Skip it.</w:t>
+      </w:r>
+    </w:p>
+    <w:p>
+      <w:pPr>
+        <w:spacing w:after="0" w:line="240" w:lineRule="auto"/>
+        <w:rPr>
+          <w:rFonts w:ascii="Times New Roman" w:eastAsia="Times New Roman" w:hAnsi="Times New Roman" w:cs="Times New Roman"/>
+          <w:sz w:val="24"/>
+          <w:szCs w:val="24"/>
+        </w:rPr>
+      </w:pPr>
+      <w:proofErr w:type="gramStart"/>
+      <w:r>
+        <w:rPr>
+          <w:rFonts w:ascii="Times New Roman" w:eastAsia="Times New Roman" w:hAnsi="Times New Roman" w:cs="Times New Roman"/>
+          <w:b/>
+          <w:bCs/>
+          <w:sz w:val="24"/>
+          <w:szCs w:val="24"/>
+        </w:rPr>
+        <w:t>3.Evaluate</w:t>
+      </w:r>
+      <w:proofErr w:type="gramEnd"/>
+      <w:r>
+        <w:rPr>
+          <w:rFonts w:ascii="Times New Roman" w:eastAsia="Times New Roman" w:hAnsi="Times New Roman" w:cs="Times New Roman"/>
+          <w:b/>
+          <w:bCs/>
+          <w:sz w:val="24"/>
+          <w:szCs w:val="24"/>
+        </w:rPr>
+        <w:t xml:space="preserve"> A4:</w:t>
+      </w:r>
+      <w:r>
+        <w:rPr>
+          <w:rFonts w:ascii="Times New Roman" w:eastAsia="Times New Roman" w:hAnsi="Times New Roman" w:cs="Times New Roman"/>
+          <w:sz w:val="24"/>
+          <w:szCs w:val="24"/>
+        </w:rPr>
+        <w:t>Next available: 4:00.</w:t>
+      </w:r>
+    </w:p>
+    <w:p>
+      <w:pPr>
+        <w:numPr>
+          <w:ilvl w:val="0"/>
+          <w:numId w:val="8"/>
+        </w:numPr>
+        <w:spacing w:before="100" w:beforeAutospacing="1" w:after="100" w:afterAutospacing="1" w:line="240" w:lineRule="auto"/>
+        <w:rPr>
+          <w:rFonts w:ascii="Times New Roman" w:eastAsia="Times New Roman" w:hAnsi="Times New Roman" w:cs="Times New Roman"/>
+          <w:sz w:val="24"/>
+          <w:szCs w:val="24"/>
+        </w:rPr>
+      </w:pPr>
+      <w:r>
+        <w:rPr>
+          <w:rFonts w:ascii="Times New Roman" w:eastAsia="Times New Roman" w:hAnsi="Times New Roman" w:cs="Times New Roman"/>
+          <w:b/>
+          <w:bCs/>
+          <w:sz w:val="24"/>
+          <w:szCs w:val="24"/>
+        </w:rPr>
+        <w:t>A4</w:t>
+      </w:r>
+      <w:r>
+        <w:rPr>
+          <w:rFonts w:ascii="Times New Roman" w:eastAsia="Times New Roman" w:hAnsi="Times New Roman" w:cs="Times New Roman"/>
+          <w:sz w:val="24"/>
+          <w:szCs w:val="24"/>
+        </w:rPr>
+        <w:t xml:space="preserve"> (5:00 to 7:00): Starts at 5:00. Since 5:00 is greater than or equal to 4:00, there is no conflict!</w:t>
+      </w:r>
+    </w:p>
+    <w:p>
+      <w:pPr>
+        <w:numPr>
+          <w:ilvl w:val="0"/>
+          <w:numId w:val="8"/>
+        </w:numPr>
+        <w:spacing w:before="100" w:beforeAutospacing="1" w:after="100" w:afterAutospacing="1" w:line="240" w:lineRule="auto"/>
+        <w:rPr>
+          <w:rFonts w:ascii="Times New Roman" w:eastAsia="Times New Roman" w:hAnsi="Times New Roman" w:cs="Times New Roman"/>
+          <w:sz w:val="24"/>
+          <w:szCs w:val="24"/>
+        </w:rPr>
+      </w:pPr>
+      <w:r>
+        <w:rPr>
+          <w:rFonts w:ascii="Times New Roman" w:eastAsia="Times New Roman" w:hAnsi="Times New Roman" w:cs="Times New Roman"/>
+          <w:b/>
+          <w:bCs/>
+          <w:sz w:val="24"/>
+          <w:szCs w:val="24"/>
+        </w:rPr>
+        <w:t>Select A4</w:t>
+      </w:r>
+      <w:r>
+        <w:rPr>
+          <w:rFonts w:ascii="Times New Roman" w:eastAsia="Times New Roman" w:hAnsi="Times New Roman" w:cs="Times New Roman"/>
+          <w:sz w:val="24"/>
+          <w:szCs w:val="24"/>
+        </w:rPr>
+        <w:t>.</w:t>
+      </w:r>
+    </w:p>
+    <w:p>
+      <w:pPr>
+        <w:numPr>
+          <w:ilvl w:val="0"/>
+          <w:numId w:val="8"/>
+        </w:numPr>
+        <w:spacing w:before="100" w:beforeAutospacing="1" w:after="100" w:afterAutospacing="1" w:line="240" w:lineRule="auto"/>
+        <w:rPr>
+          <w:rFonts w:ascii="Times New Roman" w:eastAsia="Times New Roman" w:hAnsi="Times New Roman" w:cs="Times New Roman"/>
+          <w:sz w:val="24"/>
+          <w:szCs w:val="24"/>
+        </w:rPr>
+      </w:pPr>
+      <w:r>
+        <w:rPr>
+          <w:rFonts w:ascii="Times New Roman" w:eastAsia="Times New Roman" w:hAnsi="Times New Roman" w:cs="Times New Roman"/>
+          <w:i/>
+          <w:iCs/>
+          <w:sz w:val="24"/>
+          <w:szCs w:val="24"/>
+        </w:rPr>
+        <w:t>Next available room time:</w:t>
+      </w:r>
+      <w:r>
+        <w:rPr>
+          <w:rFonts w:ascii="Times New Roman" w:eastAsia="Times New Roman" w:hAnsi="Times New Roman" w:cs="Times New Roman"/>
+          <w:sz w:val="24"/>
+          <w:szCs w:val="24"/>
+        </w:rPr>
+        <w:t xml:space="preserve"> </w:t>
+      </w:r>
+      <w:r>
+        <w:rPr>
+          <w:rFonts w:ascii="Times New Roman" w:eastAsia="Times New Roman" w:hAnsi="Times New Roman" w:cs="Times New Roman"/>
+          <w:b/>
+          <w:bCs/>
+          <w:sz w:val="24"/>
+          <w:szCs w:val="24"/>
+        </w:rPr>
+        <w:t>7:00</w:t>
+      </w:r>
+      <w:r>
+        <w:rPr>
+          <w:rFonts w:ascii="Times New Roman" w:eastAsia="Times New Roman" w:hAnsi="Times New Roman" w:cs="Times New Roman"/>
+          <w:sz w:val="24"/>
+          <w:szCs w:val="24"/>
+        </w:rPr>
+        <w:t>.</w:t>
+      </w:r>
+    </w:p>
+    <w:p>
+      <w:pPr>
+        <w:spacing w:after="0" w:line="240" w:lineRule="auto"/>
+        <w:rPr>
+          <w:rFonts w:ascii="Times New Roman" w:eastAsia="Times New Roman" w:hAnsi="Times New Roman" w:cs="Times New Roman"/>
+          <w:sz w:val="24"/>
+          <w:szCs w:val="24"/>
+        </w:rPr>
+      </w:pPr>
+      <w:proofErr w:type="gramStart"/>
+      <w:r>
+        <w:rPr>
+          <w:rFonts w:ascii="Times New Roman" w:eastAsia="Times New Roman" w:hAnsi="Times New Roman" w:cs="Times New Roman"/>
+          <w:b/>
+          <w:bCs/>
+          <w:sz w:val="24"/>
+          <w:szCs w:val="24"/>
+        </w:rPr>
+        <w:t>4.Evaluate</w:t>
+      </w:r>
+      <w:proofErr w:type="gramEnd"/>
+      <w:r>
+        <w:rPr>
+          <w:rFonts w:ascii="Times New Roman" w:eastAsia="Times New Roman" w:hAnsi="Times New Roman" w:cs="Times New Roman"/>
+          <w:b/>
+          <w:bCs/>
+          <w:sz w:val="24"/>
+          <w:szCs w:val="24"/>
+        </w:rPr>
+        <w:t xml:space="preserve"> A5 &amp; A6:</w:t>
+      </w:r>
+      <w:r>
+        <w:rPr>
+          <w:rFonts w:ascii="Times New Roman" w:eastAsia="Times New Roman" w:hAnsi="Times New Roman" w:cs="Times New Roman"/>
+          <w:sz w:val="24"/>
+          <w:szCs w:val="24"/>
+        </w:rPr>
+        <w:t>Next available: 7:00.</w:t>
+      </w:r>
+    </w:p>
+    <w:p>
+      <w:pPr>
+        <w:numPr>
+          <w:ilvl w:val="0"/>
+          <w:numId w:val="9"/>
+        </w:numPr>
+        <w:spacing w:before="100" w:beforeAutospacing="1" w:after="100" w:afterAutospacing="1" w:line="240" w:lineRule="auto"/>
+        <w:rPr>
+          <w:rFonts w:ascii="Times New Roman" w:eastAsia="Times New Roman" w:hAnsi="Times New Roman" w:cs="Times New Roman"/>
+          <w:sz w:val="24"/>
+          <w:szCs w:val="24"/>
+        </w:rPr>
+      </w:pPr>
+      <w:r>
+        <w:rPr>
+          <w:rFonts w:ascii="Times New Roman" w:eastAsia="Times New Roman" w:hAnsi="Times New Roman" w:cs="Times New Roman"/>
+          <w:b/>
+          <w:bCs/>
+          <w:sz w:val="24"/>
+          <w:szCs w:val="24"/>
+        </w:rPr>
+        <w:t>A5</w:t>
+      </w:r>
+      <w:r>
+        <w:rPr>
+          <w:rFonts w:ascii="Times New Roman" w:eastAsia="Times New Roman" w:hAnsi="Times New Roman" w:cs="Times New Roman"/>
+          <w:sz w:val="24"/>
+          <w:szCs w:val="24"/>
+        </w:rPr>
+        <w:t xml:space="preserve"> (3:00 to 9:00): Starts at 3:00. Conflicts with our timeline. </w:t>
+      </w:r>
+      <w:r>
+        <w:rPr>
+          <w:rFonts w:ascii="Times New Roman" w:eastAsia="Times New Roman" w:hAnsi="Times New Roman" w:cs="Times New Roman"/>
+          <w:b/>
+          <w:bCs/>
+          <w:sz w:val="24"/>
+          <w:szCs w:val="24"/>
+        </w:rPr>
+        <w:t>Skip it.</w:t>
+      </w:r>
+    </w:p>
+    <w:p>
+      <w:pPr>
+        <w:numPr>
+          <w:ilvl w:val="0"/>
+          <w:numId w:val="9"/>
+        </w:numPr>
+        <w:spacing w:before="100" w:beforeAutospacing="1" w:after="100" w:afterAutospacing="1" w:line="240" w:lineRule="auto"/>
+        <w:rPr>
+          <w:rFonts w:ascii="Times New Roman" w:eastAsia="Times New Roman" w:hAnsi="Times New Roman" w:cs="Times New Roman"/>
+          <w:sz w:val="24"/>
+          <w:szCs w:val="24"/>
+        </w:rPr>
+      </w:pPr>
+      <w:r>
+        <w:rPr>
+          <w:rFonts w:ascii="Times New Roman" w:eastAsia="Times New Roman" w:hAnsi="Times New Roman" w:cs="Times New Roman"/>
+          <w:b/>
+          <w:bCs/>
+          <w:sz w:val="24"/>
+          <w:szCs w:val="24"/>
+        </w:rPr>
+        <w:t>A6</w:t>
+      </w:r>
+      <w:r>
+        <w:rPr>
+          <w:rFonts w:ascii="Times New Roman" w:eastAsia="Times New Roman" w:hAnsi="Times New Roman" w:cs="Times New Roman"/>
+          <w:sz w:val="24"/>
+          <w:szCs w:val="24"/>
+        </w:rPr>
+        <w:t xml:space="preserve"> (5:00 to 9:00): Starts at 5:00. Conflicts with A4 (runs until 7:00). </w:t>
+      </w:r>
+      <w:r>
+        <w:rPr>
+          <w:rFonts w:ascii="Times New Roman" w:eastAsia="Times New Roman" w:hAnsi="Times New Roman" w:cs="Times New Roman"/>
+          <w:b/>
+          <w:bCs/>
+          <w:sz w:val="24"/>
+          <w:szCs w:val="24"/>
+        </w:rPr>
+        <w:t>Skip it.</w:t>
+      </w:r>
+    </w:p>
+    <w:p>
+      <w:pPr>
+        <w:spacing w:before="100" w:beforeAutospacing="1" w:after="100" w:afterAutospacing="1" w:line="240" w:lineRule="auto"/>
+        <w:rPr>
+          <w:rFonts w:ascii="Times New Roman" w:eastAsia="Times New Roman" w:hAnsi="Times New Roman" w:cs="Times New Roman"/>
+          <w:sz w:val="24"/>
+          <w:szCs w:val="24"/>
+        </w:rPr>
+      </w:pPr>
+      <w:r>
+        <w:rPr>
+          <w:rFonts w:ascii="Times New Roman" w:eastAsia="Times New Roman" w:hAnsi="Times New Roman" w:cs="Times New Roman"/>
+          <w:b/>
+          <w:bCs/>
+          <w:sz w:val="24"/>
+          <w:szCs w:val="24"/>
+        </w:rPr>
+        <w:t>Final Selection:</w:t>
+      </w:r>
+      <w:r>
+        <w:rPr>
+          <w:rFonts w:ascii="Times New Roman" w:eastAsia="Times New Roman" w:hAnsi="Times New Roman" w:cs="Times New Roman"/>
+          <w:sz w:val="24"/>
+          <w:szCs w:val="24"/>
+        </w:rPr>
+        <w:t xml:space="preserve"> </w:t>
+      </w:r>
+      <w:r>
+        <w:rPr>
+          <w:rFonts w:ascii="Times New Roman" w:eastAsia="Times New Roman" w:hAnsi="Times New Roman" w:cs="Times New Roman"/>
+          <w:b/>
+          <w:bCs/>
+          <w:sz w:val="24"/>
+          <w:szCs w:val="24"/>
+        </w:rPr>
+        <w:t>{A1, A4}</w:t>
+      </w:r>
+      <w:r>
+        <w:rPr>
+          <w:rFonts w:ascii="Times New Roman" w:eastAsia="Times New Roman" w:hAnsi="Times New Roman" w:cs="Times New Roman"/>
+          <w:sz w:val="24"/>
+          <w:szCs w:val="24"/>
+        </w:rPr>
+        <w:t>. You successfully hosted 2 maximum non-overlapping activities.</w:t>
+      </w:r>
+    </w:p>
+    <w:p>
+      <w:pPr>
+        <w:spacing w:before="100" w:beforeAutospacing="1" w:after="100" w:afterAutospacing="1" w:line="240" w:lineRule="auto"/>
+        <w:outlineLvl w:val="1"/>
+        <w:rPr>
+          <w:rFonts w:ascii="Times New Roman" w:eastAsia="Times New Roman" w:hAnsi="Times New Roman" w:cs="Times New Roman"/>
+          <w:b/>
+          <w:bCs/>
+          <w:sz w:val="36"/>
+          <w:szCs w:val="36"/>
+        </w:rPr>
+      </w:pPr>
+      <w:r>
+        <w:rPr>
+          <w:rFonts w:ascii="Times New Roman" w:eastAsia="Times New Roman" w:hAnsi="Times New Roman" w:cs="Times New Roman"/>
+          <w:b/>
+          <w:bCs/>
+          <w:sz w:val="36"/>
+          <w:szCs w:val="36"/>
+        </w:rPr>
+        <w:t>Code Implementation (Python)</w:t>
+      </w:r>
+    </w:p>
+    <w:p>
+      <w:pPr>
+        <w:spacing w:before="100" w:beforeAutospacing="1" w:after="100" w:afterAutospacing="1" w:line="240" w:lineRule="auto"/>
+        <w:rPr>
+          <w:rFonts w:ascii="Times New Roman" w:eastAsia="Times New Roman" w:hAnsi="Times New Roman" w:cs="Times New Roman"/>
+          <w:sz w:val="24"/>
+          <w:szCs w:val="24"/>
+        </w:rPr>
+      </w:pPr>
+      <w:r>
+        <w:rPr>
+          <w:rFonts w:ascii="Times New Roman" w:eastAsia="Times New Roman" w:hAnsi="Times New Roman" w:cs="Times New Roman"/>
+          <w:sz w:val="24"/>
+          <w:szCs w:val="24"/>
+        </w:rPr>
+        <w:lastRenderedPageBreak/>
+        <w:t xml:space="preserve">If the activities are already sorted by their finish times, the algorithm runs in </w:t>
+      </w:r>
+      <w:r>
+        <w:rPr>
+          <w:rFonts w:ascii="Times New Roman" w:eastAsia="Times New Roman" w:hAnsi="Times New Roman" w:cs="Times New Roman"/>
+          <w:b/>
+          <w:bCs/>
+          <w:sz w:val="24"/>
+          <w:szCs w:val="24"/>
+        </w:rPr>
+        <w:t>$</w:t>
+      </w:r>
+      <w:proofErr w:type="gramStart"/>
+      <w:r>
+        <w:rPr>
+          <w:rFonts w:ascii="Times New Roman" w:eastAsia="Times New Roman" w:hAnsi="Times New Roman" w:cs="Times New Roman"/>
+          <w:b/>
+          <w:bCs/>
+          <w:sz w:val="24"/>
+          <w:szCs w:val="24"/>
+        </w:rPr>
+        <w:t>O(</w:t>
+      </w:r>
+      <w:proofErr w:type="gramEnd"/>
+      <w:r>
+        <w:rPr>
+          <w:rFonts w:ascii="Times New Roman" w:eastAsia="Times New Roman" w:hAnsi="Times New Roman" w:cs="Times New Roman"/>
+          <w:b/>
+          <w:bCs/>
+          <w:sz w:val="24"/>
+          <w:szCs w:val="24"/>
+        </w:rPr>
+        <w:t>n)$ time</w:t>
+      </w:r>
+      <w:r>
+        <w:rPr>
+          <w:rFonts w:ascii="Times New Roman" w:eastAsia="Times New Roman" w:hAnsi="Times New Roman" w:cs="Times New Roman"/>
+          <w:sz w:val="24"/>
+          <w:szCs w:val="24"/>
+        </w:rPr>
+        <w:t xml:space="preserve"> because it only needs to look at each activity exactly once. If they aren't sorted, sorting them takes </w:t>
+      </w:r>
+      <w:r>
+        <w:rPr>
+          <w:rFonts w:ascii="Times New Roman" w:eastAsia="Times New Roman" w:hAnsi="Times New Roman" w:cs="Times New Roman"/>
+          <w:b/>
+          <w:bCs/>
+          <w:sz w:val="24"/>
+          <w:szCs w:val="24"/>
+        </w:rPr>
+        <w:t>$</w:t>
+      </w:r>
+      <w:proofErr w:type="gramStart"/>
+      <w:r>
+        <w:rPr>
+          <w:rFonts w:ascii="Times New Roman" w:eastAsia="Times New Roman" w:hAnsi="Times New Roman" w:cs="Times New Roman"/>
+          <w:b/>
+          <w:bCs/>
+          <w:sz w:val="24"/>
+          <w:szCs w:val="24"/>
+        </w:rPr>
+        <w:t>O(</w:t>
+      </w:r>
+      <w:proofErr w:type="gramEnd"/>
+      <w:r>
+        <w:rPr>
+          <w:rFonts w:ascii="Times New Roman" w:eastAsia="Times New Roman" w:hAnsi="Times New Roman" w:cs="Times New Roman"/>
+          <w:b/>
+          <w:bCs/>
+          <w:sz w:val="24"/>
+          <w:szCs w:val="24"/>
+        </w:rPr>
+        <w:t>n \log n)$ time</w:t>
+      </w:r>
+      <w:r>
+        <w:rPr>
+          <w:rFonts w:ascii="Times New Roman" w:eastAsia="Times New Roman" w:hAnsi="Times New Roman" w:cs="Times New Roman"/>
+          <w:sz w:val="24"/>
+          <w:szCs w:val="24"/>
+        </w:rPr>
+        <w:t>, making the overall time complexity $O(n \log n)$.</w:t>
+      </w:r>
+    </w:p>
+    <w:p>
+      <w:pPr>
+        <w:pStyle w:val="NoSpacing"/>
+        <w:rPr>
+          <w:rFonts w:eastAsia="Times New Roman"/>
+        </w:rPr>
+      </w:pPr>
+    </w:p>
+    <w:p>
+      <w:pPr>
+        <w:jc w:val="center"/>
+        <w:rPr>
+          <w:b/>
+          <w:sz w:val="36"/>
+          <w:szCs w:val="36"/>
+        </w:rPr>
+      </w:pPr>
     </w:p>
     <w:p>
       <w:pPr>
@@ -1362,6 +3599,751 @@
     </w:lvl>
   </w:abstractNum>
   <w:abstractNum w:abstractNumId="3">
+    <w:nsid w:val="19EA5019"/>
+    <w:multiLevelType w:val="multilevel"/>
+    <w:tmpl w:val="4EC44D20"/>
+    <w:lvl w:ilvl="0">
+      <w:start w:val="1"/>
+      <w:numFmt w:val="bullet"/>
+      <w:lvlText w:val=""/>
+      <w:lvlJc w:val="left"/>
+      <w:pPr>
+        <w:tabs>
+          <w:tab w:val="num" w:pos="720"/>
+        </w:tabs>
+        <w:ind w:left="720" w:hanging="360"/>
+      </w:pPr>
+      <w:rPr>
+        <w:rFonts w:ascii="Symbol" w:hAnsi="Symbol" w:hint="default"/>
+        <w:sz w:val="20"/>
+      </w:rPr>
+    </w:lvl>
+    <w:lvl w:ilvl="1" w:tentative="1">
+      <w:start w:val="1"/>
+      <w:numFmt w:val="bullet"/>
+      <w:lvlText w:val="o"/>
+      <w:lvlJc w:val="left"/>
+      <w:pPr>
+        <w:tabs>
+          <w:tab w:val="num" w:pos="1440"/>
+        </w:tabs>
+        <w:ind w:left="1440" w:hanging="360"/>
+      </w:pPr>
+      <w:rPr>
+        <w:rFonts w:ascii="Courier New" w:hAnsi="Courier New" w:hint="default"/>
+        <w:sz w:val="20"/>
+      </w:rPr>
+    </w:lvl>
+    <w:lvl w:ilvl="2" w:tentative="1">
+      <w:start w:val="1"/>
+      <w:numFmt w:val="bullet"/>
+      <w:lvlText w:val=""/>
+      <w:lvlJc w:val="left"/>
+      <w:pPr>
+        <w:tabs>
+          <w:tab w:val="num" w:pos="2160"/>
+        </w:tabs>
+        <w:ind w:left="2160" w:hanging="360"/>
+      </w:pPr>
+      <w:rPr>
+        <w:rFonts w:ascii="Wingdings" w:hAnsi="Wingdings" w:hint="default"/>
+        <w:sz w:val="20"/>
+      </w:rPr>
+    </w:lvl>
+    <w:lvl w:ilvl="3" w:tentative="1">
+      <w:start w:val="1"/>
+      <w:numFmt w:val="bullet"/>
+      <w:lvlText w:val=""/>
+      <w:lvlJc w:val="left"/>
+      <w:pPr>
+        <w:tabs>
+          <w:tab w:val="num" w:pos="2880"/>
+        </w:tabs>
+        <w:ind w:left="2880" w:hanging="360"/>
+      </w:pPr>
+      <w:rPr>
+        <w:rFonts w:ascii="Wingdings" w:hAnsi="Wingdings" w:hint="default"/>
+        <w:sz w:val="20"/>
+      </w:rPr>
+    </w:lvl>
+    <w:lvl w:ilvl="4" w:tentative="1">
+      <w:start w:val="1"/>
+      <w:numFmt w:val="bullet"/>
+      <w:lvlText w:val=""/>
+      <w:lvlJc w:val="left"/>
+      <w:pPr>
+        <w:tabs>
+          <w:tab w:val="num" w:pos="3600"/>
+        </w:tabs>
+        <w:ind w:left="3600" w:hanging="360"/>
+      </w:pPr>
+      <w:rPr>
+        <w:rFonts w:ascii="Wingdings" w:hAnsi="Wingdings" w:hint="default"/>
+        <w:sz w:val="20"/>
+      </w:rPr>
+    </w:lvl>
+    <w:lvl w:ilvl="5" w:tentative="1">
+      <w:start w:val="1"/>
+      <w:numFmt w:val="bullet"/>
+      <w:lvlText w:val=""/>
+      <w:lvlJc w:val="left"/>
+      <w:pPr>
+        <w:tabs>
+          <w:tab w:val="num" w:pos="4320"/>
+        </w:tabs>
+        <w:ind w:left="4320" w:hanging="360"/>
+      </w:pPr>
+      <w:rPr>
+        <w:rFonts w:ascii="Wingdings" w:hAnsi="Wingdings" w:hint="default"/>
+        <w:sz w:val="20"/>
+      </w:rPr>
+    </w:lvl>
+    <w:lvl w:ilvl="6" w:tentative="1">
+      <w:start w:val="1"/>
+      <w:numFmt w:val="bullet"/>
+      <w:lvlText w:val=""/>
+      <w:lvlJc w:val="left"/>
+      <w:pPr>
+        <w:tabs>
+          <w:tab w:val="num" w:pos="5040"/>
+        </w:tabs>
+        <w:ind w:left="5040" w:hanging="360"/>
+      </w:pPr>
+      <w:rPr>
+        <w:rFonts w:ascii="Wingdings" w:hAnsi="Wingdings" w:hint="default"/>
+        <w:sz w:val="20"/>
+      </w:rPr>
+    </w:lvl>
+    <w:lvl w:ilvl="7" w:tentative="1">
+      <w:start w:val="1"/>
+      <w:numFmt w:val="bullet"/>
+      <w:lvlText w:val=""/>
+      <w:lvlJc w:val="left"/>
+      <w:pPr>
+        <w:tabs>
+          <w:tab w:val="num" w:pos="5760"/>
+        </w:tabs>
+        <w:ind w:left="5760" w:hanging="360"/>
+      </w:pPr>
+      <w:rPr>
+        <w:rFonts w:ascii="Wingdings" w:hAnsi="Wingdings" w:hint="default"/>
+        <w:sz w:val="20"/>
+      </w:rPr>
+    </w:lvl>
+    <w:lvl w:ilvl="8" w:tentative="1">
+      <w:start w:val="1"/>
+      <w:numFmt w:val="bullet"/>
+      <w:lvlText w:val=""/>
+      <w:lvlJc w:val="left"/>
+      <w:pPr>
+        <w:tabs>
+          <w:tab w:val="num" w:pos="6480"/>
+        </w:tabs>
+        <w:ind w:left="6480" w:hanging="360"/>
+      </w:pPr>
+      <w:rPr>
+        <w:rFonts w:ascii="Wingdings" w:hAnsi="Wingdings" w:hint="default"/>
+        <w:sz w:val="20"/>
+      </w:rPr>
+    </w:lvl>
+  </w:abstractNum>
+  <w:abstractNum w:abstractNumId="4">
+    <w:nsid w:val="211026E1"/>
+    <w:multiLevelType w:val="multilevel"/>
+    <w:tmpl w:val="7CBE213C"/>
+    <w:lvl w:ilvl="0">
+      <w:start w:val="1"/>
+      <w:numFmt w:val="bullet"/>
+      <w:lvlText w:val=""/>
+      <w:lvlJc w:val="left"/>
+      <w:pPr>
+        <w:tabs>
+          <w:tab w:val="num" w:pos="720"/>
+        </w:tabs>
+        <w:ind w:left="720" w:hanging="360"/>
+      </w:pPr>
+      <w:rPr>
+        <w:rFonts w:ascii="Symbol" w:hAnsi="Symbol" w:hint="default"/>
+        <w:sz w:val="20"/>
+      </w:rPr>
+    </w:lvl>
+    <w:lvl w:ilvl="1" w:tentative="1">
+      <w:start w:val="1"/>
+      <w:numFmt w:val="bullet"/>
+      <w:lvlText w:val="o"/>
+      <w:lvlJc w:val="left"/>
+      <w:pPr>
+        <w:tabs>
+          <w:tab w:val="num" w:pos="1440"/>
+        </w:tabs>
+        <w:ind w:left="1440" w:hanging="360"/>
+      </w:pPr>
+      <w:rPr>
+        <w:rFonts w:ascii="Courier New" w:hAnsi="Courier New" w:hint="default"/>
+        <w:sz w:val="20"/>
+      </w:rPr>
+    </w:lvl>
+    <w:lvl w:ilvl="2" w:tentative="1">
+      <w:start w:val="1"/>
+      <w:numFmt w:val="bullet"/>
+      <w:lvlText w:val=""/>
+      <w:lvlJc w:val="left"/>
+      <w:pPr>
+        <w:tabs>
+          <w:tab w:val="num" w:pos="2160"/>
+        </w:tabs>
+        <w:ind w:left="2160" w:hanging="360"/>
+      </w:pPr>
+      <w:rPr>
+        <w:rFonts w:ascii="Wingdings" w:hAnsi="Wingdings" w:hint="default"/>
+        <w:sz w:val="20"/>
+      </w:rPr>
+    </w:lvl>
+    <w:lvl w:ilvl="3" w:tentative="1">
+      <w:start w:val="1"/>
+      <w:numFmt w:val="bullet"/>
+      <w:lvlText w:val=""/>
+      <w:lvlJc w:val="left"/>
+      <w:pPr>
+        <w:tabs>
+          <w:tab w:val="num" w:pos="2880"/>
+        </w:tabs>
+        <w:ind w:left="2880" w:hanging="360"/>
+      </w:pPr>
+      <w:rPr>
+        <w:rFonts w:ascii="Wingdings" w:hAnsi="Wingdings" w:hint="default"/>
+        <w:sz w:val="20"/>
+      </w:rPr>
+    </w:lvl>
+    <w:lvl w:ilvl="4" w:tentative="1">
+      <w:start w:val="1"/>
+      <w:numFmt w:val="bullet"/>
+      <w:lvlText w:val=""/>
+      <w:lvlJc w:val="left"/>
+      <w:pPr>
+        <w:tabs>
+          <w:tab w:val="num" w:pos="3600"/>
+        </w:tabs>
+        <w:ind w:left="3600" w:hanging="360"/>
+      </w:pPr>
+      <w:rPr>
+        <w:rFonts w:ascii="Wingdings" w:hAnsi="Wingdings" w:hint="default"/>
+        <w:sz w:val="20"/>
+      </w:rPr>
+    </w:lvl>
+    <w:lvl w:ilvl="5" w:tentative="1">
+      <w:start w:val="1"/>
+      <w:numFmt w:val="bullet"/>
+      <w:lvlText w:val=""/>
+      <w:lvlJc w:val="left"/>
+      <w:pPr>
+        <w:tabs>
+          <w:tab w:val="num" w:pos="4320"/>
+        </w:tabs>
+        <w:ind w:left="4320" w:hanging="360"/>
+      </w:pPr>
+      <w:rPr>
+        <w:rFonts w:ascii="Wingdings" w:hAnsi="Wingdings" w:hint="default"/>
+        <w:sz w:val="20"/>
+      </w:rPr>
+    </w:lvl>
+    <w:lvl w:ilvl="6" w:tentative="1">
+      <w:start w:val="1"/>
+      <w:numFmt w:val="bullet"/>
+      <w:lvlText w:val=""/>
+      <w:lvlJc w:val="left"/>
+      <w:pPr>
+        <w:tabs>
+          <w:tab w:val="num" w:pos="5040"/>
+        </w:tabs>
+        <w:ind w:left="5040" w:hanging="360"/>
+      </w:pPr>
+      <w:rPr>
+        <w:rFonts w:ascii="Wingdings" w:hAnsi="Wingdings" w:hint="default"/>
+        <w:sz w:val="20"/>
+      </w:rPr>
+    </w:lvl>
+    <w:lvl w:ilvl="7" w:tentative="1">
+      <w:start w:val="1"/>
+      <w:numFmt w:val="bullet"/>
+      <w:lvlText w:val=""/>
+      <w:lvlJc w:val="left"/>
+      <w:pPr>
+        <w:tabs>
+          <w:tab w:val="num" w:pos="5760"/>
+        </w:tabs>
+        <w:ind w:left="5760" w:hanging="360"/>
+      </w:pPr>
+      <w:rPr>
+        <w:rFonts w:ascii="Wingdings" w:hAnsi="Wingdings" w:hint="default"/>
+        <w:sz w:val="20"/>
+      </w:rPr>
+    </w:lvl>
+    <w:lvl w:ilvl="8" w:tentative="1">
+      <w:start w:val="1"/>
+      <w:numFmt w:val="bullet"/>
+      <w:lvlText w:val=""/>
+      <w:lvlJc w:val="left"/>
+      <w:pPr>
+        <w:tabs>
+          <w:tab w:val="num" w:pos="6480"/>
+        </w:tabs>
+        <w:ind w:left="6480" w:hanging="360"/>
+      </w:pPr>
+      <w:rPr>
+        <w:rFonts w:ascii="Wingdings" w:hAnsi="Wingdings" w:hint="default"/>
+        <w:sz w:val="20"/>
+      </w:rPr>
+    </w:lvl>
+  </w:abstractNum>
+  <w:abstractNum w:abstractNumId="5">
+    <w:nsid w:val="35B81BD5"/>
+    <w:multiLevelType w:val="multilevel"/>
+    <w:tmpl w:val="F55EB3C8"/>
+    <w:lvl w:ilvl="0">
+      <w:start w:val="1"/>
+      <w:numFmt w:val="bullet"/>
+      <w:lvlText w:val=""/>
+      <w:lvlJc w:val="left"/>
+      <w:pPr>
+        <w:tabs>
+          <w:tab w:val="num" w:pos="720"/>
+        </w:tabs>
+        <w:ind w:left="720" w:hanging="360"/>
+      </w:pPr>
+      <w:rPr>
+        <w:rFonts w:ascii="Symbol" w:hAnsi="Symbol" w:hint="default"/>
+        <w:sz w:val="20"/>
+      </w:rPr>
+    </w:lvl>
+    <w:lvl w:ilvl="1" w:tentative="1">
+      <w:start w:val="1"/>
+      <w:numFmt w:val="bullet"/>
+      <w:lvlText w:val="o"/>
+      <w:lvlJc w:val="left"/>
+      <w:pPr>
+        <w:tabs>
+          <w:tab w:val="num" w:pos="1440"/>
+        </w:tabs>
+        <w:ind w:left="1440" w:hanging="360"/>
+      </w:pPr>
+      <w:rPr>
+        <w:rFonts w:ascii="Courier New" w:hAnsi="Courier New" w:hint="default"/>
+        <w:sz w:val="20"/>
+      </w:rPr>
+    </w:lvl>
+    <w:lvl w:ilvl="2" w:tentative="1">
+      <w:start w:val="1"/>
+      <w:numFmt w:val="bullet"/>
+      <w:lvlText w:val=""/>
+      <w:lvlJc w:val="left"/>
+      <w:pPr>
+        <w:tabs>
+          <w:tab w:val="num" w:pos="2160"/>
+        </w:tabs>
+        <w:ind w:left="2160" w:hanging="360"/>
+      </w:pPr>
+      <w:rPr>
+        <w:rFonts w:ascii="Wingdings" w:hAnsi="Wingdings" w:hint="default"/>
+        <w:sz w:val="20"/>
+      </w:rPr>
+    </w:lvl>
+    <w:lvl w:ilvl="3" w:tentative="1">
+      <w:start w:val="1"/>
+      <w:numFmt w:val="bullet"/>
+      <w:lvlText w:val=""/>
+      <w:lvlJc w:val="left"/>
+      <w:pPr>
+        <w:tabs>
+          <w:tab w:val="num" w:pos="2880"/>
+        </w:tabs>
+        <w:ind w:left="2880" w:hanging="360"/>
+      </w:pPr>
+      <w:rPr>
+        <w:rFonts w:ascii="Wingdings" w:hAnsi="Wingdings" w:hint="default"/>
+        <w:sz w:val="20"/>
+      </w:rPr>
+    </w:lvl>
+    <w:lvl w:ilvl="4" w:tentative="1">
+      <w:start w:val="1"/>
+      <w:numFmt w:val="bullet"/>
+      <w:lvlText w:val=""/>
+      <w:lvlJc w:val="left"/>
+      <w:pPr>
+        <w:tabs>
+          <w:tab w:val="num" w:pos="3600"/>
+        </w:tabs>
+        <w:ind w:left="3600" w:hanging="360"/>
+      </w:pPr>
+      <w:rPr>
+        <w:rFonts w:ascii="Wingdings" w:hAnsi="Wingdings" w:hint="default"/>
+        <w:sz w:val="20"/>
+      </w:rPr>
+    </w:lvl>
+    <w:lvl w:ilvl="5" w:tentative="1">
+      <w:start w:val="1"/>
+      <w:numFmt w:val="bullet"/>
+      <w:lvlText w:val=""/>
+      <w:lvlJc w:val="left"/>
+      <w:pPr>
+        <w:tabs>
+          <w:tab w:val="num" w:pos="4320"/>
+        </w:tabs>
+        <w:ind w:left="4320" w:hanging="360"/>
+      </w:pPr>
+      <w:rPr>
+        <w:rFonts w:ascii="Wingdings" w:hAnsi="Wingdings" w:hint="default"/>
+        <w:sz w:val="20"/>
+      </w:rPr>
+    </w:lvl>
+    <w:lvl w:ilvl="6" w:tentative="1">
+      <w:start w:val="1"/>
+      <w:numFmt w:val="bullet"/>
+      <w:lvlText w:val=""/>
+      <w:lvlJc w:val="left"/>
+      <w:pPr>
+        <w:tabs>
+          <w:tab w:val="num" w:pos="5040"/>
+        </w:tabs>
+        <w:ind w:left="5040" w:hanging="360"/>
+      </w:pPr>
+      <w:rPr>
+        <w:rFonts w:ascii="Wingdings" w:hAnsi="Wingdings" w:hint="default"/>
+        <w:sz w:val="20"/>
+      </w:rPr>
+    </w:lvl>
+    <w:lvl w:ilvl="7" w:tentative="1">
+      <w:start w:val="1"/>
+      <w:numFmt w:val="bullet"/>
+      <w:lvlText w:val=""/>
+      <w:lvlJc w:val="left"/>
+      <w:pPr>
+        <w:tabs>
+          <w:tab w:val="num" w:pos="5760"/>
+        </w:tabs>
+        <w:ind w:left="5760" w:hanging="360"/>
+      </w:pPr>
+      <w:rPr>
+        <w:rFonts w:ascii="Wingdings" w:hAnsi="Wingdings" w:hint="default"/>
+        <w:sz w:val="20"/>
+      </w:rPr>
+    </w:lvl>
+    <w:lvl w:ilvl="8" w:tentative="1">
+      <w:start w:val="1"/>
+      <w:numFmt w:val="bullet"/>
+      <w:lvlText w:val=""/>
+      <w:lvlJc w:val="left"/>
+      <w:pPr>
+        <w:tabs>
+          <w:tab w:val="num" w:pos="6480"/>
+        </w:tabs>
+        <w:ind w:left="6480" w:hanging="360"/>
+      </w:pPr>
+      <w:rPr>
+        <w:rFonts w:ascii="Wingdings" w:hAnsi="Wingdings" w:hint="default"/>
+        <w:sz w:val="20"/>
+      </w:rPr>
+    </w:lvl>
+  </w:abstractNum>
+  <w:abstractNum w:abstractNumId="6">
+    <w:nsid w:val="3FB53A17"/>
+    <w:multiLevelType w:val="multilevel"/>
+    <w:tmpl w:val="6412A3A2"/>
+    <w:lvl w:ilvl="0">
+      <w:start w:val="1"/>
+      <w:numFmt w:val="bullet"/>
+      <w:lvlText w:val=""/>
+      <w:lvlJc w:val="left"/>
+      <w:pPr>
+        <w:tabs>
+          <w:tab w:val="num" w:pos="720"/>
+        </w:tabs>
+        <w:ind w:left="720" w:hanging="360"/>
+      </w:pPr>
+      <w:rPr>
+        <w:rFonts w:ascii="Symbol" w:hAnsi="Symbol" w:hint="default"/>
+        <w:sz w:val="20"/>
+      </w:rPr>
+    </w:lvl>
+    <w:lvl w:ilvl="1" w:tentative="1">
+      <w:start w:val="1"/>
+      <w:numFmt w:val="bullet"/>
+      <w:lvlText w:val="o"/>
+      <w:lvlJc w:val="left"/>
+      <w:pPr>
+        <w:tabs>
+          <w:tab w:val="num" w:pos="1440"/>
+        </w:tabs>
+        <w:ind w:left="1440" w:hanging="360"/>
+      </w:pPr>
+      <w:rPr>
+        <w:rFonts w:ascii="Courier New" w:hAnsi="Courier New" w:hint="default"/>
+        <w:sz w:val="20"/>
+      </w:rPr>
+    </w:lvl>
+    <w:lvl w:ilvl="2" w:tentative="1">
+      <w:start w:val="1"/>
+      <w:numFmt w:val="bullet"/>
+      <w:lvlText w:val=""/>
+      <w:lvlJc w:val="left"/>
+      <w:pPr>
+        <w:tabs>
+          <w:tab w:val="num" w:pos="2160"/>
+        </w:tabs>
+        <w:ind w:left="2160" w:hanging="360"/>
+      </w:pPr>
+      <w:rPr>
+        <w:rFonts w:ascii="Wingdings" w:hAnsi="Wingdings" w:hint="default"/>
+        <w:sz w:val="20"/>
+      </w:rPr>
+    </w:lvl>
+    <w:lvl w:ilvl="3" w:tentative="1">
+      <w:start w:val="1"/>
+      <w:numFmt w:val="bullet"/>
+      <w:lvlText w:val=""/>
+      <w:lvlJc w:val="left"/>
+      <w:pPr>
+        <w:tabs>
+          <w:tab w:val="num" w:pos="2880"/>
+        </w:tabs>
+        <w:ind w:left="2880" w:hanging="360"/>
+      </w:pPr>
+      <w:rPr>
+        <w:rFonts w:ascii="Wingdings" w:hAnsi="Wingdings" w:hint="default"/>
+        <w:sz w:val="20"/>
+      </w:rPr>
+    </w:lvl>
+    <w:lvl w:ilvl="4" w:tentative="1">
+      <w:start w:val="1"/>
+      <w:numFmt w:val="bullet"/>
+      <w:lvlText w:val=""/>
+      <w:lvlJc w:val="left"/>
+      <w:pPr>
+        <w:tabs>
+          <w:tab w:val="num" w:pos="3600"/>
+        </w:tabs>
+        <w:ind w:left="3600" w:hanging="360"/>
+      </w:pPr>
+      <w:rPr>
+        <w:rFonts w:ascii="Wingdings" w:hAnsi="Wingdings" w:hint="default"/>
+        <w:sz w:val="20"/>
+      </w:rPr>
+    </w:lvl>
+    <w:lvl w:ilvl="5" w:tentative="1">
+      <w:start w:val="1"/>
+      <w:numFmt w:val="bullet"/>
+      <w:lvlText w:val=""/>
+      <w:lvlJc w:val="left"/>
+      <w:pPr>
+        <w:tabs>
+          <w:tab w:val="num" w:pos="4320"/>
+        </w:tabs>
+        <w:ind w:left="4320" w:hanging="360"/>
+      </w:pPr>
+      <w:rPr>
+        <w:rFonts w:ascii="Wingdings" w:hAnsi="Wingdings" w:hint="default"/>
+        <w:sz w:val="20"/>
+      </w:rPr>
+    </w:lvl>
+    <w:lvl w:ilvl="6" w:tentative="1">
+      <w:start w:val="1"/>
+      <w:numFmt w:val="bullet"/>
+      <w:lvlText w:val=""/>
+      <w:lvlJc w:val="left"/>
+      <w:pPr>
+        <w:tabs>
+          <w:tab w:val="num" w:pos="5040"/>
+        </w:tabs>
+        <w:ind w:left="5040" w:hanging="360"/>
+      </w:pPr>
+      <w:rPr>
+        <w:rFonts w:ascii="Wingdings" w:hAnsi="Wingdings" w:hint="default"/>
+        <w:sz w:val="20"/>
+      </w:rPr>
+    </w:lvl>
+    <w:lvl w:ilvl="7" w:tentative="1">
+      <w:start w:val="1"/>
+      <w:numFmt w:val="bullet"/>
+      <w:lvlText w:val=""/>
+      <w:lvlJc w:val="left"/>
+      <w:pPr>
+        <w:tabs>
+          <w:tab w:val="num" w:pos="5760"/>
+        </w:tabs>
+        <w:ind w:left="5760" w:hanging="360"/>
+      </w:pPr>
+      <w:rPr>
+        <w:rFonts w:ascii="Wingdings" w:hAnsi="Wingdings" w:hint="default"/>
+        <w:sz w:val="20"/>
+      </w:rPr>
+    </w:lvl>
+    <w:lvl w:ilvl="8" w:tentative="1">
+      <w:start w:val="1"/>
+      <w:numFmt w:val="bullet"/>
+      <w:lvlText w:val=""/>
+      <w:lvlJc w:val="left"/>
+      <w:pPr>
+        <w:tabs>
+          <w:tab w:val="num" w:pos="6480"/>
+        </w:tabs>
+        <w:ind w:left="6480" w:hanging="360"/>
+      </w:pPr>
+      <w:rPr>
+        <w:rFonts w:ascii="Wingdings" w:hAnsi="Wingdings" w:hint="default"/>
+        <w:sz w:val="20"/>
+      </w:rPr>
+    </w:lvl>
+  </w:abstractNum>
+  <w:abstractNum w:abstractNumId="7">
+    <w:nsid w:val="5039734A"/>
+    <w:multiLevelType w:val="multilevel"/>
+    <w:tmpl w:val="66DC909E"/>
+    <w:lvl w:ilvl="0">
+      <w:start w:val="1"/>
+      <w:numFmt w:val="bullet"/>
+      <w:lvlText w:val=""/>
+      <w:lvlJc w:val="left"/>
+      <w:pPr>
+        <w:tabs>
+          <w:tab w:val="num" w:pos="720"/>
+        </w:tabs>
+        <w:ind w:left="720" w:hanging="360"/>
+      </w:pPr>
+      <w:rPr>
+        <w:rFonts w:ascii="Symbol" w:hAnsi="Symbol" w:hint="default"/>
+        <w:sz w:val="20"/>
+      </w:rPr>
+    </w:lvl>
+    <w:lvl w:ilvl="1" w:tentative="1">
+      <w:start w:val="1"/>
+      <w:numFmt w:val="bullet"/>
+      <w:lvlText w:val="o"/>
+      <w:lvlJc w:val="left"/>
+      <w:pPr>
+        <w:tabs>
+          <w:tab w:val="num" w:pos="1440"/>
+        </w:tabs>
+        <w:ind w:left="1440" w:hanging="360"/>
+      </w:pPr>
+      <w:rPr>
+        <w:rFonts w:ascii="Courier New" w:hAnsi="Courier New" w:hint="default"/>
+        <w:sz w:val="20"/>
+      </w:rPr>
+    </w:lvl>
+    <w:lvl w:ilvl="2" w:tentative="1">
+      <w:start w:val="1"/>
+      <w:numFmt w:val="bullet"/>
+      <w:lvlText w:val=""/>
+      <w:lvlJc w:val="left"/>
+      <w:pPr>
+        <w:tabs>
+          <w:tab w:val="num" w:pos="2160"/>
+        </w:tabs>
+        <w:ind w:left="2160" w:hanging="360"/>
+      </w:pPr>
+      <w:rPr>
+        <w:rFonts w:ascii="Wingdings" w:hAnsi="Wingdings" w:hint="default"/>
+        <w:sz w:val="20"/>
+      </w:rPr>
+    </w:lvl>
+    <w:lvl w:ilvl="3" w:tentative="1">
+      <w:start w:val="1"/>
+      <w:numFmt w:val="bullet"/>
+      <w:lvlText w:val=""/>
+      <w:lvlJc w:val="left"/>
+      <w:pPr>
+        <w:tabs>
+          <w:tab w:val="num" w:pos="2880"/>
+        </w:tabs>
+        <w:ind w:left="2880" w:hanging="360"/>
+      </w:pPr>
+      <w:rPr>
+        <w:rFonts w:ascii="Wingdings" w:hAnsi="Wingdings" w:hint="default"/>
+        <w:sz w:val="20"/>
+      </w:rPr>
+    </w:lvl>
+    <w:lvl w:ilvl="4" w:tentative="1">
+      <w:start w:val="1"/>
+      <w:numFmt w:val="bullet"/>
+      <w:lvlText w:val=""/>
+      <w:lvlJc w:val="left"/>
+      <w:pPr>
+        <w:tabs>
+          <w:tab w:val="num" w:pos="3600"/>
+        </w:tabs>
+        <w:ind w:left="3600" w:hanging="360"/>
+      </w:pPr>
+      <w:rPr>
+        <w:rFonts w:ascii="Wingdings" w:hAnsi="Wingdings" w:hint="default"/>
+        <w:sz w:val="20"/>
+      </w:rPr>
+    </w:lvl>
+    <w:lvl w:ilvl="5" w:tentative="1">
+      <w:start w:val="1"/>
+      <w:numFmt w:val="bullet"/>
+      <w:lvlText w:val=""/>
+      <w:lvlJc w:val="left"/>
+      <w:pPr>
+        <w:tabs>
+          <w:tab w:val="num" w:pos="4320"/>
+        </w:tabs>
+        <w:ind w:left="4320" w:hanging="360"/>
+      </w:pPr>
+      <w:rPr>
+        <w:rFonts w:ascii="Wingdings" w:hAnsi="Wingdings" w:hint="default"/>
+        <w:sz w:val="20"/>
+      </w:rPr>
+    </w:lvl>
+    <w:lvl w:ilvl="6" w:tentative="1">
+      <w:start w:val="1"/>
+      <w:numFmt w:val="bullet"/>
+      <w:lvlText w:val=""/>
+      <w:lvlJc w:val="left"/>
+      <w:pPr>
+        <w:tabs>
+          <w:tab w:val="num" w:pos="5040"/>
+        </w:tabs>
+        <w:ind w:left="5040" w:hanging="360"/>
+      </w:pPr>
+      <w:rPr>
+        <w:rFonts w:ascii="Wingdings" w:hAnsi="Wingdings" w:hint="default"/>
+        <w:sz w:val="20"/>
+      </w:rPr>
+    </w:lvl>
+    <w:lvl w:ilvl="7" w:tentative="1">
+      <w:start w:val="1"/>
+      <w:numFmt w:val="bullet"/>
+      <w:lvlText w:val=""/>
+      <w:lvlJc w:val="left"/>
+      <w:pPr>
+        <w:tabs>
+          <w:tab w:val="num" w:pos="5760"/>
+        </w:tabs>
+        <w:ind w:left="5760" w:hanging="360"/>
+      </w:pPr>
+      <w:rPr>
+        <w:rFonts w:ascii="Wingdings" w:hAnsi="Wingdings" w:hint="default"/>
+        <w:sz w:val="20"/>
+      </w:rPr>
+    </w:lvl>
+    <w:lvl w:ilvl="8" w:tentative="1">
+      <w:start w:val="1"/>
+      <w:numFmt w:val="bullet"/>
+      <w:lvlText w:val=""/>
+      <w:lvlJc w:val="left"/>
+      <w:pPr>
+        <w:tabs>
+          <w:tab w:val="num" w:pos="6480"/>
+        </w:tabs>
+        <w:ind w:left="6480" w:hanging="360"/>
+      </w:pPr>
+      <w:rPr>
+        <w:rFonts w:ascii="Wingdings" w:hAnsi="Wingdings" w:hint="default"/>
+        <w:sz w:val="20"/>
+      </w:rPr>
+    </w:lvl>
+  </w:abstractNum>
+  <w:abstractNum w:abstractNumId="8">
     <w:nsid w:val="6C6F248E"/>
     <w:multiLevelType w:val="multilevel"/>
     <w:tmpl w:val="29201F7A"/>
@@ -1520,7 +4502,22 @@
     <w:abstractNumId w:val="0"/>
   </w:num>
   <w:num w:numId="4">
+    <w:abstractNumId w:val="8"/>
+  </w:num>
+  <w:num w:numId="5">
     <w:abstractNumId w:val="3"/>
+  </w:num>
+  <w:num w:numId="6">
+    <w:abstractNumId w:val="4"/>
+  </w:num>
+  <w:num w:numId="7">
+    <w:abstractNumId w:val="6"/>
+  </w:num>
+  <w:num w:numId="8">
+    <w:abstractNumId w:val="5"/>
+  </w:num>
+  <w:num w:numId="9">
+    <w:abstractNumId w:val="7"/>
   </w:num>
 </w:numbering>
 </file>
@@ -1684,6 +4681,7 @@
   <w:style w:type="paragraph" w:default="1" w:styleId="Normal">
     <w:name w:val="Normal"/>
     <w:qFormat/>
+    <w:rsid w:val="005936AE"/>
   </w:style>
   <w:style w:type="paragraph" w:styleId="Heading2">
     <w:name w:val="heading 2"/>
@@ -1818,6 +4816,38 @@
       <w:sz w:val="20"/>
       <w:szCs w:val="20"/>
     </w:rPr>
+  </w:style>
+  <w:style w:type="paragraph" w:styleId="NoSpacing">
+    <w:name w:val="No Spacing"/>
+    <w:uiPriority w:val="1"/>
+    <w:qFormat/>
+    <w:rsid w:val="00807487"/>
+    <w:pPr>
+      <w:spacing w:after="0" w:line="240" w:lineRule="auto"/>
+    </w:pPr>
+  </w:style>
+  <w:style w:type="character" w:customStyle="1" w:styleId="only-show-to-message-actions">
+    <w:name w:val="only-show-to-message-actions"/>
+    <w:basedOn w:val="DefaultParagraphFont"/>
+    <w:rsid w:val="008F5F3B"/>
+  </w:style>
+  <w:style w:type="paragraph" w:customStyle="1" w:styleId="ng-star-inserted">
+    <w:name w:val="ng-star-inserted"/>
+    <w:basedOn w:val="Normal"/>
+    <w:rsid w:val="008F5F3B"/>
+    <w:pPr>
+      <w:spacing w:before="100" w:beforeAutospacing="1" w:after="100" w:afterAutospacing="1" w:line="240" w:lineRule="auto"/>
+    </w:pPr>
+    <w:rPr>
+      <w:rFonts w:ascii="Times New Roman" w:eastAsia="Times New Roman" w:hAnsi="Times New Roman" w:cs="Times New Roman"/>
+      <w:sz w:val="24"/>
+      <w:szCs w:val="24"/>
+    </w:rPr>
+  </w:style>
+  <w:style w:type="character" w:customStyle="1" w:styleId="math-inline">
+    <w:name w:val="math-inline"/>
+    <w:basedOn w:val="DefaultParagraphFont"/>
+    <w:rsid w:val="008F5F3B"/>
   </w:style>
 </w:styles>
 </file>

</xml_diff>

<commit_message>
Adding Huffman Coding Algo
</commit_message>
<xml_diff>
--- a/Greedy Algorithms/Greedy.docx
+++ b/Greedy Algorithms/Greedy.docx
@@ -3175,6 +3175,2743 @@
         </w:rPr>
       </w:pPr>
     </w:p>
+    <w:p>
+      <w:pPr>
+        <w:jc w:val="center"/>
+        <w:rPr>
+          <w:b/>
+          <w:sz w:val="36"/>
+          <w:szCs w:val="36"/>
+        </w:rPr>
+      </w:pPr>
+      <w:r>
+        <w:rPr>
+          <w:b/>
+          <w:sz w:val="36"/>
+          <w:szCs w:val="36"/>
+        </w:rPr>
+        <w:t>Huffman Coding</w:t>
+      </w:r>
+    </w:p>
+    <w:p>
+      <w:pPr>
+        <w:pStyle w:val="NormalWeb"/>
+      </w:pPr>
+      <w:r>
+        <w:rPr>
+          <w:b/>
+          <w:bCs/>
+        </w:rPr>
+        <w:t>Huffman Coding</w:t>
+      </w:r>
+      <w:r>
+        <w:t xml:space="preserve"> is a brilliant, widely used greedy algorithm designed for </w:t>
+      </w:r>
+      <w:r>
+        <w:rPr>
+          <w:b/>
+          <w:bCs/>
+        </w:rPr>
+        <w:t>lossless data compression</w:t>
+      </w:r>
+      <w:r>
+        <w:t>. It reduces the file size of text, images, or audio without losing a single bit of the original data.</w:t>
+      </w:r>
+    </w:p>
+    <w:p>
+      <w:pPr>
+        <w:pStyle w:val="NormalWeb"/>
+      </w:pPr>
+      <w:r>
+        <w:t xml:space="preserve">It forms the backbone of technologies you use every day, including </w:t>
+      </w:r>
+      <w:r>
+        <w:rPr>
+          <w:b/>
+          <w:bCs/>
+        </w:rPr>
+        <w:t>JPEG images, MP3 audio files, and ZIP files</w:t>
+      </w:r>
+      <w:r>
+        <w:t>.</w:t>
+      </w:r>
+    </w:p>
+    <w:p>
+      <w:pPr>
+        <w:spacing w:before="100" w:beforeAutospacing="1" w:after="100" w:afterAutospacing="1" w:line="240" w:lineRule="auto"/>
+        <w:outlineLvl w:val="2"/>
+        <w:rPr>
+          <w:rFonts w:ascii="Times New Roman" w:eastAsia="Times New Roman" w:hAnsi="Times New Roman" w:cs="Times New Roman"/>
+          <w:b/>
+          <w:bCs/>
+          <w:sz w:val="27"/>
+          <w:szCs w:val="27"/>
+        </w:rPr>
+      </w:pPr>
+      <w:r>
+        <w:rPr>
+          <w:rFonts w:ascii="Times New Roman" w:eastAsia="Times New Roman" w:hAnsi="Times New Roman" w:cs="Times New Roman"/>
+          <w:b/>
+          <w:bCs/>
+          <w:sz w:val="27"/>
+          <w:szCs w:val="27"/>
+        </w:rPr>
+        <w:t>Step-by-Step Example</w:t>
+      </w:r>
+    </w:p>
+    <w:p>
+      <w:pPr>
+        <w:spacing w:before="100" w:beforeAutospacing="1" w:after="100" w:afterAutospacing="1" w:line="240" w:lineRule="auto"/>
+        <w:rPr>
+          <w:rFonts w:ascii="Times New Roman" w:eastAsia="Times New Roman" w:hAnsi="Times New Roman" w:cs="Times New Roman"/>
+          <w:sz w:val="24"/>
+          <w:szCs w:val="24"/>
+        </w:rPr>
+      </w:pPr>
+      <w:r>
+        <w:rPr>
+          <w:rFonts w:ascii="Times New Roman" w:eastAsia="Times New Roman" w:hAnsi="Times New Roman" w:cs="Times New Roman"/>
+          <w:sz w:val="24"/>
+          <w:szCs w:val="24"/>
+        </w:rPr>
+        <w:t>Let's compress a short string where the character frequencies are:</w:t>
+      </w:r>
+    </w:p>
+    <w:p>
+      <w:pPr>
+        <w:numPr>
+          <w:ilvl w:val="0"/>
+          <w:numId w:val="10"/>
+        </w:numPr>
+        <w:spacing w:before="100" w:beforeAutospacing="1" w:after="100" w:afterAutospacing="1" w:line="240" w:lineRule="auto"/>
+        <w:rPr>
+          <w:rFonts w:ascii="Times New Roman" w:eastAsia="Times New Roman" w:hAnsi="Times New Roman" w:cs="Times New Roman"/>
+          <w:sz w:val="24"/>
+          <w:szCs w:val="24"/>
+        </w:rPr>
+      </w:pPr>
+      <w:r>
+        <w:rPr>
+          <w:rFonts w:ascii="Times New Roman" w:eastAsia="Times New Roman" w:hAnsi="Times New Roman" w:cs="Times New Roman"/>
+          <w:b/>
+          <w:bCs/>
+          <w:sz w:val="24"/>
+          <w:szCs w:val="24"/>
+        </w:rPr>
+        <w:t>A:</w:t>
+      </w:r>
+      <w:r>
+        <w:rPr>
+          <w:rFonts w:ascii="Times New Roman" w:eastAsia="Times New Roman" w:hAnsi="Times New Roman" w:cs="Times New Roman"/>
+          <w:sz w:val="24"/>
+          <w:szCs w:val="24"/>
+        </w:rPr>
+        <w:t xml:space="preserve"> 5</w:t>
+      </w:r>
+    </w:p>
+    <w:p>
+      <w:pPr>
+        <w:numPr>
+          <w:ilvl w:val="0"/>
+          <w:numId w:val="10"/>
+        </w:numPr>
+        <w:spacing w:before="100" w:beforeAutospacing="1" w:after="100" w:afterAutospacing="1" w:line="240" w:lineRule="auto"/>
+        <w:rPr>
+          <w:rFonts w:ascii="Times New Roman" w:eastAsia="Times New Roman" w:hAnsi="Times New Roman" w:cs="Times New Roman"/>
+          <w:sz w:val="24"/>
+          <w:szCs w:val="24"/>
+        </w:rPr>
+      </w:pPr>
+      <w:r>
+        <w:rPr>
+          <w:rFonts w:ascii="Times New Roman" w:eastAsia="Times New Roman" w:hAnsi="Times New Roman" w:cs="Times New Roman"/>
+          <w:b/>
+          <w:bCs/>
+          <w:sz w:val="24"/>
+          <w:szCs w:val="24"/>
+        </w:rPr>
+        <w:t>B:</w:t>
+      </w:r>
+      <w:r>
+        <w:rPr>
+          <w:rFonts w:ascii="Times New Roman" w:eastAsia="Times New Roman" w:hAnsi="Times New Roman" w:cs="Times New Roman"/>
+          <w:sz w:val="24"/>
+          <w:szCs w:val="24"/>
+        </w:rPr>
+        <w:t xml:space="preserve"> 9</w:t>
+      </w:r>
+    </w:p>
+    <w:p>
+      <w:pPr>
+        <w:numPr>
+          <w:ilvl w:val="0"/>
+          <w:numId w:val="10"/>
+        </w:numPr>
+        <w:spacing w:before="100" w:beforeAutospacing="1" w:after="100" w:afterAutospacing="1" w:line="240" w:lineRule="auto"/>
+        <w:rPr>
+          <w:rFonts w:ascii="Times New Roman" w:eastAsia="Times New Roman" w:hAnsi="Times New Roman" w:cs="Times New Roman"/>
+          <w:sz w:val="24"/>
+          <w:szCs w:val="24"/>
+        </w:rPr>
+      </w:pPr>
+      <w:r>
+        <w:rPr>
+          <w:rFonts w:ascii="Times New Roman" w:eastAsia="Times New Roman" w:hAnsi="Times New Roman" w:cs="Times New Roman"/>
+          <w:b/>
+          <w:bCs/>
+          <w:sz w:val="24"/>
+          <w:szCs w:val="24"/>
+        </w:rPr>
+        <w:t>C:</w:t>
+      </w:r>
+      <w:r>
+        <w:rPr>
+          <w:rFonts w:ascii="Times New Roman" w:eastAsia="Times New Roman" w:hAnsi="Times New Roman" w:cs="Times New Roman"/>
+          <w:sz w:val="24"/>
+          <w:szCs w:val="24"/>
+        </w:rPr>
+        <w:t xml:space="preserve"> 12</w:t>
+      </w:r>
+    </w:p>
+    <w:p>
+      <w:pPr>
+        <w:numPr>
+          <w:ilvl w:val="0"/>
+          <w:numId w:val="10"/>
+        </w:numPr>
+        <w:spacing w:before="100" w:beforeAutospacing="1" w:after="100" w:afterAutospacing="1" w:line="240" w:lineRule="auto"/>
+        <w:rPr>
+          <w:rFonts w:ascii="Times New Roman" w:eastAsia="Times New Roman" w:hAnsi="Times New Roman" w:cs="Times New Roman"/>
+          <w:sz w:val="24"/>
+          <w:szCs w:val="24"/>
+        </w:rPr>
+      </w:pPr>
+      <w:r>
+        <w:rPr>
+          <w:rFonts w:ascii="Times New Roman" w:eastAsia="Times New Roman" w:hAnsi="Times New Roman" w:cs="Times New Roman"/>
+          <w:b/>
+          <w:bCs/>
+          <w:sz w:val="24"/>
+          <w:szCs w:val="24"/>
+        </w:rPr>
+        <w:t>D:</w:t>
+      </w:r>
+      <w:r>
+        <w:rPr>
+          <w:rFonts w:ascii="Times New Roman" w:eastAsia="Times New Roman" w:hAnsi="Times New Roman" w:cs="Times New Roman"/>
+          <w:sz w:val="24"/>
+          <w:szCs w:val="24"/>
+        </w:rPr>
+        <w:t xml:space="preserve"> 13</w:t>
+      </w:r>
+    </w:p>
+    <w:p>
+      <w:pPr>
+        <w:numPr>
+          <w:ilvl w:val="0"/>
+          <w:numId w:val="10"/>
+        </w:numPr>
+        <w:spacing w:before="100" w:beforeAutospacing="1" w:after="100" w:afterAutospacing="1" w:line="240" w:lineRule="auto"/>
+        <w:rPr>
+          <w:rFonts w:ascii="Times New Roman" w:eastAsia="Times New Roman" w:hAnsi="Times New Roman" w:cs="Times New Roman"/>
+          <w:sz w:val="24"/>
+          <w:szCs w:val="24"/>
+        </w:rPr>
+      </w:pPr>
+      <w:r>
+        <w:rPr>
+          <w:rFonts w:ascii="Times New Roman" w:eastAsia="Times New Roman" w:hAnsi="Times New Roman" w:cs="Times New Roman"/>
+          <w:b/>
+          <w:bCs/>
+          <w:sz w:val="24"/>
+          <w:szCs w:val="24"/>
+        </w:rPr>
+        <w:t>E:</w:t>
+      </w:r>
+      <w:r>
+        <w:rPr>
+          <w:rFonts w:ascii="Times New Roman" w:eastAsia="Times New Roman" w:hAnsi="Times New Roman" w:cs="Times New Roman"/>
+          <w:sz w:val="24"/>
+          <w:szCs w:val="24"/>
+        </w:rPr>
+        <w:t xml:space="preserve"> 16</w:t>
+      </w:r>
+    </w:p>
+    <w:p>
+      <w:pPr>
+        <w:numPr>
+          <w:ilvl w:val="0"/>
+          <w:numId w:val="10"/>
+        </w:numPr>
+        <w:spacing w:before="100" w:beforeAutospacing="1" w:after="100" w:afterAutospacing="1" w:line="240" w:lineRule="auto"/>
+        <w:rPr>
+          <w:rFonts w:ascii="Times New Roman" w:eastAsia="Times New Roman" w:hAnsi="Times New Roman" w:cs="Times New Roman"/>
+          <w:sz w:val="24"/>
+          <w:szCs w:val="24"/>
+        </w:rPr>
+      </w:pPr>
+      <w:r>
+        <w:rPr>
+          <w:rFonts w:ascii="Times New Roman" w:eastAsia="Times New Roman" w:hAnsi="Times New Roman" w:cs="Times New Roman"/>
+          <w:b/>
+          <w:bCs/>
+          <w:sz w:val="24"/>
+          <w:szCs w:val="24"/>
+        </w:rPr>
+        <w:t>F:</w:t>
+      </w:r>
+      <w:r>
+        <w:rPr>
+          <w:rFonts w:ascii="Times New Roman" w:eastAsia="Times New Roman" w:hAnsi="Times New Roman" w:cs="Times New Roman"/>
+          <w:sz w:val="24"/>
+          <w:szCs w:val="24"/>
+        </w:rPr>
+        <w:t xml:space="preserve"> 45</w:t>
+      </w:r>
+    </w:p>
+    <w:p>
+      <w:pPr>
+        <w:spacing w:after="0" w:line="240" w:lineRule="auto"/>
+        <w:rPr>
+          <w:rFonts w:ascii="Times New Roman" w:eastAsia="Times New Roman" w:hAnsi="Times New Roman" w:cs="Times New Roman"/>
+          <w:sz w:val="24"/>
+          <w:szCs w:val="24"/>
+        </w:rPr>
+      </w:pPr>
+      <w:proofErr w:type="gramStart"/>
+      <w:r>
+        <w:rPr>
+          <w:rFonts w:ascii="Times New Roman" w:eastAsia="Times New Roman" w:hAnsi="Times New Roman" w:cs="Times New Roman"/>
+          <w:b/>
+          <w:bCs/>
+          <w:sz w:val="24"/>
+          <w:szCs w:val="24"/>
+        </w:rPr>
+        <w:t>1.Step</w:t>
+      </w:r>
+      <w:proofErr w:type="gramEnd"/>
+      <w:r>
+        <w:rPr>
+          <w:rFonts w:ascii="Times New Roman" w:eastAsia="Times New Roman" w:hAnsi="Times New Roman" w:cs="Times New Roman"/>
+          <w:b/>
+          <w:bCs/>
+          <w:sz w:val="24"/>
+          <w:szCs w:val="24"/>
+        </w:rPr>
+        <w:t xml:space="preserve"> 1: Combine the two </w:t>
+      </w:r>
+      <w:proofErr w:type="spellStart"/>
+      <w:r>
+        <w:rPr>
+          <w:rFonts w:ascii="Times New Roman" w:eastAsia="Times New Roman" w:hAnsi="Times New Roman" w:cs="Times New Roman"/>
+          <w:b/>
+          <w:bCs/>
+          <w:sz w:val="24"/>
+          <w:szCs w:val="24"/>
+        </w:rPr>
+        <w:t>lowest:</w:t>
+      </w:r>
+      <w:r>
+        <w:rPr>
+          <w:rFonts w:ascii="Times New Roman" w:eastAsia="Times New Roman" w:hAnsi="Times New Roman" w:cs="Times New Roman"/>
+          <w:sz w:val="24"/>
+          <w:szCs w:val="24"/>
+        </w:rPr>
+        <w:t>Queue</w:t>
+      </w:r>
+      <w:proofErr w:type="spellEnd"/>
+      <w:r>
+        <w:rPr>
+          <w:rFonts w:ascii="Times New Roman" w:eastAsia="Times New Roman" w:hAnsi="Times New Roman" w:cs="Times New Roman"/>
+          <w:sz w:val="24"/>
+          <w:szCs w:val="24"/>
+        </w:rPr>
+        <w:t>: A(5), B(9), C(12), D(13), E(16), F(45).</w:t>
+      </w:r>
+    </w:p>
+    <w:p>
+      <w:pPr>
+        <w:spacing w:before="100" w:beforeAutospacing="1" w:after="100" w:afterAutospacing="1" w:line="240" w:lineRule="auto"/>
+        <w:rPr>
+          <w:rFonts w:ascii="Times New Roman" w:eastAsia="Times New Roman" w:hAnsi="Times New Roman" w:cs="Times New Roman"/>
+          <w:sz w:val="24"/>
+          <w:szCs w:val="24"/>
+        </w:rPr>
+      </w:pPr>
+      <w:r>
+        <w:rPr>
+          <w:rFonts w:ascii="Times New Roman" w:eastAsia="Times New Roman" w:hAnsi="Times New Roman" w:cs="Times New Roman"/>
+          <w:sz w:val="24"/>
+          <w:szCs w:val="24"/>
+        </w:rPr>
+        <w:t xml:space="preserve">The lowest frequencies are </w:t>
+      </w:r>
+      <w:proofErr w:type="gramStart"/>
+      <w:r>
+        <w:rPr>
+          <w:rFonts w:ascii="Times New Roman" w:eastAsia="Times New Roman" w:hAnsi="Times New Roman" w:cs="Times New Roman"/>
+          <w:b/>
+          <w:bCs/>
+          <w:sz w:val="24"/>
+          <w:szCs w:val="24"/>
+        </w:rPr>
+        <w:t>A</w:t>
+      </w:r>
+      <w:proofErr w:type="gramEnd"/>
+      <w:r>
+        <w:rPr>
+          <w:rFonts w:ascii="Times New Roman" w:eastAsia="Times New Roman" w:hAnsi="Times New Roman" w:cs="Times New Roman"/>
+          <w:b/>
+          <w:bCs/>
+          <w:sz w:val="24"/>
+          <w:szCs w:val="24"/>
+        </w:rPr>
+        <w:t xml:space="preserve"> (5)</w:t>
+      </w:r>
+      <w:r>
+        <w:rPr>
+          <w:rFonts w:ascii="Times New Roman" w:eastAsia="Times New Roman" w:hAnsi="Times New Roman" w:cs="Times New Roman"/>
+          <w:sz w:val="24"/>
+          <w:szCs w:val="24"/>
+        </w:rPr>
+        <w:t xml:space="preserve"> and </w:t>
+      </w:r>
+      <w:r>
+        <w:rPr>
+          <w:rFonts w:ascii="Times New Roman" w:eastAsia="Times New Roman" w:hAnsi="Times New Roman" w:cs="Times New Roman"/>
+          <w:b/>
+          <w:bCs/>
+          <w:sz w:val="24"/>
+          <w:szCs w:val="24"/>
+        </w:rPr>
+        <w:t>B (9)</w:t>
+      </w:r>
+      <w:r>
+        <w:rPr>
+          <w:rFonts w:ascii="Times New Roman" w:eastAsia="Times New Roman" w:hAnsi="Times New Roman" w:cs="Times New Roman"/>
+          <w:sz w:val="24"/>
+          <w:szCs w:val="24"/>
+        </w:rPr>
+        <w:t>.</w:t>
+      </w:r>
+    </w:p>
+    <w:p>
+      <w:pPr>
+        <w:numPr>
+          <w:ilvl w:val="0"/>
+          <w:numId w:val="11"/>
+        </w:numPr>
+        <w:spacing w:before="100" w:beforeAutospacing="1" w:after="100" w:afterAutospacing="1" w:line="240" w:lineRule="auto"/>
+        <w:rPr>
+          <w:rFonts w:ascii="Times New Roman" w:eastAsia="Times New Roman" w:hAnsi="Times New Roman" w:cs="Times New Roman"/>
+          <w:sz w:val="24"/>
+          <w:szCs w:val="24"/>
+        </w:rPr>
+      </w:pPr>
+      <w:r>
+        <w:rPr>
+          <w:rFonts w:ascii="Times New Roman" w:eastAsia="Times New Roman" w:hAnsi="Times New Roman" w:cs="Times New Roman"/>
+          <w:i/>
+          <w:iCs/>
+          <w:sz w:val="24"/>
+          <w:szCs w:val="24"/>
+        </w:rPr>
+        <w:t>Action:</w:t>
+      </w:r>
+      <w:r>
+        <w:rPr>
+          <w:rFonts w:ascii="Times New Roman" w:eastAsia="Times New Roman" w:hAnsi="Times New Roman" w:cs="Times New Roman"/>
+          <w:sz w:val="24"/>
+          <w:szCs w:val="24"/>
+        </w:rPr>
+        <w:t xml:space="preserve"> Merge them into a new internal node </w:t>
+      </w:r>
+      <w:r>
+        <w:rPr>
+          <w:rFonts w:ascii="Times New Roman" w:eastAsia="Times New Roman" w:hAnsi="Times New Roman" w:cs="Times New Roman"/>
+          <w:b/>
+          <w:bCs/>
+          <w:sz w:val="24"/>
+          <w:szCs w:val="24"/>
+        </w:rPr>
+        <w:t>(A+B)</w:t>
+      </w:r>
+      <w:r>
+        <w:rPr>
+          <w:rFonts w:ascii="Times New Roman" w:eastAsia="Times New Roman" w:hAnsi="Times New Roman" w:cs="Times New Roman"/>
+          <w:sz w:val="24"/>
+          <w:szCs w:val="24"/>
+        </w:rPr>
+        <w:t xml:space="preserve"> with a combined weight of $5 + 9 = \</w:t>
+      </w:r>
+      <w:proofErr w:type="spellStart"/>
+      <w:r>
+        <w:rPr>
+          <w:rFonts w:ascii="Times New Roman" w:eastAsia="Times New Roman" w:hAnsi="Times New Roman" w:cs="Times New Roman"/>
+          <w:sz w:val="24"/>
+          <w:szCs w:val="24"/>
+        </w:rPr>
+        <w:t>mathbf</w:t>
+      </w:r>
+      <w:proofErr w:type="spellEnd"/>
+      <w:r>
+        <w:rPr>
+          <w:rFonts w:ascii="Times New Roman" w:eastAsia="Times New Roman" w:hAnsi="Times New Roman" w:cs="Times New Roman"/>
+          <w:sz w:val="24"/>
+          <w:szCs w:val="24"/>
+        </w:rPr>
+        <w:t>{14}$.</w:t>
+      </w:r>
+    </w:p>
+    <w:p>
+      <w:pPr>
+        <w:spacing w:after="0" w:line="240" w:lineRule="auto"/>
+        <w:rPr>
+          <w:rFonts w:ascii="Times New Roman" w:eastAsia="Times New Roman" w:hAnsi="Times New Roman" w:cs="Times New Roman"/>
+          <w:sz w:val="24"/>
+          <w:szCs w:val="24"/>
+        </w:rPr>
+      </w:pPr>
+      <w:proofErr w:type="gramStart"/>
+      <w:r>
+        <w:rPr>
+          <w:rFonts w:ascii="Times New Roman" w:eastAsia="Times New Roman" w:hAnsi="Times New Roman" w:cs="Times New Roman"/>
+          <w:b/>
+          <w:bCs/>
+          <w:sz w:val="24"/>
+          <w:szCs w:val="24"/>
+        </w:rPr>
+        <w:t>2.Step</w:t>
+      </w:r>
+      <w:proofErr w:type="gramEnd"/>
+      <w:r>
+        <w:rPr>
+          <w:rFonts w:ascii="Times New Roman" w:eastAsia="Times New Roman" w:hAnsi="Times New Roman" w:cs="Times New Roman"/>
+          <w:b/>
+          <w:bCs/>
+          <w:sz w:val="24"/>
+          <w:szCs w:val="24"/>
+        </w:rPr>
+        <w:t xml:space="preserve"> 2: Combine the next two </w:t>
+      </w:r>
+      <w:proofErr w:type="spellStart"/>
+      <w:r>
+        <w:rPr>
+          <w:rFonts w:ascii="Times New Roman" w:eastAsia="Times New Roman" w:hAnsi="Times New Roman" w:cs="Times New Roman"/>
+          <w:b/>
+          <w:bCs/>
+          <w:sz w:val="24"/>
+          <w:szCs w:val="24"/>
+        </w:rPr>
+        <w:t>lowest:</w:t>
+      </w:r>
+      <w:r>
+        <w:rPr>
+          <w:rFonts w:ascii="Times New Roman" w:eastAsia="Times New Roman" w:hAnsi="Times New Roman" w:cs="Times New Roman"/>
+          <w:sz w:val="24"/>
+          <w:szCs w:val="24"/>
+        </w:rPr>
+        <w:t>Queue</w:t>
+      </w:r>
+      <w:proofErr w:type="spellEnd"/>
+      <w:r>
+        <w:rPr>
+          <w:rFonts w:ascii="Times New Roman" w:eastAsia="Times New Roman" w:hAnsi="Times New Roman" w:cs="Times New Roman"/>
+          <w:sz w:val="24"/>
+          <w:szCs w:val="24"/>
+        </w:rPr>
+        <w:t>: C(12), D(13), (A+B)(14), E(16), F(45).</w:t>
+      </w:r>
+    </w:p>
+    <w:p>
+      <w:pPr>
+        <w:spacing w:before="100" w:beforeAutospacing="1" w:after="100" w:afterAutospacing="1" w:line="240" w:lineRule="auto"/>
+        <w:rPr>
+          <w:rFonts w:ascii="Times New Roman" w:eastAsia="Times New Roman" w:hAnsi="Times New Roman" w:cs="Times New Roman"/>
+          <w:sz w:val="24"/>
+          <w:szCs w:val="24"/>
+        </w:rPr>
+      </w:pPr>
+      <w:r>
+        <w:rPr>
+          <w:rFonts w:ascii="Times New Roman" w:eastAsia="Times New Roman" w:hAnsi="Times New Roman" w:cs="Times New Roman"/>
+          <w:sz w:val="24"/>
+          <w:szCs w:val="24"/>
+        </w:rPr>
+        <w:t xml:space="preserve">The lowest frequencies now are </w:t>
+      </w:r>
+      <w:r>
+        <w:rPr>
+          <w:rFonts w:ascii="Times New Roman" w:eastAsia="Times New Roman" w:hAnsi="Times New Roman" w:cs="Times New Roman"/>
+          <w:b/>
+          <w:bCs/>
+          <w:sz w:val="24"/>
+          <w:szCs w:val="24"/>
+        </w:rPr>
+        <w:t>C (12)</w:t>
+      </w:r>
+      <w:r>
+        <w:rPr>
+          <w:rFonts w:ascii="Times New Roman" w:eastAsia="Times New Roman" w:hAnsi="Times New Roman" w:cs="Times New Roman"/>
+          <w:sz w:val="24"/>
+          <w:szCs w:val="24"/>
+        </w:rPr>
+        <w:t xml:space="preserve"> and </w:t>
+      </w:r>
+      <w:r>
+        <w:rPr>
+          <w:rFonts w:ascii="Times New Roman" w:eastAsia="Times New Roman" w:hAnsi="Times New Roman" w:cs="Times New Roman"/>
+          <w:b/>
+          <w:bCs/>
+          <w:sz w:val="24"/>
+          <w:szCs w:val="24"/>
+        </w:rPr>
+        <w:t>D (13)</w:t>
+      </w:r>
+      <w:r>
+        <w:rPr>
+          <w:rFonts w:ascii="Times New Roman" w:eastAsia="Times New Roman" w:hAnsi="Times New Roman" w:cs="Times New Roman"/>
+          <w:sz w:val="24"/>
+          <w:szCs w:val="24"/>
+        </w:rPr>
+        <w:t>.</w:t>
+      </w:r>
+    </w:p>
+    <w:p>
+      <w:pPr>
+        <w:numPr>
+          <w:ilvl w:val="0"/>
+          <w:numId w:val="12"/>
+        </w:numPr>
+        <w:spacing w:before="100" w:beforeAutospacing="1" w:after="100" w:afterAutospacing="1" w:line="240" w:lineRule="auto"/>
+        <w:rPr>
+          <w:rFonts w:ascii="Times New Roman" w:eastAsia="Times New Roman" w:hAnsi="Times New Roman" w:cs="Times New Roman"/>
+          <w:sz w:val="24"/>
+          <w:szCs w:val="24"/>
+        </w:rPr>
+      </w:pPr>
+      <w:r>
+        <w:rPr>
+          <w:rFonts w:ascii="Times New Roman" w:eastAsia="Times New Roman" w:hAnsi="Times New Roman" w:cs="Times New Roman"/>
+          <w:i/>
+          <w:iCs/>
+          <w:sz w:val="24"/>
+          <w:szCs w:val="24"/>
+        </w:rPr>
+        <w:t>Action:</w:t>
+      </w:r>
+      <w:r>
+        <w:rPr>
+          <w:rFonts w:ascii="Times New Roman" w:eastAsia="Times New Roman" w:hAnsi="Times New Roman" w:cs="Times New Roman"/>
+          <w:sz w:val="24"/>
+          <w:szCs w:val="24"/>
+        </w:rPr>
+        <w:t xml:space="preserve"> Merge them into an internal node </w:t>
+      </w:r>
+      <w:r>
+        <w:rPr>
+          <w:rFonts w:ascii="Times New Roman" w:eastAsia="Times New Roman" w:hAnsi="Times New Roman" w:cs="Times New Roman"/>
+          <w:b/>
+          <w:bCs/>
+          <w:sz w:val="24"/>
+          <w:szCs w:val="24"/>
+        </w:rPr>
+        <w:t>(C+D)</w:t>
+      </w:r>
+      <w:r>
+        <w:rPr>
+          <w:rFonts w:ascii="Times New Roman" w:eastAsia="Times New Roman" w:hAnsi="Times New Roman" w:cs="Times New Roman"/>
+          <w:sz w:val="24"/>
+          <w:szCs w:val="24"/>
+        </w:rPr>
+        <w:t xml:space="preserve"> with a weight of $12 + 13 = \</w:t>
+      </w:r>
+      <w:proofErr w:type="spellStart"/>
+      <w:r>
+        <w:rPr>
+          <w:rFonts w:ascii="Times New Roman" w:eastAsia="Times New Roman" w:hAnsi="Times New Roman" w:cs="Times New Roman"/>
+          <w:sz w:val="24"/>
+          <w:szCs w:val="24"/>
+        </w:rPr>
+        <w:t>mathbf</w:t>
+      </w:r>
+      <w:proofErr w:type="spellEnd"/>
+      <w:r>
+        <w:rPr>
+          <w:rFonts w:ascii="Times New Roman" w:eastAsia="Times New Roman" w:hAnsi="Times New Roman" w:cs="Times New Roman"/>
+          <w:sz w:val="24"/>
+          <w:szCs w:val="24"/>
+        </w:rPr>
+        <w:t>{25}$.</w:t>
+      </w:r>
+    </w:p>
+    <w:p>
+      <w:pPr>
+        <w:spacing w:after="0" w:line="240" w:lineRule="auto"/>
+        <w:rPr>
+          <w:rFonts w:ascii="Times New Roman" w:eastAsia="Times New Roman" w:hAnsi="Times New Roman" w:cs="Times New Roman"/>
+          <w:sz w:val="24"/>
+          <w:szCs w:val="24"/>
+        </w:rPr>
+      </w:pPr>
+      <w:proofErr w:type="gramStart"/>
+      <w:r>
+        <w:rPr>
+          <w:rFonts w:ascii="Times New Roman" w:eastAsia="Times New Roman" w:hAnsi="Times New Roman" w:cs="Times New Roman"/>
+          <w:b/>
+          <w:bCs/>
+          <w:sz w:val="24"/>
+          <w:szCs w:val="24"/>
+        </w:rPr>
+        <w:t>3.Step</w:t>
+      </w:r>
+      <w:proofErr w:type="gramEnd"/>
+      <w:r>
+        <w:rPr>
+          <w:rFonts w:ascii="Times New Roman" w:eastAsia="Times New Roman" w:hAnsi="Times New Roman" w:cs="Times New Roman"/>
+          <w:b/>
+          <w:bCs/>
+          <w:sz w:val="24"/>
+          <w:szCs w:val="24"/>
+        </w:rPr>
+        <w:t xml:space="preserve"> 3: Combine </w:t>
+      </w:r>
+      <w:proofErr w:type="spellStart"/>
+      <w:r>
+        <w:rPr>
+          <w:rFonts w:ascii="Times New Roman" w:eastAsia="Times New Roman" w:hAnsi="Times New Roman" w:cs="Times New Roman"/>
+          <w:b/>
+          <w:bCs/>
+          <w:sz w:val="24"/>
+          <w:szCs w:val="24"/>
+        </w:rPr>
+        <w:t>again:</w:t>
+      </w:r>
+      <w:r>
+        <w:rPr>
+          <w:rFonts w:ascii="Times New Roman" w:eastAsia="Times New Roman" w:hAnsi="Times New Roman" w:cs="Times New Roman"/>
+          <w:sz w:val="24"/>
+          <w:szCs w:val="24"/>
+        </w:rPr>
+        <w:t>Queue</w:t>
+      </w:r>
+      <w:proofErr w:type="spellEnd"/>
+      <w:r>
+        <w:rPr>
+          <w:rFonts w:ascii="Times New Roman" w:eastAsia="Times New Roman" w:hAnsi="Times New Roman" w:cs="Times New Roman"/>
+          <w:sz w:val="24"/>
+          <w:szCs w:val="24"/>
+        </w:rPr>
+        <w:t>: (A+B)(14), E(16), (C+D)(25), F(45).</w:t>
+      </w:r>
+    </w:p>
+    <w:p>
+      <w:pPr>
+        <w:spacing w:before="100" w:beforeAutospacing="1" w:after="100" w:afterAutospacing="1" w:line="240" w:lineRule="auto"/>
+        <w:rPr>
+          <w:rFonts w:ascii="Times New Roman" w:eastAsia="Times New Roman" w:hAnsi="Times New Roman" w:cs="Times New Roman"/>
+          <w:sz w:val="24"/>
+          <w:szCs w:val="24"/>
+        </w:rPr>
+      </w:pPr>
+      <w:r>
+        <w:rPr>
+          <w:rFonts w:ascii="Times New Roman" w:eastAsia="Times New Roman" w:hAnsi="Times New Roman" w:cs="Times New Roman"/>
+          <w:sz w:val="24"/>
+          <w:szCs w:val="24"/>
+        </w:rPr>
+        <w:lastRenderedPageBreak/>
+        <w:t xml:space="preserve">The lowest frequencies are </w:t>
+      </w:r>
+      <w:r>
+        <w:rPr>
+          <w:rFonts w:ascii="Times New Roman" w:eastAsia="Times New Roman" w:hAnsi="Times New Roman" w:cs="Times New Roman"/>
+          <w:b/>
+          <w:bCs/>
+          <w:sz w:val="24"/>
+          <w:szCs w:val="24"/>
+        </w:rPr>
+        <w:t>(A+B) (14)</w:t>
+      </w:r>
+      <w:r>
+        <w:rPr>
+          <w:rFonts w:ascii="Times New Roman" w:eastAsia="Times New Roman" w:hAnsi="Times New Roman" w:cs="Times New Roman"/>
+          <w:sz w:val="24"/>
+          <w:szCs w:val="24"/>
+        </w:rPr>
+        <w:t xml:space="preserve"> and </w:t>
+      </w:r>
+      <w:r>
+        <w:rPr>
+          <w:rFonts w:ascii="Times New Roman" w:eastAsia="Times New Roman" w:hAnsi="Times New Roman" w:cs="Times New Roman"/>
+          <w:b/>
+          <w:bCs/>
+          <w:sz w:val="24"/>
+          <w:szCs w:val="24"/>
+        </w:rPr>
+        <w:t>E (16)</w:t>
+      </w:r>
+      <w:r>
+        <w:rPr>
+          <w:rFonts w:ascii="Times New Roman" w:eastAsia="Times New Roman" w:hAnsi="Times New Roman" w:cs="Times New Roman"/>
+          <w:sz w:val="24"/>
+          <w:szCs w:val="24"/>
+        </w:rPr>
+        <w:t>.</w:t>
+      </w:r>
+    </w:p>
+    <w:p>
+      <w:pPr>
+        <w:numPr>
+          <w:ilvl w:val="0"/>
+          <w:numId w:val="13"/>
+        </w:numPr>
+        <w:spacing w:before="100" w:beforeAutospacing="1" w:after="100" w:afterAutospacing="1" w:line="240" w:lineRule="auto"/>
+        <w:rPr>
+          <w:rFonts w:ascii="Times New Roman" w:eastAsia="Times New Roman" w:hAnsi="Times New Roman" w:cs="Times New Roman"/>
+          <w:sz w:val="24"/>
+          <w:szCs w:val="24"/>
+        </w:rPr>
+      </w:pPr>
+      <w:r>
+        <w:rPr>
+          <w:rFonts w:ascii="Times New Roman" w:eastAsia="Times New Roman" w:hAnsi="Times New Roman" w:cs="Times New Roman"/>
+          <w:i/>
+          <w:iCs/>
+          <w:sz w:val="24"/>
+          <w:szCs w:val="24"/>
+        </w:rPr>
+        <w:t>Action:</w:t>
+      </w:r>
+      <w:r>
+        <w:rPr>
+          <w:rFonts w:ascii="Times New Roman" w:eastAsia="Times New Roman" w:hAnsi="Times New Roman" w:cs="Times New Roman"/>
+          <w:sz w:val="24"/>
+          <w:szCs w:val="24"/>
+        </w:rPr>
+        <w:t xml:space="preserve"> Merge them into an internal node </w:t>
+      </w:r>
+      <w:r>
+        <w:rPr>
+          <w:rFonts w:ascii="Times New Roman" w:eastAsia="Times New Roman" w:hAnsi="Times New Roman" w:cs="Times New Roman"/>
+          <w:b/>
+          <w:bCs/>
+          <w:sz w:val="24"/>
+          <w:szCs w:val="24"/>
+        </w:rPr>
+        <w:t>((A+B</w:t>
+      </w:r>
+      <w:proofErr w:type="gramStart"/>
+      <w:r>
+        <w:rPr>
+          <w:rFonts w:ascii="Times New Roman" w:eastAsia="Times New Roman" w:hAnsi="Times New Roman" w:cs="Times New Roman"/>
+          <w:b/>
+          <w:bCs/>
+          <w:sz w:val="24"/>
+          <w:szCs w:val="24"/>
+        </w:rPr>
+        <w:t>)+</w:t>
+      </w:r>
+      <w:proofErr w:type="gramEnd"/>
+      <w:r>
+        <w:rPr>
+          <w:rFonts w:ascii="Times New Roman" w:eastAsia="Times New Roman" w:hAnsi="Times New Roman" w:cs="Times New Roman"/>
+          <w:b/>
+          <w:bCs/>
+          <w:sz w:val="24"/>
+          <w:szCs w:val="24"/>
+        </w:rPr>
+        <w:t>E)</w:t>
+      </w:r>
+      <w:r>
+        <w:rPr>
+          <w:rFonts w:ascii="Times New Roman" w:eastAsia="Times New Roman" w:hAnsi="Times New Roman" w:cs="Times New Roman"/>
+          <w:sz w:val="24"/>
+          <w:szCs w:val="24"/>
+        </w:rPr>
+        <w:t xml:space="preserve"> with a weight of $14 + 16 = \</w:t>
+      </w:r>
+      <w:proofErr w:type="spellStart"/>
+      <w:r>
+        <w:rPr>
+          <w:rFonts w:ascii="Times New Roman" w:eastAsia="Times New Roman" w:hAnsi="Times New Roman" w:cs="Times New Roman"/>
+          <w:sz w:val="24"/>
+          <w:szCs w:val="24"/>
+        </w:rPr>
+        <w:t>mathbf</w:t>
+      </w:r>
+      <w:proofErr w:type="spellEnd"/>
+      <w:r>
+        <w:rPr>
+          <w:rFonts w:ascii="Times New Roman" w:eastAsia="Times New Roman" w:hAnsi="Times New Roman" w:cs="Times New Roman"/>
+          <w:sz w:val="24"/>
+          <w:szCs w:val="24"/>
+        </w:rPr>
+        <w:t>{30}$.</w:t>
+      </w:r>
+    </w:p>
+    <w:p>
+      <w:pPr>
+        <w:spacing w:after="0" w:line="240" w:lineRule="auto"/>
+        <w:rPr>
+          <w:rFonts w:ascii="Times New Roman" w:eastAsia="Times New Roman" w:hAnsi="Times New Roman" w:cs="Times New Roman"/>
+          <w:sz w:val="24"/>
+          <w:szCs w:val="24"/>
+        </w:rPr>
+      </w:pPr>
+      <w:proofErr w:type="gramStart"/>
+      <w:r>
+        <w:rPr>
+          <w:rFonts w:ascii="Times New Roman" w:eastAsia="Times New Roman" w:hAnsi="Times New Roman" w:cs="Times New Roman"/>
+          <w:b/>
+          <w:bCs/>
+          <w:sz w:val="24"/>
+          <w:szCs w:val="24"/>
+        </w:rPr>
+        <w:t>4.Step</w:t>
+      </w:r>
+      <w:proofErr w:type="gramEnd"/>
+      <w:r>
+        <w:rPr>
+          <w:rFonts w:ascii="Times New Roman" w:eastAsia="Times New Roman" w:hAnsi="Times New Roman" w:cs="Times New Roman"/>
+          <w:b/>
+          <w:bCs/>
+          <w:sz w:val="24"/>
+          <w:szCs w:val="24"/>
+        </w:rPr>
+        <w:t xml:space="preserve"> 4: Keep </w:t>
+      </w:r>
+      <w:proofErr w:type="spellStart"/>
+      <w:r>
+        <w:rPr>
+          <w:rFonts w:ascii="Times New Roman" w:eastAsia="Times New Roman" w:hAnsi="Times New Roman" w:cs="Times New Roman"/>
+          <w:b/>
+          <w:bCs/>
+          <w:sz w:val="24"/>
+          <w:szCs w:val="24"/>
+        </w:rPr>
+        <w:t>merging:</w:t>
+      </w:r>
+      <w:r>
+        <w:rPr>
+          <w:rFonts w:ascii="Times New Roman" w:eastAsia="Times New Roman" w:hAnsi="Times New Roman" w:cs="Times New Roman"/>
+          <w:sz w:val="24"/>
+          <w:szCs w:val="24"/>
+        </w:rPr>
+        <w:t>Queue</w:t>
+      </w:r>
+      <w:proofErr w:type="spellEnd"/>
+      <w:r>
+        <w:rPr>
+          <w:rFonts w:ascii="Times New Roman" w:eastAsia="Times New Roman" w:hAnsi="Times New Roman" w:cs="Times New Roman"/>
+          <w:sz w:val="24"/>
+          <w:szCs w:val="24"/>
+        </w:rPr>
+        <w:t>: (C+D)(25), ((A+B)+E)(30), F(45).</w:t>
+      </w:r>
+    </w:p>
+    <w:p>
+      <w:pPr>
+        <w:spacing w:before="100" w:beforeAutospacing="1" w:after="100" w:afterAutospacing="1" w:line="240" w:lineRule="auto"/>
+        <w:rPr>
+          <w:rFonts w:ascii="Times New Roman" w:eastAsia="Times New Roman" w:hAnsi="Times New Roman" w:cs="Times New Roman"/>
+          <w:sz w:val="24"/>
+          <w:szCs w:val="24"/>
+        </w:rPr>
+      </w:pPr>
+      <w:r>
+        <w:rPr>
+          <w:rFonts w:ascii="Times New Roman" w:eastAsia="Times New Roman" w:hAnsi="Times New Roman" w:cs="Times New Roman"/>
+          <w:sz w:val="24"/>
+          <w:szCs w:val="24"/>
+        </w:rPr>
+        <w:t xml:space="preserve">The lowest frequencies are </w:t>
+      </w:r>
+      <w:r>
+        <w:rPr>
+          <w:rFonts w:ascii="Times New Roman" w:eastAsia="Times New Roman" w:hAnsi="Times New Roman" w:cs="Times New Roman"/>
+          <w:b/>
+          <w:bCs/>
+          <w:sz w:val="24"/>
+          <w:szCs w:val="24"/>
+        </w:rPr>
+        <w:t>(C+D) (25)</w:t>
+      </w:r>
+      <w:r>
+        <w:rPr>
+          <w:rFonts w:ascii="Times New Roman" w:eastAsia="Times New Roman" w:hAnsi="Times New Roman" w:cs="Times New Roman"/>
+          <w:sz w:val="24"/>
+          <w:szCs w:val="24"/>
+        </w:rPr>
+        <w:t xml:space="preserve"> and </w:t>
+      </w:r>
+      <w:r>
+        <w:rPr>
+          <w:rFonts w:ascii="Times New Roman" w:eastAsia="Times New Roman" w:hAnsi="Times New Roman" w:cs="Times New Roman"/>
+          <w:b/>
+          <w:bCs/>
+          <w:sz w:val="24"/>
+          <w:szCs w:val="24"/>
+        </w:rPr>
+        <w:t>((A+B</w:t>
+      </w:r>
+      <w:proofErr w:type="gramStart"/>
+      <w:r>
+        <w:rPr>
+          <w:rFonts w:ascii="Times New Roman" w:eastAsia="Times New Roman" w:hAnsi="Times New Roman" w:cs="Times New Roman"/>
+          <w:b/>
+          <w:bCs/>
+          <w:sz w:val="24"/>
+          <w:szCs w:val="24"/>
+        </w:rPr>
+        <w:t>)+</w:t>
+      </w:r>
+      <w:proofErr w:type="gramEnd"/>
+      <w:r>
+        <w:rPr>
+          <w:rFonts w:ascii="Times New Roman" w:eastAsia="Times New Roman" w:hAnsi="Times New Roman" w:cs="Times New Roman"/>
+          <w:b/>
+          <w:bCs/>
+          <w:sz w:val="24"/>
+          <w:szCs w:val="24"/>
+        </w:rPr>
+        <w:t>E) (30)</w:t>
+      </w:r>
+      <w:r>
+        <w:rPr>
+          <w:rFonts w:ascii="Times New Roman" w:eastAsia="Times New Roman" w:hAnsi="Times New Roman" w:cs="Times New Roman"/>
+          <w:sz w:val="24"/>
+          <w:szCs w:val="24"/>
+        </w:rPr>
+        <w:t>.</w:t>
+      </w:r>
+    </w:p>
+    <w:p>
+      <w:pPr>
+        <w:numPr>
+          <w:ilvl w:val="0"/>
+          <w:numId w:val="14"/>
+        </w:numPr>
+        <w:spacing w:before="100" w:beforeAutospacing="1" w:after="100" w:afterAutospacing="1" w:line="240" w:lineRule="auto"/>
+        <w:rPr>
+          <w:rFonts w:ascii="Times New Roman" w:eastAsia="Times New Roman" w:hAnsi="Times New Roman" w:cs="Times New Roman"/>
+          <w:sz w:val="24"/>
+          <w:szCs w:val="24"/>
+        </w:rPr>
+      </w:pPr>
+      <w:r>
+        <w:rPr>
+          <w:rFonts w:ascii="Times New Roman" w:eastAsia="Times New Roman" w:hAnsi="Times New Roman" w:cs="Times New Roman"/>
+          <w:i/>
+          <w:iCs/>
+          <w:sz w:val="24"/>
+          <w:szCs w:val="24"/>
+        </w:rPr>
+        <w:t>Action:</w:t>
+      </w:r>
+      <w:r>
+        <w:rPr>
+          <w:rFonts w:ascii="Times New Roman" w:eastAsia="Times New Roman" w:hAnsi="Times New Roman" w:cs="Times New Roman"/>
+          <w:sz w:val="24"/>
+          <w:szCs w:val="24"/>
+        </w:rPr>
+        <w:t xml:space="preserve"> Merge them into a giant </w:t>
+      </w:r>
+      <w:proofErr w:type="spellStart"/>
+      <w:r>
+        <w:rPr>
+          <w:rFonts w:ascii="Times New Roman" w:eastAsia="Times New Roman" w:hAnsi="Times New Roman" w:cs="Times New Roman"/>
+          <w:sz w:val="24"/>
+          <w:szCs w:val="24"/>
+        </w:rPr>
+        <w:t>subtree</w:t>
+      </w:r>
+      <w:proofErr w:type="spellEnd"/>
+      <w:r>
+        <w:rPr>
+          <w:rFonts w:ascii="Times New Roman" w:eastAsia="Times New Roman" w:hAnsi="Times New Roman" w:cs="Times New Roman"/>
+          <w:sz w:val="24"/>
+          <w:szCs w:val="24"/>
+        </w:rPr>
+        <w:t xml:space="preserve"> with a weight of $25 + 30 = \</w:t>
+      </w:r>
+      <w:proofErr w:type="spellStart"/>
+      <w:r>
+        <w:rPr>
+          <w:rFonts w:ascii="Times New Roman" w:eastAsia="Times New Roman" w:hAnsi="Times New Roman" w:cs="Times New Roman"/>
+          <w:sz w:val="24"/>
+          <w:szCs w:val="24"/>
+        </w:rPr>
+        <w:t>mathbf</w:t>
+      </w:r>
+      <w:proofErr w:type="spellEnd"/>
+      <w:r>
+        <w:rPr>
+          <w:rFonts w:ascii="Times New Roman" w:eastAsia="Times New Roman" w:hAnsi="Times New Roman" w:cs="Times New Roman"/>
+          <w:sz w:val="24"/>
+          <w:szCs w:val="24"/>
+        </w:rPr>
+        <w:t>{55}$.</w:t>
+      </w:r>
+    </w:p>
+    <w:p>
+      <w:pPr>
+        <w:spacing w:after="0" w:line="240" w:lineRule="auto"/>
+        <w:rPr>
+          <w:rFonts w:ascii="Times New Roman" w:eastAsia="Times New Roman" w:hAnsi="Times New Roman" w:cs="Times New Roman"/>
+          <w:sz w:val="24"/>
+          <w:szCs w:val="24"/>
+        </w:rPr>
+      </w:pPr>
+      <w:proofErr w:type="gramStart"/>
+      <w:r>
+        <w:rPr>
+          <w:rFonts w:ascii="Times New Roman" w:eastAsia="Times New Roman" w:hAnsi="Times New Roman" w:cs="Times New Roman"/>
+          <w:b/>
+          <w:bCs/>
+          <w:sz w:val="24"/>
+          <w:szCs w:val="24"/>
+        </w:rPr>
+        <w:t>5.Step</w:t>
+      </w:r>
+      <w:proofErr w:type="gramEnd"/>
+      <w:r>
+        <w:rPr>
+          <w:rFonts w:ascii="Times New Roman" w:eastAsia="Times New Roman" w:hAnsi="Times New Roman" w:cs="Times New Roman"/>
+          <w:b/>
+          <w:bCs/>
+          <w:sz w:val="24"/>
+          <w:szCs w:val="24"/>
+        </w:rPr>
+        <w:t xml:space="preserve"> 5: Final </w:t>
+      </w:r>
+      <w:proofErr w:type="spellStart"/>
+      <w:r>
+        <w:rPr>
+          <w:rFonts w:ascii="Times New Roman" w:eastAsia="Times New Roman" w:hAnsi="Times New Roman" w:cs="Times New Roman"/>
+          <w:b/>
+          <w:bCs/>
+          <w:sz w:val="24"/>
+          <w:szCs w:val="24"/>
+        </w:rPr>
+        <w:t>Merge:</w:t>
+      </w:r>
+      <w:r>
+        <w:rPr>
+          <w:rFonts w:ascii="Times New Roman" w:eastAsia="Times New Roman" w:hAnsi="Times New Roman" w:cs="Times New Roman"/>
+          <w:sz w:val="24"/>
+          <w:szCs w:val="24"/>
+        </w:rPr>
+        <w:t>Queue</w:t>
+      </w:r>
+      <w:proofErr w:type="spellEnd"/>
+      <w:r>
+        <w:rPr>
+          <w:rFonts w:ascii="Times New Roman" w:eastAsia="Times New Roman" w:hAnsi="Times New Roman" w:cs="Times New Roman"/>
+          <w:sz w:val="24"/>
+          <w:szCs w:val="24"/>
+        </w:rPr>
+        <w:t xml:space="preserve">: F(45), </w:t>
+      </w:r>
+      <w:proofErr w:type="spellStart"/>
+      <w:r>
+        <w:rPr>
+          <w:rFonts w:ascii="Times New Roman" w:eastAsia="Times New Roman" w:hAnsi="Times New Roman" w:cs="Times New Roman"/>
+          <w:sz w:val="24"/>
+          <w:szCs w:val="24"/>
+        </w:rPr>
+        <w:t>Subtree</w:t>
+      </w:r>
+      <w:proofErr w:type="spellEnd"/>
+      <w:r>
+        <w:rPr>
+          <w:rFonts w:ascii="Times New Roman" w:eastAsia="Times New Roman" w:hAnsi="Times New Roman" w:cs="Times New Roman"/>
+          <w:sz w:val="24"/>
+          <w:szCs w:val="24"/>
+        </w:rPr>
+        <w:t>(55).</w:t>
+      </w:r>
+    </w:p>
+    <w:p>
+      <w:pPr>
+        <w:spacing w:before="100" w:beforeAutospacing="1" w:after="100" w:afterAutospacing="1" w:line="240" w:lineRule="auto"/>
+        <w:rPr>
+          <w:rFonts w:ascii="Times New Roman" w:eastAsia="Times New Roman" w:hAnsi="Times New Roman" w:cs="Times New Roman"/>
+          <w:sz w:val="24"/>
+          <w:szCs w:val="24"/>
+        </w:rPr>
+      </w:pPr>
+      <w:r>
+        <w:rPr>
+          <w:rFonts w:ascii="Times New Roman" w:eastAsia="Times New Roman" w:hAnsi="Times New Roman" w:cs="Times New Roman"/>
+          <w:sz w:val="24"/>
+          <w:szCs w:val="24"/>
+        </w:rPr>
+        <w:t xml:space="preserve">Finally, merge </w:t>
+      </w:r>
+      <w:r>
+        <w:rPr>
+          <w:rFonts w:ascii="Times New Roman" w:eastAsia="Times New Roman" w:hAnsi="Times New Roman" w:cs="Times New Roman"/>
+          <w:b/>
+          <w:bCs/>
+          <w:sz w:val="24"/>
+          <w:szCs w:val="24"/>
+        </w:rPr>
+        <w:t>F (45)</w:t>
+      </w:r>
+      <w:r>
+        <w:rPr>
+          <w:rFonts w:ascii="Times New Roman" w:eastAsia="Times New Roman" w:hAnsi="Times New Roman" w:cs="Times New Roman"/>
+          <w:sz w:val="24"/>
+          <w:szCs w:val="24"/>
+        </w:rPr>
+        <w:t xml:space="preserve"> with the </w:t>
+      </w:r>
+      <w:proofErr w:type="spellStart"/>
+      <w:r>
+        <w:rPr>
+          <w:rFonts w:ascii="Times New Roman" w:eastAsia="Times New Roman" w:hAnsi="Times New Roman" w:cs="Times New Roman"/>
+          <w:b/>
+          <w:bCs/>
+          <w:sz w:val="24"/>
+          <w:szCs w:val="24"/>
+        </w:rPr>
+        <w:t>Subtree</w:t>
+      </w:r>
+      <w:proofErr w:type="spellEnd"/>
+      <w:r>
+        <w:rPr>
+          <w:rFonts w:ascii="Times New Roman" w:eastAsia="Times New Roman" w:hAnsi="Times New Roman" w:cs="Times New Roman"/>
+          <w:b/>
+          <w:bCs/>
+          <w:sz w:val="24"/>
+          <w:szCs w:val="24"/>
+        </w:rPr>
+        <w:t xml:space="preserve"> (55)</w:t>
+      </w:r>
+      <w:r>
+        <w:rPr>
+          <w:rFonts w:ascii="Times New Roman" w:eastAsia="Times New Roman" w:hAnsi="Times New Roman" w:cs="Times New Roman"/>
+          <w:sz w:val="24"/>
+          <w:szCs w:val="24"/>
+        </w:rPr>
+        <w:t xml:space="preserve"> to create the root node of </w:t>
+      </w:r>
+      <w:r>
+        <w:rPr>
+          <w:rFonts w:ascii="Times New Roman" w:eastAsia="Times New Roman" w:hAnsi="Times New Roman" w:cs="Times New Roman"/>
+          <w:b/>
+          <w:bCs/>
+          <w:sz w:val="24"/>
+          <w:szCs w:val="24"/>
+        </w:rPr>
+        <w:t>100</w:t>
+      </w:r>
+      <w:r>
+        <w:rPr>
+          <w:rFonts w:ascii="Times New Roman" w:eastAsia="Times New Roman" w:hAnsi="Times New Roman" w:cs="Times New Roman"/>
+          <w:sz w:val="24"/>
+          <w:szCs w:val="24"/>
+        </w:rPr>
+        <w:t>. The tree is complete!</w:t>
+      </w:r>
+    </w:p>
+    <w:p>
+      <w:pPr>
+        <w:spacing w:before="100" w:beforeAutospacing="1" w:after="100" w:afterAutospacing="1" w:line="240" w:lineRule="auto"/>
+        <w:outlineLvl w:val="2"/>
+        <w:rPr>
+          <w:rFonts w:ascii="Times New Roman" w:eastAsia="Times New Roman" w:hAnsi="Times New Roman" w:cs="Times New Roman"/>
+          <w:b/>
+          <w:bCs/>
+          <w:sz w:val="27"/>
+          <w:szCs w:val="27"/>
+        </w:rPr>
+      </w:pPr>
+      <w:r>
+        <w:rPr>
+          <w:rFonts w:ascii="Times New Roman" w:eastAsia="Times New Roman" w:hAnsi="Times New Roman" w:cs="Times New Roman"/>
+          <w:b/>
+          <w:bCs/>
+          <w:sz w:val="27"/>
+          <w:szCs w:val="27"/>
+        </w:rPr>
+        <w:t>Assigning the Bit Codes</w:t>
+      </w:r>
+    </w:p>
+    <w:p>
+      <w:pPr>
+        <w:spacing w:before="100" w:beforeAutospacing="1" w:after="100" w:afterAutospacing="1" w:line="240" w:lineRule="auto"/>
+        <w:rPr>
+          <w:rFonts w:ascii="Times New Roman" w:eastAsia="Times New Roman" w:hAnsi="Times New Roman" w:cs="Times New Roman"/>
+          <w:sz w:val="24"/>
+          <w:szCs w:val="24"/>
+        </w:rPr>
+      </w:pPr>
+      <w:r>
+        <w:rPr>
+          <w:rFonts w:ascii="Times New Roman" w:eastAsia="Times New Roman" w:hAnsi="Times New Roman" w:cs="Times New Roman"/>
+          <w:sz w:val="24"/>
+          <w:szCs w:val="24"/>
+        </w:rPr>
+        <w:t xml:space="preserve">Once the tree is built, we assign </w:t>
+      </w:r>
+      <w:r>
+        <w:rPr>
+          <w:rFonts w:ascii="Times New Roman" w:eastAsia="Times New Roman" w:hAnsi="Times New Roman" w:cs="Times New Roman"/>
+          <w:b/>
+          <w:bCs/>
+          <w:sz w:val="24"/>
+          <w:szCs w:val="24"/>
+        </w:rPr>
+        <w:t>0</w:t>
+      </w:r>
+      <w:r>
+        <w:rPr>
+          <w:rFonts w:ascii="Times New Roman" w:eastAsia="Times New Roman" w:hAnsi="Times New Roman" w:cs="Times New Roman"/>
+          <w:sz w:val="24"/>
+          <w:szCs w:val="24"/>
+        </w:rPr>
+        <w:t xml:space="preserve"> to every left branch and </w:t>
+      </w:r>
+      <w:r>
+        <w:rPr>
+          <w:rFonts w:ascii="Times New Roman" w:eastAsia="Times New Roman" w:hAnsi="Times New Roman" w:cs="Times New Roman"/>
+          <w:b/>
+          <w:bCs/>
+          <w:sz w:val="24"/>
+          <w:szCs w:val="24"/>
+        </w:rPr>
+        <w:t>1</w:t>
+      </w:r>
+      <w:r>
+        <w:rPr>
+          <w:rFonts w:ascii="Times New Roman" w:eastAsia="Times New Roman" w:hAnsi="Times New Roman" w:cs="Times New Roman"/>
+          <w:sz w:val="24"/>
+          <w:szCs w:val="24"/>
+        </w:rPr>
+        <w:t xml:space="preserve"> to every right branch. Traveling from the root down to each letter reveals its unique binary code:</w:t>
+      </w:r>
+    </w:p>
+    <w:tbl>
+      <w:tblPr>
+        <w:tblW w:w="0" w:type="auto"/>
+        <w:tblCellSpacing w:w="15" w:type="dxa"/>
+        <w:tblCellMar>
+          <w:top w:w="15" w:type="dxa"/>
+          <w:left w:w="15" w:type="dxa"/>
+          <w:bottom w:w="15" w:type="dxa"/>
+          <w:right w:w="15" w:type="dxa"/>
+        </w:tblCellMar>
+        <w:tblLook w:val="04A0"/>
+      </w:tblPr>
+      <w:tblGrid>
+        <w:gridCol w:w="1358"/>
+        <w:gridCol w:w="1889"/>
+        <w:gridCol w:w="2125"/>
+        <w:gridCol w:w="2529"/>
+        <w:gridCol w:w="1779"/>
+      </w:tblGrid>
+      <w:tr>
+        <w:trPr>
+          <w:tblHeader/>
+          <w:tblCellSpacing w:w="15" w:type="dxa"/>
+        </w:trPr>
+        <w:tc>
+          <w:tcPr>
+            <w:tcW w:w="0" w:type="auto"/>
+            <w:tcBorders>
+              <w:top w:val="single" w:sz="4" w:space="0" w:color="C4C7C5"/>
+              <w:left w:val="single" w:sz="4" w:space="0" w:color="C4C7C5"/>
+              <w:bottom w:val="single" w:sz="4" w:space="0" w:color="C4C7C5"/>
+              <w:right w:val="single" w:sz="4" w:space="0" w:color="C4C7C5"/>
+            </w:tcBorders>
+            <w:tcMar>
+              <w:top w:w="80" w:type="dxa"/>
+              <w:left w:w="120" w:type="dxa"/>
+              <w:bottom w:w="80" w:type="dxa"/>
+              <w:right w:w="120" w:type="dxa"/>
+            </w:tcMar>
+            <w:vAlign w:val="center"/>
+            <w:hideMark/>
+          </w:tcPr>
+          <w:p>
+            <w:pPr>
+              <w:spacing w:after="320" w:line="240" w:lineRule="auto"/>
+              <w:rPr>
+                <w:rFonts w:ascii="Times New Roman" w:eastAsia="Times New Roman" w:hAnsi="Times New Roman" w:cs="Times New Roman"/>
+                <w:sz w:val="24"/>
+                <w:szCs w:val="24"/>
+              </w:rPr>
+            </w:pPr>
+            <w:r>
+              <w:rPr>
+                <w:rFonts w:ascii="Times New Roman" w:eastAsia="Times New Roman" w:hAnsi="Times New Roman" w:cs="Times New Roman"/>
+                <w:b/>
+                <w:bCs/>
+                <w:sz w:val="24"/>
+                <w:szCs w:val="24"/>
+              </w:rPr>
+              <w:t>Character</w:t>
+            </w:r>
+          </w:p>
+        </w:tc>
+        <w:tc>
+          <w:tcPr>
+            <w:tcW w:w="0" w:type="auto"/>
+            <w:tcBorders>
+              <w:top w:val="single" w:sz="4" w:space="0" w:color="C4C7C5"/>
+              <w:left w:val="single" w:sz="4" w:space="0" w:color="C4C7C5"/>
+              <w:bottom w:val="single" w:sz="4" w:space="0" w:color="C4C7C5"/>
+              <w:right w:val="single" w:sz="4" w:space="0" w:color="C4C7C5"/>
+            </w:tcBorders>
+            <w:tcMar>
+              <w:top w:w="80" w:type="dxa"/>
+              <w:left w:w="120" w:type="dxa"/>
+              <w:bottom w:w="80" w:type="dxa"/>
+              <w:right w:w="120" w:type="dxa"/>
+            </w:tcMar>
+            <w:vAlign w:val="center"/>
+            <w:hideMark/>
+          </w:tcPr>
+          <w:p>
+            <w:pPr>
+              <w:spacing w:after="320" w:line="240" w:lineRule="auto"/>
+              <w:rPr>
+                <w:rFonts w:ascii="Times New Roman" w:eastAsia="Times New Roman" w:hAnsi="Times New Roman" w:cs="Times New Roman"/>
+                <w:sz w:val="24"/>
+                <w:szCs w:val="24"/>
+              </w:rPr>
+            </w:pPr>
+            <w:r>
+              <w:rPr>
+                <w:rFonts w:ascii="Times New Roman" w:eastAsia="Times New Roman" w:hAnsi="Times New Roman" w:cs="Times New Roman"/>
+                <w:b/>
+                <w:bCs/>
+                <w:sz w:val="24"/>
+                <w:szCs w:val="24"/>
+              </w:rPr>
+              <w:t>Original Frequency</w:t>
+            </w:r>
+          </w:p>
+        </w:tc>
+        <w:tc>
+          <w:tcPr>
+            <w:tcW w:w="0" w:type="auto"/>
+            <w:tcBorders>
+              <w:top w:val="single" w:sz="4" w:space="0" w:color="C4C7C5"/>
+              <w:left w:val="single" w:sz="4" w:space="0" w:color="C4C7C5"/>
+              <w:bottom w:val="single" w:sz="4" w:space="0" w:color="C4C7C5"/>
+              <w:right w:val="single" w:sz="4" w:space="0" w:color="C4C7C5"/>
+            </w:tcBorders>
+            <w:tcMar>
+              <w:top w:w="80" w:type="dxa"/>
+              <w:left w:w="120" w:type="dxa"/>
+              <w:bottom w:w="80" w:type="dxa"/>
+              <w:right w:w="120" w:type="dxa"/>
+            </w:tcMar>
+            <w:vAlign w:val="center"/>
+            <w:hideMark/>
+          </w:tcPr>
+          <w:p>
+            <w:pPr>
+              <w:spacing w:after="320" w:line="240" w:lineRule="auto"/>
+              <w:rPr>
+                <w:rFonts w:ascii="Times New Roman" w:eastAsia="Times New Roman" w:hAnsi="Times New Roman" w:cs="Times New Roman"/>
+                <w:sz w:val="24"/>
+                <w:szCs w:val="24"/>
+              </w:rPr>
+            </w:pPr>
+            <w:r>
+              <w:rPr>
+                <w:rFonts w:ascii="Times New Roman" w:eastAsia="Times New Roman" w:hAnsi="Times New Roman" w:cs="Times New Roman"/>
+                <w:b/>
+                <w:bCs/>
+                <w:sz w:val="24"/>
+                <w:szCs w:val="24"/>
+              </w:rPr>
+              <w:t>Fixed-Length Code (3 bits)</w:t>
+            </w:r>
+          </w:p>
+        </w:tc>
+        <w:tc>
+          <w:tcPr>
+            <w:tcW w:w="0" w:type="auto"/>
+            <w:tcBorders>
+              <w:top w:val="single" w:sz="4" w:space="0" w:color="C4C7C5"/>
+              <w:left w:val="single" w:sz="4" w:space="0" w:color="C4C7C5"/>
+              <w:bottom w:val="single" w:sz="4" w:space="0" w:color="C4C7C5"/>
+              <w:right w:val="single" w:sz="4" w:space="0" w:color="C4C7C5"/>
+            </w:tcBorders>
+            <w:tcMar>
+              <w:top w:w="80" w:type="dxa"/>
+              <w:left w:w="120" w:type="dxa"/>
+              <w:bottom w:w="80" w:type="dxa"/>
+              <w:right w:w="120" w:type="dxa"/>
+            </w:tcMar>
+            <w:vAlign w:val="center"/>
+            <w:hideMark/>
+          </w:tcPr>
+          <w:p>
+            <w:pPr>
+              <w:spacing w:after="320" w:line="240" w:lineRule="auto"/>
+              <w:rPr>
+                <w:rFonts w:ascii="Times New Roman" w:eastAsia="Times New Roman" w:hAnsi="Times New Roman" w:cs="Times New Roman"/>
+                <w:sz w:val="24"/>
+                <w:szCs w:val="24"/>
+              </w:rPr>
+            </w:pPr>
+            <w:r>
+              <w:rPr>
+                <w:rFonts w:ascii="Times New Roman" w:eastAsia="Times New Roman" w:hAnsi="Times New Roman" w:cs="Times New Roman"/>
+                <w:b/>
+                <w:bCs/>
+                <w:sz w:val="24"/>
+                <w:szCs w:val="24"/>
+              </w:rPr>
+              <w:t>Huffman Variable-Length Code</w:t>
+            </w:r>
+          </w:p>
+        </w:tc>
+        <w:tc>
+          <w:tcPr>
+            <w:tcW w:w="0" w:type="auto"/>
+            <w:tcBorders>
+              <w:top w:val="single" w:sz="4" w:space="0" w:color="C4C7C5"/>
+              <w:left w:val="single" w:sz="4" w:space="0" w:color="C4C7C5"/>
+              <w:bottom w:val="single" w:sz="4" w:space="0" w:color="C4C7C5"/>
+              <w:right w:val="single" w:sz="4" w:space="0" w:color="C4C7C5"/>
+            </w:tcBorders>
+            <w:tcMar>
+              <w:top w:w="80" w:type="dxa"/>
+              <w:left w:w="120" w:type="dxa"/>
+              <w:bottom w:w="80" w:type="dxa"/>
+              <w:right w:w="120" w:type="dxa"/>
+            </w:tcMar>
+            <w:vAlign w:val="center"/>
+            <w:hideMark/>
+          </w:tcPr>
+          <w:p>
+            <w:pPr>
+              <w:spacing w:after="320" w:line="240" w:lineRule="auto"/>
+              <w:rPr>
+                <w:rFonts w:ascii="Times New Roman" w:eastAsia="Times New Roman" w:hAnsi="Times New Roman" w:cs="Times New Roman"/>
+                <w:sz w:val="24"/>
+                <w:szCs w:val="24"/>
+              </w:rPr>
+            </w:pPr>
+            <w:r>
+              <w:rPr>
+                <w:rFonts w:ascii="Times New Roman" w:eastAsia="Times New Roman" w:hAnsi="Times New Roman" w:cs="Times New Roman"/>
+                <w:b/>
+                <w:bCs/>
+                <w:sz w:val="24"/>
+                <w:szCs w:val="24"/>
+              </w:rPr>
+              <w:t>Saved Bits?</w:t>
+            </w:r>
+          </w:p>
+        </w:tc>
+      </w:tr>
+      <w:tr>
+        <w:trPr>
+          <w:tblCellSpacing w:w="15" w:type="dxa"/>
+        </w:trPr>
+        <w:tc>
+          <w:tcPr>
+            <w:tcW w:w="0" w:type="auto"/>
+            <w:tcBorders>
+              <w:top w:val="single" w:sz="4" w:space="0" w:color="C4C7C5"/>
+              <w:left w:val="single" w:sz="4" w:space="0" w:color="C4C7C5"/>
+              <w:bottom w:val="single" w:sz="4" w:space="0" w:color="C4C7C5"/>
+              <w:right w:val="single" w:sz="4" w:space="0" w:color="C4C7C5"/>
+            </w:tcBorders>
+            <w:tcMar>
+              <w:top w:w="80" w:type="dxa"/>
+              <w:left w:w="120" w:type="dxa"/>
+              <w:bottom w:w="80" w:type="dxa"/>
+              <w:right w:w="120" w:type="dxa"/>
+            </w:tcMar>
+            <w:vAlign w:val="center"/>
+            <w:hideMark/>
+          </w:tcPr>
+          <w:p>
+            <w:pPr>
+              <w:spacing w:after="320" w:line="240" w:lineRule="auto"/>
+              <w:rPr>
+                <w:rFonts w:ascii="Times New Roman" w:eastAsia="Times New Roman" w:hAnsi="Times New Roman" w:cs="Times New Roman"/>
+                <w:sz w:val="24"/>
+                <w:szCs w:val="24"/>
+              </w:rPr>
+            </w:pPr>
+            <w:r>
+              <w:rPr>
+                <w:rFonts w:ascii="Times New Roman" w:eastAsia="Times New Roman" w:hAnsi="Times New Roman" w:cs="Times New Roman"/>
+                <w:b/>
+                <w:bCs/>
+                <w:sz w:val="24"/>
+                <w:szCs w:val="24"/>
+              </w:rPr>
+              <w:t>F</w:t>
+            </w:r>
+          </w:p>
+        </w:tc>
+        <w:tc>
+          <w:tcPr>
+            <w:tcW w:w="0" w:type="auto"/>
+            <w:tcBorders>
+              <w:top w:val="single" w:sz="4" w:space="0" w:color="C4C7C5"/>
+              <w:left w:val="single" w:sz="4" w:space="0" w:color="C4C7C5"/>
+              <w:bottom w:val="single" w:sz="4" w:space="0" w:color="C4C7C5"/>
+              <w:right w:val="single" w:sz="4" w:space="0" w:color="C4C7C5"/>
+            </w:tcBorders>
+            <w:tcMar>
+              <w:top w:w="80" w:type="dxa"/>
+              <w:left w:w="120" w:type="dxa"/>
+              <w:bottom w:w="80" w:type="dxa"/>
+              <w:right w:w="120" w:type="dxa"/>
+            </w:tcMar>
+            <w:vAlign w:val="center"/>
+            <w:hideMark/>
+          </w:tcPr>
+          <w:p>
+            <w:pPr>
+              <w:spacing w:after="320" w:line="240" w:lineRule="auto"/>
+              <w:rPr>
+                <w:rFonts w:ascii="Times New Roman" w:eastAsia="Times New Roman" w:hAnsi="Times New Roman" w:cs="Times New Roman"/>
+                <w:sz w:val="24"/>
+                <w:szCs w:val="24"/>
+              </w:rPr>
+            </w:pPr>
+            <w:r>
+              <w:rPr>
+                <w:rFonts w:ascii="Times New Roman" w:eastAsia="Times New Roman" w:hAnsi="Times New Roman" w:cs="Times New Roman"/>
+                <w:sz w:val="24"/>
+                <w:szCs w:val="24"/>
+              </w:rPr>
+              <w:t>45</w:t>
+            </w:r>
+          </w:p>
+        </w:tc>
+        <w:tc>
+          <w:tcPr>
+            <w:tcW w:w="0" w:type="auto"/>
+            <w:tcBorders>
+              <w:top w:val="single" w:sz="4" w:space="0" w:color="C4C7C5"/>
+              <w:left w:val="single" w:sz="4" w:space="0" w:color="C4C7C5"/>
+              <w:bottom w:val="single" w:sz="4" w:space="0" w:color="C4C7C5"/>
+              <w:right w:val="single" w:sz="4" w:space="0" w:color="C4C7C5"/>
+            </w:tcBorders>
+            <w:tcMar>
+              <w:top w:w="80" w:type="dxa"/>
+              <w:left w:w="120" w:type="dxa"/>
+              <w:bottom w:w="80" w:type="dxa"/>
+              <w:right w:w="120" w:type="dxa"/>
+            </w:tcMar>
+            <w:vAlign w:val="center"/>
+            <w:hideMark/>
+          </w:tcPr>
+          <w:p>
+            <w:pPr>
+              <w:spacing w:after="320" w:line="240" w:lineRule="auto"/>
+              <w:rPr>
+                <w:rFonts w:ascii="Times New Roman" w:eastAsia="Times New Roman" w:hAnsi="Times New Roman" w:cs="Times New Roman"/>
+                <w:sz w:val="24"/>
+                <w:szCs w:val="24"/>
+              </w:rPr>
+            </w:pPr>
+            <w:r>
+              <w:rPr>
+                <w:rFonts w:ascii="Courier New" w:eastAsia="Times New Roman" w:hAnsi="Courier New" w:cs="Courier New"/>
+                <w:sz w:val="20"/>
+              </w:rPr>
+              <w:t>000</w:t>
+            </w:r>
+          </w:p>
+        </w:tc>
+        <w:tc>
+          <w:tcPr>
+            <w:tcW w:w="0" w:type="auto"/>
+            <w:tcBorders>
+              <w:top w:val="single" w:sz="4" w:space="0" w:color="C4C7C5"/>
+              <w:left w:val="single" w:sz="4" w:space="0" w:color="C4C7C5"/>
+              <w:bottom w:val="single" w:sz="4" w:space="0" w:color="C4C7C5"/>
+              <w:right w:val="single" w:sz="4" w:space="0" w:color="C4C7C5"/>
+            </w:tcBorders>
+            <w:tcMar>
+              <w:top w:w="80" w:type="dxa"/>
+              <w:left w:w="120" w:type="dxa"/>
+              <w:bottom w:w="80" w:type="dxa"/>
+              <w:right w:w="120" w:type="dxa"/>
+            </w:tcMar>
+            <w:vAlign w:val="center"/>
+            <w:hideMark/>
+          </w:tcPr>
+          <w:p>
+            <w:pPr>
+              <w:spacing w:after="320" w:line="240" w:lineRule="auto"/>
+              <w:rPr>
+                <w:rFonts w:ascii="Times New Roman" w:eastAsia="Times New Roman" w:hAnsi="Times New Roman" w:cs="Times New Roman"/>
+                <w:sz w:val="24"/>
+                <w:szCs w:val="24"/>
+              </w:rPr>
+            </w:pPr>
+            <w:r>
+              <w:rPr>
+                <w:rFonts w:ascii="Courier New" w:eastAsia="Times New Roman" w:hAnsi="Courier New" w:cs="Courier New"/>
+                <w:sz w:val="20"/>
+              </w:rPr>
+              <w:t>0</w:t>
+            </w:r>
+            <w:r>
+              <w:rPr>
+                <w:rFonts w:ascii="Times New Roman" w:eastAsia="Times New Roman" w:hAnsi="Times New Roman" w:cs="Times New Roman"/>
+                <w:sz w:val="24"/>
+                <w:szCs w:val="24"/>
+              </w:rPr>
+              <w:t xml:space="preserve"> (1 bit)</w:t>
+            </w:r>
+          </w:p>
+        </w:tc>
+        <w:tc>
+          <w:tcPr>
+            <w:tcW w:w="0" w:type="auto"/>
+            <w:tcBorders>
+              <w:top w:val="single" w:sz="4" w:space="0" w:color="C4C7C5"/>
+              <w:left w:val="single" w:sz="4" w:space="0" w:color="C4C7C5"/>
+              <w:bottom w:val="single" w:sz="4" w:space="0" w:color="C4C7C5"/>
+              <w:right w:val="single" w:sz="4" w:space="0" w:color="C4C7C5"/>
+            </w:tcBorders>
+            <w:tcMar>
+              <w:top w:w="80" w:type="dxa"/>
+              <w:left w:w="120" w:type="dxa"/>
+              <w:bottom w:w="80" w:type="dxa"/>
+              <w:right w:w="120" w:type="dxa"/>
+            </w:tcMar>
+            <w:vAlign w:val="center"/>
+            <w:hideMark/>
+          </w:tcPr>
+          <w:p>
+            <w:pPr>
+              <w:spacing w:after="320" w:line="240" w:lineRule="auto"/>
+              <w:rPr>
+                <w:rFonts w:ascii="Times New Roman" w:eastAsia="Times New Roman" w:hAnsi="Times New Roman" w:cs="Times New Roman"/>
+                <w:sz w:val="24"/>
+                <w:szCs w:val="24"/>
+              </w:rPr>
+            </w:pPr>
+            <w:r>
+              <w:rPr>
+                <w:rFonts w:ascii="Times New Roman" w:eastAsia="Times New Roman" w:hAnsi="Times New Roman" w:cs="Times New Roman"/>
+                <w:sz w:val="24"/>
+                <w:szCs w:val="24"/>
+              </w:rPr>
+              <w:t>🎉 Massively Saved</w:t>
+            </w:r>
+          </w:p>
+        </w:tc>
+      </w:tr>
+      <w:tr>
+        <w:trPr>
+          <w:tblCellSpacing w:w="15" w:type="dxa"/>
+        </w:trPr>
+        <w:tc>
+          <w:tcPr>
+            <w:tcW w:w="0" w:type="auto"/>
+            <w:tcBorders>
+              <w:top w:val="single" w:sz="4" w:space="0" w:color="C4C7C5"/>
+              <w:left w:val="single" w:sz="4" w:space="0" w:color="C4C7C5"/>
+              <w:bottom w:val="single" w:sz="4" w:space="0" w:color="C4C7C5"/>
+              <w:right w:val="single" w:sz="4" w:space="0" w:color="C4C7C5"/>
+            </w:tcBorders>
+            <w:tcMar>
+              <w:top w:w="80" w:type="dxa"/>
+              <w:left w:w="120" w:type="dxa"/>
+              <w:bottom w:w="80" w:type="dxa"/>
+              <w:right w:w="120" w:type="dxa"/>
+            </w:tcMar>
+            <w:vAlign w:val="center"/>
+            <w:hideMark/>
+          </w:tcPr>
+          <w:p>
+            <w:pPr>
+              <w:spacing w:after="320" w:line="240" w:lineRule="auto"/>
+              <w:rPr>
+                <w:rFonts w:ascii="Times New Roman" w:eastAsia="Times New Roman" w:hAnsi="Times New Roman" w:cs="Times New Roman"/>
+                <w:sz w:val="24"/>
+                <w:szCs w:val="24"/>
+              </w:rPr>
+            </w:pPr>
+            <w:r>
+              <w:rPr>
+                <w:rFonts w:ascii="Times New Roman" w:eastAsia="Times New Roman" w:hAnsi="Times New Roman" w:cs="Times New Roman"/>
+                <w:b/>
+                <w:bCs/>
+                <w:sz w:val="24"/>
+                <w:szCs w:val="24"/>
+              </w:rPr>
+              <w:t>C</w:t>
+            </w:r>
+          </w:p>
+        </w:tc>
+        <w:tc>
+          <w:tcPr>
+            <w:tcW w:w="0" w:type="auto"/>
+            <w:tcBorders>
+              <w:top w:val="single" w:sz="4" w:space="0" w:color="C4C7C5"/>
+              <w:left w:val="single" w:sz="4" w:space="0" w:color="C4C7C5"/>
+              <w:bottom w:val="single" w:sz="4" w:space="0" w:color="C4C7C5"/>
+              <w:right w:val="single" w:sz="4" w:space="0" w:color="C4C7C5"/>
+            </w:tcBorders>
+            <w:tcMar>
+              <w:top w:w="80" w:type="dxa"/>
+              <w:left w:w="120" w:type="dxa"/>
+              <w:bottom w:w="80" w:type="dxa"/>
+              <w:right w:w="120" w:type="dxa"/>
+            </w:tcMar>
+            <w:vAlign w:val="center"/>
+            <w:hideMark/>
+          </w:tcPr>
+          <w:p>
+            <w:pPr>
+              <w:spacing w:after="320" w:line="240" w:lineRule="auto"/>
+              <w:rPr>
+                <w:rFonts w:ascii="Times New Roman" w:eastAsia="Times New Roman" w:hAnsi="Times New Roman" w:cs="Times New Roman"/>
+                <w:sz w:val="24"/>
+                <w:szCs w:val="24"/>
+              </w:rPr>
+            </w:pPr>
+            <w:r>
+              <w:rPr>
+                <w:rFonts w:ascii="Times New Roman" w:eastAsia="Times New Roman" w:hAnsi="Times New Roman" w:cs="Times New Roman"/>
+                <w:sz w:val="24"/>
+                <w:szCs w:val="24"/>
+              </w:rPr>
+              <w:t>12</w:t>
+            </w:r>
+          </w:p>
+        </w:tc>
+        <w:tc>
+          <w:tcPr>
+            <w:tcW w:w="0" w:type="auto"/>
+            <w:tcBorders>
+              <w:top w:val="single" w:sz="4" w:space="0" w:color="C4C7C5"/>
+              <w:left w:val="single" w:sz="4" w:space="0" w:color="C4C7C5"/>
+              <w:bottom w:val="single" w:sz="4" w:space="0" w:color="C4C7C5"/>
+              <w:right w:val="single" w:sz="4" w:space="0" w:color="C4C7C5"/>
+            </w:tcBorders>
+            <w:tcMar>
+              <w:top w:w="80" w:type="dxa"/>
+              <w:left w:w="120" w:type="dxa"/>
+              <w:bottom w:w="80" w:type="dxa"/>
+              <w:right w:w="120" w:type="dxa"/>
+            </w:tcMar>
+            <w:vAlign w:val="center"/>
+            <w:hideMark/>
+          </w:tcPr>
+          <w:p>
+            <w:pPr>
+              <w:spacing w:after="320" w:line="240" w:lineRule="auto"/>
+              <w:rPr>
+                <w:rFonts w:ascii="Times New Roman" w:eastAsia="Times New Roman" w:hAnsi="Times New Roman" w:cs="Times New Roman"/>
+                <w:sz w:val="24"/>
+                <w:szCs w:val="24"/>
+              </w:rPr>
+            </w:pPr>
+            <w:r>
+              <w:rPr>
+                <w:rFonts w:ascii="Courier New" w:eastAsia="Times New Roman" w:hAnsi="Courier New" w:cs="Courier New"/>
+                <w:sz w:val="20"/>
+              </w:rPr>
+              <w:t>001</w:t>
+            </w:r>
+          </w:p>
+        </w:tc>
+        <w:tc>
+          <w:tcPr>
+            <w:tcW w:w="0" w:type="auto"/>
+            <w:tcBorders>
+              <w:top w:val="single" w:sz="4" w:space="0" w:color="C4C7C5"/>
+              <w:left w:val="single" w:sz="4" w:space="0" w:color="C4C7C5"/>
+              <w:bottom w:val="single" w:sz="4" w:space="0" w:color="C4C7C5"/>
+              <w:right w:val="single" w:sz="4" w:space="0" w:color="C4C7C5"/>
+            </w:tcBorders>
+            <w:tcMar>
+              <w:top w:w="80" w:type="dxa"/>
+              <w:left w:w="120" w:type="dxa"/>
+              <w:bottom w:w="80" w:type="dxa"/>
+              <w:right w:w="120" w:type="dxa"/>
+            </w:tcMar>
+            <w:vAlign w:val="center"/>
+            <w:hideMark/>
+          </w:tcPr>
+          <w:p>
+            <w:pPr>
+              <w:spacing w:after="320" w:line="240" w:lineRule="auto"/>
+              <w:rPr>
+                <w:rFonts w:ascii="Times New Roman" w:eastAsia="Times New Roman" w:hAnsi="Times New Roman" w:cs="Times New Roman"/>
+                <w:sz w:val="24"/>
+                <w:szCs w:val="24"/>
+              </w:rPr>
+            </w:pPr>
+            <w:r>
+              <w:rPr>
+                <w:rFonts w:ascii="Courier New" w:eastAsia="Times New Roman" w:hAnsi="Courier New" w:cs="Courier New"/>
+                <w:sz w:val="20"/>
+              </w:rPr>
+              <w:t>100</w:t>
+            </w:r>
+            <w:r>
+              <w:rPr>
+                <w:rFonts w:ascii="Times New Roman" w:eastAsia="Times New Roman" w:hAnsi="Times New Roman" w:cs="Times New Roman"/>
+                <w:sz w:val="24"/>
+                <w:szCs w:val="24"/>
+              </w:rPr>
+              <w:t xml:space="preserve"> (3 bits)</w:t>
+            </w:r>
+          </w:p>
+        </w:tc>
+        <w:tc>
+          <w:tcPr>
+            <w:tcW w:w="0" w:type="auto"/>
+            <w:tcBorders>
+              <w:top w:val="single" w:sz="4" w:space="0" w:color="C4C7C5"/>
+              <w:left w:val="single" w:sz="4" w:space="0" w:color="C4C7C5"/>
+              <w:bottom w:val="single" w:sz="4" w:space="0" w:color="C4C7C5"/>
+              <w:right w:val="single" w:sz="4" w:space="0" w:color="C4C7C5"/>
+            </w:tcBorders>
+            <w:tcMar>
+              <w:top w:w="80" w:type="dxa"/>
+              <w:left w:w="120" w:type="dxa"/>
+              <w:bottom w:w="80" w:type="dxa"/>
+              <w:right w:w="120" w:type="dxa"/>
+            </w:tcMar>
+            <w:vAlign w:val="center"/>
+            <w:hideMark/>
+          </w:tcPr>
+          <w:p>
+            <w:pPr>
+              <w:spacing w:after="320" w:line="240" w:lineRule="auto"/>
+              <w:rPr>
+                <w:rFonts w:ascii="Times New Roman" w:eastAsia="Times New Roman" w:hAnsi="Times New Roman" w:cs="Times New Roman"/>
+                <w:sz w:val="24"/>
+                <w:szCs w:val="24"/>
+              </w:rPr>
+            </w:pPr>
+            <w:r>
+              <w:rPr>
+                <w:rFonts w:ascii="Times New Roman" w:eastAsia="Times New Roman" w:hAnsi="Times New Roman" w:cs="Times New Roman"/>
+                <w:sz w:val="24"/>
+                <w:szCs w:val="24"/>
+              </w:rPr>
+              <w:t>Neutral</w:t>
+            </w:r>
+          </w:p>
+        </w:tc>
+      </w:tr>
+      <w:tr>
+        <w:trPr>
+          <w:tblCellSpacing w:w="15" w:type="dxa"/>
+        </w:trPr>
+        <w:tc>
+          <w:tcPr>
+            <w:tcW w:w="0" w:type="auto"/>
+            <w:tcBorders>
+              <w:top w:val="single" w:sz="4" w:space="0" w:color="C4C7C5"/>
+              <w:left w:val="single" w:sz="4" w:space="0" w:color="C4C7C5"/>
+              <w:bottom w:val="single" w:sz="4" w:space="0" w:color="C4C7C5"/>
+              <w:right w:val="single" w:sz="4" w:space="0" w:color="C4C7C5"/>
+            </w:tcBorders>
+            <w:tcMar>
+              <w:top w:w="80" w:type="dxa"/>
+              <w:left w:w="120" w:type="dxa"/>
+              <w:bottom w:w="80" w:type="dxa"/>
+              <w:right w:w="120" w:type="dxa"/>
+            </w:tcMar>
+            <w:vAlign w:val="center"/>
+            <w:hideMark/>
+          </w:tcPr>
+          <w:p>
+            <w:pPr>
+              <w:spacing w:after="320" w:line="240" w:lineRule="auto"/>
+              <w:rPr>
+                <w:rFonts w:ascii="Times New Roman" w:eastAsia="Times New Roman" w:hAnsi="Times New Roman" w:cs="Times New Roman"/>
+                <w:sz w:val="24"/>
+                <w:szCs w:val="24"/>
+              </w:rPr>
+            </w:pPr>
+            <w:r>
+              <w:rPr>
+                <w:rFonts w:ascii="Times New Roman" w:eastAsia="Times New Roman" w:hAnsi="Times New Roman" w:cs="Times New Roman"/>
+                <w:b/>
+                <w:bCs/>
+                <w:sz w:val="24"/>
+                <w:szCs w:val="24"/>
+              </w:rPr>
+              <w:t>D</w:t>
+            </w:r>
+          </w:p>
+        </w:tc>
+        <w:tc>
+          <w:tcPr>
+            <w:tcW w:w="0" w:type="auto"/>
+            <w:tcBorders>
+              <w:top w:val="single" w:sz="4" w:space="0" w:color="C4C7C5"/>
+              <w:left w:val="single" w:sz="4" w:space="0" w:color="C4C7C5"/>
+              <w:bottom w:val="single" w:sz="4" w:space="0" w:color="C4C7C5"/>
+              <w:right w:val="single" w:sz="4" w:space="0" w:color="C4C7C5"/>
+            </w:tcBorders>
+            <w:tcMar>
+              <w:top w:w="80" w:type="dxa"/>
+              <w:left w:w="120" w:type="dxa"/>
+              <w:bottom w:w="80" w:type="dxa"/>
+              <w:right w:w="120" w:type="dxa"/>
+            </w:tcMar>
+            <w:vAlign w:val="center"/>
+            <w:hideMark/>
+          </w:tcPr>
+          <w:p>
+            <w:pPr>
+              <w:spacing w:after="320" w:line="240" w:lineRule="auto"/>
+              <w:rPr>
+                <w:rFonts w:ascii="Times New Roman" w:eastAsia="Times New Roman" w:hAnsi="Times New Roman" w:cs="Times New Roman"/>
+                <w:sz w:val="24"/>
+                <w:szCs w:val="24"/>
+              </w:rPr>
+            </w:pPr>
+            <w:r>
+              <w:rPr>
+                <w:rFonts w:ascii="Times New Roman" w:eastAsia="Times New Roman" w:hAnsi="Times New Roman" w:cs="Times New Roman"/>
+                <w:sz w:val="24"/>
+                <w:szCs w:val="24"/>
+              </w:rPr>
+              <w:t>13</w:t>
+            </w:r>
+          </w:p>
+        </w:tc>
+        <w:tc>
+          <w:tcPr>
+            <w:tcW w:w="0" w:type="auto"/>
+            <w:tcBorders>
+              <w:top w:val="single" w:sz="4" w:space="0" w:color="C4C7C5"/>
+              <w:left w:val="single" w:sz="4" w:space="0" w:color="C4C7C5"/>
+              <w:bottom w:val="single" w:sz="4" w:space="0" w:color="C4C7C5"/>
+              <w:right w:val="single" w:sz="4" w:space="0" w:color="C4C7C5"/>
+            </w:tcBorders>
+            <w:tcMar>
+              <w:top w:w="80" w:type="dxa"/>
+              <w:left w:w="120" w:type="dxa"/>
+              <w:bottom w:w="80" w:type="dxa"/>
+              <w:right w:w="120" w:type="dxa"/>
+            </w:tcMar>
+            <w:vAlign w:val="center"/>
+            <w:hideMark/>
+          </w:tcPr>
+          <w:p>
+            <w:pPr>
+              <w:spacing w:after="320" w:line="240" w:lineRule="auto"/>
+              <w:rPr>
+                <w:rFonts w:ascii="Times New Roman" w:eastAsia="Times New Roman" w:hAnsi="Times New Roman" w:cs="Times New Roman"/>
+                <w:sz w:val="24"/>
+                <w:szCs w:val="24"/>
+              </w:rPr>
+            </w:pPr>
+            <w:r>
+              <w:rPr>
+                <w:rFonts w:ascii="Courier New" w:eastAsia="Times New Roman" w:hAnsi="Courier New" w:cs="Courier New"/>
+                <w:sz w:val="20"/>
+              </w:rPr>
+              <w:t>010</w:t>
+            </w:r>
+          </w:p>
+        </w:tc>
+        <w:tc>
+          <w:tcPr>
+            <w:tcW w:w="0" w:type="auto"/>
+            <w:tcBorders>
+              <w:top w:val="single" w:sz="4" w:space="0" w:color="C4C7C5"/>
+              <w:left w:val="single" w:sz="4" w:space="0" w:color="C4C7C5"/>
+              <w:bottom w:val="single" w:sz="4" w:space="0" w:color="C4C7C5"/>
+              <w:right w:val="single" w:sz="4" w:space="0" w:color="C4C7C5"/>
+            </w:tcBorders>
+            <w:tcMar>
+              <w:top w:w="80" w:type="dxa"/>
+              <w:left w:w="120" w:type="dxa"/>
+              <w:bottom w:w="80" w:type="dxa"/>
+              <w:right w:w="120" w:type="dxa"/>
+            </w:tcMar>
+            <w:vAlign w:val="center"/>
+            <w:hideMark/>
+          </w:tcPr>
+          <w:p>
+            <w:pPr>
+              <w:spacing w:after="320" w:line="240" w:lineRule="auto"/>
+              <w:rPr>
+                <w:rFonts w:ascii="Times New Roman" w:eastAsia="Times New Roman" w:hAnsi="Times New Roman" w:cs="Times New Roman"/>
+                <w:sz w:val="24"/>
+                <w:szCs w:val="24"/>
+              </w:rPr>
+            </w:pPr>
+            <w:r>
+              <w:rPr>
+                <w:rFonts w:ascii="Courier New" w:eastAsia="Times New Roman" w:hAnsi="Courier New" w:cs="Courier New"/>
+                <w:sz w:val="20"/>
+              </w:rPr>
+              <w:t>101</w:t>
+            </w:r>
+            <w:r>
+              <w:rPr>
+                <w:rFonts w:ascii="Times New Roman" w:eastAsia="Times New Roman" w:hAnsi="Times New Roman" w:cs="Times New Roman"/>
+                <w:sz w:val="24"/>
+                <w:szCs w:val="24"/>
+              </w:rPr>
+              <w:t xml:space="preserve"> (3 bits)</w:t>
+            </w:r>
+          </w:p>
+        </w:tc>
+        <w:tc>
+          <w:tcPr>
+            <w:tcW w:w="0" w:type="auto"/>
+            <w:tcBorders>
+              <w:top w:val="single" w:sz="4" w:space="0" w:color="C4C7C5"/>
+              <w:left w:val="single" w:sz="4" w:space="0" w:color="C4C7C5"/>
+              <w:bottom w:val="single" w:sz="4" w:space="0" w:color="C4C7C5"/>
+              <w:right w:val="single" w:sz="4" w:space="0" w:color="C4C7C5"/>
+            </w:tcBorders>
+            <w:tcMar>
+              <w:top w:w="80" w:type="dxa"/>
+              <w:left w:w="120" w:type="dxa"/>
+              <w:bottom w:w="80" w:type="dxa"/>
+              <w:right w:w="120" w:type="dxa"/>
+            </w:tcMar>
+            <w:vAlign w:val="center"/>
+            <w:hideMark/>
+          </w:tcPr>
+          <w:p>
+            <w:pPr>
+              <w:spacing w:after="320" w:line="240" w:lineRule="auto"/>
+              <w:rPr>
+                <w:rFonts w:ascii="Times New Roman" w:eastAsia="Times New Roman" w:hAnsi="Times New Roman" w:cs="Times New Roman"/>
+                <w:sz w:val="24"/>
+                <w:szCs w:val="24"/>
+              </w:rPr>
+            </w:pPr>
+            <w:r>
+              <w:rPr>
+                <w:rFonts w:ascii="Times New Roman" w:eastAsia="Times New Roman" w:hAnsi="Times New Roman" w:cs="Times New Roman"/>
+                <w:sz w:val="24"/>
+                <w:szCs w:val="24"/>
+              </w:rPr>
+              <w:t>Neutral</w:t>
+            </w:r>
+          </w:p>
+        </w:tc>
+      </w:tr>
+      <w:tr>
+        <w:trPr>
+          <w:tblCellSpacing w:w="15" w:type="dxa"/>
+        </w:trPr>
+        <w:tc>
+          <w:tcPr>
+            <w:tcW w:w="0" w:type="auto"/>
+            <w:tcBorders>
+              <w:top w:val="single" w:sz="4" w:space="0" w:color="C4C7C5"/>
+              <w:left w:val="single" w:sz="4" w:space="0" w:color="C4C7C5"/>
+              <w:bottom w:val="single" w:sz="4" w:space="0" w:color="C4C7C5"/>
+              <w:right w:val="single" w:sz="4" w:space="0" w:color="C4C7C5"/>
+            </w:tcBorders>
+            <w:tcMar>
+              <w:top w:w="80" w:type="dxa"/>
+              <w:left w:w="120" w:type="dxa"/>
+              <w:bottom w:w="80" w:type="dxa"/>
+              <w:right w:w="120" w:type="dxa"/>
+            </w:tcMar>
+            <w:vAlign w:val="center"/>
+            <w:hideMark/>
+          </w:tcPr>
+          <w:p>
+            <w:pPr>
+              <w:spacing w:after="320" w:line="240" w:lineRule="auto"/>
+              <w:rPr>
+                <w:rFonts w:ascii="Times New Roman" w:eastAsia="Times New Roman" w:hAnsi="Times New Roman" w:cs="Times New Roman"/>
+                <w:sz w:val="24"/>
+                <w:szCs w:val="24"/>
+              </w:rPr>
+            </w:pPr>
+            <w:r>
+              <w:rPr>
+                <w:rFonts w:ascii="Times New Roman" w:eastAsia="Times New Roman" w:hAnsi="Times New Roman" w:cs="Times New Roman"/>
+                <w:b/>
+                <w:bCs/>
+                <w:sz w:val="24"/>
+                <w:szCs w:val="24"/>
+              </w:rPr>
+              <w:t>E</w:t>
+            </w:r>
+          </w:p>
+        </w:tc>
+        <w:tc>
+          <w:tcPr>
+            <w:tcW w:w="0" w:type="auto"/>
+            <w:tcBorders>
+              <w:top w:val="single" w:sz="4" w:space="0" w:color="C4C7C5"/>
+              <w:left w:val="single" w:sz="4" w:space="0" w:color="C4C7C5"/>
+              <w:bottom w:val="single" w:sz="4" w:space="0" w:color="C4C7C5"/>
+              <w:right w:val="single" w:sz="4" w:space="0" w:color="C4C7C5"/>
+            </w:tcBorders>
+            <w:tcMar>
+              <w:top w:w="80" w:type="dxa"/>
+              <w:left w:w="120" w:type="dxa"/>
+              <w:bottom w:w="80" w:type="dxa"/>
+              <w:right w:w="120" w:type="dxa"/>
+            </w:tcMar>
+            <w:vAlign w:val="center"/>
+            <w:hideMark/>
+          </w:tcPr>
+          <w:p>
+            <w:pPr>
+              <w:spacing w:after="320" w:line="240" w:lineRule="auto"/>
+              <w:rPr>
+                <w:rFonts w:ascii="Times New Roman" w:eastAsia="Times New Roman" w:hAnsi="Times New Roman" w:cs="Times New Roman"/>
+                <w:sz w:val="24"/>
+                <w:szCs w:val="24"/>
+              </w:rPr>
+            </w:pPr>
+            <w:r>
+              <w:rPr>
+                <w:rFonts w:ascii="Times New Roman" w:eastAsia="Times New Roman" w:hAnsi="Times New Roman" w:cs="Times New Roman"/>
+                <w:sz w:val="24"/>
+                <w:szCs w:val="24"/>
+              </w:rPr>
+              <w:t>16</w:t>
+            </w:r>
+          </w:p>
+        </w:tc>
+        <w:tc>
+          <w:tcPr>
+            <w:tcW w:w="0" w:type="auto"/>
+            <w:tcBorders>
+              <w:top w:val="single" w:sz="4" w:space="0" w:color="C4C7C5"/>
+              <w:left w:val="single" w:sz="4" w:space="0" w:color="C4C7C5"/>
+              <w:bottom w:val="single" w:sz="4" w:space="0" w:color="C4C7C5"/>
+              <w:right w:val="single" w:sz="4" w:space="0" w:color="C4C7C5"/>
+            </w:tcBorders>
+            <w:tcMar>
+              <w:top w:w="80" w:type="dxa"/>
+              <w:left w:w="120" w:type="dxa"/>
+              <w:bottom w:w="80" w:type="dxa"/>
+              <w:right w:w="120" w:type="dxa"/>
+            </w:tcMar>
+            <w:vAlign w:val="center"/>
+            <w:hideMark/>
+          </w:tcPr>
+          <w:p>
+            <w:pPr>
+              <w:spacing w:after="320" w:line="240" w:lineRule="auto"/>
+              <w:rPr>
+                <w:rFonts w:ascii="Times New Roman" w:eastAsia="Times New Roman" w:hAnsi="Times New Roman" w:cs="Times New Roman"/>
+                <w:sz w:val="24"/>
+                <w:szCs w:val="24"/>
+              </w:rPr>
+            </w:pPr>
+            <w:r>
+              <w:rPr>
+                <w:rFonts w:ascii="Courier New" w:eastAsia="Times New Roman" w:hAnsi="Courier New" w:cs="Courier New"/>
+                <w:sz w:val="20"/>
+              </w:rPr>
+              <w:t>011</w:t>
+            </w:r>
+          </w:p>
+        </w:tc>
+        <w:tc>
+          <w:tcPr>
+            <w:tcW w:w="0" w:type="auto"/>
+            <w:tcBorders>
+              <w:top w:val="single" w:sz="4" w:space="0" w:color="C4C7C5"/>
+              <w:left w:val="single" w:sz="4" w:space="0" w:color="C4C7C5"/>
+              <w:bottom w:val="single" w:sz="4" w:space="0" w:color="C4C7C5"/>
+              <w:right w:val="single" w:sz="4" w:space="0" w:color="C4C7C5"/>
+            </w:tcBorders>
+            <w:tcMar>
+              <w:top w:w="80" w:type="dxa"/>
+              <w:left w:w="120" w:type="dxa"/>
+              <w:bottom w:w="80" w:type="dxa"/>
+              <w:right w:w="120" w:type="dxa"/>
+            </w:tcMar>
+            <w:vAlign w:val="center"/>
+            <w:hideMark/>
+          </w:tcPr>
+          <w:p>
+            <w:pPr>
+              <w:spacing w:after="320" w:line="240" w:lineRule="auto"/>
+              <w:rPr>
+                <w:rFonts w:ascii="Times New Roman" w:eastAsia="Times New Roman" w:hAnsi="Times New Roman" w:cs="Times New Roman"/>
+                <w:sz w:val="24"/>
+                <w:szCs w:val="24"/>
+              </w:rPr>
+            </w:pPr>
+            <w:r>
+              <w:rPr>
+                <w:rFonts w:ascii="Courier New" w:eastAsia="Times New Roman" w:hAnsi="Courier New" w:cs="Courier New"/>
+                <w:sz w:val="20"/>
+              </w:rPr>
+              <w:t>111</w:t>
+            </w:r>
+            <w:r>
+              <w:rPr>
+                <w:rFonts w:ascii="Times New Roman" w:eastAsia="Times New Roman" w:hAnsi="Times New Roman" w:cs="Times New Roman"/>
+                <w:sz w:val="24"/>
+                <w:szCs w:val="24"/>
+              </w:rPr>
+              <w:t xml:space="preserve"> (3 bits)</w:t>
+            </w:r>
+          </w:p>
+        </w:tc>
+        <w:tc>
+          <w:tcPr>
+            <w:tcW w:w="0" w:type="auto"/>
+            <w:tcBorders>
+              <w:top w:val="single" w:sz="4" w:space="0" w:color="C4C7C5"/>
+              <w:left w:val="single" w:sz="4" w:space="0" w:color="C4C7C5"/>
+              <w:bottom w:val="single" w:sz="4" w:space="0" w:color="C4C7C5"/>
+              <w:right w:val="single" w:sz="4" w:space="0" w:color="C4C7C5"/>
+            </w:tcBorders>
+            <w:tcMar>
+              <w:top w:w="80" w:type="dxa"/>
+              <w:left w:w="120" w:type="dxa"/>
+              <w:bottom w:w="80" w:type="dxa"/>
+              <w:right w:w="120" w:type="dxa"/>
+            </w:tcMar>
+            <w:vAlign w:val="center"/>
+            <w:hideMark/>
+          </w:tcPr>
+          <w:p>
+            <w:pPr>
+              <w:spacing w:after="320" w:line="240" w:lineRule="auto"/>
+              <w:rPr>
+                <w:rFonts w:ascii="Times New Roman" w:eastAsia="Times New Roman" w:hAnsi="Times New Roman" w:cs="Times New Roman"/>
+                <w:sz w:val="24"/>
+                <w:szCs w:val="24"/>
+              </w:rPr>
+            </w:pPr>
+            <w:r>
+              <w:rPr>
+                <w:rFonts w:ascii="Times New Roman" w:eastAsia="Times New Roman" w:hAnsi="Times New Roman" w:cs="Times New Roman"/>
+                <w:sz w:val="24"/>
+                <w:szCs w:val="24"/>
+              </w:rPr>
+              <w:t>Neutral</w:t>
+            </w:r>
+          </w:p>
+        </w:tc>
+      </w:tr>
+      <w:tr>
+        <w:trPr>
+          <w:tblCellSpacing w:w="15" w:type="dxa"/>
+        </w:trPr>
+        <w:tc>
+          <w:tcPr>
+            <w:tcW w:w="0" w:type="auto"/>
+            <w:tcBorders>
+              <w:top w:val="single" w:sz="4" w:space="0" w:color="C4C7C5"/>
+              <w:left w:val="single" w:sz="4" w:space="0" w:color="C4C7C5"/>
+              <w:bottom w:val="single" w:sz="4" w:space="0" w:color="C4C7C5"/>
+              <w:right w:val="single" w:sz="4" w:space="0" w:color="C4C7C5"/>
+            </w:tcBorders>
+            <w:tcMar>
+              <w:top w:w="80" w:type="dxa"/>
+              <w:left w:w="120" w:type="dxa"/>
+              <w:bottom w:w="80" w:type="dxa"/>
+              <w:right w:w="120" w:type="dxa"/>
+            </w:tcMar>
+            <w:vAlign w:val="center"/>
+            <w:hideMark/>
+          </w:tcPr>
+          <w:p>
+            <w:pPr>
+              <w:spacing w:after="320" w:line="240" w:lineRule="auto"/>
+              <w:rPr>
+                <w:rFonts w:ascii="Times New Roman" w:eastAsia="Times New Roman" w:hAnsi="Times New Roman" w:cs="Times New Roman"/>
+                <w:sz w:val="24"/>
+                <w:szCs w:val="24"/>
+              </w:rPr>
+            </w:pPr>
+            <w:r>
+              <w:rPr>
+                <w:rFonts w:ascii="Times New Roman" w:eastAsia="Times New Roman" w:hAnsi="Times New Roman" w:cs="Times New Roman"/>
+                <w:b/>
+                <w:bCs/>
+                <w:sz w:val="24"/>
+                <w:szCs w:val="24"/>
+              </w:rPr>
+              <w:t>A</w:t>
+            </w:r>
+          </w:p>
+        </w:tc>
+        <w:tc>
+          <w:tcPr>
+            <w:tcW w:w="0" w:type="auto"/>
+            <w:tcBorders>
+              <w:top w:val="single" w:sz="4" w:space="0" w:color="C4C7C5"/>
+              <w:left w:val="single" w:sz="4" w:space="0" w:color="C4C7C5"/>
+              <w:bottom w:val="single" w:sz="4" w:space="0" w:color="C4C7C5"/>
+              <w:right w:val="single" w:sz="4" w:space="0" w:color="C4C7C5"/>
+            </w:tcBorders>
+            <w:tcMar>
+              <w:top w:w="80" w:type="dxa"/>
+              <w:left w:w="120" w:type="dxa"/>
+              <w:bottom w:w="80" w:type="dxa"/>
+              <w:right w:w="120" w:type="dxa"/>
+            </w:tcMar>
+            <w:vAlign w:val="center"/>
+            <w:hideMark/>
+          </w:tcPr>
+          <w:p>
+            <w:pPr>
+              <w:spacing w:after="320" w:line="240" w:lineRule="auto"/>
+              <w:rPr>
+                <w:rFonts w:ascii="Times New Roman" w:eastAsia="Times New Roman" w:hAnsi="Times New Roman" w:cs="Times New Roman"/>
+                <w:sz w:val="24"/>
+                <w:szCs w:val="24"/>
+              </w:rPr>
+            </w:pPr>
+            <w:r>
+              <w:rPr>
+                <w:rFonts w:ascii="Times New Roman" w:eastAsia="Times New Roman" w:hAnsi="Times New Roman" w:cs="Times New Roman"/>
+                <w:sz w:val="24"/>
+                <w:szCs w:val="24"/>
+              </w:rPr>
+              <w:t>5</w:t>
+            </w:r>
+          </w:p>
+        </w:tc>
+        <w:tc>
+          <w:tcPr>
+            <w:tcW w:w="0" w:type="auto"/>
+            <w:tcBorders>
+              <w:top w:val="single" w:sz="4" w:space="0" w:color="C4C7C5"/>
+              <w:left w:val="single" w:sz="4" w:space="0" w:color="C4C7C5"/>
+              <w:bottom w:val="single" w:sz="4" w:space="0" w:color="C4C7C5"/>
+              <w:right w:val="single" w:sz="4" w:space="0" w:color="C4C7C5"/>
+            </w:tcBorders>
+            <w:tcMar>
+              <w:top w:w="80" w:type="dxa"/>
+              <w:left w:w="120" w:type="dxa"/>
+              <w:bottom w:w="80" w:type="dxa"/>
+              <w:right w:w="120" w:type="dxa"/>
+            </w:tcMar>
+            <w:vAlign w:val="center"/>
+            <w:hideMark/>
+          </w:tcPr>
+          <w:p>
+            <w:pPr>
+              <w:spacing w:after="320" w:line="240" w:lineRule="auto"/>
+              <w:rPr>
+                <w:rFonts w:ascii="Times New Roman" w:eastAsia="Times New Roman" w:hAnsi="Times New Roman" w:cs="Times New Roman"/>
+                <w:sz w:val="24"/>
+                <w:szCs w:val="24"/>
+              </w:rPr>
+            </w:pPr>
+            <w:r>
+              <w:rPr>
+                <w:rFonts w:ascii="Courier New" w:eastAsia="Times New Roman" w:hAnsi="Courier New" w:cs="Courier New"/>
+                <w:sz w:val="20"/>
+              </w:rPr>
+              <w:t>100</w:t>
+            </w:r>
+          </w:p>
+        </w:tc>
+        <w:tc>
+          <w:tcPr>
+            <w:tcW w:w="0" w:type="auto"/>
+            <w:tcBorders>
+              <w:top w:val="single" w:sz="4" w:space="0" w:color="C4C7C5"/>
+              <w:left w:val="single" w:sz="4" w:space="0" w:color="C4C7C5"/>
+              <w:bottom w:val="single" w:sz="4" w:space="0" w:color="C4C7C5"/>
+              <w:right w:val="single" w:sz="4" w:space="0" w:color="C4C7C5"/>
+            </w:tcBorders>
+            <w:tcMar>
+              <w:top w:w="80" w:type="dxa"/>
+              <w:left w:w="120" w:type="dxa"/>
+              <w:bottom w:w="80" w:type="dxa"/>
+              <w:right w:w="120" w:type="dxa"/>
+            </w:tcMar>
+            <w:vAlign w:val="center"/>
+            <w:hideMark/>
+          </w:tcPr>
+          <w:p>
+            <w:pPr>
+              <w:spacing w:after="320" w:line="240" w:lineRule="auto"/>
+              <w:rPr>
+                <w:rFonts w:ascii="Times New Roman" w:eastAsia="Times New Roman" w:hAnsi="Times New Roman" w:cs="Times New Roman"/>
+                <w:sz w:val="24"/>
+                <w:szCs w:val="24"/>
+              </w:rPr>
+            </w:pPr>
+            <w:r>
+              <w:rPr>
+                <w:rFonts w:ascii="Courier New" w:eastAsia="Times New Roman" w:hAnsi="Courier New" w:cs="Courier New"/>
+                <w:sz w:val="20"/>
+              </w:rPr>
+              <w:t>1100</w:t>
+            </w:r>
+            <w:r>
+              <w:rPr>
+                <w:rFonts w:ascii="Times New Roman" w:eastAsia="Times New Roman" w:hAnsi="Times New Roman" w:cs="Times New Roman"/>
+                <w:sz w:val="24"/>
+                <w:szCs w:val="24"/>
+              </w:rPr>
+              <w:t xml:space="preserve"> (4 bits)</w:t>
+            </w:r>
+          </w:p>
+        </w:tc>
+        <w:tc>
+          <w:tcPr>
+            <w:tcW w:w="0" w:type="auto"/>
+            <w:tcBorders>
+              <w:top w:val="single" w:sz="4" w:space="0" w:color="C4C7C5"/>
+              <w:left w:val="single" w:sz="4" w:space="0" w:color="C4C7C5"/>
+              <w:bottom w:val="single" w:sz="4" w:space="0" w:color="C4C7C5"/>
+              <w:right w:val="single" w:sz="4" w:space="0" w:color="C4C7C5"/>
+            </w:tcBorders>
+            <w:tcMar>
+              <w:top w:w="80" w:type="dxa"/>
+              <w:left w:w="120" w:type="dxa"/>
+              <w:bottom w:w="80" w:type="dxa"/>
+              <w:right w:w="120" w:type="dxa"/>
+            </w:tcMar>
+            <w:vAlign w:val="center"/>
+            <w:hideMark/>
+          </w:tcPr>
+          <w:p>
+            <w:pPr>
+              <w:spacing w:after="320" w:line="240" w:lineRule="auto"/>
+              <w:rPr>
+                <w:rFonts w:ascii="Times New Roman" w:eastAsia="Times New Roman" w:hAnsi="Times New Roman" w:cs="Times New Roman"/>
+                <w:sz w:val="24"/>
+                <w:szCs w:val="24"/>
+              </w:rPr>
+            </w:pPr>
+            <w:r>
+              <w:rPr>
+                <w:rFonts w:ascii="Times New Roman" w:eastAsia="Times New Roman" w:hAnsi="Times New Roman" w:cs="Times New Roman"/>
+                <w:sz w:val="24"/>
+                <w:szCs w:val="24"/>
+              </w:rPr>
+              <w:t>Costlier</w:t>
+            </w:r>
+          </w:p>
+        </w:tc>
+      </w:tr>
+      <w:tr>
+        <w:trPr>
+          <w:tblCellSpacing w:w="15" w:type="dxa"/>
+        </w:trPr>
+        <w:tc>
+          <w:tcPr>
+            <w:tcW w:w="0" w:type="auto"/>
+            <w:tcBorders>
+              <w:top w:val="single" w:sz="4" w:space="0" w:color="C4C7C5"/>
+              <w:left w:val="single" w:sz="4" w:space="0" w:color="C4C7C5"/>
+              <w:bottom w:val="single" w:sz="4" w:space="0" w:color="C4C7C5"/>
+              <w:right w:val="single" w:sz="4" w:space="0" w:color="C4C7C5"/>
+            </w:tcBorders>
+            <w:tcMar>
+              <w:top w:w="80" w:type="dxa"/>
+              <w:left w:w="120" w:type="dxa"/>
+              <w:bottom w:w="80" w:type="dxa"/>
+              <w:right w:w="120" w:type="dxa"/>
+            </w:tcMar>
+            <w:vAlign w:val="center"/>
+            <w:hideMark/>
+          </w:tcPr>
+          <w:p>
+            <w:pPr>
+              <w:spacing w:after="320" w:line="240" w:lineRule="auto"/>
+              <w:rPr>
+                <w:rFonts w:ascii="Times New Roman" w:eastAsia="Times New Roman" w:hAnsi="Times New Roman" w:cs="Times New Roman"/>
+                <w:sz w:val="24"/>
+                <w:szCs w:val="24"/>
+              </w:rPr>
+            </w:pPr>
+            <w:r>
+              <w:rPr>
+                <w:rFonts w:ascii="Times New Roman" w:eastAsia="Times New Roman" w:hAnsi="Times New Roman" w:cs="Times New Roman"/>
+                <w:b/>
+                <w:bCs/>
+                <w:sz w:val="24"/>
+                <w:szCs w:val="24"/>
+              </w:rPr>
+              <w:t>B</w:t>
+            </w:r>
+          </w:p>
+        </w:tc>
+        <w:tc>
+          <w:tcPr>
+            <w:tcW w:w="0" w:type="auto"/>
+            <w:tcBorders>
+              <w:top w:val="single" w:sz="4" w:space="0" w:color="C4C7C5"/>
+              <w:left w:val="single" w:sz="4" w:space="0" w:color="C4C7C5"/>
+              <w:bottom w:val="single" w:sz="4" w:space="0" w:color="C4C7C5"/>
+              <w:right w:val="single" w:sz="4" w:space="0" w:color="C4C7C5"/>
+            </w:tcBorders>
+            <w:tcMar>
+              <w:top w:w="80" w:type="dxa"/>
+              <w:left w:w="120" w:type="dxa"/>
+              <w:bottom w:w="80" w:type="dxa"/>
+              <w:right w:w="120" w:type="dxa"/>
+            </w:tcMar>
+            <w:vAlign w:val="center"/>
+            <w:hideMark/>
+          </w:tcPr>
+          <w:p>
+            <w:pPr>
+              <w:spacing w:after="320" w:line="240" w:lineRule="auto"/>
+              <w:rPr>
+                <w:rFonts w:ascii="Times New Roman" w:eastAsia="Times New Roman" w:hAnsi="Times New Roman" w:cs="Times New Roman"/>
+                <w:sz w:val="24"/>
+                <w:szCs w:val="24"/>
+              </w:rPr>
+            </w:pPr>
+            <w:r>
+              <w:rPr>
+                <w:rFonts w:ascii="Times New Roman" w:eastAsia="Times New Roman" w:hAnsi="Times New Roman" w:cs="Times New Roman"/>
+                <w:sz w:val="24"/>
+                <w:szCs w:val="24"/>
+              </w:rPr>
+              <w:t>9</w:t>
+            </w:r>
+          </w:p>
+        </w:tc>
+        <w:tc>
+          <w:tcPr>
+            <w:tcW w:w="0" w:type="auto"/>
+            <w:tcBorders>
+              <w:top w:val="single" w:sz="4" w:space="0" w:color="C4C7C5"/>
+              <w:left w:val="single" w:sz="4" w:space="0" w:color="C4C7C5"/>
+              <w:bottom w:val="single" w:sz="4" w:space="0" w:color="C4C7C5"/>
+              <w:right w:val="single" w:sz="4" w:space="0" w:color="C4C7C5"/>
+            </w:tcBorders>
+            <w:tcMar>
+              <w:top w:w="80" w:type="dxa"/>
+              <w:left w:w="120" w:type="dxa"/>
+              <w:bottom w:w="80" w:type="dxa"/>
+              <w:right w:w="120" w:type="dxa"/>
+            </w:tcMar>
+            <w:vAlign w:val="center"/>
+            <w:hideMark/>
+          </w:tcPr>
+          <w:p>
+            <w:pPr>
+              <w:spacing w:after="320" w:line="240" w:lineRule="auto"/>
+              <w:rPr>
+                <w:rFonts w:ascii="Times New Roman" w:eastAsia="Times New Roman" w:hAnsi="Times New Roman" w:cs="Times New Roman"/>
+                <w:sz w:val="24"/>
+                <w:szCs w:val="24"/>
+              </w:rPr>
+            </w:pPr>
+            <w:r>
+              <w:rPr>
+                <w:rFonts w:ascii="Courier New" w:eastAsia="Times New Roman" w:hAnsi="Courier New" w:cs="Courier New"/>
+                <w:sz w:val="20"/>
+              </w:rPr>
+              <w:t>101</w:t>
+            </w:r>
+          </w:p>
+        </w:tc>
+        <w:tc>
+          <w:tcPr>
+            <w:tcW w:w="0" w:type="auto"/>
+            <w:tcBorders>
+              <w:top w:val="single" w:sz="4" w:space="0" w:color="C4C7C5"/>
+              <w:left w:val="single" w:sz="4" w:space="0" w:color="C4C7C5"/>
+              <w:bottom w:val="single" w:sz="4" w:space="0" w:color="C4C7C5"/>
+              <w:right w:val="single" w:sz="4" w:space="0" w:color="C4C7C5"/>
+            </w:tcBorders>
+            <w:tcMar>
+              <w:top w:w="80" w:type="dxa"/>
+              <w:left w:w="120" w:type="dxa"/>
+              <w:bottom w:w="80" w:type="dxa"/>
+              <w:right w:w="120" w:type="dxa"/>
+            </w:tcMar>
+            <w:vAlign w:val="center"/>
+            <w:hideMark/>
+          </w:tcPr>
+          <w:p>
+            <w:pPr>
+              <w:spacing w:after="320" w:line="240" w:lineRule="auto"/>
+              <w:rPr>
+                <w:rFonts w:ascii="Times New Roman" w:eastAsia="Times New Roman" w:hAnsi="Times New Roman" w:cs="Times New Roman"/>
+                <w:sz w:val="24"/>
+                <w:szCs w:val="24"/>
+              </w:rPr>
+            </w:pPr>
+            <w:r>
+              <w:rPr>
+                <w:rFonts w:ascii="Courier New" w:eastAsia="Times New Roman" w:hAnsi="Courier New" w:cs="Courier New"/>
+                <w:sz w:val="20"/>
+              </w:rPr>
+              <w:t>1101</w:t>
+            </w:r>
+            <w:r>
+              <w:rPr>
+                <w:rFonts w:ascii="Times New Roman" w:eastAsia="Times New Roman" w:hAnsi="Times New Roman" w:cs="Times New Roman"/>
+                <w:sz w:val="24"/>
+                <w:szCs w:val="24"/>
+              </w:rPr>
+              <w:t xml:space="preserve"> (4 bits)</w:t>
+            </w:r>
+          </w:p>
+        </w:tc>
+        <w:tc>
+          <w:tcPr>
+            <w:tcW w:w="0" w:type="auto"/>
+            <w:tcBorders>
+              <w:top w:val="single" w:sz="4" w:space="0" w:color="C4C7C5"/>
+              <w:left w:val="single" w:sz="4" w:space="0" w:color="C4C7C5"/>
+              <w:bottom w:val="single" w:sz="4" w:space="0" w:color="C4C7C5"/>
+              <w:right w:val="single" w:sz="4" w:space="0" w:color="C4C7C5"/>
+            </w:tcBorders>
+            <w:tcMar>
+              <w:top w:w="80" w:type="dxa"/>
+              <w:left w:w="120" w:type="dxa"/>
+              <w:bottom w:w="80" w:type="dxa"/>
+              <w:right w:w="120" w:type="dxa"/>
+            </w:tcMar>
+            <w:vAlign w:val="center"/>
+            <w:hideMark/>
+          </w:tcPr>
+          <w:p>
+            <w:pPr>
+              <w:spacing w:after="320" w:line="240" w:lineRule="auto"/>
+              <w:rPr>
+                <w:rFonts w:ascii="Times New Roman" w:eastAsia="Times New Roman" w:hAnsi="Times New Roman" w:cs="Times New Roman"/>
+                <w:sz w:val="24"/>
+                <w:szCs w:val="24"/>
+              </w:rPr>
+            </w:pPr>
+            <w:r>
+              <w:rPr>
+                <w:rFonts w:ascii="Times New Roman" w:eastAsia="Times New Roman" w:hAnsi="Times New Roman" w:cs="Times New Roman"/>
+                <w:sz w:val="24"/>
+                <w:szCs w:val="24"/>
+              </w:rPr>
+              <w:t>Costlier</w:t>
+            </w:r>
+          </w:p>
+        </w:tc>
+      </w:tr>
+    </w:tbl>
+    <w:p>
+      <w:pPr>
+        <w:jc w:val="center"/>
+        <w:rPr>
+          <w:b/>
+          <w:sz w:val="36"/>
+          <w:szCs w:val="36"/>
+        </w:rPr>
+      </w:pPr>
+    </w:p>
     <w:sectPr>
       <w:pgSz w:w="12240" w:h="15840"/>
       <w:pgMar w:top="1440" w:right="1440" w:bottom="1440" w:left="1440" w:header="720" w:footer="720" w:gutter="0"/>
@@ -4046,6 +6783,155 @@
     </w:lvl>
   </w:abstractNum>
   <w:abstractNum w:abstractNumId="6">
+    <w:nsid w:val="39496B23"/>
+    <w:multiLevelType w:val="multilevel"/>
+    <w:tmpl w:val="C262B5DA"/>
+    <w:lvl w:ilvl="0">
+      <w:start w:val="1"/>
+      <w:numFmt w:val="bullet"/>
+      <w:lvlText w:val=""/>
+      <w:lvlJc w:val="left"/>
+      <w:pPr>
+        <w:tabs>
+          <w:tab w:val="num" w:pos="720"/>
+        </w:tabs>
+        <w:ind w:left="720" w:hanging="360"/>
+      </w:pPr>
+      <w:rPr>
+        <w:rFonts w:ascii="Symbol" w:hAnsi="Symbol" w:hint="default"/>
+        <w:sz w:val="20"/>
+      </w:rPr>
+    </w:lvl>
+    <w:lvl w:ilvl="1" w:tentative="1">
+      <w:start w:val="1"/>
+      <w:numFmt w:val="bullet"/>
+      <w:lvlText w:val="o"/>
+      <w:lvlJc w:val="left"/>
+      <w:pPr>
+        <w:tabs>
+          <w:tab w:val="num" w:pos="1440"/>
+        </w:tabs>
+        <w:ind w:left="1440" w:hanging="360"/>
+      </w:pPr>
+      <w:rPr>
+        <w:rFonts w:ascii="Courier New" w:hAnsi="Courier New" w:hint="default"/>
+        <w:sz w:val="20"/>
+      </w:rPr>
+    </w:lvl>
+    <w:lvl w:ilvl="2" w:tentative="1">
+      <w:start w:val="1"/>
+      <w:numFmt w:val="bullet"/>
+      <w:lvlText w:val=""/>
+      <w:lvlJc w:val="left"/>
+      <w:pPr>
+        <w:tabs>
+          <w:tab w:val="num" w:pos="2160"/>
+        </w:tabs>
+        <w:ind w:left="2160" w:hanging="360"/>
+      </w:pPr>
+      <w:rPr>
+        <w:rFonts w:ascii="Wingdings" w:hAnsi="Wingdings" w:hint="default"/>
+        <w:sz w:val="20"/>
+      </w:rPr>
+    </w:lvl>
+    <w:lvl w:ilvl="3" w:tentative="1">
+      <w:start w:val="1"/>
+      <w:numFmt w:val="bullet"/>
+      <w:lvlText w:val=""/>
+      <w:lvlJc w:val="left"/>
+      <w:pPr>
+        <w:tabs>
+          <w:tab w:val="num" w:pos="2880"/>
+        </w:tabs>
+        <w:ind w:left="2880" w:hanging="360"/>
+      </w:pPr>
+      <w:rPr>
+        <w:rFonts w:ascii="Wingdings" w:hAnsi="Wingdings" w:hint="default"/>
+        <w:sz w:val="20"/>
+      </w:rPr>
+    </w:lvl>
+    <w:lvl w:ilvl="4" w:tentative="1">
+      <w:start w:val="1"/>
+      <w:numFmt w:val="bullet"/>
+      <w:lvlText w:val=""/>
+      <w:lvlJc w:val="left"/>
+      <w:pPr>
+        <w:tabs>
+          <w:tab w:val="num" w:pos="3600"/>
+        </w:tabs>
+        <w:ind w:left="3600" w:hanging="360"/>
+      </w:pPr>
+      <w:rPr>
+        <w:rFonts w:ascii="Wingdings" w:hAnsi="Wingdings" w:hint="default"/>
+        <w:sz w:val="20"/>
+      </w:rPr>
+    </w:lvl>
+    <w:lvl w:ilvl="5" w:tentative="1">
+      <w:start w:val="1"/>
+      <w:numFmt w:val="bullet"/>
+      <w:lvlText w:val=""/>
+      <w:lvlJc w:val="left"/>
+      <w:pPr>
+        <w:tabs>
+          <w:tab w:val="num" w:pos="4320"/>
+        </w:tabs>
+        <w:ind w:left="4320" w:hanging="360"/>
+      </w:pPr>
+      <w:rPr>
+        <w:rFonts w:ascii="Wingdings" w:hAnsi="Wingdings" w:hint="default"/>
+        <w:sz w:val="20"/>
+      </w:rPr>
+    </w:lvl>
+    <w:lvl w:ilvl="6" w:tentative="1">
+      <w:start w:val="1"/>
+      <w:numFmt w:val="bullet"/>
+      <w:lvlText w:val=""/>
+      <w:lvlJc w:val="left"/>
+      <w:pPr>
+        <w:tabs>
+          <w:tab w:val="num" w:pos="5040"/>
+        </w:tabs>
+        <w:ind w:left="5040" w:hanging="360"/>
+      </w:pPr>
+      <w:rPr>
+        <w:rFonts w:ascii="Wingdings" w:hAnsi="Wingdings" w:hint="default"/>
+        <w:sz w:val="20"/>
+      </w:rPr>
+    </w:lvl>
+    <w:lvl w:ilvl="7" w:tentative="1">
+      <w:start w:val="1"/>
+      <w:numFmt w:val="bullet"/>
+      <w:lvlText w:val=""/>
+      <w:lvlJc w:val="left"/>
+      <w:pPr>
+        <w:tabs>
+          <w:tab w:val="num" w:pos="5760"/>
+        </w:tabs>
+        <w:ind w:left="5760" w:hanging="360"/>
+      </w:pPr>
+      <w:rPr>
+        <w:rFonts w:ascii="Wingdings" w:hAnsi="Wingdings" w:hint="default"/>
+        <w:sz w:val="20"/>
+      </w:rPr>
+    </w:lvl>
+    <w:lvl w:ilvl="8" w:tentative="1">
+      <w:start w:val="1"/>
+      <w:numFmt w:val="bullet"/>
+      <w:lvlText w:val=""/>
+      <w:lvlJc w:val="left"/>
+      <w:pPr>
+        <w:tabs>
+          <w:tab w:val="num" w:pos="6480"/>
+        </w:tabs>
+        <w:ind w:left="6480" w:hanging="360"/>
+      </w:pPr>
+      <w:rPr>
+        <w:rFonts w:ascii="Wingdings" w:hAnsi="Wingdings" w:hint="default"/>
+        <w:sz w:val="20"/>
+      </w:rPr>
+    </w:lvl>
+  </w:abstractNum>
+  <w:abstractNum w:abstractNumId="7">
     <w:nsid w:val="3FB53A17"/>
     <w:multiLevelType w:val="multilevel"/>
     <w:tmpl w:val="6412A3A2"/>
@@ -4194,7 +7080,305 @@
       </w:rPr>
     </w:lvl>
   </w:abstractNum>
-  <w:abstractNum w:abstractNumId="7">
+  <w:abstractNum w:abstractNumId="8">
+    <w:nsid w:val="4D69709E"/>
+    <w:multiLevelType w:val="multilevel"/>
+    <w:tmpl w:val="3FEA5FC0"/>
+    <w:lvl w:ilvl="0">
+      <w:start w:val="1"/>
+      <w:numFmt w:val="bullet"/>
+      <w:lvlText w:val=""/>
+      <w:lvlJc w:val="left"/>
+      <w:pPr>
+        <w:tabs>
+          <w:tab w:val="num" w:pos="720"/>
+        </w:tabs>
+        <w:ind w:left="720" w:hanging="360"/>
+      </w:pPr>
+      <w:rPr>
+        <w:rFonts w:ascii="Symbol" w:hAnsi="Symbol" w:hint="default"/>
+        <w:sz w:val="20"/>
+      </w:rPr>
+    </w:lvl>
+    <w:lvl w:ilvl="1" w:tentative="1">
+      <w:start w:val="1"/>
+      <w:numFmt w:val="bullet"/>
+      <w:lvlText w:val="o"/>
+      <w:lvlJc w:val="left"/>
+      <w:pPr>
+        <w:tabs>
+          <w:tab w:val="num" w:pos="1440"/>
+        </w:tabs>
+        <w:ind w:left="1440" w:hanging="360"/>
+      </w:pPr>
+      <w:rPr>
+        <w:rFonts w:ascii="Courier New" w:hAnsi="Courier New" w:hint="default"/>
+        <w:sz w:val="20"/>
+      </w:rPr>
+    </w:lvl>
+    <w:lvl w:ilvl="2" w:tentative="1">
+      <w:start w:val="1"/>
+      <w:numFmt w:val="bullet"/>
+      <w:lvlText w:val=""/>
+      <w:lvlJc w:val="left"/>
+      <w:pPr>
+        <w:tabs>
+          <w:tab w:val="num" w:pos="2160"/>
+        </w:tabs>
+        <w:ind w:left="2160" w:hanging="360"/>
+      </w:pPr>
+      <w:rPr>
+        <w:rFonts w:ascii="Wingdings" w:hAnsi="Wingdings" w:hint="default"/>
+        <w:sz w:val="20"/>
+      </w:rPr>
+    </w:lvl>
+    <w:lvl w:ilvl="3" w:tentative="1">
+      <w:start w:val="1"/>
+      <w:numFmt w:val="bullet"/>
+      <w:lvlText w:val=""/>
+      <w:lvlJc w:val="left"/>
+      <w:pPr>
+        <w:tabs>
+          <w:tab w:val="num" w:pos="2880"/>
+        </w:tabs>
+        <w:ind w:left="2880" w:hanging="360"/>
+      </w:pPr>
+      <w:rPr>
+        <w:rFonts w:ascii="Wingdings" w:hAnsi="Wingdings" w:hint="default"/>
+        <w:sz w:val="20"/>
+      </w:rPr>
+    </w:lvl>
+    <w:lvl w:ilvl="4" w:tentative="1">
+      <w:start w:val="1"/>
+      <w:numFmt w:val="bullet"/>
+      <w:lvlText w:val=""/>
+      <w:lvlJc w:val="left"/>
+      <w:pPr>
+        <w:tabs>
+          <w:tab w:val="num" w:pos="3600"/>
+        </w:tabs>
+        <w:ind w:left="3600" w:hanging="360"/>
+      </w:pPr>
+      <w:rPr>
+        <w:rFonts w:ascii="Wingdings" w:hAnsi="Wingdings" w:hint="default"/>
+        <w:sz w:val="20"/>
+      </w:rPr>
+    </w:lvl>
+    <w:lvl w:ilvl="5" w:tentative="1">
+      <w:start w:val="1"/>
+      <w:numFmt w:val="bullet"/>
+      <w:lvlText w:val=""/>
+      <w:lvlJc w:val="left"/>
+      <w:pPr>
+        <w:tabs>
+          <w:tab w:val="num" w:pos="4320"/>
+        </w:tabs>
+        <w:ind w:left="4320" w:hanging="360"/>
+      </w:pPr>
+      <w:rPr>
+        <w:rFonts w:ascii="Wingdings" w:hAnsi="Wingdings" w:hint="default"/>
+        <w:sz w:val="20"/>
+      </w:rPr>
+    </w:lvl>
+    <w:lvl w:ilvl="6" w:tentative="1">
+      <w:start w:val="1"/>
+      <w:numFmt w:val="bullet"/>
+      <w:lvlText w:val=""/>
+      <w:lvlJc w:val="left"/>
+      <w:pPr>
+        <w:tabs>
+          <w:tab w:val="num" w:pos="5040"/>
+        </w:tabs>
+        <w:ind w:left="5040" w:hanging="360"/>
+      </w:pPr>
+      <w:rPr>
+        <w:rFonts w:ascii="Wingdings" w:hAnsi="Wingdings" w:hint="default"/>
+        <w:sz w:val="20"/>
+      </w:rPr>
+    </w:lvl>
+    <w:lvl w:ilvl="7" w:tentative="1">
+      <w:start w:val="1"/>
+      <w:numFmt w:val="bullet"/>
+      <w:lvlText w:val=""/>
+      <w:lvlJc w:val="left"/>
+      <w:pPr>
+        <w:tabs>
+          <w:tab w:val="num" w:pos="5760"/>
+        </w:tabs>
+        <w:ind w:left="5760" w:hanging="360"/>
+      </w:pPr>
+      <w:rPr>
+        <w:rFonts w:ascii="Wingdings" w:hAnsi="Wingdings" w:hint="default"/>
+        <w:sz w:val="20"/>
+      </w:rPr>
+    </w:lvl>
+    <w:lvl w:ilvl="8" w:tentative="1">
+      <w:start w:val="1"/>
+      <w:numFmt w:val="bullet"/>
+      <w:lvlText w:val=""/>
+      <w:lvlJc w:val="left"/>
+      <w:pPr>
+        <w:tabs>
+          <w:tab w:val="num" w:pos="6480"/>
+        </w:tabs>
+        <w:ind w:left="6480" w:hanging="360"/>
+      </w:pPr>
+      <w:rPr>
+        <w:rFonts w:ascii="Wingdings" w:hAnsi="Wingdings" w:hint="default"/>
+        <w:sz w:val="20"/>
+      </w:rPr>
+    </w:lvl>
+  </w:abstractNum>
+  <w:abstractNum w:abstractNumId="9">
+    <w:nsid w:val="4D8A6C53"/>
+    <w:multiLevelType w:val="multilevel"/>
+    <w:tmpl w:val="D3864012"/>
+    <w:lvl w:ilvl="0">
+      <w:start w:val="1"/>
+      <w:numFmt w:val="bullet"/>
+      <w:lvlText w:val=""/>
+      <w:lvlJc w:val="left"/>
+      <w:pPr>
+        <w:tabs>
+          <w:tab w:val="num" w:pos="720"/>
+        </w:tabs>
+        <w:ind w:left="720" w:hanging="360"/>
+      </w:pPr>
+      <w:rPr>
+        <w:rFonts w:ascii="Symbol" w:hAnsi="Symbol" w:hint="default"/>
+        <w:sz w:val="20"/>
+      </w:rPr>
+    </w:lvl>
+    <w:lvl w:ilvl="1" w:tentative="1">
+      <w:start w:val="1"/>
+      <w:numFmt w:val="bullet"/>
+      <w:lvlText w:val="o"/>
+      <w:lvlJc w:val="left"/>
+      <w:pPr>
+        <w:tabs>
+          <w:tab w:val="num" w:pos="1440"/>
+        </w:tabs>
+        <w:ind w:left="1440" w:hanging="360"/>
+      </w:pPr>
+      <w:rPr>
+        <w:rFonts w:ascii="Courier New" w:hAnsi="Courier New" w:hint="default"/>
+        <w:sz w:val="20"/>
+      </w:rPr>
+    </w:lvl>
+    <w:lvl w:ilvl="2" w:tentative="1">
+      <w:start w:val="1"/>
+      <w:numFmt w:val="bullet"/>
+      <w:lvlText w:val=""/>
+      <w:lvlJc w:val="left"/>
+      <w:pPr>
+        <w:tabs>
+          <w:tab w:val="num" w:pos="2160"/>
+        </w:tabs>
+        <w:ind w:left="2160" w:hanging="360"/>
+      </w:pPr>
+      <w:rPr>
+        <w:rFonts w:ascii="Wingdings" w:hAnsi="Wingdings" w:hint="default"/>
+        <w:sz w:val="20"/>
+      </w:rPr>
+    </w:lvl>
+    <w:lvl w:ilvl="3" w:tentative="1">
+      <w:start w:val="1"/>
+      <w:numFmt w:val="bullet"/>
+      <w:lvlText w:val=""/>
+      <w:lvlJc w:val="left"/>
+      <w:pPr>
+        <w:tabs>
+          <w:tab w:val="num" w:pos="2880"/>
+        </w:tabs>
+        <w:ind w:left="2880" w:hanging="360"/>
+      </w:pPr>
+      <w:rPr>
+        <w:rFonts w:ascii="Wingdings" w:hAnsi="Wingdings" w:hint="default"/>
+        <w:sz w:val="20"/>
+      </w:rPr>
+    </w:lvl>
+    <w:lvl w:ilvl="4" w:tentative="1">
+      <w:start w:val="1"/>
+      <w:numFmt w:val="bullet"/>
+      <w:lvlText w:val=""/>
+      <w:lvlJc w:val="left"/>
+      <w:pPr>
+        <w:tabs>
+          <w:tab w:val="num" w:pos="3600"/>
+        </w:tabs>
+        <w:ind w:left="3600" w:hanging="360"/>
+      </w:pPr>
+      <w:rPr>
+        <w:rFonts w:ascii="Wingdings" w:hAnsi="Wingdings" w:hint="default"/>
+        <w:sz w:val="20"/>
+      </w:rPr>
+    </w:lvl>
+    <w:lvl w:ilvl="5" w:tentative="1">
+      <w:start w:val="1"/>
+      <w:numFmt w:val="bullet"/>
+      <w:lvlText w:val=""/>
+      <w:lvlJc w:val="left"/>
+      <w:pPr>
+        <w:tabs>
+          <w:tab w:val="num" w:pos="4320"/>
+        </w:tabs>
+        <w:ind w:left="4320" w:hanging="360"/>
+      </w:pPr>
+      <w:rPr>
+        <w:rFonts w:ascii="Wingdings" w:hAnsi="Wingdings" w:hint="default"/>
+        <w:sz w:val="20"/>
+      </w:rPr>
+    </w:lvl>
+    <w:lvl w:ilvl="6" w:tentative="1">
+      <w:start w:val="1"/>
+      <w:numFmt w:val="bullet"/>
+      <w:lvlText w:val=""/>
+      <w:lvlJc w:val="left"/>
+      <w:pPr>
+        <w:tabs>
+          <w:tab w:val="num" w:pos="5040"/>
+        </w:tabs>
+        <w:ind w:left="5040" w:hanging="360"/>
+      </w:pPr>
+      <w:rPr>
+        <w:rFonts w:ascii="Wingdings" w:hAnsi="Wingdings" w:hint="default"/>
+        <w:sz w:val="20"/>
+      </w:rPr>
+    </w:lvl>
+    <w:lvl w:ilvl="7" w:tentative="1">
+      <w:start w:val="1"/>
+      <w:numFmt w:val="bullet"/>
+      <w:lvlText w:val=""/>
+      <w:lvlJc w:val="left"/>
+      <w:pPr>
+        <w:tabs>
+          <w:tab w:val="num" w:pos="5760"/>
+        </w:tabs>
+        <w:ind w:left="5760" w:hanging="360"/>
+      </w:pPr>
+      <w:rPr>
+        <w:rFonts w:ascii="Wingdings" w:hAnsi="Wingdings" w:hint="default"/>
+        <w:sz w:val="20"/>
+      </w:rPr>
+    </w:lvl>
+    <w:lvl w:ilvl="8" w:tentative="1">
+      <w:start w:val="1"/>
+      <w:numFmt w:val="bullet"/>
+      <w:lvlText w:val=""/>
+      <w:lvlJc w:val="left"/>
+      <w:pPr>
+        <w:tabs>
+          <w:tab w:val="num" w:pos="6480"/>
+        </w:tabs>
+        <w:ind w:left="6480" w:hanging="360"/>
+      </w:pPr>
+      <w:rPr>
+        <w:rFonts w:ascii="Wingdings" w:hAnsi="Wingdings" w:hint="default"/>
+        <w:sz w:val="20"/>
+      </w:rPr>
+    </w:lvl>
+  </w:abstractNum>
+  <w:abstractNum w:abstractNumId="10">
     <w:nsid w:val="5039734A"/>
     <w:multiLevelType w:val="multilevel"/>
     <w:tmpl w:val="66DC909E"/>
@@ -4343,10 +7527,308 @@
       </w:rPr>
     </w:lvl>
   </w:abstractNum>
-  <w:abstractNum w:abstractNumId="8">
+  <w:abstractNum w:abstractNumId="11">
+    <w:nsid w:val="5B11539B"/>
+    <w:multiLevelType w:val="multilevel"/>
+    <w:tmpl w:val="362A6400"/>
+    <w:lvl w:ilvl="0">
+      <w:start w:val="1"/>
+      <w:numFmt w:val="bullet"/>
+      <w:lvlText w:val=""/>
+      <w:lvlJc w:val="left"/>
+      <w:pPr>
+        <w:tabs>
+          <w:tab w:val="num" w:pos="720"/>
+        </w:tabs>
+        <w:ind w:left="720" w:hanging="360"/>
+      </w:pPr>
+      <w:rPr>
+        <w:rFonts w:ascii="Symbol" w:hAnsi="Symbol" w:hint="default"/>
+        <w:sz w:val="20"/>
+      </w:rPr>
+    </w:lvl>
+    <w:lvl w:ilvl="1" w:tentative="1">
+      <w:start w:val="1"/>
+      <w:numFmt w:val="bullet"/>
+      <w:lvlText w:val="o"/>
+      <w:lvlJc w:val="left"/>
+      <w:pPr>
+        <w:tabs>
+          <w:tab w:val="num" w:pos="1440"/>
+        </w:tabs>
+        <w:ind w:left="1440" w:hanging="360"/>
+      </w:pPr>
+      <w:rPr>
+        <w:rFonts w:ascii="Courier New" w:hAnsi="Courier New" w:hint="default"/>
+        <w:sz w:val="20"/>
+      </w:rPr>
+    </w:lvl>
+    <w:lvl w:ilvl="2" w:tentative="1">
+      <w:start w:val="1"/>
+      <w:numFmt w:val="bullet"/>
+      <w:lvlText w:val=""/>
+      <w:lvlJc w:val="left"/>
+      <w:pPr>
+        <w:tabs>
+          <w:tab w:val="num" w:pos="2160"/>
+        </w:tabs>
+        <w:ind w:left="2160" w:hanging="360"/>
+      </w:pPr>
+      <w:rPr>
+        <w:rFonts w:ascii="Wingdings" w:hAnsi="Wingdings" w:hint="default"/>
+        <w:sz w:val="20"/>
+      </w:rPr>
+    </w:lvl>
+    <w:lvl w:ilvl="3" w:tentative="1">
+      <w:start w:val="1"/>
+      <w:numFmt w:val="bullet"/>
+      <w:lvlText w:val=""/>
+      <w:lvlJc w:val="left"/>
+      <w:pPr>
+        <w:tabs>
+          <w:tab w:val="num" w:pos="2880"/>
+        </w:tabs>
+        <w:ind w:left="2880" w:hanging="360"/>
+      </w:pPr>
+      <w:rPr>
+        <w:rFonts w:ascii="Wingdings" w:hAnsi="Wingdings" w:hint="default"/>
+        <w:sz w:val="20"/>
+      </w:rPr>
+    </w:lvl>
+    <w:lvl w:ilvl="4" w:tentative="1">
+      <w:start w:val="1"/>
+      <w:numFmt w:val="bullet"/>
+      <w:lvlText w:val=""/>
+      <w:lvlJc w:val="left"/>
+      <w:pPr>
+        <w:tabs>
+          <w:tab w:val="num" w:pos="3600"/>
+        </w:tabs>
+        <w:ind w:left="3600" w:hanging="360"/>
+      </w:pPr>
+      <w:rPr>
+        <w:rFonts w:ascii="Wingdings" w:hAnsi="Wingdings" w:hint="default"/>
+        <w:sz w:val="20"/>
+      </w:rPr>
+    </w:lvl>
+    <w:lvl w:ilvl="5" w:tentative="1">
+      <w:start w:val="1"/>
+      <w:numFmt w:val="bullet"/>
+      <w:lvlText w:val=""/>
+      <w:lvlJc w:val="left"/>
+      <w:pPr>
+        <w:tabs>
+          <w:tab w:val="num" w:pos="4320"/>
+        </w:tabs>
+        <w:ind w:left="4320" w:hanging="360"/>
+      </w:pPr>
+      <w:rPr>
+        <w:rFonts w:ascii="Wingdings" w:hAnsi="Wingdings" w:hint="default"/>
+        <w:sz w:val="20"/>
+      </w:rPr>
+    </w:lvl>
+    <w:lvl w:ilvl="6" w:tentative="1">
+      <w:start w:val="1"/>
+      <w:numFmt w:val="bullet"/>
+      <w:lvlText w:val=""/>
+      <w:lvlJc w:val="left"/>
+      <w:pPr>
+        <w:tabs>
+          <w:tab w:val="num" w:pos="5040"/>
+        </w:tabs>
+        <w:ind w:left="5040" w:hanging="360"/>
+      </w:pPr>
+      <w:rPr>
+        <w:rFonts w:ascii="Wingdings" w:hAnsi="Wingdings" w:hint="default"/>
+        <w:sz w:val="20"/>
+      </w:rPr>
+    </w:lvl>
+    <w:lvl w:ilvl="7" w:tentative="1">
+      <w:start w:val="1"/>
+      <w:numFmt w:val="bullet"/>
+      <w:lvlText w:val=""/>
+      <w:lvlJc w:val="left"/>
+      <w:pPr>
+        <w:tabs>
+          <w:tab w:val="num" w:pos="5760"/>
+        </w:tabs>
+        <w:ind w:left="5760" w:hanging="360"/>
+      </w:pPr>
+      <w:rPr>
+        <w:rFonts w:ascii="Wingdings" w:hAnsi="Wingdings" w:hint="default"/>
+        <w:sz w:val="20"/>
+      </w:rPr>
+    </w:lvl>
+    <w:lvl w:ilvl="8" w:tentative="1">
+      <w:start w:val="1"/>
+      <w:numFmt w:val="bullet"/>
+      <w:lvlText w:val=""/>
+      <w:lvlJc w:val="left"/>
+      <w:pPr>
+        <w:tabs>
+          <w:tab w:val="num" w:pos="6480"/>
+        </w:tabs>
+        <w:ind w:left="6480" w:hanging="360"/>
+      </w:pPr>
+      <w:rPr>
+        <w:rFonts w:ascii="Wingdings" w:hAnsi="Wingdings" w:hint="default"/>
+        <w:sz w:val="20"/>
+      </w:rPr>
+    </w:lvl>
+  </w:abstractNum>
+  <w:abstractNum w:abstractNumId="12">
     <w:nsid w:val="6C6F248E"/>
     <w:multiLevelType w:val="multilevel"/>
     <w:tmpl w:val="29201F7A"/>
+    <w:lvl w:ilvl="0">
+      <w:start w:val="1"/>
+      <w:numFmt w:val="bullet"/>
+      <w:lvlText w:val=""/>
+      <w:lvlJc w:val="left"/>
+      <w:pPr>
+        <w:tabs>
+          <w:tab w:val="num" w:pos="720"/>
+        </w:tabs>
+        <w:ind w:left="720" w:hanging="360"/>
+      </w:pPr>
+      <w:rPr>
+        <w:rFonts w:ascii="Symbol" w:hAnsi="Symbol" w:hint="default"/>
+        <w:sz w:val="20"/>
+      </w:rPr>
+    </w:lvl>
+    <w:lvl w:ilvl="1" w:tentative="1">
+      <w:start w:val="1"/>
+      <w:numFmt w:val="bullet"/>
+      <w:lvlText w:val="o"/>
+      <w:lvlJc w:val="left"/>
+      <w:pPr>
+        <w:tabs>
+          <w:tab w:val="num" w:pos="1440"/>
+        </w:tabs>
+        <w:ind w:left="1440" w:hanging="360"/>
+      </w:pPr>
+      <w:rPr>
+        <w:rFonts w:ascii="Courier New" w:hAnsi="Courier New" w:hint="default"/>
+        <w:sz w:val="20"/>
+      </w:rPr>
+    </w:lvl>
+    <w:lvl w:ilvl="2" w:tentative="1">
+      <w:start w:val="1"/>
+      <w:numFmt w:val="bullet"/>
+      <w:lvlText w:val=""/>
+      <w:lvlJc w:val="left"/>
+      <w:pPr>
+        <w:tabs>
+          <w:tab w:val="num" w:pos="2160"/>
+        </w:tabs>
+        <w:ind w:left="2160" w:hanging="360"/>
+      </w:pPr>
+      <w:rPr>
+        <w:rFonts w:ascii="Wingdings" w:hAnsi="Wingdings" w:hint="default"/>
+        <w:sz w:val="20"/>
+      </w:rPr>
+    </w:lvl>
+    <w:lvl w:ilvl="3" w:tentative="1">
+      <w:start w:val="1"/>
+      <w:numFmt w:val="bullet"/>
+      <w:lvlText w:val=""/>
+      <w:lvlJc w:val="left"/>
+      <w:pPr>
+        <w:tabs>
+          <w:tab w:val="num" w:pos="2880"/>
+        </w:tabs>
+        <w:ind w:left="2880" w:hanging="360"/>
+      </w:pPr>
+      <w:rPr>
+        <w:rFonts w:ascii="Wingdings" w:hAnsi="Wingdings" w:hint="default"/>
+        <w:sz w:val="20"/>
+      </w:rPr>
+    </w:lvl>
+    <w:lvl w:ilvl="4" w:tentative="1">
+      <w:start w:val="1"/>
+      <w:numFmt w:val="bullet"/>
+      <w:lvlText w:val=""/>
+      <w:lvlJc w:val="left"/>
+      <w:pPr>
+        <w:tabs>
+          <w:tab w:val="num" w:pos="3600"/>
+        </w:tabs>
+        <w:ind w:left="3600" w:hanging="360"/>
+      </w:pPr>
+      <w:rPr>
+        <w:rFonts w:ascii="Wingdings" w:hAnsi="Wingdings" w:hint="default"/>
+        <w:sz w:val="20"/>
+      </w:rPr>
+    </w:lvl>
+    <w:lvl w:ilvl="5" w:tentative="1">
+      <w:start w:val="1"/>
+      <w:numFmt w:val="bullet"/>
+      <w:lvlText w:val=""/>
+      <w:lvlJc w:val="left"/>
+      <w:pPr>
+        <w:tabs>
+          <w:tab w:val="num" w:pos="4320"/>
+        </w:tabs>
+        <w:ind w:left="4320" w:hanging="360"/>
+      </w:pPr>
+      <w:rPr>
+        <w:rFonts w:ascii="Wingdings" w:hAnsi="Wingdings" w:hint="default"/>
+        <w:sz w:val="20"/>
+      </w:rPr>
+    </w:lvl>
+    <w:lvl w:ilvl="6" w:tentative="1">
+      <w:start w:val="1"/>
+      <w:numFmt w:val="bullet"/>
+      <w:lvlText w:val=""/>
+      <w:lvlJc w:val="left"/>
+      <w:pPr>
+        <w:tabs>
+          <w:tab w:val="num" w:pos="5040"/>
+        </w:tabs>
+        <w:ind w:left="5040" w:hanging="360"/>
+      </w:pPr>
+      <w:rPr>
+        <w:rFonts w:ascii="Wingdings" w:hAnsi="Wingdings" w:hint="default"/>
+        <w:sz w:val="20"/>
+      </w:rPr>
+    </w:lvl>
+    <w:lvl w:ilvl="7" w:tentative="1">
+      <w:start w:val="1"/>
+      <w:numFmt w:val="bullet"/>
+      <w:lvlText w:val=""/>
+      <w:lvlJc w:val="left"/>
+      <w:pPr>
+        <w:tabs>
+          <w:tab w:val="num" w:pos="5760"/>
+        </w:tabs>
+        <w:ind w:left="5760" w:hanging="360"/>
+      </w:pPr>
+      <w:rPr>
+        <w:rFonts w:ascii="Wingdings" w:hAnsi="Wingdings" w:hint="default"/>
+        <w:sz w:val="20"/>
+      </w:rPr>
+    </w:lvl>
+    <w:lvl w:ilvl="8" w:tentative="1">
+      <w:start w:val="1"/>
+      <w:numFmt w:val="bullet"/>
+      <w:lvlText w:val=""/>
+      <w:lvlJc w:val="left"/>
+      <w:pPr>
+        <w:tabs>
+          <w:tab w:val="num" w:pos="6480"/>
+        </w:tabs>
+        <w:ind w:left="6480" w:hanging="360"/>
+      </w:pPr>
+      <w:rPr>
+        <w:rFonts w:ascii="Wingdings" w:hAnsi="Wingdings" w:hint="default"/>
+        <w:sz w:val="20"/>
+      </w:rPr>
+    </w:lvl>
+  </w:abstractNum>
+  <w:abstractNum w:abstractNumId="13">
+    <w:nsid w:val="79354708"/>
+    <w:multiLevelType w:val="multilevel"/>
+    <w:tmpl w:val="7FC6629E"/>
     <w:lvl w:ilvl="0">
       <w:start w:val="1"/>
       <w:numFmt w:val="bullet"/>
@@ -4502,7 +7984,7 @@
     <w:abstractNumId w:val="0"/>
   </w:num>
   <w:num w:numId="4">
-    <w:abstractNumId w:val="8"/>
+    <w:abstractNumId w:val="12"/>
   </w:num>
   <w:num w:numId="5">
     <w:abstractNumId w:val="3"/>
@@ -4511,13 +7993,28 @@
     <w:abstractNumId w:val="4"/>
   </w:num>
   <w:num w:numId="7">
-    <w:abstractNumId w:val="6"/>
+    <w:abstractNumId w:val="7"/>
   </w:num>
   <w:num w:numId="8">
     <w:abstractNumId w:val="5"/>
   </w:num>
   <w:num w:numId="9">
-    <w:abstractNumId w:val="7"/>
+    <w:abstractNumId w:val="10"/>
+  </w:num>
+  <w:num w:numId="10">
+    <w:abstractNumId w:val="13"/>
+  </w:num>
+  <w:num w:numId="11">
+    <w:abstractNumId w:val="11"/>
+  </w:num>
+  <w:num w:numId="12">
+    <w:abstractNumId w:val="8"/>
+  </w:num>
+  <w:num w:numId="13">
+    <w:abstractNumId w:val="9"/>
+  </w:num>
+  <w:num w:numId="14">
+    <w:abstractNumId w:val="6"/>
   </w:num>
 </w:numbering>
 </file>

</xml_diff>

<commit_message>
Adding Fractional knapsack greedy Algo
</commit_message>
<xml_diff>
--- a/Greedy Algorithms/Greedy.docx
+++ b/Greedy Algorithms/Greedy.docx
@@ -5905,6 +5905,2255 @@
     <w:p>
       <w:pPr>
         <w:jc w:val="center"/>
+      </w:pPr>
+    </w:p>
+    <w:p>
+      <w:r>
+        <w:lastRenderedPageBreak/>
+        <w:t xml:space="preserve">Notice the greedy magic: even though </w:t>
+      </w:r>
+      <w:proofErr w:type="gramStart"/>
+      <w:r>
+        <w:rPr>
+          <w:b/>
+          <w:bCs/>
+        </w:rPr>
+        <w:t>A</w:t>
+      </w:r>
+      <w:r>
+        <w:t xml:space="preserve"> and</w:t>
+      </w:r>
+      <w:proofErr w:type="gramEnd"/>
+      <w:r>
+        <w:t xml:space="preserve"> </w:t>
+      </w:r>
+      <w:r>
+        <w:rPr>
+          <w:b/>
+          <w:bCs/>
+        </w:rPr>
+        <w:t>B</w:t>
+      </w:r>
+      <w:r>
+        <w:t xml:space="preserve"> now take 4 bits instead of 3, they happen so rarely (only 5 and 9 times) that it doesn't matter. Meanwhile, </w:t>
+      </w:r>
+      <w:r>
+        <w:rPr>
+          <w:b/>
+          <w:bCs/>
+        </w:rPr>
+        <w:t>F</w:t>
+      </w:r>
+      <w:r>
+        <w:t xml:space="preserve"> happens 45 times and its size dropped from 3 bits to just </w:t>
+      </w:r>
+      <w:r>
+        <w:rPr>
+          <w:b/>
+          <w:bCs/>
+        </w:rPr>
+        <w:t>1 bit</w:t>
+      </w:r>
+      <w:r>
+        <w:t>!</w:t>
+      </w:r>
+    </w:p>
+    <w:p>
+      <w:pPr>
+        <w:spacing w:before="100" w:beforeAutospacing="1" w:after="100" w:afterAutospacing="1" w:line="240" w:lineRule="auto"/>
+        <w:outlineLvl w:val="1"/>
+        <w:rPr>
+          <w:rFonts w:ascii="Times New Roman" w:eastAsia="Times New Roman" w:hAnsi="Times New Roman" w:cs="Times New Roman"/>
+          <w:b/>
+          <w:bCs/>
+          <w:sz w:val="36"/>
+          <w:szCs w:val="36"/>
+        </w:rPr>
+      </w:pPr>
+      <w:r>
+        <w:rPr>
+          <w:rFonts w:ascii="Times New Roman" w:eastAsia="Times New Roman" w:hAnsi="Times New Roman" w:cs="Times New Roman"/>
+          <w:b/>
+          <w:bCs/>
+          <w:sz w:val="36"/>
+          <w:szCs w:val="36"/>
+        </w:rPr>
+        <w:t>Complexity Analysis</w:t>
+      </w:r>
+    </w:p>
+    <w:p>
+      <w:pPr>
+        <w:numPr>
+          <w:ilvl w:val="0"/>
+          <w:numId w:val="15"/>
+        </w:numPr>
+        <w:spacing w:before="100" w:beforeAutospacing="1" w:after="100" w:afterAutospacing="1" w:line="240" w:lineRule="auto"/>
+        <w:rPr>
+          <w:rFonts w:ascii="Times New Roman" w:eastAsia="Times New Roman" w:hAnsi="Times New Roman" w:cs="Times New Roman"/>
+          <w:sz w:val="24"/>
+          <w:szCs w:val="24"/>
+        </w:rPr>
+      </w:pPr>
+      <w:r>
+        <w:rPr>
+          <w:rFonts w:ascii="Times New Roman" w:eastAsia="Times New Roman" w:hAnsi="Times New Roman" w:cs="Times New Roman"/>
+          <w:b/>
+          <w:bCs/>
+          <w:sz w:val="24"/>
+          <w:szCs w:val="24"/>
+        </w:rPr>
+        <w:t>Time Complexity:</w:t>
+      </w:r>
+      <w:r>
+        <w:rPr>
+          <w:rFonts w:ascii="Times New Roman" w:eastAsia="Times New Roman" w:hAnsi="Times New Roman" w:cs="Times New Roman"/>
+          <w:sz w:val="24"/>
+          <w:szCs w:val="24"/>
+        </w:rPr>
+        <w:t xml:space="preserve"> </w:t>
+      </w:r>
+      <w:r>
+        <w:rPr>
+          <w:rFonts w:ascii="Times New Roman" w:eastAsia="Times New Roman" w:hAnsi="Times New Roman" w:cs="Times New Roman"/>
+          <w:b/>
+          <w:bCs/>
+          <w:sz w:val="24"/>
+          <w:szCs w:val="24"/>
+        </w:rPr>
+        <w:t>$</w:t>
+      </w:r>
+      <w:proofErr w:type="gramStart"/>
+      <w:r>
+        <w:rPr>
+          <w:rFonts w:ascii="Times New Roman" w:eastAsia="Times New Roman" w:hAnsi="Times New Roman" w:cs="Times New Roman"/>
+          <w:b/>
+          <w:bCs/>
+          <w:sz w:val="24"/>
+          <w:szCs w:val="24"/>
+        </w:rPr>
+        <w:t>O(</w:t>
+      </w:r>
+      <w:proofErr w:type="gramEnd"/>
+      <w:r>
+        <w:rPr>
+          <w:rFonts w:ascii="Times New Roman" w:eastAsia="Times New Roman" w:hAnsi="Times New Roman" w:cs="Times New Roman"/>
+          <w:b/>
+          <w:bCs/>
+          <w:sz w:val="24"/>
+          <w:szCs w:val="24"/>
+        </w:rPr>
+        <w:t>n \log n)$</w:t>
+      </w:r>
+      <w:r>
+        <w:rPr>
+          <w:rFonts w:ascii="Times New Roman" w:eastAsia="Times New Roman" w:hAnsi="Times New Roman" w:cs="Times New Roman"/>
+          <w:sz w:val="24"/>
+          <w:szCs w:val="24"/>
+        </w:rPr>
+        <w:t>, where $n$ is the number of unique characters. Extracting the minimum from a priority queue of size $n$ takes $</w:t>
+      </w:r>
+      <w:proofErr w:type="gramStart"/>
+      <w:r>
+        <w:rPr>
+          <w:rFonts w:ascii="Times New Roman" w:eastAsia="Times New Roman" w:hAnsi="Times New Roman" w:cs="Times New Roman"/>
+          <w:sz w:val="24"/>
+          <w:szCs w:val="24"/>
+        </w:rPr>
+        <w:t>O(</w:t>
+      </w:r>
+      <w:proofErr w:type="gramEnd"/>
+      <w:r>
+        <w:rPr>
+          <w:rFonts w:ascii="Times New Roman" w:eastAsia="Times New Roman" w:hAnsi="Times New Roman" w:cs="Times New Roman"/>
+          <w:sz w:val="24"/>
+          <w:szCs w:val="24"/>
+        </w:rPr>
+        <w:t>\log n)$ time, and we repeat this process $n-1$ times.</w:t>
+      </w:r>
+    </w:p>
+    <w:p>
+      <w:pPr>
+        <w:numPr>
+          <w:ilvl w:val="0"/>
+          <w:numId w:val="15"/>
+        </w:numPr>
+        <w:spacing w:before="100" w:beforeAutospacing="1" w:after="100" w:afterAutospacing="1" w:line="240" w:lineRule="auto"/>
+        <w:rPr>
+          <w:rFonts w:ascii="Times New Roman" w:eastAsia="Times New Roman" w:hAnsi="Times New Roman" w:cs="Times New Roman"/>
+          <w:sz w:val="24"/>
+          <w:szCs w:val="24"/>
+        </w:rPr>
+      </w:pPr>
+      <w:r>
+        <w:rPr>
+          <w:rFonts w:ascii="Times New Roman" w:eastAsia="Times New Roman" w:hAnsi="Times New Roman" w:cs="Times New Roman"/>
+          <w:b/>
+          <w:bCs/>
+          <w:sz w:val="24"/>
+          <w:szCs w:val="24"/>
+        </w:rPr>
+        <w:t>Space Complexity:</w:t>
+      </w:r>
+      <w:r>
+        <w:rPr>
+          <w:rFonts w:ascii="Times New Roman" w:eastAsia="Times New Roman" w:hAnsi="Times New Roman" w:cs="Times New Roman"/>
+          <w:sz w:val="24"/>
+          <w:szCs w:val="24"/>
+        </w:rPr>
+        <w:t xml:space="preserve"> </w:t>
+      </w:r>
+      <w:r>
+        <w:rPr>
+          <w:rFonts w:ascii="Times New Roman" w:eastAsia="Times New Roman" w:hAnsi="Times New Roman" w:cs="Times New Roman"/>
+          <w:b/>
+          <w:bCs/>
+          <w:sz w:val="24"/>
+          <w:szCs w:val="24"/>
+        </w:rPr>
+        <w:t>$</w:t>
+      </w:r>
+      <w:proofErr w:type="gramStart"/>
+      <w:r>
+        <w:rPr>
+          <w:rFonts w:ascii="Times New Roman" w:eastAsia="Times New Roman" w:hAnsi="Times New Roman" w:cs="Times New Roman"/>
+          <w:b/>
+          <w:bCs/>
+          <w:sz w:val="24"/>
+          <w:szCs w:val="24"/>
+        </w:rPr>
+        <w:t>O(</w:t>
+      </w:r>
+      <w:proofErr w:type="gramEnd"/>
+      <w:r>
+        <w:rPr>
+          <w:rFonts w:ascii="Times New Roman" w:eastAsia="Times New Roman" w:hAnsi="Times New Roman" w:cs="Times New Roman"/>
+          <w:b/>
+          <w:bCs/>
+          <w:sz w:val="24"/>
+          <w:szCs w:val="24"/>
+        </w:rPr>
+        <w:t>n)$</w:t>
+      </w:r>
+      <w:r>
+        <w:rPr>
+          <w:rFonts w:ascii="Times New Roman" w:eastAsia="Times New Roman" w:hAnsi="Times New Roman" w:cs="Times New Roman"/>
+          <w:sz w:val="24"/>
+          <w:szCs w:val="24"/>
+        </w:rPr>
+        <w:t>, because we are maintaining a tree structures and hash map tables to hold codes for $n$ distinct characters.</w:t>
+      </w:r>
+    </w:p>
+    <w:p>
+      <w:pPr>
+        <w:rPr>
+          <w:b/>
+          <w:sz w:val="36"/>
+          <w:szCs w:val="36"/>
+        </w:rPr>
+      </w:pPr>
+    </w:p>
+    <w:p>
+      <w:pPr>
+        <w:jc w:val="center"/>
+        <w:rPr>
+          <w:b/>
+          <w:sz w:val="36"/>
+          <w:szCs w:val="36"/>
+        </w:rPr>
+      </w:pPr>
+      <w:r>
+        <w:rPr>
+          <w:b/>
+          <w:sz w:val="36"/>
+          <w:szCs w:val="36"/>
+        </w:rPr>
+        <w:t>Fractional knapsack</w:t>
+      </w:r>
+    </w:p>
+    <w:p>
+      <w:pPr>
+        <w:spacing w:before="100" w:beforeAutospacing="1" w:after="100" w:afterAutospacing="1" w:line="240" w:lineRule="auto"/>
+        <w:rPr>
+          <w:rFonts w:ascii="Times New Roman" w:eastAsia="Times New Roman" w:hAnsi="Times New Roman" w:cs="Times New Roman"/>
+          <w:sz w:val="24"/>
+          <w:szCs w:val="24"/>
+        </w:rPr>
+      </w:pPr>
+      <w:r>
+        <w:rPr>
+          <w:rFonts w:ascii="Times New Roman" w:eastAsia="Times New Roman" w:hAnsi="Times New Roman" w:cs="Times New Roman"/>
+          <w:sz w:val="24"/>
+          <w:szCs w:val="24"/>
+        </w:rPr>
+        <w:t xml:space="preserve">The </w:t>
+      </w:r>
+      <w:r>
+        <w:rPr>
+          <w:rFonts w:ascii="Times New Roman" w:eastAsia="Times New Roman" w:hAnsi="Times New Roman" w:cs="Times New Roman"/>
+          <w:b/>
+          <w:bCs/>
+          <w:sz w:val="24"/>
+          <w:szCs w:val="24"/>
+        </w:rPr>
+        <w:t>Fractional Knapsack Problem</w:t>
+      </w:r>
+      <w:r>
+        <w:rPr>
+          <w:rFonts w:ascii="Times New Roman" w:eastAsia="Times New Roman" w:hAnsi="Times New Roman" w:cs="Times New Roman"/>
+          <w:sz w:val="24"/>
+          <w:szCs w:val="24"/>
+        </w:rPr>
+        <w:t xml:space="preserve"> is a classic optimization problem that perfectly illustrates why greedy algorithms are so powerful when they are applicable.</w:t>
+      </w:r>
+    </w:p>
+    <w:p>
+      <w:pPr>
+        <w:spacing w:before="100" w:beforeAutospacing="1" w:after="100" w:afterAutospacing="1" w:line="240" w:lineRule="auto"/>
+        <w:rPr>
+          <w:rFonts w:ascii="Times New Roman" w:eastAsia="Times New Roman" w:hAnsi="Times New Roman" w:cs="Times New Roman"/>
+          <w:sz w:val="24"/>
+          <w:szCs w:val="24"/>
+        </w:rPr>
+      </w:pPr>
+      <w:r>
+        <w:rPr>
+          <w:rFonts w:ascii="Times New Roman" w:eastAsia="Times New Roman" w:hAnsi="Times New Roman" w:cs="Times New Roman"/>
+          <w:sz w:val="24"/>
+          <w:szCs w:val="24"/>
+        </w:rPr>
+        <w:t xml:space="preserve">Imagine you are a thief breaking into a jewelry store with a knapsack (backpack) that can only hold a maximum weight of </w:t>
+      </w:r>
+      <w:r>
+        <w:rPr>
+          <w:rFonts w:ascii="Times New Roman" w:eastAsia="Times New Roman" w:hAnsi="Times New Roman" w:cs="Times New Roman"/>
+          <w:b/>
+          <w:bCs/>
+          <w:sz w:val="24"/>
+          <w:szCs w:val="24"/>
+        </w:rPr>
+        <w:t>50 kg</w:t>
+      </w:r>
+      <w:r>
+        <w:rPr>
+          <w:rFonts w:ascii="Times New Roman" w:eastAsia="Times New Roman" w:hAnsi="Times New Roman" w:cs="Times New Roman"/>
+          <w:sz w:val="24"/>
+          <w:szCs w:val="24"/>
+        </w:rPr>
+        <w:t xml:space="preserve">. The store has items like gold dust, silver dust, and expensive spices. Because these items are quantities of powders or liquids, </w:t>
+      </w:r>
+      <w:r>
+        <w:rPr>
+          <w:rFonts w:ascii="Times New Roman" w:eastAsia="Times New Roman" w:hAnsi="Times New Roman" w:cs="Times New Roman"/>
+          <w:b/>
+          <w:bCs/>
+          <w:sz w:val="24"/>
+          <w:szCs w:val="24"/>
+        </w:rPr>
+        <w:t>you can take fractions of them</w:t>
+      </w:r>
+      <w:r>
+        <w:rPr>
+          <w:rFonts w:ascii="Times New Roman" w:eastAsia="Times New Roman" w:hAnsi="Times New Roman" w:cs="Times New Roman"/>
+          <w:sz w:val="24"/>
+          <w:szCs w:val="24"/>
+        </w:rPr>
+        <w:t>—you don’t have to take the whole item or nothing at all.</w:t>
+      </w:r>
+    </w:p>
+    <w:p>
+      <w:pPr>
+        <w:spacing w:before="100" w:beforeAutospacing="1" w:after="100" w:afterAutospacing="1" w:line="240" w:lineRule="auto"/>
+        <w:rPr>
+          <w:rFonts w:ascii="Times New Roman" w:eastAsia="Times New Roman" w:hAnsi="Times New Roman" w:cs="Times New Roman"/>
+          <w:sz w:val="24"/>
+          <w:szCs w:val="24"/>
+        </w:rPr>
+      </w:pPr>
+      <w:r>
+        <w:rPr>
+          <w:rFonts w:ascii="Times New Roman" w:eastAsia="Times New Roman" w:hAnsi="Times New Roman" w:cs="Times New Roman"/>
+          <w:sz w:val="24"/>
+          <w:szCs w:val="24"/>
+        </w:rPr>
+        <w:t>Your goal is to fill your knapsack to maximize the total value of the loot without exceeding the weight limit.</w:t>
+      </w:r>
+    </w:p>
+    <w:p>
+      <w:pPr>
+        <w:spacing w:before="100" w:beforeAutospacing="1" w:after="100" w:afterAutospacing="1" w:line="240" w:lineRule="auto"/>
+        <w:outlineLvl w:val="1"/>
+        <w:rPr>
+          <w:rFonts w:ascii="Times New Roman" w:eastAsia="Times New Roman" w:hAnsi="Times New Roman" w:cs="Times New Roman"/>
+          <w:b/>
+          <w:bCs/>
+          <w:sz w:val="36"/>
+          <w:szCs w:val="36"/>
+        </w:rPr>
+      </w:pPr>
+      <w:r>
+        <w:rPr>
+          <w:rFonts w:ascii="Times New Roman" w:eastAsia="Times New Roman" w:hAnsi="Times New Roman" w:cs="Times New Roman"/>
+          <w:b/>
+          <w:bCs/>
+          <w:sz w:val="36"/>
+          <w:szCs w:val="36"/>
+        </w:rPr>
+        <w:t>The Greedy Strategy: Value per Kilogram</w:t>
+      </w:r>
+    </w:p>
+    <w:p>
+      <w:pPr>
+        <w:spacing w:before="100" w:beforeAutospacing="1" w:after="100" w:afterAutospacing="1" w:line="240" w:lineRule="auto"/>
+        <w:rPr>
+          <w:rFonts w:ascii="Times New Roman" w:eastAsia="Times New Roman" w:hAnsi="Times New Roman" w:cs="Times New Roman"/>
+          <w:sz w:val="24"/>
+          <w:szCs w:val="24"/>
+        </w:rPr>
+      </w:pPr>
+      <w:r>
+        <w:rPr>
+          <w:rFonts w:ascii="Times New Roman" w:eastAsia="Times New Roman" w:hAnsi="Times New Roman" w:cs="Times New Roman"/>
+          <w:sz w:val="24"/>
+          <w:szCs w:val="24"/>
+        </w:rPr>
+        <w:t>If you want to make the most money with limited weight capacity, what should your selection rule be?</w:t>
+      </w:r>
+    </w:p>
+    <w:p>
+      <w:pPr>
+        <w:numPr>
+          <w:ilvl w:val="0"/>
+          <w:numId w:val="16"/>
+        </w:numPr>
+        <w:spacing w:before="100" w:beforeAutospacing="1" w:after="100" w:afterAutospacing="1" w:line="240" w:lineRule="auto"/>
+        <w:rPr>
+          <w:rFonts w:ascii="Times New Roman" w:eastAsia="Times New Roman" w:hAnsi="Times New Roman" w:cs="Times New Roman"/>
+          <w:sz w:val="24"/>
+          <w:szCs w:val="24"/>
+        </w:rPr>
+      </w:pPr>
+      <w:r>
+        <w:rPr>
+          <w:rFonts w:ascii="Times New Roman" w:eastAsia="Times New Roman" w:hAnsi="Times New Roman" w:cs="Times New Roman"/>
+          <w:sz w:val="24"/>
+          <w:szCs w:val="24"/>
+        </w:rPr>
+        <w:t xml:space="preserve">Do you pick the most expensive overall item? </w:t>
+      </w:r>
+      <w:r>
+        <w:rPr>
+          <w:rFonts w:ascii="Times New Roman" w:eastAsia="Times New Roman" w:hAnsi="Times New Roman" w:cs="Times New Roman"/>
+          <w:i/>
+          <w:iCs/>
+          <w:sz w:val="24"/>
+          <w:szCs w:val="24"/>
+        </w:rPr>
+        <w:t>(No, it might weigh 100 kg and not fit).</w:t>
+      </w:r>
+    </w:p>
+    <w:p>
+      <w:pPr>
+        <w:numPr>
+          <w:ilvl w:val="0"/>
+          <w:numId w:val="16"/>
+        </w:numPr>
+        <w:spacing w:before="100" w:beforeAutospacing="1" w:after="100" w:afterAutospacing="1" w:line="240" w:lineRule="auto"/>
+        <w:rPr>
+          <w:rFonts w:ascii="Times New Roman" w:eastAsia="Times New Roman" w:hAnsi="Times New Roman" w:cs="Times New Roman"/>
+          <w:sz w:val="24"/>
+          <w:szCs w:val="24"/>
+        </w:rPr>
+      </w:pPr>
+      <w:r>
+        <w:rPr>
+          <w:rFonts w:ascii="Times New Roman" w:eastAsia="Times New Roman" w:hAnsi="Times New Roman" w:cs="Times New Roman"/>
+          <w:sz w:val="24"/>
+          <w:szCs w:val="24"/>
+        </w:rPr>
+        <w:t xml:space="preserve">Do you pick the lightest item? </w:t>
+      </w:r>
+      <w:r>
+        <w:rPr>
+          <w:rFonts w:ascii="Times New Roman" w:eastAsia="Times New Roman" w:hAnsi="Times New Roman" w:cs="Times New Roman"/>
+          <w:i/>
+          <w:iCs/>
+          <w:sz w:val="24"/>
+          <w:szCs w:val="24"/>
+        </w:rPr>
+        <w:t>(No, it might be worth nothing).</w:t>
+      </w:r>
+    </w:p>
+    <w:p>
+      <w:pPr>
+        <w:spacing w:before="100" w:beforeAutospacing="1" w:after="100" w:afterAutospacing="1" w:line="240" w:lineRule="auto"/>
+        <w:rPr>
+          <w:rFonts w:ascii="Times New Roman" w:eastAsia="Times New Roman" w:hAnsi="Times New Roman" w:cs="Times New Roman"/>
+          <w:sz w:val="24"/>
+          <w:szCs w:val="24"/>
+        </w:rPr>
+      </w:pPr>
+      <w:r>
+        <w:rPr>
+          <w:rFonts w:ascii="Times New Roman" w:eastAsia="Times New Roman" w:hAnsi="Times New Roman" w:cs="Times New Roman"/>
+          <w:sz w:val="24"/>
+          <w:szCs w:val="24"/>
+        </w:rPr>
+        <w:t xml:space="preserve">The optimal greedy rule is: </w:t>
+      </w:r>
+      <w:r>
+        <w:rPr>
+          <w:rFonts w:ascii="Times New Roman" w:eastAsia="Times New Roman" w:hAnsi="Times New Roman" w:cs="Times New Roman"/>
+          <w:b/>
+          <w:bCs/>
+          <w:sz w:val="24"/>
+          <w:szCs w:val="24"/>
+        </w:rPr>
+        <w:t>Calculate the value density (Value ÷ Weight) for each item, and greedily take as much of the highest-density item as possible.</w:t>
+      </w:r>
+    </w:p>
+    <w:p>
+      <w:pPr>
+        <w:spacing w:before="100" w:beforeAutospacing="1" w:after="100" w:afterAutospacing="1" w:line="240" w:lineRule="auto"/>
+        <w:outlineLvl w:val="1"/>
+        <w:rPr>
+          <w:rFonts w:ascii="Times New Roman" w:eastAsia="Times New Roman" w:hAnsi="Times New Roman" w:cs="Times New Roman"/>
+          <w:b/>
+          <w:bCs/>
+          <w:sz w:val="36"/>
+          <w:szCs w:val="36"/>
+        </w:rPr>
+      </w:pPr>
+      <w:r>
+        <w:rPr>
+          <w:rFonts w:ascii="Times New Roman" w:eastAsia="Times New Roman" w:hAnsi="Times New Roman" w:cs="Times New Roman"/>
+          <w:b/>
+          <w:bCs/>
+          <w:sz w:val="36"/>
+          <w:szCs w:val="36"/>
+        </w:rPr>
+        <w:t>Step-by-Step Walkthrough</w:t>
+      </w:r>
+    </w:p>
+    <w:p>
+      <w:pPr>
+        <w:spacing w:before="100" w:beforeAutospacing="1" w:after="100" w:afterAutospacing="1" w:line="240" w:lineRule="auto"/>
+        <w:rPr>
+          <w:rFonts w:ascii="Times New Roman" w:eastAsia="Times New Roman" w:hAnsi="Times New Roman" w:cs="Times New Roman"/>
+          <w:sz w:val="24"/>
+          <w:szCs w:val="24"/>
+        </w:rPr>
+      </w:pPr>
+      <w:r>
+        <w:rPr>
+          <w:rFonts w:ascii="Times New Roman" w:eastAsia="Times New Roman" w:hAnsi="Times New Roman" w:cs="Times New Roman"/>
+          <w:sz w:val="24"/>
+          <w:szCs w:val="24"/>
+        </w:rPr>
+        <w:t xml:space="preserve">Let’s look at a concrete example. Suppose your knapsack can hold a maximum capacity of </w:t>
+      </w:r>
+      <w:r>
+        <w:rPr>
+          <w:rFonts w:ascii="Times New Roman" w:eastAsia="Times New Roman" w:hAnsi="Times New Roman" w:cs="Times New Roman"/>
+          <w:b/>
+          <w:bCs/>
+          <w:sz w:val="24"/>
+          <w:szCs w:val="24"/>
+        </w:rPr>
+        <w:t>$W = 50\</w:t>
+      </w:r>
+      <w:proofErr w:type="gramStart"/>
+      <w:r>
+        <w:rPr>
+          <w:rFonts w:ascii="Times New Roman" w:eastAsia="Times New Roman" w:hAnsi="Times New Roman" w:cs="Times New Roman"/>
+          <w:b/>
+          <w:bCs/>
+          <w:sz w:val="24"/>
+          <w:szCs w:val="24"/>
+        </w:rPr>
+        <w:t>text{</w:t>
+      </w:r>
+      <w:proofErr w:type="gramEnd"/>
+      <w:r>
+        <w:rPr>
+          <w:rFonts w:ascii="Times New Roman" w:eastAsia="Times New Roman" w:hAnsi="Times New Roman" w:cs="Times New Roman"/>
+          <w:b/>
+          <w:bCs/>
+          <w:sz w:val="24"/>
+          <w:szCs w:val="24"/>
+        </w:rPr>
+        <w:t xml:space="preserve"> kg}$</w:t>
+      </w:r>
+      <w:r>
+        <w:rPr>
+          <w:rFonts w:ascii="Times New Roman" w:eastAsia="Times New Roman" w:hAnsi="Times New Roman" w:cs="Times New Roman"/>
+          <w:sz w:val="24"/>
+          <w:szCs w:val="24"/>
+        </w:rPr>
+        <w:t>. You have 3 items available:</w:t>
+      </w:r>
+    </w:p>
+    <w:tbl>
+      <w:tblPr>
+        <w:tblW w:w="0" w:type="auto"/>
+        <w:tblCellSpacing w:w="15" w:type="dxa"/>
+        <w:tblCellMar>
+          <w:top w:w="15" w:type="dxa"/>
+          <w:left w:w="15" w:type="dxa"/>
+          <w:bottom w:w="15" w:type="dxa"/>
+          <w:right w:w="15" w:type="dxa"/>
+        </w:tblCellMar>
+        <w:tblLook w:val="04A0"/>
+      </w:tblPr>
+      <w:tblGrid>
+        <w:gridCol w:w="785"/>
+        <w:gridCol w:w="890"/>
+        <w:gridCol w:w="1037"/>
+        <w:gridCol w:w="2619"/>
+      </w:tblGrid>
+      <w:tr>
+        <w:trPr>
+          <w:tblHeader/>
+          <w:tblCellSpacing w:w="15" w:type="dxa"/>
+        </w:trPr>
+        <w:tc>
+          <w:tcPr>
+            <w:tcW w:w="0" w:type="auto"/>
+            <w:tcBorders>
+              <w:top w:val="single" w:sz="4" w:space="0" w:color="C4C7C5"/>
+              <w:left w:val="single" w:sz="4" w:space="0" w:color="C4C7C5"/>
+              <w:bottom w:val="single" w:sz="4" w:space="0" w:color="C4C7C5"/>
+              <w:right w:val="single" w:sz="4" w:space="0" w:color="C4C7C5"/>
+            </w:tcBorders>
+            <w:tcMar>
+              <w:top w:w="80" w:type="dxa"/>
+              <w:left w:w="120" w:type="dxa"/>
+              <w:bottom w:w="80" w:type="dxa"/>
+              <w:right w:w="120" w:type="dxa"/>
+            </w:tcMar>
+            <w:vAlign w:val="center"/>
+            <w:hideMark/>
+          </w:tcPr>
+          <w:p>
+            <w:pPr>
+              <w:spacing w:after="320" w:line="240" w:lineRule="auto"/>
+              <w:rPr>
+                <w:rFonts w:ascii="Times New Roman" w:eastAsia="Times New Roman" w:hAnsi="Times New Roman" w:cs="Times New Roman"/>
+                <w:sz w:val="24"/>
+                <w:szCs w:val="24"/>
+              </w:rPr>
+            </w:pPr>
+            <w:r>
+              <w:rPr>
+                <w:rFonts w:ascii="Times New Roman" w:eastAsia="Times New Roman" w:hAnsi="Times New Roman" w:cs="Times New Roman"/>
+                <w:b/>
+                <w:bCs/>
+                <w:sz w:val="24"/>
+                <w:szCs w:val="24"/>
+              </w:rPr>
+              <w:lastRenderedPageBreak/>
+              <w:t>Item</w:t>
+            </w:r>
+          </w:p>
+        </w:tc>
+        <w:tc>
+          <w:tcPr>
+            <w:tcW w:w="0" w:type="auto"/>
+            <w:tcBorders>
+              <w:top w:val="single" w:sz="4" w:space="0" w:color="C4C7C5"/>
+              <w:left w:val="single" w:sz="4" w:space="0" w:color="C4C7C5"/>
+              <w:bottom w:val="single" w:sz="4" w:space="0" w:color="C4C7C5"/>
+              <w:right w:val="single" w:sz="4" w:space="0" w:color="C4C7C5"/>
+            </w:tcBorders>
+            <w:tcMar>
+              <w:top w:w="80" w:type="dxa"/>
+              <w:left w:w="120" w:type="dxa"/>
+              <w:bottom w:w="80" w:type="dxa"/>
+              <w:right w:w="120" w:type="dxa"/>
+            </w:tcMar>
+            <w:vAlign w:val="center"/>
+            <w:hideMark/>
+          </w:tcPr>
+          <w:p>
+            <w:pPr>
+              <w:spacing w:after="320" w:line="240" w:lineRule="auto"/>
+              <w:rPr>
+                <w:rFonts w:ascii="Times New Roman" w:eastAsia="Times New Roman" w:hAnsi="Times New Roman" w:cs="Times New Roman"/>
+                <w:sz w:val="24"/>
+                <w:szCs w:val="24"/>
+              </w:rPr>
+            </w:pPr>
+            <w:r>
+              <w:rPr>
+                <w:rFonts w:ascii="Times New Roman" w:eastAsia="Times New Roman" w:hAnsi="Times New Roman" w:cs="Times New Roman"/>
+                <w:b/>
+                <w:bCs/>
+                <w:sz w:val="24"/>
+                <w:szCs w:val="24"/>
+              </w:rPr>
+              <w:t>Value</w:t>
+            </w:r>
+          </w:p>
+        </w:tc>
+        <w:tc>
+          <w:tcPr>
+            <w:tcW w:w="0" w:type="auto"/>
+            <w:tcBorders>
+              <w:top w:val="single" w:sz="4" w:space="0" w:color="C4C7C5"/>
+              <w:left w:val="single" w:sz="4" w:space="0" w:color="C4C7C5"/>
+              <w:bottom w:val="single" w:sz="4" w:space="0" w:color="C4C7C5"/>
+              <w:right w:val="single" w:sz="4" w:space="0" w:color="C4C7C5"/>
+            </w:tcBorders>
+            <w:tcMar>
+              <w:top w:w="80" w:type="dxa"/>
+              <w:left w:w="120" w:type="dxa"/>
+              <w:bottom w:w="80" w:type="dxa"/>
+              <w:right w:w="120" w:type="dxa"/>
+            </w:tcMar>
+            <w:vAlign w:val="center"/>
+            <w:hideMark/>
+          </w:tcPr>
+          <w:p>
+            <w:pPr>
+              <w:spacing w:after="320" w:line="240" w:lineRule="auto"/>
+              <w:rPr>
+                <w:rFonts w:ascii="Times New Roman" w:eastAsia="Times New Roman" w:hAnsi="Times New Roman" w:cs="Times New Roman"/>
+                <w:sz w:val="24"/>
+                <w:szCs w:val="24"/>
+              </w:rPr>
+            </w:pPr>
+            <w:r>
+              <w:rPr>
+                <w:rFonts w:ascii="Times New Roman" w:eastAsia="Times New Roman" w:hAnsi="Times New Roman" w:cs="Times New Roman"/>
+                <w:b/>
+                <w:bCs/>
+                <w:sz w:val="24"/>
+                <w:szCs w:val="24"/>
+              </w:rPr>
+              <w:t>Weight</w:t>
+            </w:r>
+          </w:p>
+        </w:tc>
+        <w:tc>
+          <w:tcPr>
+            <w:tcW w:w="0" w:type="auto"/>
+            <w:tcBorders>
+              <w:top w:val="single" w:sz="4" w:space="0" w:color="C4C7C5"/>
+              <w:left w:val="single" w:sz="4" w:space="0" w:color="C4C7C5"/>
+              <w:bottom w:val="single" w:sz="4" w:space="0" w:color="C4C7C5"/>
+              <w:right w:val="single" w:sz="4" w:space="0" w:color="C4C7C5"/>
+            </w:tcBorders>
+            <w:tcMar>
+              <w:top w:w="80" w:type="dxa"/>
+              <w:left w:w="120" w:type="dxa"/>
+              <w:bottom w:w="80" w:type="dxa"/>
+              <w:right w:w="120" w:type="dxa"/>
+            </w:tcMar>
+            <w:vAlign w:val="center"/>
+            <w:hideMark/>
+          </w:tcPr>
+          <w:p>
+            <w:pPr>
+              <w:spacing w:after="320" w:line="240" w:lineRule="auto"/>
+              <w:rPr>
+                <w:rFonts w:ascii="Times New Roman" w:eastAsia="Times New Roman" w:hAnsi="Times New Roman" w:cs="Times New Roman"/>
+                <w:sz w:val="24"/>
+                <w:szCs w:val="24"/>
+              </w:rPr>
+            </w:pPr>
+            <w:r>
+              <w:rPr>
+                <w:rFonts w:ascii="Times New Roman" w:eastAsia="Times New Roman" w:hAnsi="Times New Roman" w:cs="Times New Roman"/>
+                <w:b/>
+                <w:bCs/>
+                <w:sz w:val="24"/>
+                <w:szCs w:val="24"/>
+              </w:rPr>
+              <w:t>Value per kg (Density)</w:t>
+            </w:r>
+          </w:p>
+        </w:tc>
+      </w:tr>
+      <w:tr>
+        <w:trPr>
+          <w:tblCellSpacing w:w="15" w:type="dxa"/>
+        </w:trPr>
+        <w:tc>
+          <w:tcPr>
+            <w:tcW w:w="0" w:type="auto"/>
+            <w:tcBorders>
+              <w:top w:val="single" w:sz="4" w:space="0" w:color="C4C7C5"/>
+              <w:left w:val="single" w:sz="4" w:space="0" w:color="C4C7C5"/>
+              <w:bottom w:val="single" w:sz="4" w:space="0" w:color="C4C7C5"/>
+              <w:right w:val="single" w:sz="4" w:space="0" w:color="C4C7C5"/>
+            </w:tcBorders>
+            <w:tcMar>
+              <w:top w:w="80" w:type="dxa"/>
+              <w:left w:w="120" w:type="dxa"/>
+              <w:bottom w:w="80" w:type="dxa"/>
+              <w:right w:w="120" w:type="dxa"/>
+            </w:tcMar>
+            <w:vAlign w:val="center"/>
+            <w:hideMark/>
+          </w:tcPr>
+          <w:p>
+            <w:pPr>
+              <w:spacing w:after="320" w:line="240" w:lineRule="auto"/>
+              <w:rPr>
+                <w:rFonts w:ascii="Times New Roman" w:eastAsia="Times New Roman" w:hAnsi="Times New Roman" w:cs="Times New Roman"/>
+                <w:sz w:val="24"/>
+                <w:szCs w:val="24"/>
+              </w:rPr>
+            </w:pPr>
+            <w:r>
+              <w:rPr>
+                <w:rFonts w:ascii="Times New Roman" w:eastAsia="Times New Roman" w:hAnsi="Times New Roman" w:cs="Times New Roman"/>
+                <w:b/>
+                <w:bCs/>
+                <w:sz w:val="24"/>
+                <w:szCs w:val="24"/>
+              </w:rPr>
+              <w:t>A</w:t>
+            </w:r>
+          </w:p>
+        </w:tc>
+        <w:tc>
+          <w:tcPr>
+            <w:tcW w:w="0" w:type="auto"/>
+            <w:tcBorders>
+              <w:top w:val="single" w:sz="4" w:space="0" w:color="C4C7C5"/>
+              <w:left w:val="single" w:sz="4" w:space="0" w:color="C4C7C5"/>
+              <w:bottom w:val="single" w:sz="4" w:space="0" w:color="C4C7C5"/>
+              <w:right w:val="single" w:sz="4" w:space="0" w:color="C4C7C5"/>
+            </w:tcBorders>
+            <w:tcMar>
+              <w:top w:w="80" w:type="dxa"/>
+              <w:left w:w="120" w:type="dxa"/>
+              <w:bottom w:w="80" w:type="dxa"/>
+              <w:right w:w="120" w:type="dxa"/>
+            </w:tcMar>
+            <w:vAlign w:val="center"/>
+            <w:hideMark/>
+          </w:tcPr>
+          <w:p>
+            <w:pPr>
+              <w:spacing w:after="320" w:line="240" w:lineRule="auto"/>
+              <w:rPr>
+                <w:rFonts w:ascii="Times New Roman" w:eastAsia="Times New Roman" w:hAnsi="Times New Roman" w:cs="Times New Roman"/>
+                <w:sz w:val="24"/>
+                <w:szCs w:val="24"/>
+              </w:rPr>
+            </w:pPr>
+            <w:r>
+              <w:rPr>
+                <w:rFonts w:ascii="Times New Roman" w:eastAsia="Times New Roman" w:hAnsi="Times New Roman" w:cs="Times New Roman"/>
+                <w:sz w:val="24"/>
+                <w:szCs w:val="24"/>
+              </w:rPr>
+              <w:t>$60</w:t>
+            </w:r>
+          </w:p>
+        </w:tc>
+        <w:tc>
+          <w:tcPr>
+            <w:tcW w:w="0" w:type="auto"/>
+            <w:tcBorders>
+              <w:top w:val="single" w:sz="4" w:space="0" w:color="C4C7C5"/>
+              <w:left w:val="single" w:sz="4" w:space="0" w:color="C4C7C5"/>
+              <w:bottom w:val="single" w:sz="4" w:space="0" w:color="C4C7C5"/>
+              <w:right w:val="single" w:sz="4" w:space="0" w:color="C4C7C5"/>
+            </w:tcBorders>
+            <w:tcMar>
+              <w:top w:w="80" w:type="dxa"/>
+              <w:left w:w="120" w:type="dxa"/>
+              <w:bottom w:w="80" w:type="dxa"/>
+              <w:right w:w="120" w:type="dxa"/>
+            </w:tcMar>
+            <w:vAlign w:val="center"/>
+            <w:hideMark/>
+          </w:tcPr>
+          <w:p>
+            <w:pPr>
+              <w:spacing w:after="320" w:line="240" w:lineRule="auto"/>
+              <w:rPr>
+                <w:rFonts w:ascii="Times New Roman" w:eastAsia="Times New Roman" w:hAnsi="Times New Roman" w:cs="Times New Roman"/>
+                <w:sz w:val="24"/>
+                <w:szCs w:val="24"/>
+              </w:rPr>
+            </w:pPr>
+            <w:r>
+              <w:rPr>
+                <w:rFonts w:ascii="Times New Roman" w:eastAsia="Times New Roman" w:hAnsi="Times New Roman" w:cs="Times New Roman"/>
+                <w:sz w:val="24"/>
+                <w:szCs w:val="24"/>
+              </w:rPr>
+              <w:t>10 kg</w:t>
+            </w:r>
+          </w:p>
+        </w:tc>
+        <w:tc>
+          <w:tcPr>
+            <w:tcW w:w="0" w:type="auto"/>
+            <w:tcBorders>
+              <w:top w:val="single" w:sz="4" w:space="0" w:color="C4C7C5"/>
+              <w:left w:val="single" w:sz="4" w:space="0" w:color="C4C7C5"/>
+              <w:bottom w:val="single" w:sz="4" w:space="0" w:color="C4C7C5"/>
+              <w:right w:val="single" w:sz="4" w:space="0" w:color="C4C7C5"/>
+            </w:tcBorders>
+            <w:tcMar>
+              <w:top w:w="80" w:type="dxa"/>
+              <w:left w:w="120" w:type="dxa"/>
+              <w:bottom w:w="80" w:type="dxa"/>
+              <w:right w:w="120" w:type="dxa"/>
+            </w:tcMar>
+            <w:vAlign w:val="center"/>
+            <w:hideMark/>
+          </w:tcPr>
+          <w:p>
+            <w:pPr>
+              <w:spacing w:after="320" w:line="240" w:lineRule="auto"/>
+              <w:rPr>
+                <w:rFonts w:ascii="Times New Roman" w:eastAsia="Times New Roman" w:hAnsi="Times New Roman" w:cs="Times New Roman"/>
+                <w:sz w:val="24"/>
+                <w:szCs w:val="24"/>
+              </w:rPr>
+            </w:pPr>
+            <w:r>
+              <w:rPr>
+                <w:rFonts w:ascii="Times New Roman" w:eastAsia="Times New Roman" w:hAnsi="Times New Roman" w:cs="Times New Roman"/>
+                <w:sz w:val="24"/>
+                <w:szCs w:val="24"/>
+              </w:rPr>
+              <w:t>$6 / kg</w:t>
+            </w:r>
+          </w:p>
+        </w:tc>
+      </w:tr>
+      <w:tr>
+        <w:trPr>
+          <w:tblCellSpacing w:w="15" w:type="dxa"/>
+        </w:trPr>
+        <w:tc>
+          <w:tcPr>
+            <w:tcW w:w="0" w:type="auto"/>
+            <w:tcBorders>
+              <w:top w:val="single" w:sz="4" w:space="0" w:color="C4C7C5"/>
+              <w:left w:val="single" w:sz="4" w:space="0" w:color="C4C7C5"/>
+              <w:bottom w:val="single" w:sz="4" w:space="0" w:color="C4C7C5"/>
+              <w:right w:val="single" w:sz="4" w:space="0" w:color="C4C7C5"/>
+            </w:tcBorders>
+            <w:tcMar>
+              <w:top w:w="80" w:type="dxa"/>
+              <w:left w:w="120" w:type="dxa"/>
+              <w:bottom w:w="80" w:type="dxa"/>
+              <w:right w:w="120" w:type="dxa"/>
+            </w:tcMar>
+            <w:vAlign w:val="center"/>
+            <w:hideMark/>
+          </w:tcPr>
+          <w:p>
+            <w:pPr>
+              <w:spacing w:after="320" w:line="240" w:lineRule="auto"/>
+              <w:rPr>
+                <w:rFonts w:ascii="Times New Roman" w:eastAsia="Times New Roman" w:hAnsi="Times New Roman" w:cs="Times New Roman"/>
+                <w:sz w:val="24"/>
+                <w:szCs w:val="24"/>
+              </w:rPr>
+            </w:pPr>
+            <w:r>
+              <w:rPr>
+                <w:rFonts w:ascii="Times New Roman" w:eastAsia="Times New Roman" w:hAnsi="Times New Roman" w:cs="Times New Roman"/>
+                <w:b/>
+                <w:bCs/>
+                <w:sz w:val="24"/>
+                <w:szCs w:val="24"/>
+              </w:rPr>
+              <w:t>B</w:t>
+            </w:r>
+          </w:p>
+        </w:tc>
+        <w:tc>
+          <w:tcPr>
+            <w:tcW w:w="0" w:type="auto"/>
+            <w:tcBorders>
+              <w:top w:val="single" w:sz="4" w:space="0" w:color="C4C7C5"/>
+              <w:left w:val="single" w:sz="4" w:space="0" w:color="C4C7C5"/>
+              <w:bottom w:val="single" w:sz="4" w:space="0" w:color="C4C7C5"/>
+              <w:right w:val="single" w:sz="4" w:space="0" w:color="C4C7C5"/>
+            </w:tcBorders>
+            <w:tcMar>
+              <w:top w:w="80" w:type="dxa"/>
+              <w:left w:w="120" w:type="dxa"/>
+              <w:bottom w:w="80" w:type="dxa"/>
+              <w:right w:w="120" w:type="dxa"/>
+            </w:tcMar>
+            <w:vAlign w:val="center"/>
+            <w:hideMark/>
+          </w:tcPr>
+          <w:p>
+            <w:pPr>
+              <w:spacing w:after="320" w:line="240" w:lineRule="auto"/>
+              <w:rPr>
+                <w:rFonts w:ascii="Times New Roman" w:eastAsia="Times New Roman" w:hAnsi="Times New Roman" w:cs="Times New Roman"/>
+                <w:sz w:val="24"/>
+                <w:szCs w:val="24"/>
+              </w:rPr>
+            </w:pPr>
+            <w:r>
+              <w:rPr>
+                <w:rFonts w:ascii="Times New Roman" w:eastAsia="Times New Roman" w:hAnsi="Times New Roman" w:cs="Times New Roman"/>
+                <w:sz w:val="24"/>
+                <w:szCs w:val="24"/>
+              </w:rPr>
+              <w:t>$100</w:t>
+            </w:r>
+          </w:p>
+        </w:tc>
+        <w:tc>
+          <w:tcPr>
+            <w:tcW w:w="0" w:type="auto"/>
+            <w:tcBorders>
+              <w:top w:val="single" w:sz="4" w:space="0" w:color="C4C7C5"/>
+              <w:left w:val="single" w:sz="4" w:space="0" w:color="C4C7C5"/>
+              <w:bottom w:val="single" w:sz="4" w:space="0" w:color="C4C7C5"/>
+              <w:right w:val="single" w:sz="4" w:space="0" w:color="C4C7C5"/>
+            </w:tcBorders>
+            <w:tcMar>
+              <w:top w:w="80" w:type="dxa"/>
+              <w:left w:w="120" w:type="dxa"/>
+              <w:bottom w:w="80" w:type="dxa"/>
+              <w:right w:w="120" w:type="dxa"/>
+            </w:tcMar>
+            <w:vAlign w:val="center"/>
+            <w:hideMark/>
+          </w:tcPr>
+          <w:p>
+            <w:pPr>
+              <w:spacing w:after="320" w:line="240" w:lineRule="auto"/>
+              <w:rPr>
+                <w:rFonts w:ascii="Times New Roman" w:eastAsia="Times New Roman" w:hAnsi="Times New Roman" w:cs="Times New Roman"/>
+                <w:sz w:val="24"/>
+                <w:szCs w:val="24"/>
+              </w:rPr>
+            </w:pPr>
+            <w:r>
+              <w:rPr>
+                <w:rFonts w:ascii="Times New Roman" w:eastAsia="Times New Roman" w:hAnsi="Times New Roman" w:cs="Times New Roman"/>
+                <w:sz w:val="24"/>
+                <w:szCs w:val="24"/>
+              </w:rPr>
+              <w:t>20 kg</w:t>
+            </w:r>
+          </w:p>
+        </w:tc>
+        <w:tc>
+          <w:tcPr>
+            <w:tcW w:w="0" w:type="auto"/>
+            <w:tcBorders>
+              <w:top w:val="single" w:sz="4" w:space="0" w:color="C4C7C5"/>
+              <w:left w:val="single" w:sz="4" w:space="0" w:color="C4C7C5"/>
+              <w:bottom w:val="single" w:sz="4" w:space="0" w:color="C4C7C5"/>
+              <w:right w:val="single" w:sz="4" w:space="0" w:color="C4C7C5"/>
+            </w:tcBorders>
+            <w:tcMar>
+              <w:top w:w="80" w:type="dxa"/>
+              <w:left w:w="120" w:type="dxa"/>
+              <w:bottom w:w="80" w:type="dxa"/>
+              <w:right w:w="120" w:type="dxa"/>
+            </w:tcMar>
+            <w:vAlign w:val="center"/>
+            <w:hideMark/>
+          </w:tcPr>
+          <w:p>
+            <w:pPr>
+              <w:spacing w:after="320" w:line="240" w:lineRule="auto"/>
+              <w:rPr>
+                <w:rFonts w:ascii="Times New Roman" w:eastAsia="Times New Roman" w:hAnsi="Times New Roman" w:cs="Times New Roman"/>
+                <w:sz w:val="24"/>
+                <w:szCs w:val="24"/>
+              </w:rPr>
+            </w:pPr>
+            <w:r>
+              <w:rPr>
+                <w:rFonts w:ascii="Times New Roman" w:eastAsia="Times New Roman" w:hAnsi="Times New Roman" w:cs="Times New Roman"/>
+                <w:sz w:val="24"/>
+                <w:szCs w:val="24"/>
+              </w:rPr>
+              <w:t>$5 / kg</w:t>
+            </w:r>
+          </w:p>
+        </w:tc>
+      </w:tr>
+      <w:tr>
+        <w:trPr>
+          <w:tblCellSpacing w:w="15" w:type="dxa"/>
+        </w:trPr>
+        <w:tc>
+          <w:tcPr>
+            <w:tcW w:w="0" w:type="auto"/>
+            <w:tcBorders>
+              <w:top w:val="single" w:sz="4" w:space="0" w:color="C4C7C5"/>
+              <w:left w:val="single" w:sz="4" w:space="0" w:color="C4C7C5"/>
+              <w:bottom w:val="single" w:sz="4" w:space="0" w:color="C4C7C5"/>
+              <w:right w:val="single" w:sz="4" w:space="0" w:color="C4C7C5"/>
+            </w:tcBorders>
+            <w:tcMar>
+              <w:top w:w="80" w:type="dxa"/>
+              <w:left w:w="120" w:type="dxa"/>
+              <w:bottom w:w="80" w:type="dxa"/>
+              <w:right w:w="120" w:type="dxa"/>
+            </w:tcMar>
+            <w:vAlign w:val="center"/>
+            <w:hideMark/>
+          </w:tcPr>
+          <w:p>
+            <w:pPr>
+              <w:spacing w:after="320" w:line="240" w:lineRule="auto"/>
+              <w:rPr>
+                <w:rFonts w:ascii="Times New Roman" w:eastAsia="Times New Roman" w:hAnsi="Times New Roman" w:cs="Times New Roman"/>
+                <w:sz w:val="24"/>
+                <w:szCs w:val="24"/>
+              </w:rPr>
+            </w:pPr>
+            <w:r>
+              <w:rPr>
+                <w:rFonts w:ascii="Times New Roman" w:eastAsia="Times New Roman" w:hAnsi="Times New Roman" w:cs="Times New Roman"/>
+                <w:b/>
+                <w:bCs/>
+                <w:sz w:val="24"/>
+                <w:szCs w:val="24"/>
+              </w:rPr>
+              <w:t>C</w:t>
+            </w:r>
+          </w:p>
+        </w:tc>
+        <w:tc>
+          <w:tcPr>
+            <w:tcW w:w="0" w:type="auto"/>
+            <w:tcBorders>
+              <w:top w:val="single" w:sz="4" w:space="0" w:color="C4C7C5"/>
+              <w:left w:val="single" w:sz="4" w:space="0" w:color="C4C7C5"/>
+              <w:bottom w:val="single" w:sz="4" w:space="0" w:color="C4C7C5"/>
+              <w:right w:val="single" w:sz="4" w:space="0" w:color="C4C7C5"/>
+            </w:tcBorders>
+            <w:tcMar>
+              <w:top w:w="80" w:type="dxa"/>
+              <w:left w:w="120" w:type="dxa"/>
+              <w:bottom w:w="80" w:type="dxa"/>
+              <w:right w:w="120" w:type="dxa"/>
+            </w:tcMar>
+            <w:vAlign w:val="center"/>
+            <w:hideMark/>
+          </w:tcPr>
+          <w:p>
+            <w:pPr>
+              <w:spacing w:after="320" w:line="240" w:lineRule="auto"/>
+              <w:rPr>
+                <w:rFonts w:ascii="Times New Roman" w:eastAsia="Times New Roman" w:hAnsi="Times New Roman" w:cs="Times New Roman"/>
+                <w:sz w:val="24"/>
+                <w:szCs w:val="24"/>
+              </w:rPr>
+            </w:pPr>
+            <w:r>
+              <w:rPr>
+                <w:rFonts w:ascii="Times New Roman" w:eastAsia="Times New Roman" w:hAnsi="Times New Roman" w:cs="Times New Roman"/>
+                <w:sz w:val="24"/>
+                <w:szCs w:val="24"/>
+              </w:rPr>
+              <w:t>$120</w:t>
+            </w:r>
+          </w:p>
+        </w:tc>
+        <w:tc>
+          <w:tcPr>
+            <w:tcW w:w="0" w:type="auto"/>
+            <w:tcBorders>
+              <w:top w:val="single" w:sz="4" w:space="0" w:color="C4C7C5"/>
+              <w:left w:val="single" w:sz="4" w:space="0" w:color="C4C7C5"/>
+              <w:bottom w:val="single" w:sz="4" w:space="0" w:color="C4C7C5"/>
+              <w:right w:val="single" w:sz="4" w:space="0" w:color="C4C7C5"/>
+            </w:tcBorders>
+            <w:tcMar>
+              <w:top w:w="80" w:type="dxa"/>
+              <w:left w:w="120" w:type="dxa"/>
+              <w:bottom w:w="80" w:type="dxa"/>
+              <w:right w:w="120" w:type="dxa"/>
+            </w:tcMar>
+            <w:vAlign w:val="center"/>
+            <w:hideMark/>
+          </w:tcPr>
+          <w:p>
+            <w:pPr>
+              <w:spacing w:after="320" w:line="240" w:lineRule="auto"/>
+              <w:rPr>
+                <w:rFonts w:ascii="Times New Roman" w:eastAsia="Times New Roman" w:hAnsi="Times New Roman" w:cs="Times New Roman"/>
+                <w:sz w:val="24"/>
+                <w:szCs w:val="24"/>
+              </w:rPr>
+            </w:pPr>
+            <w:r>
+              <w:rPr>
+                <w:rFonts w:ascii="Times New Roman" w:eastAsia="Times New Roman" w:hAnsi="Times New Roman" w:cs="Times New Roman"/>
+                <w:sz w:val="24"/>
+                <w:szCs w:val="24"/>
+              </w:rPr>
+              <w:t>30 kg</w:t>
+            </w:r>
+          </w:p>
+        </w:tc>
+        <w:tc>
+          <w:tcPr>
+            <w:tcW w:w="0" w:type="auto"/>
+            <w:tcBorders>
+              <w:top w:val="single" w:sz="4" w:space="0" w:color="C4C7C5"/>
+              <w:left w:val="single" w:sz="4" w:space="0" w:color="C4C7C5"/>
+              <w:bottom w:val="single" w:sz="4" w:space="0" w:color="C4C7C5"/>
+              <w:right w:val="single" w:sz="4" w:space="0" w:color="C4C7C5"/>
+            </w:tcBorders>
+            <w:tcMar>
+              <w:top w:w="80" w:type="dxa"/>
+              <w:left w:w="120" w:type="dxa"/>
+              <w:bottom w:w="80" w:type="dxa"/>
+              <w:right w:w="120" w:type="dxa"/>
+            </w:tcMar>
+            <w:vAlign w:val="center"/>
+            <w:hideMark/>
+          </w:tcPr>
+          <w:p>
+            <w:pPr>
+              <w:spacing w:after="320" w:line="240" w:lineRule="auto"/>
+              <w:rPr>
+                <w:rFonts w:ascii="Times New Roman" w:eastAsia="Times New Roman" w:hAnsi="Times New Roman" w:cs="Times New Roman"/>
+                <w:sz w:val="24"/>
+                <w:szCs w:val="24"/>
+              </w:rPr>
+            </w:pPr>
+            <w:r>
+              <w:rPr>
+                <w:rFonts w:ascii="Times New Roman" w:eastAsia="Times New Roman" w:hAnsi="Times New Roman" w:cs="Times New Roman"/>
+                <w:sz w:val="24"/>
+                <w:szCs w:val="24"/>
+              </w:rPr>
+              <w:t>$4 / kg</w:t>
+            </w:r>
+          </w:p>
+        </w:tc>
+      </w:tr>
+    </w:tbl>
+    <w:p>
+      <w:pPr>
+        <w:spacing w:before="100" w:beforeAutospacing="1" w:after="100" w:afterAutospacing="1" w:line="240" w:lineRule="auto"/>
+        <w:outlineLvl w:val="2"/>
+        <w:rPr>
+          <w:rFonts w:ascii="Times New Roman" w:eastAsia="Times New Roman" w:hAnsi="Times New Roman" w:cs="Times New Roman"/>
+          <w:b/>
+          <w:bCs/>
+          <w:sz w:val="27"/>
+          <w:szCs w:val="27"/>
+        </w:rPr>
+      </w:pPr>
+      <w:r>
+        <w:rPr>
+          <w:rFonts w:ascii="Times New Roman" w:eastAsia="Times New Roman" w:hAnsi="Times New Roman" w:cs="Times New Roman"/>
+          <w:b/>
+          <w:bCs/>
+          <w:sz w:val="27"/>
+          <w:szCs w:val="27"/>
+        </w:rPr>
+        <w:t>Step 1: Sort by Value per Kilogram</w:t>
+      </w:r>
+    </w:p>
+    <w:p>
+      <w:pPr>
+        <w:spacing w:before="100" w:beforeAutospacing="1" w:after="100" w:afterAutospacing="1" w:line="240" w:lineRule="auto"/>
+        <w:rPr>
+          <w:rFonts w:ascii="Times New Roman" w:eastAsia="Times New Roman" w:hAnsi="Times New Roman" w:cs="Times New Roman"/>
+          <w:sz w:val="24"/>
+          <w:szCs w:val="24"/>
+        </w:rPr>
+      </w:pPr>
+      <w:r>
+        <w:rPr>
+          <w:rFonts w:ascii="Times New Roman" w:eastAsia="Times New Roman" w:hAnsi="Times New Roman" w:cs="Times New Roman"/>
+          <w:sz w:val="24"/>
+          <w:szCs w:val="24"/>
+        </w:rPr>
+        <w:t>To make our greedy choices, we sort the items in descending order of their value per kg density. (Conveniently, our table above is already sorted this way: $A &gt; B &gt; C$).</w:t>
+      </w:r>
+    </w:p>
+    <w:p>
+      <w:pPr>
+        <w:spacing w:before="100" w:beforeAutospacing="1" w:after="100" w:afterAutospacing="1" w:line="240" w:lineRule="auto"/>
+        <w:outlineLvl w:val="2"/>
+        <w:rPr>
+          <w:rFonts w:ascii="Times New Roman" w:eastAsia="Times New Roman" w:hAnsi="Times New Roman" w:cs="Times New Roman"/>
+          <w:b/>
+          <w:bCs/>
+          <w:sz w:val="27"/>
+          <w:szCs w:val="27"/>
+        </w:rPr>
+      </w:pPr>
+      <w:r>
+        <w:rPr>
+          <w:rFonts w:ascii="Times New Roman" w:eastAsia="Times New Roman" w:hAnsi="Times New Roman" w:cs="Times New Roman"/>
+          <w:b/>
+          <w:bCs/>
+          <w:sz w:val="27"/>
+          <w:szCs w:val="27"/>
+        </w:rPr>
+        <w:t>Step 2: Make the Greedy Choices</w:t>
+      </w:r>
+    </w:p>
+    <w:p>
+      <w:pPr>
+        <w:spacing w:after="0" w:line="240" w:lineRule="auto"/>
+        <w:rPr>
+          <w:rFonts w:ascii="Times New Roman" w:eastAsia="Times New Roman" w:hAnsi="Times New Roman" w:cs="Times New Roman"/>
+          <w:sz w:val="24"/>
+          <w:szCs w:val="24"/>
+        </w:rPr>
+      </w:pPr>
+      <w:proofErr w:type="gramStart"/>
+      <w:r>
+        <w:rPr>
+          <w:rFonts w:ascii="Times New Roman" w:eastAsia="Times New Roman" w:hAnsi="Times New Roman" w:cs="Times New Roman"/>
+          <w:b/>
+          <w:bCs/>
+          <w:sz w:val="24"/>
+          <w:szCs w:val="24"/>
+        </w:rPr>
+        <w:t>1.Take</w:t>
+      </w:r>
+      <w:proofErr w:type="gramEnd"/>
+      <w:r>
+        <w:rPr>
+          <w:rFonts w:ascii="Times New Roman" w:eastAsia="Times New Roman" w:hAnsi="Times New Roman" w:cs="Times New Roman"/>
+          <w:b/>
+          <w:bCs/>
+          <w:sz w:val="24"/>
+          <w:szCs w:val="24"/>
+        </w:rPr>
+        <w:t xml:space="preserve"> Item A:</w:t>
+      </w:r>
+      <w:r>
+        <w:rPr>
+          <w:rFonts w:ascii="Times New Roman" w:eastAsia="Times New Roman" w:hAnsi="Times New Roman" w:cs="Times New Roman"/>
+          <w:sz w:val="24"/>
+          <w:szCs w:val="24"/>
+        </w:rPr>
+        <w:t>Remaining capacity: 50 kg.</w:t>
+      </w:r>
+    </w:p>
+    <w:p>
+      <w:pPr>
+        <w:spacing w:before="100" w:beforeAutospacing="1" w:after="100" w:afterAutospacing="1" w:line="240" w:lineRule="auto"/>
+        <w:rPr>
+          <w:rFonts w:ascii="Times New Roman" w:eastAsia="Times New Roman" w:hAnsi="Times New Roman" w:cs="Times New Roman"/>
+          <w:sz w:val="24"/>
+          <w:szCs w:val="24"/>
+        </w:rPr>
+      </w:pPr>
+      <w:r>
+        <w:rPr>
+          <w:rFonts w:ascii="Times New Roman" w:eastAsia="Times New Roman" w:hAnsi="Times New Roman" w:cs="Times New Roman"/>
+          <w:sz w:val="24"/>
+          <w:szCs w:val="24"/>
+        </w:rPr>
+        <w:t>Item A has the highest density ($6/kg). Its total weight is 10 kg, which easily fits in our 50 kg bag.</w:t>
+      </w:r>
+    </w:p>
+    <w:p>
+      <w:pPr>
+        <w:numPr>
+          <w:ilvl w:val="0"/>
+          <w:numId w:val="17"/>
+        </w:numPr>
+        <w:spacing w:before="100" w:beforeAutospacing="1" w:after="100" w:afterAutospacing="1" w:line="240" w:lineRule="auto"/>
+        <w:rPr>
+          <w:rFonts w:ascii="Times New Roman" w:eastAsia="Times New Roman" w:hAnsi="Times New Roman" w:cs="Times New Roman"/>
+          <w:sz w:val="24"/>
+          <w:szCs w:val="24"/>
+        </w:rPr>
+      </w:pPr>
+      <w:r>
+        <w:rPr>
+          <w:rFonts w:ascii="Times New Roman" w:eastAsia="Times New Roman" w:hAnsi="Times New Roman" w:cs="Times New Roman"/>
+          <w:i/>
+          <w:iCs/>
+          <w:sz w:val="24"/>
+          <w:szCs w:val="24"/>
+        </w:rPr>
+        <w:t>Action:</w:t>
+      </w:r>
+      <w:r>
+        <w:rPr>
+          <w:rFonts w:ascii="Times New Roman" w:eastAsia="Times New Roman" w:hAnsi="Times New Roman" w:cs="Times New Roman"/>
+          <w:sz w:val="24"/>
+          <w:szCs w:val="24"/>
+        </w:rPr>
+        <w:t xml:space="preserve"> Take </w:t>
+      </w:r>
+      <w:r>
+        <w:rPr>
+          <w:rFonts w:ascii="Times New Roman" w:eastAsia="Times New Roman" w:hAnsi="Times New Roman" w:cs="Times New Roman"/>
+          <w:b/>
+          <w:bCs/>
+          <w:sz w:val="24"/>
+          <w:szCs w:val="24"/>
+        </w:rPr>
+        <w:t>all</w:t>
+      </w:r>
+      <w:r>
+        <w:rPr>
+          <w:rFonts w:ascii="Times New Roman" w:eastAsia="Times New Roman" w:hAnsi="Times New Roman" w:cs="Times New Roman"/>
+          <w:sz w:val="24"/>
+          <w:szCs w:val="24"/>
+        </w:rPr>
+        <w:t xml:space="preserve"> of Item A (10 kg).</w:t>
+      </w:r>
+    </w:p>
+    <w:p>
+      <w:pPr>
+        <w:numPr>
+          <w:ilvl w:val="0"/>
+          <w:numId w:val="17"/>
+        </w:numPr>
+        <w:spacing w:before="100" w:beforeAutospacing="1" w:after="100" w:afterAutospacing="1" w:line="240" w:lineRule="auto"/>
+        <w:rPr>
+          <w:rFonts w:ascii="Times New Roman" w:eastAsia="Times New Roman" w:hAnsi="Times New Roman" w:cs="Times New Roman"/>
+          <w:sz w:val="24"/>
+          <w:szCs w:val="24"/>
+        </w:rPr>
+      </w:pPr>
+      <w:r>
+        <w:rPr>
+          <w:rFonts w:ascii="Times New Roman" w:eastAsia="Times New Roman" w:hAnsi="Times New Roman" w:cs="Times New Roman"/>
+          <w:i/>
+          <w:iCs/>
+          <w:sz w:val="24"/>
+          <w:szCs w:val="24"/>
+        </w:rPr>
+        <w:t>Value gained:</w:t>
+      </w:r>
+      <w:r>
+        <w:rPr>
+          <w:rFonts w:ascii="Times New Roman" w:eastAsia="Times New Roman" w:hAnsi="Times New Roman" w:cs="Times New Roman"/>
+          <w:sz w:val="24"/>
+          <w:szCs w:val="24"/>
+        </w:rPr>
+        <w:t xml:space="preserve"> +$60.</w:t>
+      </w:r>
+    </w:p>
+    <w:p>
+      <w:pPr>
+        <w:numPr>
+          <w:ilvl w:val="0"/>
+          <w:numId w:val="17"/>
+        </w:numPr>
+        <w:spacing w:before="100" w:beforeAutospacing="1" w:after="100" w:afterAutospacing="1" w:line="240" w:lineRule="auto"/>
+        <w:rPr>
+          <w:rFonts w:ascii="Times New Roman" w:eastAsia="Times New Roman" w:hAnsi="Times New Roman" w:cs="Times New Roman"/>
+          <w:sz w:val="24"/>
+          <w:szCs w:val="24"/>
+        </w:rPr>
+      </w:pPr>
+      <w:r>
+        <w:rPr>
+          <w:rFonts w:ascii="Times New Roman" w:eastAsia="Times New Roman" w:hAnsi="Times New Roman" w:cs="Times New Roman"/>
+          <w:i/>
+          <w:iCs/>
+          <w:sz w:val="24"/>
+          <w:szCs w:val="24"/>
+        </w:rPr>
+        <w:t>Remaining capacity:</w:t>
+      </w:r>
+      <w:r>
+        <w:rPr>
+          <w:rFonts w:ascii="Times New Roman" w:eastAsia="Times New Roman" w:hAnsi="Times New Roman" w:cs="Times New Roman"/>
+          <w:sz w:val="24"/>
+          <w:szCs w:val="24"/>
+        </w:rPr>
+        <w:t xml:space="preserve"> $50 - 10 = \</w:t>
+      </w:r>
+      <w:proofErr w:type="spellStart"/>
+      <w:r>
+        <w:rPr>
+          <w:rFonts w:ascii="Times New Roman" w:eastAsia="Times New Roman" w:hAnsi="Times New Roman" w:cs="Times New Roman"/>
+          <w:sz w:val="24"/>
+          <w:szCs w:val="24"/>
+        </w:rPr>
+        <w:t>mathbf</w:t>
+      </w:r>
+      <w:proofErr w:type="spellEnd"/>
+      <w:r>
+        <w:rPr>
+          <w:rFonts w:ascii="Times New Roman" w:eastAsia="Times New Roman" w:hAnsi="Times New Roman" w:cs="Times New Roman"/>
+          <w:sz w:val="24"/>
+          <w:szCs w:val="24"/>
+        </w:rPr>
+        <w:t>{40\</w:t>
+      </w:r>
+      <w:proofErr w:type="gramStart"/>
+      <w:r>
+        <w:rPr>
+          <w:rFonts w:ascii="Times New Roman" w:eastAsia="Times New Roman" w:hAnsi="Times New Roman" w:cs="Times New Roman"/>
+          <w:sz w:val="24"/>
+          <w:szCs w:val="24"/>
+        </w:rPr>
+        <w:t>text{</w:t>
+      </w:r>
+      <w:proofErr w:type="gramEnd"/>
+      <w:r>
+        <w:rPr>
+          <w:rFonts w:ascii="Times New Roman" w:eastAsia="Times New Roman" w:hAnsi="Times New Roman" w:cs="Times New Roman"/>
+          <w:sz w:val="24"/>
+          <w:szCs w:val="24"/>
+        </w:rPr>
+        <w:t xml:space="preserve"> kg}}$.</w:t>
+      </w:r>
+    </w:p>
+    <w:p>
+      <w:pPr>
+        <w:spacing w:after="0" w:line="240" w:lineRule="auto"/>
+        <w:rPr>
+          <w:rFonts w:ascii="Times New Roman" w:eastAsia="Times New Roman" w:hAnsi="Times New Roman" w:cs="Times New Roman"/>
+          <w:sz w:val="24"/>
+          <w:szCs w:val="24"/>
+        </w:rPr>
+      </w:pPr>
+      <w:proofErr w:type="gramStart"/>
+      <w:r>
+        <w:rPr>
+          <w:rFonts w:ascii="Times New Roman" w:eastAsia="Times New Roman" w:hAnsi="Times New Roman" w:cs="Times New Roman"/>
+          <w:b/>
+          <w:bCs/>
+          <w:sz w:val="24"/>
+          <w:szCs w:val="24"/>
+        </w:rPr>
+        <w:t>2.Take</w:t>
+      </w:r>
+      <w:proofErr w:type="gramEnd"/>
+      <w:r>
+        <w:rPr>
+          <w:rFonts w:ascii="Times New Roman" w:eastAsia="Times New Roman" w:hAnsi="Times New Roman" w:cs="Times New Roman"/>
+          <w:b/>
+          <w:bCs/>
+          <w:sz w:val="24"/>
+          <w:szCs w:val="24"/>
+        </w:rPr>
+        <w:t xml:space="preserve"> Item B:</w:t>
+      </w:r>
+      <w:r>
+        <w:rPr>
+          <w:rFonts w:ascii="Times New Roman" w:eastAsia="Times New Roman" w:hAnsi="Times New Roman" w:cs="Times New Roman"/>
+          <w:sz w:val="24"/>
+          <w:szCs w:val="24"/>
+        </w:rPr>
+        <w:t>Remaining capacity: 40 kg.</w:t>
+      </w:r>
+    </w:p>
+    <w:p>
+      <w:pPr>
+        <w:spacing w:before="100" w:beforeAutospacing="1" w:after="100" w:afterAutospacing="1" w:line="240" w:lineRule="auto"/>
+        <w:rPr>
+          <w:rFonts w:ascii="Times New Roman" w:eastAsia="Times New Roman" w:hAnsi="Times New Roman" w:cs="Times New Roman"/>
+          <w:sz w:val="24"/>
+          <w:szCs w:val="24"/>
+        </w:rPr>
+      </w:pPr>
+      <w:r>
+        <w:rPr>
+          <w:rFonts w:ascii="Times New Roman" w:eastAsia="Times New Roman" w:hAnsi="Times New Roman" w:cs="Times New Roman"/>
+          <w:sz w:val="24"/>
+          <w:szCs w:val="24"/>
+        </w:rPr>
+        <w:t>Item B has the next highest density ($5/kg). Its total weight is 20 kg, which fits in our remaining 40 kg space.</w:t>
+      </w:r>
+    </w:p>
+    <w:p>
+      <w:pPr>
+        <w:numPr>
+          <w:ilvl w:val="0"/>
+          <w:numId w:val="18"/>
+        </w:numPr>
+        <w:spacing w:before="100" w:beforeAutospacing="1" w:after="100" w:afterAutospacing="1" w:line="240" w:lineRule="auto"/>
+        <w:rPr>
+          <w:rFonts w:ascii="Times New Roman" w:eastAsia="Times New Roman" w:hAnsi="Times New Roman" w:cs="Times New Roman"/>
+          <w:sz w:val="24"/>
+          <w:szCs w:val="24"/>
+        </w:rPr>
+      </w:pPr>
+      <w:r>
+        <w:rPr>
+          <w:rFonts w:ascii="Times New Roman" w:eastAsia="Times New Roman" w:hAnsi="Times New Roman" w:cs="Times New Roman"/>
+          <w:i/>
+          <w:iCs/>
+          <w:sz w:val="24"/>
+          <w:szCs w:val="24"/>
+        </w:rPr>
+        <w:t>Action:</w:t>
+      </w:r>
+      <w:r>
+        <w:rPr>
+          <w:rFonts w:ascii="Times New Roman" w:eastAsia="Times New Roman" w:hAnsi="Times New Roman" w:cs="Times New Roman"/>
+          <w:sz w:val="24"/>
+          <w:szCs w:val="24"/>
+        </w:rPr>
+        <w:t xml:space="preserve"> Take </w:t>
+      </w:r>
+      <w:r>
+        <w:rPr>
+          <w:rFonts w:ascii="Times New Roman" w:eastAsia="Times New Roman" w:hAnsi="Times New Roman" w:cs="Times New Roman"/>
+          <w:b/>
+          <w:bCs/>
+          <w:sz w:val="24"/>
+          <w:szCs w:val="24"/>
+        </w:rPr>
+        <w:t>all</w:t>
+      </w:r>
+      <w:r>
+        <w:rPr>
+          <w:rFonts w:ascii="Times New Roman" w:eastAsia="Times New Roman" w:hAnsi="Times New Roman" w:cs="Times New Roman"/>
+          <w:sz w:val="24"/>
+          <w:szCs w:val="24"/>
+        </w:rPr>
+        <w:t xml:space="preserve"> of Item B (20 kg).</w:t>
+      </w:r>
+    </w:p>
+    <w:p>
+      <w:pPr>
+        <w:numPr>
+          <w:ilvl w:val="0"/>
+          <w:numId w:val="18"/>
+        </w:numPr>
+        <w:spacing w:before="100" w:beforeAutospacing="1" w:after="100" w:afterAutospacing="1" w:line="240" w:lineRule="auto"/>
+        <w:rPr>
+          <w:rFonts w:ascii="Times New Roman" w:eastAsia="Times New Roman" w:hAnsi="Times New Roman" w:cs="Times New Roman"/>
+          <w:sz w:val="24"/>
+          <w:szCs w:val="24"/>
+        </w:rPr>
+      </w:pPr>
+      <w:r>
+        <w:rPr>
+          <w:rFonts w:ascii="Times New Roman" w:eastAsia="Times New Roman" w:hAnsi="Times New Roman" w:cs="Times New Roman"/>
+          <w:i/>
+          <w:iCs/>
+          <w:sz w:val="24"/>
+          <w:szCs w:val="24"/>
+        </w:rPr>
+        <w:t>Value gained:</w:t>
+      </w:r>
+      <w:r>
+        <w:rPr>
+          <w:rFonts w:ascii="Times New Roman" w:eastAsia="Times New Roman" w:hAnsi="Times New Roman" w:cs="Times New Roman"/>
+          <w:sz w:val="24"/>
+          <w:szCs w:val="24"/>
+        </w:rPr>
+        <w:t xml:space="preserve"> +$100.</w:t>
+      </w:r>
+    </w:p>
+    <w:p>
+      <w:pPr>
+        <w:numPr>
+          <w:ilvl w:val="0"/>
+          <w:numId w:val="18"/>
+        </w:numPr>
+        <w:spacing w:before="100" w:beforeAutospacing="1" w:after="100" w:afterAutospacing="1" w:line="240" w:lineRule="auto"/>
+        <w:rPr>
+          <w:rFonts w:ascii="Times New Roman" w:eastAsia="Times New Roman" w:hAnsi="Times New Roman" w:cs="Times New Roman"/>
+          <w:sz w:val="24"/>
+          <w:szCs w:val="24"/>
+        </w:rPr>
+      </w:pPr>
+      <w:r>
+        <w:rPr>
+          <w:rFonts w:ascii="Times New Roman" w:eastAsia="Times New Roman" w:hAnsi="Times New Roman" w:cs="Times New Roman"/>
+          <w:i/>
+          <w:iCs/>
+          <w:sz w:val="24"/>
+          <w:szCs w:val="24"/>
+        </w:rPr>
+        <w:t>Remaining capacity:</w:t>
+      </w:r>
+      <w:r>
+        <w:rPr>
+          <w:rFonts w:ascii="Times New Roman" w:eastAsia="Times New Roman" w:hAnsi="Times New Roman" w:cs="Times New Roman"/>
+          <w:sz w:val="24"/>
+          <w:szCs w:val="24"/>
+        </w:rPr>
+        <w:t xml:space="preserve"> $40 - 20 = \</w:t>
+      </w:r>
+      <w:proofErr w:type="spellStart"/>
+      <w:r>
+        <w:rPr>
+          <w:rFonts w:ascii="Times New Roman" w:eastAsia="Times New Roman" w:hAnsi="Times New Roman" w:cs="Times New Roman"/>
+          <w:sz w:val="24"/>
+          <w:szCs w:val="24"/>
+        </w:rPr>
+        <w:t>mathbf</w:t>
+      </w:r>
+      <w:proofErr w:type="spellEnd"/>
+      <w:r>
+        <w:rPr>
+          <w:rFonts w:ascii="Times New Roman" w:eastAsia="Times New Roman" w:hAnsi="Times New Roman" w:cs="Times New Roman"/>
+          <w:sz w:val="24"/>
+          <w:szCs w:val="24"/>
+        </w:rPr>
+        <w:t>{20\</w:t>
+      </w:r>
+      <w:proofErr w:type="gramStart"/>
+      <w:r>
+        <w:rPr>
+          <w:rFonts w:ascii="Times New Roman" w:eastAsia="Times New Roman" w:hAnsi="Times New Roman" w:cs="Times New Roman"/>
+          <w:sz w:val="24"/>
+          <w:szCs w:val="24"/>
+        </w:rPr>
+        <w:t>text{</w:t>
+      </w:r>
+      <w:proofErr w:type="gramEnd"/>
+      <w:r>
+        <w:rPr>
+          <w:rFonts w:ascii="Times New Roman" w:eastAsia="Times New Roman" w:hAnsi="Times New Roman" w:cs="Times New Roman"/>
+          <w:sz w:val="24"/>
+          <w:szCs w:val="24"/>
+        </w:rPr>
+        <w:t xml:space="preserve"> kg}}$.</w:t>
+      </w:r>
+    </w:p>
+    <w:p>
+      <w:pPr>
+        <w:spacing w:after="0" w:line="240" w:lineRule="auto"/>
+        <w:rPr>
+          <w:rFonts w:ascii="Times New Roman" w:eastAsia="Times New Roman" w:hAnsi="Times New Roman" w:cs="Times New Roman"/>
+          <w:sz w:val="24"/>
+          <w:szCs w:val="24"/>
+        </w:rPr>
+      </w:pPr>
+      <w:proofErr w:type="gramStart"/>
+      <w:r>
+        <w:rPr>
+          <w:rFonts w:ascii="Times New Roman" w:eastAsia="Times New Roman" w:hAnsi="Times New Roman" w:cs="Times New Roman"/>
+          <w:b/>
+          <w:bCs/>
+          <w:sz w:val="24"/>
+          <w:szCs w:val="24"/>
+        </w:rPr>
+        <w:t>3.Take</w:t>
+      </w:r>
+      <w:proofErr w:type="gramEnd"/>
+      <w:r>
+        <w:rPr>
+          <w:rFonts w:ascii="Times New Roman" w:eastAsia="Times New Roman" w:hAnsi="Times New Roman" w:cs="Times New Roman"/>
+          <w:b/>
+          <w:bCs/>
+          <w:sz w:val="24"/>
+          <w:szCs w:val="24"/>
+        </w:rPr>
+        <w:t xml:space="preserve"> a Fraction of Item C:</w:t>
+      </w:r>
+      <w:r>
+        <w:rPr>
+          <w:rFonts w:ascii="Times New Roman" w:eastAsia="Times New Roman" w:hAnsi="Times New Roman" w:cs="Times New Roman"/>
+          <w:sz w:val="24"/>
+          <w:szCs w:val="24"/>
+        </w:rPr>
+        <w:t>Remaining capacity: 20 kg.</w:t>
+      </w:r>
+    </w:p>
+    <w:p>
+      <w:pPr>
+        <w:spacing w:before="100" w:beforeAutospacing="1" w:after="100" w:afterAutospacing="1" w:line="240" w:lineRule="auto"/>
+        <w:rPr>
+          <w:rFonts w:ascii="Times New Roman" w:eastAsia="Times New Roman" w:hAnsi="Times New Roman" w:cs="Times New Roman"/>
+          <w:sz w:val="24"/>
+          <w:szCs w:val="24"/>
+        </w:rPr>
+      </w:pPr>
+      <w:r>
+        <w:rPr>
+          <w:rFonts w:ascii="Times New Roman" w:eastAsia="Times New Roman" w:hAnsi="Times New Roman" w:cs="Times New Roman"/>
+          <w:sz w:val="24"/>
+          <w:szCs w:val="24"/>
+        </w:rPr>
+        <w:t xml:space="preserve">Item C has a density of $4/kg and a total weight of 30 kg. We only have 20 kg of space left, so we cannot take all of it. Instead, </w:t>
+      </w:r>
+      <w:r>
+        <w:rPr>
+          <w:rFonts w:ascii="Times New Roman" w:eastAsia="Times New Roman" w:hAnsi="Times New Roman" w:cs="Times New Roman"/>
+          <w:b/>
+          <w:bCs/>
+          <w:sz w:val="24"/>
+          <w:szCs w:val="24"/>
+        </w:rPr>
+        <w:t>we take a fraction</w:t>
+      </w:r>
+      <w:r>
+        <w:rPr>
+          <w:rFonts w:ascii="Times New Roman" w:eastAsia="Times New Roman" w:hAnsi="Times New Roman" w:cs="Times New Roman"/>
+          <w:sz w:val="24"/>
+          <w:szCs w:val="24"/>
+        </w:rPr>
+        <w:t>.</w:t>
+      </w:r>
+    </w:p>
+    <w:p>
+      <w:pPr>
+        <w:numPr>
+          <w:ilvl w:val="0"/>
+          <w:numId w:val="19"/>
+        </w:numPr>
+        <w:spacing w:before="100" w:beforeAutospacing="1" w:after="100" w:afterAutospacing="1" w:line="240" w:lineRule="auto"/>
+        <w:rPr>
+          <w:rFonts w:ascii="Times New Roman" w:eastAsia="Times New Roman" w:hAnsi="Times New Roman" w:cs="Times New Roman"/>
+          <w:sz w:val="24"/>
+          <w:szCs w:val="24"/>
+        </w:rPr>
+      </w:pPr>
+      <w:r>
+        <w:rPr>
+          <w:rFonts w:ascii="Times New Roman" w:eastAsia="Times New Roman" w:hAnsi="Times New Roman" w:cs="Times New Roman"/>
+          <w:i/>
+          <w:iCs/>
+          <w:sz w:val="24"/>
+          <w:szCs w:val="24"/>
+        </w:rPr>
+        <w:t>Fraction taken:</w:t>
+      </w:r>
+      <w:r>
+        <w:rPr>
+          <w:rFonts w:ascii="Times New Roman" w:eastAsia="Times New Roman" w:hAnsi="Times New Roman" w:cs="Times New Roman"/>
+          <w:sz w:val="24"/>
+          <w:szCs w:val="24"/>
+        </w:rPr>
+        <w:t xml:space="preserve"> $\</w:t>
+      </w:r>
+      <w:proofErr w:type="spellStart"/>
+      <w:proofErr w:type="gramStart"/>
+      <w:r>
+        <w:rPr>
+          <w:rFonts w:ascii="Times New Roman" w:eastAsia="Times New Roman" w:hAnsi="Times New Roman" w:cs="Times New Roman"/>
+          <w:sz w:val="24"/>
+          <w:szCs w:val="24"/>
+        </w:rPr>
+        <w:t>frac</w:t>
+      </w:r>
+      <w:proofErr w:type="spellEnd"/>
+      <w:r>
+        <w:rPr>
+          <w:rFonts w:ascii="Times New Roman" w:eastAsia="Times New Roman" w:hAnsi="Times New Roman" w:cs="Times New Roman"/>
+          <w:sz w:val="24"/>
+          <w:szCs w:val="24"/>
+        </w:rPr>
+        <w:t>{</w:t>
+      </w:r>
+      <w:proofErr w:type="gramEnd"/>
+      <w:r>
+        <w:rPr>
+          <w:rFonts w:ascii="Times New Roman" w:eastAsia="Times New Roman" w:hAnsi="Times New Roman" w:cs="Times New Roman"/>
+          <w:sz w:val="24"/>
+          <w:szCs w:val="24"/>
+        </w:rPr>
+        <w:t>20}{30} = \</w:t>
+      </w:r>
+      <w:proofErr w:type="spellStart"/>
+      <w:r>
+        <w:rPr>
+          <w:rFonts w:ascii="Times New Roman" w:eastAsia="Times New Roman" w:hAnsi="Times New Roman" w:cs="Times New Roman"/>
+          <w:sz w:val="24"/>
+          <w:szCs w:val="24"/>
+        </w:rPr>
+        <w:t>frac</w:t>
+      </w:r>
+      <w:proofErr w:type="spellEnd"/>
+      <w:r>
+        <w:rPr>
+          <w:rFonts w:ascii="Times New Roman" w:eastAsia="Times New Roman" w:hAnsi="Times New Roman" w:cs="Times New Roman"/>
+          <w:sz w:val="24"/>
+          <w:szCs w:val="24"/>
+        </w:rPr>
+        <w:t>{2}{3}$ of Item C.</w:t>
+      </w:r>
+    </w:p>
+    <w:p>
+      <w:pPr>
+        <w:numPr>
+          <w:ilvl w:val="0"/>
+          <w:numId w:val="19"/>
+        </w:numPr>
+        <w:spacing w:before="100" w:beforeAutospacing="1" w:after="100" w:afterAutospacing="1" w:line="240" w:lineRule="auto"/>
+        <w:rPr>
+          <w:rFonts w:ascii="Times New Roman" w:eastAsia="Times New Roman" w:hAnsi="Times New Roman" w:cs="Times New Roman"/>
+          <w:sz w:val="24"/>
+          <w:szCs w:val="24"/>
+        </w:rPr>
+      </w:pPr>
+      <w:r>
+        <w:rPr>
+          <w:rFonts w:ascii="Times New Roman" w:eastAsia="Times New Roman" w:hAnsi="Times New Roman" w:cs="Times New Roman"/>
+          <w:i/>
+          <w:iCs/>
+          <w:sz w:val="24"/>
+          <w:szCs w:val="24"/>
+        </w:rPr>
+        <w:t>Value gained:</w:t>
+      </w:r>
+      <w:r>
+        <w:rPr>
+          <w:rFonts w:ascii="Times New Roman" w:eastAsia="Times New Roman" w:hAnsi="Times New Roman" w:cs="Times New Roman"/>
+          <w:sz w:val="24"/>
+          <w:szCs w:val="24"/>
+        </w:rPr>
+        <w:t xml:space="preserve"> $\</w:t>
+      </w:r>
+      <w:proofErr w:type="spellStart"/>
+      <w:proofErr w:type="gramStart"/>
+      <w:r>
+        <w:rPr>
+          <w:rFonts w:ascii="Times New Roman" w:eastAsia="Times New Roman" w:hAnsi="Times New Roman" w:cs="Times New Roman"/>
+          <w:sz w:val="24"/>
+          <w:szCs w:val="24"/>
+        </w:rPr>
+        <w:t>frac</w:t>
+      </w:r>
+      <w:proofErr w:type="spellEnd"/>
+      <w:r>
+        <w:rPr>
+          <w:rFonts w:ascii="Times New Roman" w:eastAsia="Times New Roman" w:hAnsi="Times New Roman" w:cs="Times New Roman"/>
+          <w:sz w:val="24"/>
+          <w:szCs w:val="24"/>
+        </w:rPr>
+        <w:t>{</w:t>
+      </w:r>
+      <w:proofErr w:type="gramEnd"/>
+      <w:r>
+        <w:rPr>
+          <w:rFonts w:ascii="Times New Roman" w:eastAsia="Times New Roman" w:hAnsi="Times New Roman" w:cs="Times New Roman"/>
+          <w:sz w:val="24"/>
+          <w:szCs w:val="24"/>
+        </w:rPr>
+        <w:t>2}{3} \times \$120 = \</w:t>
+      </w:r>
+      <w:proofErr w:type="spellStart"/>
+      <w:r>
+        <w:rPr>
+          <w:rFonts w:ascii="Times New Roman" w:eastAsia="Times New Roman" w:hAnsi="Times New Roman" w:cs="Times New Roman"/>
+          <w:sz w:val="24"/>
+          <w:szCs w:val="24"/>
+        </w:rPr>
+        <w:t>mathbf</w:t>
+      </w:r>
+      <w:proofErr w:type="spellEnd"/>
+      <w:r>
+        <w:rPr>
+          <w:rFonts w:ascii="Times New Roman" w:eastAsia="Times New Roman" w:hAnsi="Times New Roman" w:cs="Times New Roman"/>
+          <w:sz w:val="24"/>
+          <w:szCs w:val="24"/>
+        </w:rPr>
+        <w:t>{+\$80}$.</w:t>
+      </w:r>
+    </w:p>
+    <w:p>
+      <w:pPr>
+        <w:numPr>
+          <w:ilvl w:val="0"/>
+          <w:numId w:val="19"/>
+        </w:numPr>
+        <w:spacing w:before="100" w:beforeAutospacing="1" w:after="100" w:afterAutospacing="1" w:line="240" w:lineRule="auto"/>
+        <w:rPr>
+          <w:rFonts w:ascii="Times New Roman" w:eastAsia="Times New Roman" w:hAnsi="Times New Roman" w:cs="Times New Roman"/>
+          <w:sz w:val="24"/>
+          <w:szCs w:val="24"/>
+        </w:rPr>
+      </w:pPr>
+      <w:r>
+        <w:rPr>
+          <w:rFonts w:ascii="Times New Roman" w:eastAsia="Times New Roman" w:hAnsi="Times New Roman" w:cs="Times New Roman"/>
+          <w:i/>
+          <w:iCs/>
+          <w:sz w:val="24"/>
+          <w:szCs w:val="24"/>
+        </w:rPr>
+        <w:t>Remaining capacity:</w:t>
+      </w:r>
+      <w:r>
+        <w:rPr>
+          <w:rFonts w:ascii="Times New Roman" w:eastAsia="Times New Roman" w:hAnsi="Times New Roman" w:cs="Times New Roman"/>
+          <w:sz w:val="24"/>
+          <w:szCs w:val="24"/>
+        </w:rPr>
+        <w:t xml:space="preserve"> $20 - 20 = \</w:t>
+      </w:r>
+      <w:proofErr w:type="spellStart"/>
+      <w:r>
+        <w:rPr>
+          <w:rFonts w:ascii="Times New Roman" w:eastAsia="Times New Roman" w:hAnsi="Times New Roman" w:cs="Times New Roman"/>
+          <w:sz w:val="24"/>
+          <w:szCs w:val="24"/>
+        </w:rPr>
+        <w:t>mathbf</w:t>
+      </w:r>
+      <w:proofErr w:type="spellEnd"/>
+      <w:r>
+        <w:rPr>
+          <w:rFonts w:ascii="Times New Roman" w:eastAsia="Times New Roman" w:hAnsi="Times New Roman" w:cs="Times New Roman"/>
+          <w:sz w:val="24"/>
+          <w:szCs w:val="24"/>
+        </w:rPr>
+        <w:t>{0\</w:t>
+      </w:r>
+      <w:proofErr w:type="gramStart"/>
+      <w:r>
+        <w:rPr>
+          <w:rFonts w:ascii="Times New Roman" w:eastAsia="Times New Roman" w:hAnsi="Times New Roman" w:cs="Times New Roman"/>
+          <w:sz w:val="24"/>
+          <w:szCs w:val="24"/>
+        </w:rPr>
+        <w:t>text{</w:t>
+      </w:r>
+      <w:proofErr w:type="gramEnd"/>
+      <w:r>
+        <w:rPr>
+          <w:rFonts w:ascii="Times New Roman" w:eastAsia="Times New Roman" w:hAnsi="Times New Roman" w:cs="Times New Roman"/>
+          <w:sz w:val="24"/>
+          <w:szCs w:val="24"/>
+        </w:rPr>
+        <w:t xml:space="preserve"> kg}}$.</w:t>
+      </w:r>
+    </w:p>
+    <w:p>
+      <w:pPr>
+        <w:spacing w:before="100" w:beforeAutospacing="1" w:after="100" w:afterAutospacing="1" w:line="240" w:lineRule="auto"/>
+        <w:rPr>
+          <w:rFonts w:ascii="Times New Roman" w:eastAsia="Times New Roman" w:hAnsi="Times New Roman" w:cs="Times New Roman"/>
+          <w:sz w:val="24"/>
+          <w:szCs w:val="24"/>
+        </w:rPr>
+      </w:pPr>
+      <w:r>
+        <w:rPr>
+          <w:rFonts w:ascii="Times New Roman" w:eastAsia="Times New Roman" w:hAnsi="Times New Roman" w:cs="Times New Roman"/>
+          <w:b/>
+          <w:bCs/>
+          <w:sz w:val="24"/>
+          <w:szCs w:val="24"/>
+        </w:rPr>
+        <w:lastRenderedPageBreak/>
+        <w:t>Total Optimal Value:</w:t>
+      </w:r>
+      <w:r>
+        <w:rPr>
+          <w:rFonts w:ascii="Times New Roman" w:eastAsia="Times New Roman" w:hAnsi="Times New Roman" w:cs="Times New Roman"/>
+          <w:sz w:val="24"/>
+          <w:szCs w:val="24"/>
+        </w:rPr>
+        <w:t xml:space="preserve"> $\$60 + \$100 + \$80 = \</w:t>
+      </w:r>
+      <w:proofErr w:type="spellStart"/>
+      <w:r>
+        <w:rPr>
+          <w:rFonts w:ascii="Times New Roman" w:eastAsia="Times New Roman" w:hAnsi="Times New Roman" w:cs="Times New Roman"/>
+          <w:sz w:val="24"/>
+          <w:szCs w:val="24"/>
+        </w:rPr>
+        <w:t>mathbf</w:t>
+      </w:r>
+      <w:proofErr w:type="spellEnd"/>
+      <w:r>
+        <w:rPr>
+          <w:rFonts w:ascii="Times New Roman" w:eastAsia="Times New Roman" w:hAnsi="Times New Roman" w:cs="Times New Roman"/>
+          <w:sz w:val="24"/>
+          <w:szCs w:val="24"/>
+        </w:rPr>
+        <w:t>{\$240}$</w:t>
+      </w:r>
+    </w:p>
+    <w:p>
+      <w:pPr>
+        <w:spacing w:before="100" w:beforeAutospacing="1" w:after="100" w:afterAutospacing="1" w:line="240" w:lineRule="auto"/>
+        <w:outlineLvl w:val="1"/>
+        <w:rPr>
+          <w:rFonts w:ascii="Times New Roman" w:eastAsia="Times New Roman" w:hAnsi="Times New Roman" w:cs="Times New Roman"/>
+          <w:b/>
+          <w:bCs/>
+          <w:sz w:val="36"/>
+          <w:szCs w:val="36"/>
+        </w:rPr>
+      </w:pPr>
+      <w:r>
+        <w:rPr>
+          <w:rFonts w:ascii="Times New Roman" w:eastAsia="Times New Roman" w:hAnsi="Times New Roman" w:cs="Times New Roman"/>
+          <w:b/>
+          <w:bCs/>
+          <w:sz w:val="36"/>
+          <w:szCs w:val="36"/>
+        </w:rPr>
+        <w:t>Complexity Analysis</w:t>
+      </w:r>
+    </w:p>
+    <w:p>
+      <w:pPr>
+        <w:numPr>
+          <w:ilvl w:val="0"/>
+          <w:numId w:val="20"/>
+        </w:numPr>
+        <w:spacing w:before="100" w:beforeAutospacing="1" w:after="100" w:afterAutospacing="1" w:line="240" w:lineRule="auto"/>
+        <w:rPr>
+          <w:rFonts w:ascii="Times New Roman" w:eastAsia="Times New Roman" w:hAnsi="Times New Roman" w:cs="Times New Roman"/>
+          <w:sz w:val="24"/>
+          <w:szCs w:val="24"/>
+        </w:rPr>
+      </w:pPr>
+      <w:r>
+        <w:rPr>
+          <w:rFonts w:ascii="Times New Roman" w:eastAsia="Times New Roman" w:hAnsi="Times New Roman" w:cs="Times New Roman"/>
+          <w:b/>
+          <w:bCs/>
+          <w:sz w:val="24"/>
+          <w:szCs w:val="24"/>
+        </w:rPr>
+        <w:t>Time Complexity:</w:t>
+      </w:r>
+      <w:r>
+        <w:rPr>
+          <w:rFonts w:ascii="Times New Roman" w:eastAsia="Times New Roman" w:hAnsi="Times New Roman" w:cs="Times New Roman"/>
+          <w:sz w:val="24"/>
+          <w:szCs w:val="24"/>
+        </w:rPr>
+        <w:t xml:space="preserve"> </w:t>
+      </w:r>
+      <w:r>
+        <w:rPr>
+          <w:rFonts w:ascii="Times New Roman" w:eastAsia="Times New Roman" w:hAnsi="Times New Roman" w:cs="Times New Roman"/>
+          <w:b/>
+          <w:bCs/>
+          <w:sz w:val="24"/>
+          <w:szCs w:val="24"/>
+        </w:rPr>
+        <w:t>$</w:t>
+      </w:r>
+      <w:proofErr w:type="gramStart"/>
+      <w:r>
+        <w:rPr>
+          <w:rFonts w:ascii="Times New Roman" w:eastAsia="Times New Roman" w:hAnsi="Times New Roman" w:cs="Times New Roman"/>
+          <w:b/>
+          <w:bCs/>
+          <w:sz w:val="24"/>
+          <w:szCs w:val="24"/>
+        </w:rPr>
+        <w:t>O(</w:t>
+      </w:r>
+      <w:proofErr w:type="gramEnd"/>
+      <w:r>
+        <w:rPr>
+          <w:rFonts w:ascii="Times New Roman" w:eastAsia="Times New Roman" w:hAnsi="Times New Roman" w:cs="Times New Roman"/>
+          <w:b/>
+          <w:bCs/>
+          <w:sz w:val="24"/>
+          <w:szCs w:val="24"/>
+        </w:rPr>
+        <w:t>n \log n)$</w:t>
+      </w:r>
+      <w:r>
+        <w:rPr>
+          <w:rFonts w:ascii="Times New Roman" w:eastAsia="Times New Roman" w:hAnsi="Times New Roman" w:cs="Times New Roman"/>
+          <w:sz w:val="24"/>
+          <w:szCs w:val="24"/>
+        </w:rPr>
+        <w:t xml:space="preserve"> where $n$ is the number of items. The main bottleneck is sorting the items by density at the beginning. The actual loop to fill the knapsack only takes $</w:t>
+      </w:r>
+      <w:proofErr w:type="gramStart"/>
+      <w:r>
+        <w:rPr>
+          <w:rFonts w:ascii="Times New Roman" w:eastAsia="Times New Roman" w:hAnsi="Times New Roman" w:cs="Times New Roman"/>
+          <w:sz w:val="24"/>
+          <w:szCs w:val="24"/>
+        </w:rPr>
+        <w:t>O(</w:t>
+      </w:r>
+      <w:proofErr w:type="gramEnd"/>
+      <w:r>
+        <w:rPr>
+          <w:rFonts w:ascii="Times New Roman" w:eastAsia="Times New Roman" w:hAnsi="Times New Roman" w:cs="Times New Roman"/>
+          <w:sz w:val="24"/>
+          <w:szCs w:val="24"/>
+        </w:rPr>
+        <w:t>n)$ time.</w:t>
+      </w:r>
+    </w:p>
+    <w:p>
+      <w:pPr>
+        <w:numPr>
+          <w:ilvl w:val="0"/>
+          <w:numId w:val="20"/>
+        </w:numPr>
+        <w:spacing w:before="100" w:beforeAutospacing="1" w:after="100" w:afterAutospacing="1" w:line="240" w:lineRule="auto"/>
+        <w:rPr>
+          <w:rFonts w:ascii="Times New Roman" w:eastAsia="Times New Roman" w:hAnsi="Times New Roman" w:cs="Times New Roman"/>
+          <w:sz w:val="24"/>
+          <w:szCs w:val="24"/>
+        </w:rPr>
+      </w:pPr>
+      <w:r>
+        <w:rPr>
+          <w:rFonts w:ascii="Times New Roman" w:eastAsia="Times New Roman" w:hAnsi="Times New Roman" w:cs="Times New Roman"/>
+          <w:b/>
+          <w:bCs/>
+          <w:sz w:val="24"/>
+          <w:szCs w:val="24"/>
+        </w:rPr>
+        <w:t>Space Complexity:</w:t>
+      </w:r>
+      <w:r>
+        <w:rPr>
+          <w:rFonts w:ascii="Times New Roman" w:eastAsia="Times New Roman" w:hAnsi="Times New Roman" w:cs="Times New Roman"/>
+          <w:sz w:val="24"/>
+          <w:szCs w:val="24"/>
+        </w:rPr>
+        <w:t xml:space="preserve"> </w:t>
+      </w:r>
+      <w:r>
+        <w:rPr>
+          <w:rFonts w:ascii="Times New Roman" w:eastAsia="Times New Roman" w:hAnsi="Times New Roman" w:cs="Times New Roman"/>
+          <w:b/>
+          <w:bCs/>
+          <w:sz w:val="24"/>
+          <w:szCs w:val="24"/>
+        </w:rPr>
+        <w:t>$</w:t>
+      </w:r>
+      <w:proofErr w:type="gramStart"/>
+      <w:r>
+        <w:rPr>
+          <w:rFonts w:ascii="Times New Roman" w:eastAsia="Times New Roman" w:hAnsi="Times New Roman" w:cs="Times New Roman"/>
+          <w:b/>
+          <w:bCs/>
+          <w:sz w:val="24"/>
+          <w:szCs w:val="24"/>
+        </w:rPr>
+        <w:t>O(</w:t>
+      </w:r>
+      <w:proofErr w:type="gramEnd"/>
+      <w:r>
+        <w:rPr>
+          <w:rFonts w:ascii="Times New Roman" w:eastAsia="Times New Roman" w:hAnsi="Times New Roman" w:cs="Times New Roman"/>
+          <w:b/>
+          <w:bCs/>
+          <w:sz w:val="24"/>
+          <w:szCs w:val="24"/>
+        </w:rPr>
+        <w:t>1)$</w:t>
+      </w:r>
+      <w:r>
+        <w:rPr>
+          <w:rFonts w:ascii="Times New Roman" w:eastAsia="Times New Roman" w:hAnsi="Times New Roman" w:cs="Times New Roman"/>
+          <w:sz w:val="24"/>
+          <w:szCs w:val="24"/>
+        </w:rPr>
+        <w:t xml:space="preserve"> if we sort the items in place, as it requires no extra structures.</w:t>
+      </w:r>
+    </w:p>
+    <w:p>
+      <w:pPr>
+        <w:jc w:val="center"/>
         <w:rPr>
           <w:b/>
           <w:sz w:val="36"/>
@@ -7081,6 +9330,155 @@
     </w:lvl>
   </w:abstractNum>
   <w:abstractNum w:abstractNumId="8">
+    <w:nsid w:val="41AB7285"/>
+    <w:multiLevelType w:val="multilevel"/>
+    <w:tmpl w:val="4062696C"/>
+    <w:lvl w:ilvl="0">
+      <w:start w:val="1"/>
+      <w:numFmt w:val="bullet"/>
+      <w:lvlText w:val=""/>
+      <w:lvlJc w:val="left"/>
+      <w:pPr>
+        <w:tabs>
+          <w:tab w:val="num" w:pos="720"/>
+        </w:tabs>
+        <w:ind w:left="720" w:hanging="360"/>
+      </w:pPr>
+      <w:rPr>
+        <w:rFonts w:ascii="Symbol" w:hAnsi="Symbol" w:hint="default"/>
+        <w:sz w:val="20"/>
+      </w:rPr>
+    </w:lvl>
+    <w:lvl w:ilvl="1" w:tentative="1">
+      <w:start w:val="1"/>
+      <w:numFmt w:val="bullet"/>
+      <w:lvlText w:val="o"/>
+      <w:lvlJc w:val="left"/>
+      <w:pPr>
+        <w:tabs>
+          <w:tab w:val="num" w:pos="1440"/>
+        </w:tabs>
+        <w:ind w:left="1440" w:hanging="360"/>
+      </w:pPr>
+      <w:rPr>
+        <w:rFonts w:ascii="Courier New" w:hAnsi="Courier New" w:hint="default"/>
+        <w:sz w:val="20"/>
+      </w:rPr>
+    </w:lvl>
+    <w:lvl w:ilvl="2" w:tentative="1">
+      <w:start w:val="1"/>
+      <w:numFmt w:val="bullet"/>
+      <w:lvlText w:val=""/>
+      <w:lvlJc w:val="left"/>
+      <w:pPr>
+        <w:tabs>
+          <w:tab w:val="num" w:pos="2160"/>
+        </w:tabs>
+        <w:ind w:left="2160" w:hanging="360"/>
+      </w:pPr>
+      <w:rPr>
+        <w:rFonts w:ascii="Wingdings" w:hAnsi="Wingdings" w:hint="default"/>
+        <w:sz w:val="20"/>
+      </w:rPr>
+    </w:lvl>
+    <w:lvl w:ilvl="3" w:tentative="1">
+      <w:start w:val="1"/>
+      <w:numFmt w:val="bullet"/>
+      <w:lvlText w:val=""/>
+      <w:lvlJc w:val="left"/>
+      <w:pPr>
+        <w:tabs>
+          <w:tab w:val="num" w:pos="2880"/>
+        </w:tabs>
+        <w:ind w:left="2880" w:hanging="360"/>
+      </w:pPr>
+      <w:rPr>
+        <w:rFonts w:ascii="Wingdings" w:hAnsi="Wingdings" w:hint="default"/>
+        <w:sz w:val="20"/>
+      </w:rPr>
+    </w:lvl>
+    <w:lvl w:ilvl="4" w:tentative="1">
+      <w:start w:val="1"/>
+      <w:numFmt w:val="bullet"/>
+      <w:lvlText w:val=""/>
+      <w:lvlJc w:val="left"/>
+      <w:pPr>
+        <w:tabs>
+          <w:tab w:val="num" w:pos="3600"/>
+        </w:tabs>
+        <w:ind w:left="3600" w:hanging="360"/>
+      </w:pPr>
+      <w:rPr>
+        <w:rFonts w:ascii="Wingdings" w:hAnsi="Wingdings" w:hint="default"/>
+        <w:sz w:val="20"/>
+      </w:rPr>
+    </w:lvl>
+    <w:lvl w:ilvl="5" w:tentative="1">
+      <w:start w:val="1"/>
+      <w:numFmt w:val="bullet"/>
+      <w:lvlText w:val=""/>
+      <w:lvlJc w:val="left"/>
+      <w:pPr>
+        <w:tabs>
+          <w:tab w:val="num" w:pos="4320"/>
+        </w:tabs>
+        <w:ind w:left="4320" w:hanging="360"/>
+      </w:pPr>
+      <w:rPr>
+        <w:rFonts w:ascii="Wingdings" w:hAnsi="Wingdings" w:hint="default"/>
+        <w:sz w:val="20"/>
+      </w:rPr>
+    </w:lvl>
+    <w:lvl w:ilvl="6" w:tentative="1">
+      <w:start w:val="1"/>
+      <w:numFmt w:val="bullet"/>
+      <w:lvlText w:val=""/>
+      <w:lvlJc w:val="left"/>
+      <w:pPr>
+        <w:tabs>
+          <w:tab w:val="num" w:pos="5040"/>
+        </w:tabs>
+        <w:ind w:left="5040" w:hanging="360"/>
+      </w:pPr>
+      <w:rPr>
+        <w:rFonts w:ascii="Wingdings" w:hAnsi="Wingdings" w:hint="default"/>
+        <w:sz w:val="20"/>
+      </w:rPr>
+    </w:lvl>
+    <w:lvl w:ilvl="7" w:tentative="1">
+      <w:start w:val="1"/>
+      <w:numFmt w:val="bullet"/>
+      <w:lvlText w:val=""/>
+      <w:lvlJc w:val="left"/>
+      <w:pPr>
+        <w:tabs>
+          <w:tab w:val="num" w:pos="5760"/>
+        </w:tabs>
+        <w:ind w:left="5760" w:hanging="360"/>
+      </w:pPr>
+      <w:rPr>
+        <w:rFonts w:ascii="Wingdings" w:hAnsi="Wingdings" w:hint="default"/>
+        <w:sz w:val="20"/>
+      </w:rPr>
+    </w:lvl>
+    <w:lvl w:ilvl="8" w:tentative="1">
+      <w:start w:val="1"/>
+      <w:numFmt w:val="bullet"/>
+      <w:lvlText w:val=""/>
+      <w:lvlJc w:val="left"/>
+      <w:pPr>
+        <w:tabs>
+          <w:tab w:val="num" w:pos="6480"/>
+        </w:tabs>
+        <w:ind w:left="6480" w:hanging="360"/>
+      </w:pPr>
+      <w:rPr>
+        <w:rFonts w:ascii="Wingdings" w:hAnsi="Wingdings" w:hint="default"/>
+        <w:sz w:val="20"/>
+      </w:rPr>
+    </w:lvl>
+  </w:abstractNum>
+  <w:abstractNum w:abstractNumId="9">
     <w:nsid w:val="4D69709E"/>
     <w:multiLevelType w:val="multilevel"/>
     <w:tmpl w:val="3FEA5FC0"/>
@@ -7229,7 +9627,7 @@
       </w:rPr>
     </w:lvl>
   </w:abstractNum>
-  <w:abstractNum w:abstractNumId="9">
+  <w:abstractNum w:abstractNumId="10">
     <w:nsid w:val="4D8A6C53"/>
     <w:multiLevelType w:val="multilevel"/>
     <w:tmpl w:val="D3864012"/>
@@ -7378,7 +9776,156 @@
       </w:rPr>
     </w:lvl>
   </w:abstractNum>
-  <w:abstractNum w:abstractNumId="10">
+  <w:abstractNum w:abstractNumId="11">
+    <w:nsid w:val="4E4901C2"/>
+    <w:multiLevelType w:val="multilevel"/>
+    <w:tmpl w:val="38DEE474"/>
+    <w:lvl w:ilvl="0">
+      <w:start w:val="1"/>
+      <w:numFmt w:val="bullet"/>
+      <w:lvlText w:val=""/>
+      <w:lvlJc w:val="left"/>
+      <w:pPr>
+        <w:tabs>
+          <w:tab w:val="num" w:pos="720"/>
+        </w:tabs>
+        <w:ind w:left="720" w:hanging="360"/>
+      </w:pPr>
+      <w:rPr>
+        <w:rFonts w:ascii="Symbol" w:hAnsi="Symbol" w:hint="default"/>
+        <w:sz w:val="20"/>
+      </w:rPr>
+    </w:lvl>
+    <w:lvl w:ilvl="1" w:tentative="1">
+      <w:start w:val="1"/>
+      <w:numFmt w:val="bullet"/>
+      <w:lvlText w:val="o"/>
+      <w:lvlJc w:val="left"/>
+      <w:pPr>
+        <w:tabs>
+          <w:tab w:val="num" w:pos="1440"/>
+        </w:tabs>
+        <w:ind w:left="1440" w:hanging="360"/>
+      </w:pPr>
+      <w:rPr>
+        <w:rFonts w:ascii="Courier New" w:hAnsi="Courier New" w:hint="default"/>
+        <w:sz w:val="20"/>
+      </w:rPr>
+    </w:lvl>
+    <w:lvl w:ilvl="2" w:tentative="1">
+      <w:start w:val="1"/>
+      <w:numFmt w:val="bullet"/>
+      <w:lvlText w:val=""/>
+      <w:lvlJc w:val="left"/>
+      <w:pPr>
+        <w:tabs>
+          <w:tab w:val="num" w:pos="2160"/>
+        </w:tabs>
+        <w:ind w:left="2160" w:hanging="360"/>
+      </w:pPr>
+      <w:rPr>
+        <w:rFonts w:ascii="Wingdings" w:hAnsi="Wingdings" w:hint="default"/>
+        <w:sz w:val="20"/>
+      </w:rPr>
+    </w:lvl>
+    <w:lvl w:ilvl="3" w:tentative="1">
+      <w:start w:val="1"/>
+      <w:numFmt w:val="bullet"/>
+      <w:lvlText w:val=""/>
+      <w:lvlJc w:val="left"/>
+      <w:pPr>
+        <w:tabs>
+          <w:tab w:val="num" w:pos="2880"/>
+        </w:tabs>
+        <w:ind w:left="2880" w:hanging="360"/>
+      </w:pPr>
+      <w:rPr>
+        <w:rFonts w:ascii="Wingdings" w:hAnsi="Wingdings" w:hint="default"/>
+        <w:sz w:val="20"/>
+      </w:rPr>
+    </w:lvl>
+    <w:lvl w:ilvl="4" w:tentative="1">
+      <w:start w:val="1"/>
+      <w:numFmt w:val="bullet"/>
+      <w:lvlText w:val=""/>
+      <w:lvlJc w:val="left"/>
+      <w:pPr>
+        <w:tabs>
+          <w:tab w:val="num" w:pos="3600"/>
+        </w:tabs>
+        <w:ind w:left="3600" w:hanging="360"/>
+      </w:pPr>
+      <w:rPr>
+        <w:rFonts w:ascii="Wingdings" w:hAnsi="Wingdings" w:hint="default"/>
+        <w:sz w:val="20"/>
+      </w:rPr>
+    </w:lvl>
+    <w:lvl w:ilvl="5" w:tentative="1">
+      <w:start w:val="1"/>
+      <w:numFmt w:val="bullet"/>
+      <w:lvlText w:val=""/>
+      <w:lvlJc w:val="left"/>
+      <w:pPr>
+        <w:tabs>
+          <w:tab w:val="num" w:pos="4320"/>
+        </w:tabs>
+        <w:ind w:left="4320" w:hanging="360"/>
+      </w:pPr>
+      <w:rPr>
+        <w:rFonts w:ascii="Wingdings" w:hAnsi="Wingdings" w:hint="default"/>
+        <w:sz w:val="20"/>
+      </w:rPr>
+    </w:lvl>
+    <w:lvl w:ilvl="6" w:tentative="1">
+      <w:start w:val="1"/>
+      <w:numFmt w:val="bullet"/>
+      <w:lvlText w:val=""/>
+      <w:lvlJc w:val="left"/>
+      <w:pPr>
+        <w:tabs>
+          <w:tab w:val="num" w:pos="5040"/>
+        </w:tabs>
+        <w:ind w:left="5040" w:hanging="360"/>
+      </w:pPr>
+      <w:rPr>
+        <w:rFonts w:ascii="Wingdings" w:hAnsi="Wingdings" w:hint="default"/>
+        <w:sz w:val="20"/>
+      </w:rPr>
+    </w:lvl>
+    <w:lvl w:ilvl="7" w:tentative="1">
+      <w:start w:val="1"/>
+      <w:numFmt w:val="bullet"/>
+      <w:lvlText w:val=""/>
+      <w:lvlJc w:val="left"/>
+      <w:pPr>
+        <w:tabs>
+          <w:tab w:val="num" w:pos="5760"/>
+        </w:tabs>
+        <w:ind w:left="5760" w:hanging="360"/>
+      </w:pPr>
+      <w:rPr>
+        <w:rFonts w:ascii="Wingdings" w:hAnsi="Wingdings" w:hint="default"/>
+        <w:sz w:val="20"/>
+      </w:rPr>
+    </w:lvl>
+    <w:lvl w:ilvl="8" w:tentative="1">
+      <w:start w:val="1"/>
+      <w:numFmt w:val="bullet"/>
+      <w:lvlText w:val=""/>
+      <w:lvlJc w:val="left"/>
+      <w:pPr>
+        <w:tabs>
+          <w:tab w:val="num" w:pos="6480"/>
+        </w:tabs>
+        <w:ind w:left="6480" w:hanging="360"/>
+      </w:pPr>
+      <w:rPr>
+        <w:rFonts w:ascii="Wingdings" w:hAnsi="Wingdings" w:hint="default"/>
+        <w:sz w:val="20"/>
+      </w:rPr>
+    </w:lvl>
+  </w:abstractNum>
+  <w:abstractNum w:abstractNumId="12">
     <w:nsid w:val="5039734A"/>
     <w:multiLevelType w:val="multilevel"/>
     <w:tmpl w:val="66DC909E"/>
@@ -7527,7 +10074,603 @@
       </w:rPr>
     </w:lvl>
   </w:abstractNum>
-  <w:abstractNum w:abstractNumId="11">
+  <w:abstractNum w:abstractNumId="13">
+    <w:nsid w:val="518A5285"/>
+    <w:multiLevelType w:val="multilevel"/>
+    <w:tmpl w:val="215661E4"/>
+    <w:lvl w:ilvl="0">
+      <w:start w:val="1"/>
+      <w:numFmt w:val="bullet"/>
+      <w:lvlText w:val=""/>
+      <w:lvlJc w:val="left"/>
+      <w:pPr>
+        <w:tabs>
+          <w:tab w:val="num" w:pos="720"/>
+        </w:tabs>
+        <w:ind w:left="720" w:hanging="360"/>
+      </w:pPr>
+      <w:rPr>
+        <w:rFonts w:ascii="Symbol" w:hAnsi="Symbol" w:hint="default"/>
+        <w:sz w:val="20"/>
+      </w:rPr>
+    </w:lvl>
+    <w:lvl w:ilvl="1" w:tentative="1">
+      <w:start w:val="1"/>
+      <w:numFmt w:val="bullet"/>
+      <w:lvlText w:val="o"/>
+      <w:lvlJc w:val="left"/>
+      <w:pPr>
+        <w:tabs>
+          <w:tab w:val="num" w:pos="1440"/>
+        </w:tabs>
+        <w:ind w:left="1440" w:hanging="360"/>
+      </w:pPr>
+      <w:rPr>
+        <w:rFonts w:ascii="Courier New" w:hAnsi="Courier New" w:hint="default"/>
+        <w:sz w:val="20"/>
+      </w:rPr>
+    </w:lvl>
+    <w:lvl w:ilvl="2" w:tentative="1">
+      <w:start w:val="1"/>
+      <w:numFmt w:val="bullet"/>
+      <w:lvlText w:val=""/>
+      <w:lvlJc w:val="left"/>
+      <w:pPr>
+        <w:tabs>
+          <w:tab w:val="num" w:pos="2160"/>
+        </w:tabs>
+        <w:ind w:left="2160" w:hanging="360"/>
+      </w:pPr>
+      <w:rPr>
+        <w:rFonts w:ascii="Wingdings" w:hAnsi="Wingdings" w:hint="default"/>
+        <w:sz w:val="20"/>
+      </w:rPr>
+    </w:lvl>
+    <w:lvl w:ilvl="3" w:tentative="1">
+      <w:start w:val="1"/>
+      <w:numFmt w:val="bullet"/>
+      <w:lvlText w:val=""/>
+      <w:lvlJc w:val="left"/>
+      <w:pPr>
+        <w:tabs>
+          <w:tab w:val="num" w:pos="2880"/>
+        </w:tabs>
+        <w:ind w:left="2880" w:hanging="360"/>
+      </w:pPr>
+      <w:rPr>
+        <w:rFonts w:ascii="Wingdings" w:hAnsi="Wingdings" w:hint="default"/>
+        <w:sz w:val="20"/>
+      </w:rPr>
+    </w:lvl>
+    <w:lvl w:ilvl="4" w:tentative="1">
+      <w:start w:val="1"/>
+      <w:numFmt w:val="bullet"/>
+      <w:lvlText w:val=""/>
+      <w:lvlJc w:val="left"/>
+      <w:pPr>
+        <w:tabs>
+          <w:tab w:val="num" w:pos="3600"/>
+        </w:tabs>
+        <w:ind w:left="3600" w:hanging="360"/>
+      </w:pPr>
+      <w:rPr>
+        <w:rFonts w:ascii="Wingdings" w:hAnsi="Wingdings" w:hint="default"/>
+        <w:sz w:val="20"/>
+      </w:rPr>
+    </w:lvl>
+    <w:lvl w:ilvl="5" w:tentative="1">
+      <w:start w:val="1"/>
+      <w:numFmt w:val="bullet"/>
+      <w:lvlText w:val=""/>
+      <w:lvlJc w:val="left"/>
+      <w:pPr>
+        <w:tabs>
+          <w:tab w:val="num" w:pos="4320"/>
+        </w:tabs>
+        <w:ind w:left="4320" w:hanging="360"/>
+      </w:pPr>
+      <w:rPr>
+        <w:rFonts w:ascii="Wingdings" w:hAnsi="Wingdings" w:hint="default"/>
+        <w:sz w:val="20"/>
+      </w:rPr>
+    </w:lvl>
+    <w:lvl w:ilvl="6" w:tentative="1">
+      <w:start w:val="1"/>
+      <w:numFmt w:val="bullet"/>
+      <w:lvlText w:val=""/>
+      <w:lvlJc w:val="left"/>
+      <w:pPr>
+        <w:tabs>
+          <w:tab w:val="num" w:pos="5040"/>
+        </w:tabs>
+        <w:ind w:left="5040" w:hanging="360"/>
+      </w:pPr>
+      <w:rPr>
+        <w:rFonts w:ascii="Wingdings" w:hAnsi="Wingdings" w:hint="default"/>
+        <w:sz w:val="20"/>
+      </w:rPr>
+    </w:lvl>
+    <w:lvl w:ilvl="7" w:tentative="1">
+      <w:start w:val="1"/>
+      <w:numFmt w:val="bullet"/>
+      <w:lvlText w:val=""/>
+      <w:lvlJc w:val="left"/>
+      <w:pPr>
+        <w:tabs>
+          <w:tab w:val="num" w:pos="5760"/>
+        </w:tabs>
+        <w:ind w:left="5760" w:hanging="360"/>
+      </w:pPr>
+      <w:rPr>
+        <w:rFonts w:ascii="Wingdings" w:hAnsi="Wingdings" w:hint="default"/>
+        <w:sz w:val="20"/>
+      </w:rPr>
+    </w:lvl>
+    <w:lvl w:ilvl="8" w:tentative="1">
+      <w:start w:val="1"/>
+      <w:numFmt w:val="bullet"/>
+      <w:lvlText w:val=""/>
+      <w:lvlJc w:val="left"/>
+      <w:pPr>
+        <w:tabs>
+          <w:tab w:val="num" w:pos="6480"/>
+        </w:tabs>
+        <w:ind w:left="6480" w:hanging="360"/>
+      </w:pPr>
+      <w:rPr>
+        <w:rFonts w:ascii="Wingdings" w:hAnsi="Wingdings" w:hint="default"/>
+        <w:sz w:val="20"/>
+      </w:rPr>
+    </w:lvl>
+  </w:abstractNum>
+  <w:abstractNum w:abstractNumId="14">
+    <w:nsid w:val="5198048F"/>
+    <w:multiLevelType w:val="multilevel"/>
+    <w:tmpl w:val="4184BF90"/>
+    <w:lvl w:ilvl="0">
+      <w:start w:val="1"/>
+      <w:numFmt w:val="bullet"/>
+      <w:lvlText w:val=""/>
+      <w:lvlJc w:val="left"/>
+      <w:pPr>
+        <w:tabs>
+          <w:tab w:val="num" w:pos="720"/>
+        </w:tabs>
+        <w:ind w:left="720" w:hanging="360"/>
+      </w:pPr>
+      <w:rPr>
+        <w:rFonts w:ascii="Symbol" w:hAnsi="Symbol" w:hint="default"/>
+        <w:sz w:val="20"/>
+      </w:rPr>
+    </w:lvl>
+    <w:lvl w:ilvl="1" w:tentative="1">
+      <w:start w:val="1"/>
+      <w:numFmt w:val="bullet"/>
+      <w:lvlText w:val="o"/>
+      <w:lvlJc w:val="left"/>
+      <w:pPr>
+        <w:tabs>
+          <w:tab w:val="num" w:pos="1440"/>
+        </w:tabs>
+        <w:ind w:left="1440" w:hanging="360"/>
+      </w:pPr>
+      <w:rPr>
+        <w:rFonts w:ascii="Courier New" w:hAnsi="Courier New" w:hint="default"/>
+        <w:sz w:val="20"/>
+      </w:rPr>
+    </w:lvl>
+    <w:lvl w:ilvl="2" w:tentative="1">
+      <w:start w:val="1"/>
+      <w:numFmt w:val="bullet"/>
+      <w:lvlText w:val=""/>
+      <w:lvlJc w:val="left"/>
+      <w:pPr>
+        <w:tabs>
+          <w:tab w:val="num" w:pos="2160"/>
+        </w:tabs>
+        <w:ind w:left="2160" w:hanging="360"/>
+      </w:pPr>
+      <w:rPr>
+        <w:rFonts w:ascii="Wingdings" w:hAnsi="Wingdings" w:hint="default"/>
+        <w:sz w:val="20"/>
+      </w:rPr>
+    </w:lvl>
+    <w:lvl w:ilvl="3" w:tentative="1">
+      <w:start w:val="1"/>
+      <w:numFmt w:val="bullet"/>
+      <w:lvlText w:val=""/>
+      <w:lvlJc w:val="left"/>
+      <w:pPr>
+        <w:tabs>
+          <w:tab w:val="num" w:pos="2880"/>
+        </w:tabs>
+        <w:ind w:left="2880" w:hanging="360"/>
+      </w:pPr>
+      <w:rPr>
+        <w:rFonts w:ascii="Wingdings" w:hAnsi="Wingdings" w:hint="default"/>
+        <w:sz w:val="20"/>
+      </w:rPr>
+    </w:lvl>
+    <w:lvl w:ilvl="4" w:tentative="1">
+      <w:start w:val="1"/>
+      <w:numFmt w:val="bullet"/>
+      <w:lvlText w:val=""/>
+      <w:lvlJc w:val="left"/>
+      <w:pPr>
+        <w:tabs>
+          <w:tab w:val="num" w:pos="3600"/>
+        </w:tabs>
+        <w:ind w:left="3600" w:hanging="360"/>
+      </w:pPr>
+      <w:rPr>
+        <w:rFonts w:ascii="Wingdings" w:hAnsi="Wingdings" w:hint="default"/>
+        <w:sz w:val="20"/>
+      </w:rPr>
+    </w:lvl>
+    <w:lvl w:ilvl="5" w:tentative="1">
+      <w:start w:val="1"/>
+      <w:numFmt w:val="bullet"/>
+      <w:lvlText w:val=""/>
+      <w:lvlJc w:val="left"/>
+      <w:pPr>
+        <w:tabs>
+          <w:tab w:val="num" w:pos="4320"/>
+        </w:tabs>
+        <w:ind w:left="4320" w:hanging="360"/>
+      </w:pPr>
+      <w:rPr>
+        <w:rFonts w:ascii="Wingdings" w:hAnsi="Wingdings" w:hint="default"/>
+        <w:sz w:val="20"/>
+      </w:rPr>
+    </w:lvl>
+    <w:lvl w:ilvl="6" w:tentative="1">
+      <w:start w:val="1"/>
+      <w:numFmt w:val="bullet"/>
+      <w:lvlText w:val=""/>
+      <w:lvlJc w:val="left"/>
+      <w:pPr>
+        <w:tabs>
+          <w:tab w:val="num" w:pos="5040"/>
+        </w:tabs>
+        <w:ind w:left="5040" w:hanging="360"/>
+      </w:pPr>
+      <w:rPr>
+        <w:rFonts w:ascii="Wingdings" w:hAnsi="Wingdings" w:hint="default"/>
+        <w:sz w:val="20"/>
+      </w:rPr>
+    </w:lvl>
+    <w:lvl w:ilvl="7" w:tentative="1">
+      <w:start w:val="1"/>
+      <w:numFmt w:val="bullet"/>
+      <w:lvlText w:val=""/>
+      <w:lvlJc w:val="left"/>
+      <w:pPr>
+        <w:tabs>
+          <w:tab w:val="num" w:pos="5760"/>
+        </w:tabs>
+        <w:ind w:left="5760" w:hanging="360"/>
+      </w:pPr>
+      <w:rPr>
+        <w:rFonts w:ascii="Wingdings" w:hAnsi="Wingdings" w:hint="default"/>
+        <w:sz w:val="20"/>
+      </w:rPr>
+    </w:lvl>
+    <w:lvl w:ilvl="8" w:tentative="1">
+      <w:start w:val="1"/>
+      <w:numFmt w:val="bullet"/>
+      <w:lvlText w:val=""/>
+      <w:lvlJc w:val="left"/>
+      <w:pPr>
+        <w:tabs>
+          <w:tab w:val="num" w:pos="6480"/>
+        </w:tabs>
+        <w:ind w:left="6480" w:hanging="360"/>
+      </w:pPr>
+      <w:rPr>
+        <w:rFonts w:ascii="Wingdings" w:hAnsi="Wingdings" w:hint="default"/>
+        <w:sz w:val="20"/>
+      </w:rPr>
+    </w:lvl>
+  </w:abstractNum>
+  <w:abstractNum w:abstractNumId="15">
+    <w:nsid w:val="52ED23CF"/>
+    <w:multiLevelType w:val="multilevel"/>
+    <w:tmpl w:val="F2DA4C10"/>
+    <w:lvl w:ilvl="0">
+      <w:start w:val="1"/>
+      <w:numFmt w:val="bullet"/>
+      <w:lvlText w:val=""/>
+      <w:lvlJc w:val="left"/>
+      <w:pPr>
+        <w:tabs>
+          <w:tab w:val="num" w:pos="720"/>
+        </w:tabs>
+        <w:ind w:left="720" w:hanging="360"/>
+      </w:pPr>
+      <w:rPr>
+        <w:rFonts w:ascii="Symbol" w:hAnsi="Symbol" w:hint="default"/>
+        <w:sz w:val="20"/>
+      </w:rPr>
+    </w:lvl>
+    <w:lvl w:ilvl="1" w:tentative="1">
+      <w:start w:val="1"/>
+      <w:numFmt w:val="bullet"/>
+      <w:lvlText w:val="o"/>
+      <w:lvlJc w:val="left"/>
+      <w:pPr>
+        <w:tabs>
+          <w:tab w:val="num" w:pos="1440"/>
+        </w:tabs>
+        <w:ind w:left="1440" w:hanging="360"/>
+      </w:pPr>
+      <w:rPr>
+        <w:rFonts w:ascii="Courier New" w:hAnsi="Courier New" w:hint="default"/>
+        <w:sz w:val="20"/>
+      </w:rPr>
+    </w:lvl>
+    <w:lvl w:ilvl="2" w:tentative="1">
+      <w:start w:val="1"/>
+      <w:numFmt w:val="bullet"/>
+      <w:lvlText w:val=""/>
+      <w:lvlJc w:val="left"/>
+      <w:pPr>
+        <w:tabs>
+          <w:tab w:val="num" w:pos="2160"/>
+        </w:tabs>
+        <w:ind w:left="2160" w:hanging="360"/>
+      </w:pPr>
+      <w:rPr>
+        <w:rFonts w:ascii="Wingdings" w:hAnsi="Wingdings" w:hint="default"/>
+        <w:sz w:val="20"/>
+      </w:rPr>
+    </w:lvl>
+    <w:lvl w:ilvl="3" w:tentative="1">
+      <w:start w:val="1"/>
+      <w:numFmt w:val="bullet"/>
+      <w:lvlText w:val=""/>
+      <w:lvlJc w:val="left"/>
+      <w:pPr>
+        <w:tabs>
+          <w:tab w:val="num" w:pos="2880"/>
+        </w:tabs>
+        <w:ind w:left="2880" w:hanging="360"/>
+      </w:pPr>
+      <w:rPr>
+        <w:rFonts w:ascii="Wingdings" w:hAnsi="Wingdings" w:hint="default"/>
+        <w:sz w:val="20"/>
+      </w:rPr>
+    </w:lvl>
+    <w:lvl w:ilvl="4" w:tentative="1">
+      <w:start w:val="1"/>
+      <w:numFmt w:val="bullet"/>
+      <w:lvlText w:val=""/>
+      <w:lvlJc w:val="left"/>
+      <w:pPr>
+        <w:tabs>
+          <w:tab w:val="num" w:pos="3600"/>
+        </w:tabs>
+        <w:ind w:left="3600" w:hanging="360"/>
+      </w:pPr>
+      <w:rPr>
+        <w:rFonts w:ascii="Wingdings" w:hAnsi="Wingdings" w:hint="default"/>
+        <w:sz w:val="20"/>
+      </w:rPr>
+    </w:lvl>
+    <w:lvl w:ilvl="5" w:tentative="1">
+      <w:start w:val="1"/>
+      <w:numFmt w:val="bullet"/>
+      <w:lvlText w:val=""/>
+      <w:lvlJc w:val="left"/>
+      <w:pPr>
+        <w:tabs>
+          <w:tab w:val="num" w:pos="4320"/>
+        </w:tabs>
+        <w:ind w:left="4320" w:hanging="360"/>
+      </w:pPr>
+      <w:rPr>
+        <w:rFonts w:ascii="Wingdings" w:hAnsi="Wingdings" w:hint="default"/>
+        <w:sz w:val="20"/>
+      </w:rPr>
+    </w:lvl>
+    <w:lvl w:ilvl="6" w:tentative="1">
+      <w:start w:val="1"/>
+      <w:numFmt w:val="bullet"/>
+      <w:lvlText w:val=""/>
+      <w:lvlJc w:val="left"/>
+      <w:pPr>
+        <w:tabs>
+          <w:tab w:val="num" w:pos="5040"/>
+        </w:tabs>
+        <w:ind w:left="5040" w:hanging="360"/>
+      </w:pPr>
+      <w:rPr>
+        <w:rFonts w:ascii="Wingdings" w:hAnsi="Wingdings" w:hint="default"/>
+        <w:sz w:val="20"/>
+      </w:rPr>
+    </w:lvl>
+    <w:lvl w:ilvl="7" w:tentative="1">
+      <w:start w:val="1"/>
+      <w:numFmt w:val="bullet"/>
+      <w:lvlText w:val=""/>
+      <w:lvlJc w:val="left"/>
+      <w:pPr>
+        <w:tabs>
+          <w:tab w:val="num" w:pos="5760"/>
+        </w:tabs>
+        <w:ind w:left="5760" w:hanging="360"/>
+      </w:pPr>
+      <w:rPr>
+        <w:rFonts w:ascii="Wingdings" w:hAnsi="Wingdings" w:hint="default"/>
+        <w:sz w:val="20"/>
+      </w:rPr>
+    </w:lvl>
+    <w:lvl w:ilvl="8" w:tentative="1">
+      <w:start w:val="1"/>
+      <w:numFmt w:val="bullet"/>
+      <w:lvlText w:val=""/>
+      <w:lvlJc w:val="left"/>
+      <w:pPr>
+        <w:tabs>
+          <w:tab w:val="num" w:pos="6480"/>
+        </w:tabs>
+        <w:ind w:left="6480" w:hanging="360"/>
+      </w:pPr>
+      <w:rPr>
+        <w:rFonts w:ascii="Wingdings" w:hAnsi="Wingdings" w:hint="default"/>
+        <w:sz w:val="20"/>
+      </w:rPr>
+    </w:lvl>
+  </w:abstractNum>
+  <w:abstractNum w:abstractNumId="16">
+    <w:nsid w:val="54AA33B3"/>
+    <w:multiLevelType w:val="multilevel"/>
+    <w:tmpl w:val="27F8DF3C"/>
+    <w:lvl w:ilvl="0">
+      <w:start w:val="1"/>
+      <w:numFmt w:val="bullet"/>
+      <w:lvlText w:val=""/>
+      <w:lvlJc w:val="left"/>
+      <w:pPr>
+        <w:tabs>
+          <w:tab w:val="num" w:pos="720"/>
+        </w:tabs>
+        <w:ind w:left="720" w:hanging="360"/>
+      </w:pPr>
+      <w:rPr>
+        <w:rFonts w:ascii="Symbol" w:hAnsi="Symbol" w:hint="default"/>
+        <w:sz w:val="20"/>
+      </w:rPr>
+    </w:lvl>
+    <w:lvl w:ilvl="1" w:tentative="1">
+      <w:start w:val="1"/>
+      <w:numFmt w:val="bullet"/>
+      <w:lvlText w:val="o"/>
+      <w:lvlJc w:val="left"/>
+      <w:pPr>
+        <w:tabs>
+          <w:tab w:val="num" w:pos="1440"/>
+        </w:tabs>
+        <w:ind w:left="1440" w:hanging="360"/>
+      </w:pPr>
+      <w:rPr>
+        <w:rFonts w:ascii="Courier New" w:hAnsi="Courier New" w:hint="default"/>
+        <w:sz w:val="20"/>
+      </w:rPr>
+    </w:lvl>
+    <w:lvl w:ilvl="2" w:tentative="1">
+      <w:start w:val="1"/>
+      <w:numFmt w:val="bullet"/>
+      <w:lvlText w:val=""/>
+      <w:lvlJc w:val="left"/>
+      <w:pPr>
+        <w:tabs>
+          <w:tab w:val="num" w:pos="2160"/>
+        </w:tabs>
+        <w:ind w:left="2160" w:hanging="360"/>
+      </w:pPr>
+      <w:rPr>
+        <w:rFonts w:ascii="Wingdings" w:hAnsi="Wingdings" w:hint="default"/>
+        <w:sz w:val="20"/>
+      </w:rPr>
+    </w:lvl>
+    <w:lvl w:ilvl="3" w:tentative="1">
+      <w:start w:val="1"/>
+      <w:numFmt w:val="bullet"/>
+      <w:lvlText w:val=""/>
+      <w:lvlJc w:val="left"/>
+      <w:pPr>
+        <w:tabs>
+          <w:tab w:val="num" w:pos="2880"/>
+        </w:tabs>
+        <w:ind w:left="2880" w:hanging="360"/>
+      </w:pPr>
+      <w:rPr>
+        <w:rFonts w:ascii="Wingdings" w:hAnsi="Wingdings" w:hint="default"/>
+        <w:sz w:val="20"/>
+      </w:rPr>
+    </w:lvl>
+    <w:lvl w:ilvl="4" w:tentative="1">
+      <w:start w:val="1"/>
+      <w:numFmt w:val="bullet"/>
+      <w:lvlText w:val=""/>
+      <w:lvlJc w:val="left"/>
+      <w:pPr>
+        <w:tabs>
+          <w:tab w:val="num" w:pos="3600"/>
+        </w:tabs>
+        <w:ind w:left="3600" w:hanging="360"/>
+      </w:pPr>
+      <w:rPr>
+        <w:rFonts w:ascii="Wingdings" w:hAnsi="Wingdings" w:hint="default"/>
+        <w:sz w:val="20"/>
+      </w:rPr>
+    </w:lvl>
+    <w:lvl w:ilvl="5" w:tentative="1">
+      <w:start w:val="1"/>
+      <w:numFmt w:val="bullet"/>
+      <w:lvlText w:val=""/>
+      <w:lvlJc w:val="left"/>
+      <w:pPr>
+        <w:tabs>
+          <w:tab w:val="num" w:pos="4320"/>
+        </w:tabs>
+        <w:ind w:left="4320" w:hanging="360"/>
+      </w:pPr>
+      <w:rPr>
+        <w:rFonts w:ascii="Wingdings" w:hAnsi="Wingdings" w:hint="default"/>
+        <w:sz w:val="20"/>
+      </w:rPr>
+    </w:lvl>
+    <w:lvl w:ilvl="6" w:tentative="1">
+      <w:start w:val="1"/>
+      <w:numFmt w:val="bullet"/>
+      <w:lvlText w:val=""/>
+      <w:lvlJc w:val="left"/>
+      <w:pPr>
+        <w:tabs>
+          <w:tab w:val="num" w:pos="5040"/>
+        </w:tabs>
+        <w:ind w:left="5040" w:hanging="360"/>
+      </w:pPr>
+      <w:rPr>
+        <w:rFonts w:ascii="Wingdings" w:hAnsi="Wingdings" w:hint="default"/>
+        <w:sz w:val="20"/>
+      </w:rPr>
+    </w:lvl>
+    <w:lvl w:ilvl="7" w:tentative="1">
+      <w:start w:val="1"/>
+      <w:numFmt w:val="bullet"/>
+      <w:lvlText w:val=""/>
+      <w:lvlJc w:val="left"/>
+      <w:pPr>
+        <w:tabs>
+          <w:tab w:val="num" w:pos="5760"/>
+        </w:tabs>
+        <w:ind w:left="5760" w:hanging="360"/>
+      </w:pPr>
+      <w:rPr>
+        <w:rFonts w:ascii="Wingdings" w:hAnsi="Wingdings" w:hint="default"/>
+        <w:sz w:val="20"/>
+      </w:rPr>
+    </w:lvl>
+    <w:lvl w:ilvl="8" w:tentative="1">
+      <w:start w:val="1"/>
+      <w:numFmt w:val="bullet"/>
+      <w:lvlText w:val=""/>
+      <w:lvlJc w:val="left"/>
+      <w:pPr>
+        <w:tabs>
+          <w:tab w:val="num" w:pos="6480"/>
+        </w:tabs>
+        <w:ind w:left="6480" w:hanging="360"/>
+      </w:pPr>
+      <w:rPr>
+        <w:rFonts w:ascii="Wingdings" w:hAnsi="Wingdings" w:hint="default"/>
+        <w:sz w:val="20"/>
+      </w:rPr>
+    </w:lvl>
+  </w:abstractNum>
+  <w:abstractNum w:abstractNumId="17">
     <w:nsid w:val="5B11539B"/>
     <w:multiLevelType w:val="multilevel"/>
     <w:tmpl w:val="362A6400"/>
@@ -7676,7 +10819,7 @@
       </w:rPr>
     </w:lvl>
   </w:abstractNum>
-  <w:abstractNum w:abstractNumId="12">
+  <w:abstractNum w:abstractNumId="18">
     <w:nsid w:val="6C6F248E"/>
     <w:multiLevelType w:val="multilevel"/>
     <w:tmpl w:val="29201F7A"/>
@@ -7825,7 +10968,7 @@
       </w:rPr>
     </w:lvl>
   </w:abstractNum>
-  <w:abstractNum w:abstractNumId="13">
+  <w:abstractNum w:abstractNumId="19">
     <w:nsid w:val="79354708"/>
     <w:multiLevelType w:val="multilevel"/>
     <w:tmpl w:val="7FC6629E"/>
@@ -7984,7 +11127,7 @@
     <w:abstractNumId w:val="0"/>
   </w:num>
   <w:num w:numId="4">
-    <w:abstractNumId w:val="12"/>
+    <w:abstractNumId w:val="18"/>
   </w:num>
   <w:num w:numId="5">
     <w:abstractNumId w:val="3"/>
@@ -7999,22 +11142,40 @@
     <w:abstractNumId w:val="5"/>
   </w:num>
   <w:num w:numId="9">
-    <w:abstractNumId w:val="10"/>
+    <w:abstractNumId w:val="12"/>
   </w:num>
   <w:num w:numId="10">
-    <w:abstractNumId w:val="13"/>
+    <w:abstractNumId w:val="19"/>
   </w:num>
   <w:num w:numId="11">
-    <w:abstractNumId w:val="11"/>
+    <w:abstractNumId w:val="17"/>
   </w:num>
   <w:num w:numId="12">
-    <w:abstractNumId w:val="8"/>
+    <w:abstractNumId w:val="9"/>
   </w:num>
   <w:num w:numId="13">
-    <w:abstractNumId w:val="9"/>
+    <w:abstractNumId w:val="10"/>
   </w:num>
   <w:num w:numId="14">
     <w:abstractNumId w:val="6"/>
+  </w:num>
+  <w:num w:numId="15">
+    <w:abstractNumId w:val="13"/>
+  </w:num>
+  <w:num w:numId="16">
+    <w:abstractNumId w:val="15"/>
+  </w:num>
+  <w:num w:numId="17">
+    <w:abstractNumId w:val="8"/>
+  </w:num>
+  <w:num w:numId="18">
+    <w:abstractNumId w:val="14"/>
+  </w:num>
+  <w:num w:numId="19">
+    <w:abstractNumId w:val="16"/>
+  </w:num>
+  <w:num w:numId="20">
+    <w:abstractNumId w:val="11"/>
   </w:num>
 </w:numbering>
 </file>

</xml_diff>

<commit_message>
Adding job sequencing greedy algo
</commit_message>
<xml_diff>
--- a/Greedy Algorithms/Greedy.docx
+++ b/Greedy Algorithms/Greedy.docx
@@ -8028,55 +8028,15 @@
           <w:sz w:val="24"/>
           <w:szCs w:val="24"/>
         </w:rPr>
-        <w:t>$</w:t>
-      </w:r>
-      <w:proofErr w:type="gramStart"/>
-      <w:r>
-        <w:rPr>
-          <w:rFonts w:ascii="Times New Roman" w:eastAsia="Times New Roman" w:hAnsi="Times New Roman" w:cs="Times New Roman"/>
-          <w:b/>
-          <w:bCs/>
-          <w:sz w:val="24"/>
-          <w:szCs w:val="24"/>
-        </w:rPr>
-        <w:t>O(</w:t>
-      </w:r>
-      <w:proofErr w:type="gramEnd"/>
-      <w:r>
-        <w:rPr>
-          <w:rFonts w:ascii="Times New Roman" w:eastAsia="Times New Roman" w:hAnsi="Times New Roman" w:cs="Times New Roman"/>
-          <w:b/>
-          <w:bCs/>
-          <w:sz w:val="24"/>
-          <w:szCs w:val="24"/>
-        </w:rPr>
-        <w:t>n \log n)$</w:t>
-      </w:r>
-      <w:r>
-        <w:rPr>
-          <w:rFonts w:ascii="Times New Roman" w:eastAsia="Times New Roman" w:hAnsi="Times New Roman" w:cs="Times New Roman"/>
-          <w:sz w:val="24"/>
-          <w:szCs w:val="24"/>
-        </w:rPr>
-        <w:t xml:space="preserve"> where $n$ is the number of items. The main bottleneck is sorting the items by density at the beginning. The actual loop to fill the knapsack only takes $</w:t>
-      </w:r>
-      <w:proofErr w:type="gramStart"/>
-      <w:r>
-        <w:rPr>
-          <w:rFonts w:ascii="Times New Roman" w:eastAsia="Times New Roman" w:hAnsi="Times New Roman" w:cs="Times New Roman"/>
-          <w:sz w:val="24"/>
-          <w:szCs w:val="24"/>
-        </w:rPr>
-        <w:t>O(</w:t>
-      </w:r>
-      <w:proofErr w:type="gramEnd"/>
-      <w:r>
-        <w:rPr>
-          <w:rFonts w:ascii="Times New Roman" w:eastAsia="Times New Roman" w:hAnsi="Times New Roman" w:cs="Times New Roman"/>
-          <w:sz w:val="24"/>
-          <w:szCs w:val="24"/>
-        </w:rPr>
-        <w:t>n)$ time.</w:t>
+        <w:t>$O(n \log n)$</w:t>
+      </w:r>
+      <w:r>
+        <w:rPr>
+          <w:rFonts w:ascii="Times New Roman" w:eastAsia="Times New Roman" w:hAnsi="Times New Roman" w:cs="Times New Roman"/>
+          <w:sz w:val="24"/>
+          <w:szCs w:val="24"/>
+        </w:rPr>
+        <w:t xml:space="preserve"> where $n$ is the number of items. The main bottleneck is sorting the items by density at the beginning. The actual loop to fill the knapsack only takes $O(n)$ time.</w:t>
       </w:r>
     </w:p>
     <w:p>
@@ -8118,29 +8078,7 @@
           <w:sz w:val="24"/>
           <w:szCs w:val="24"/>
         </w:rPr>
-        <w:t>$</w:t>
-      </w:r>
-      <w:proofErr w:type="gramStart"/>
-      <w:r>
-        <w:rPr>
-          <w:rFonts w:ascii="Times New Roman" w:eastAsia="Times New Roman" w:hAnsi="Times New Roman" w:cs="Times New Roman"/>
-          <w:b/>
-          <w:bCs/>
-          <w:sz w:val="24"/>
-          <w:szCs w:val="24"/>
-        </w:rPr>
-        <w:t>O(</w:t>
-      </w:r>
-      <w:proofErr w:type="gramEnd"/>
-      <w:r>
-        <w:rPr>
-          <w:rFonts w:ascii="Times New Roman" w:eastAsia="Times New Roman" w:hAnsi="Times New Roman" w:cs="Times New Roman"/>
-          <w:b/>
-          <w:bCs/>
-          <w:sz w:val="24"/>
-          <w:szCs w:val="24"/>
-        </w:rPr>
-        <w:t>1)$</w:t>
+        <w:t>$O(1)$</w:t>
       </w:r>
       <w:r>
         <w:rPr>
@@ -8149,6 +8087,2181 @@
           <w:szCs w:val="24"/>
         </w:rPr>
         <w:t xml:space="preserve"> if we sort the items in place, as it requires no extra structures.</w:t>
+      </w:r>
+    </w:p>
+    <w:p>
+      <w:pPr>
+        <w:jc w:val="center"/>
+        <w:rPr>
+          <w:b/>
+          <w:sz w:val="36"/>
+          <w:szCs w:val="36"/>
+        </w:rPr>
+      </w:pPr>
+    </w:p>
+    <w:p>
+      <w:pPr>
+        <w:jc w:val="center"/>
+        <w:rPr>
+          <w:b/>
+          <w:sz w:val="36"/>
+          <w:szCs w:val="36"/>
+        </w:rPr>
+      </w:pPr>
+      <w:r>
+        <w:rPr>
+          <w:b/>
+          <w:sz w:val="36"/>
+          <w:szCs w:val="36"/>
+        </w:rPr>
+        <w:t>Job Sequencing</w:t>
+      </w:r>
+    </w:p>
+    <w:p>
+      <w:pPr>
+        <w:spacing w:before="100" w:beforeAutospacing="1" w:after="100" w:afterAutospacing="1" w:line="240" w:lineRule="auto"/>
+        <w:rPr>
+          <w:rFonts w:ascii="Times New Roman" w:eastAsia="Times New Roman" w:hAnsi="Times New Roman" w:cs="Times New Roman"/>
+          <w:sz w:val="24"/>
+          <w:szCs w:val="24"/>
+        </w:rPr>
+      </w:pPr>
+      <w:r>
+        <w:rPr>
+          <w:rFonts w:ascii="Times New Roman" w:eastAsia="Times New Roman" w:hAnsi="Times New Roman" w:cs="Times New Roman"/>
+          <w:sz w:val="24"/>
+          <w:szCs w:val="24"/>
+        </w:rPr>
+        <w:t xml:space="preserve">The </w:t>
+      </w:r>
+      <w:r>
+        <w:rPr>
+          <w:rFonts w:ascii="Times New Roman" w:eastAsia="Times New Roman" w:hAnsi="Times New Roman" w:cs="Times New Roman"/>
+          <w:b/>
+          <w:bCs/>
+          <w:sz w:val="24"/>
+          <w:szCs w:val="24"/>
+        </w:rPr>
+        <w:t>Job Sequencing Problem with Deadlines</w:t>
+      </w:r>
+      <w:r>
+        <w:rPr>
+          <w:rFonts w:ascii="Times New Roman" w:eastAsia="Times New Roman" w:hAnsi="Times New Roman" w:cs="Times New Roman"/>
+          <w:sz w:val="24"/>
+          <w:szCs w:val="24"/>
+        </w:rPr>
+        <w:t xml:space="preserve"> is another classic optimization puzzle solved beautifully by a greedy algorithm.</w:t>
+      </w:r>
+    </w:p>
+    <w:p>
+      <w:pPr>
+        <w:spacing w:before="100" w:beforeAutospacing="1" w:after="100" w:afterAutospacing="1" w:line="240" w:lineRule="auto"/>
+        <w:rPr>
+          <w:rFonts w:ascii="Times New Roman" w:eastAsia="Times New Roman" w:hAnsi="Times New Roman" w:cs="Times New Roman"/>
+          <w:sz w:val="24"/>
+          <w:szCs w:val="24"/>
+        </w:rPr>
+      </w:pPr>
+      <w:r>
+        <w:rPr>
+          <w:rFonts w:ascii="Times New Roman" w:eastAsia="Times New Roman" w:hAnsi="Times New Roman" w:cs="Times New Roman"/>
+          <w:sz w:val="24"/>
+          <w:szCs w:val="24"/>
+        </w:rPr>
+        <w:t xml:space="preserve">Imagine you are a freelance software developer or a factory manager. You have a list of tasks (jobs) to complete. Each job has a specific </w:t>
+      </w:r>
+      <w:r>
+        <w:rPr>
+          <w:rFonts w:ascii="Times New Roman" w:eastAsia="Times New Roman" w:hAnsi="Times New Roman" w:cs="Times New Roman"/>
+          <w:b/>
+          <w:bCs/>
+          <w:sz w:val="24"/>
+          <w:szCs w:val="24"/>
+        </w:rPr>
+        <w:t>deadline</w:t>
+      </w:r>
+      <w:r>
+        <w:rPr>
+          <w:rFonts w:ascii="Times New Roman" w:eastAsia="Times New Roman" w:hAnsi="Times New Roman" w:cs="Times New Roman"/>
+          <w:sz w:val="24"/>
+          <w:szCs w:val="24"/>
+        </w:rPr>
+        <w:t xml:space="preserve"> (the hour or day by which it must be finished) and an associated </w:t>
+      </w:r>
+      <w:r>
+        <w:rPr>
+          <w:rFonts w:ascii="Times New Roman" w:eastAsia="Times New Roman" w:hAnsi="Times New Roman" w:cs="Times New Roman"/>
+          <w:b/>
+          <w:bCs/>
+          <w:sz w:val="24"/>
+          <w:szCs w:val="24"/>
+        </w:rPr>
+        <w:t>profit</w:t>
+      </w:r>
+      <w:r>
+        <w:rPr>
+          <w:rFonts w:ascii="Times New Roman" w:eastAsia="Times New Roman" w:hAnsi="Times New Roman" w:cs="Times New Roman"/>
+          <w:sz w:val="24"/>
+          <w:szCs w:val="24"/>
+        </w:rPr>
+        <w:t xml:space="preserve"> you earn if you complete it on time. Every job takes exactly </w:t>
+      </w:r>
+      <w:r>
+        <w:rPr>
+          <w:rFonts w:ascii="Times New Roman" w:eastAsia="Times New Roman" w:hAnsi="Times New Roman" w:cs="Times New Roman"/>
+          <w:b/>
+          <w:bCs/>
+          <w:sz w:val="24"/>
+          <w:szCs w:val="24"/>
+        </w:rPr>
+        <w:t>1 unit of time</w:t>
+      </w:r>
+      <w:r>
+        <w:rPr>
+          <w:rFonts w:ascii="Times New Roman" w:eastAsia="Times New Roman" w:hAnsi="Times New Roman" w:cs="Times New Roman"/>
+          <w:sz w:val="24"/>
+          <w:szCs w:val="24"/>
+        </w:rPr>
+        <w:t xml:space="preserve"> to finish, and you can only work on one job at a time.</w:t>
+      </w:r>
+    </w:p>
+    <w:p>
+      <w:pPr>
+        <w:spacing w:before="100" w:beforeAutospacing="1" w:after="100" w:afterAutospacing="1" w:line="240" w:lineRule="auto"/>
+        <w:rPr>
+          <w:rFonts w:ascii="Times New Roman" w:eastAsia="Times New Roman" w:hAnsi="Times New Roman" w:cs="Times New Roman"/>
+          <w:sz w:val="24"/>
+          <w:szCs w:val="24"/>
+        </w:rPr>
+      </w:pPr>
+      <w:r>
+        <w:rPr>
+          <w:rFonts w:ascii="Times New Roman" w:eastAsia="Times New Roman" w:hAnsi="Times New Roman" w:cs="Times New Roman"/>
+          <w:sz w:val="24"/>
+          <w:szCs w:val="24"/>
+        </w:rPr>
+        <w:t xml:space="preserve">Your goal is to choose a sequence of jobs that </w:t>
+      </w:r>
+      <w:r>
+        <w:rPr>
+          <w:rFonts w:ascii="Times New Roman" w:eastAsia="Times New Roman" w:hAnsi="Times New Roman" w:cs="Times New Roman"/>
+          <w:b/>
+          <w:bCs/>
+          <w:sz w:val="24"/>
+          <w:szCs w:val="24"/>
+        </w:rPr>
+        <w:t>maximizes your total profit</w:t>
+      </w:r>
+      <w:r>
+        <w:rPr>
+          <w:rFonts w:ascii="Times New Roman" w:eastAsia="Times New Roman" w:hAnsi="Times New Roman" w:cs="Times New Roman"/>
+          <w:sz w:val="24"/>
+          <w:szCs w:val="24"/>
+        </w:rPr>
+        <w:t>, ensuring that every job you pick is completed before or on its deadline.</w:t>
+      </w:r>
+    </w:p>
+    <w:p>
+      <w:pPr>
+        <w:spacing w:before="100" w:beforeAutospacing="1" w:after="100" w:afterAutospacing="1" w:line="240" w:lineRule="auto"/>
+        <w:outlineLvl w:val="1"/>
+        <w:rPr>
+          <w:rFonts w:ascii="Times New Roman" w:eastAsia="Times New Roman" w:hAnsi="Times New Roman" w:cs="Times New Roman"/>
+          <w:b/>
+          <w:bCs/>
+          <w:sz w:val="36"/>
+          <w:szCs w:val="36"/>
+        </w:rPr>
+      </w:pPr>
+      <w:r>
+        <w:rPr>
+          <w:rFonts w:ascii="Times New Roman" w:eastAsia="Times New Roman" w:hAnsi="Times New Roman" w:cs="Times New Roman"/>
+          <w:b/>
+          <w:bCs/>
+          <w:sz w:val="36"/>
+          <w:szCs w:val="36"/>
+        </w:rPr>
+        <w:t>The Greedy Strategy: High Profit, Last Minute</w:t>
+      </w:r>
+    </w:p>
+    <w:p>
+      <w:pPr>
+        <w:spacing w:before="100" w:beforeAutospacing="1" w:after="100" w:afterAutospacing="1" w:line="240" w:lineRule="auto"/>
+        <w:rPr>
+          <w:rFonts w:ascii="Times New Roman" w:eastAsia="Times New Roman" w:hAnsi="Times New Roman" w:cs="Times New Roman"/>
+          <w:sz w:val="24"/>
+          <w:szCs w:val="24"/>
+        </w:rPr>
+      </w:pPr>
+      <w:r>
+        <w:rPr>
+          <w:rFonts w:ascii="Times New Roman" w:eastAsia="Times New Roman" w:hAnsi="Times New Roman" w:cs="Times New Roman"/>
+          <w:sz w:val="24"/>
+          <w:szCs w:val="24"/>
+        </w:rPr>
+        <w:t>If you want to maximize your cash flow under a time constraint, what should your strategy be?</w:t>
+      </w:r>
+    </w:p>
+    <w:p>
+      <w:pPr>
+        <w:numPr>
+          <w:ilvl w:val="0"/>
+          <w:numId w:val="21"/>
+        </w:numPr>
+        <w:spacing w:before="100" w:beforeAutospacing="1" w:after="100" w:afterAutospacing="1" w:line="240" w:lineRule="auto"/>
+        <w:rPr>
+          <w:rFonts w:ascii="Times New Roman" w:eastAsia="Times New Roman" w:hAnsi="Times New Roman" w:cs="Times New Roman"/>
+          <w:sz w:val="24"/>
+          <w:szCs w:val="24"/>
+        </w:rPr>
+      </w:pPr>
+      <w:r>
+        <w:rPr>
+          <w:rFonts w:ascii="Times New Roman" w:eastAsia="Times New Roman" w:hAnsi="Times New Roman" w:cs="Times New Roman"/>
+          <w:sz w:val="24"/>
+          <w:szCs w:val="24"/>
+        </w:rPr>
+        <w:t xml:space="preserve">Do you pick the job with the earliest deadline? </w:t>
+      </w:r>
+      <w:r>
+        <w:rPr>
+          <w:rFonts w:ascii="Times New Roman" w:eastAsia="Times New Roman" w:hAnsi="Times New Roman" w:cs="Times New Roman"/>
+          <w:i/>
+          <w:iCs/>
+          <w:sz w:val="24"/>
+          <w:szCs w:val="24"/>
+        </w:rPr>
+        <w:t>(No, it might pay pennies compared to a later job).</w:t>
+      </w:r>
+    </w:p>
+    <w:p>
+      <w:pPr>
+        <w:numPr>
+          <w:ilvl w:val="0"/>
+          <w:numId w:val="21"/>
+        </w:numPr>
+        <w:spacing w:before="100" w:beforeAutospacing="1" w:after="100" w:afterAutospacing="1" w:line="240" w:lineRule="auto"/>
+        <w:rPr>
+          <w:rFonts w:ascii="Times New Roman" w:eastAsia="Times New Roman" w:hAnsi="Times New Roman" w:cs="Times New Roman"/>
+          <w:sz w:val="24"/>
+          <w:szCs w:val="24"/>
+        </w:rPr>
+      </w:pPr>
+      <w:r>
+        <w:rPr>
+          <w:rFonts w:ascii="Times New Roman" w:eastAsia="Times New Roman" w:hAnsi="Times New Roman" w:cs="Times New Roman"/>
+          <w:sz w:val="24"/>
+          <w:szCs w:val="24"/>
+        </w:rPr>
+        <w:t xml:space="preserve">Do you pick the shortest job? </w:t>
+      </w:r>
+      <w:r>
+        <w:rPr>
+          <w:rFonts w:ascii="Times New Roman" w:eastAsia="Times New Roman" w:hAnsi="Times New Roman" w:cs="Times New Roman"/>
+          <w:i/>
+          <w:iCs/>
+          <w:sz w:val="24"/>
+          <w:szCs w:val="24"/>
+        </w:rPr>
+        <w:t>(All jobs take 1 unit of time here, so they are all the same length).</w:t>
+      </w:r>
+    </w:p>
+    <w:p>
+      <w:pPr>
+        <w:spacing w:before="100" w:beforeAutospacing="1" w:after="100" w:afterAutospacing="1" w:line="240" w:lineRule="auto"/>
+        <w:rPr>
+          <w:rFonts w:ascii="Times New Roman" w:eastAsia="Times New Roman" w:hAnsi="Times New Roman" w:cs="Times New Roman"/>
+          <w:sz w:val="24"/>
+          <w:szCs w:val="24"/>
+        </w:rPr>
+      </w:pPr>
+      <w:r>
+        <w:rPr>
+          <w:rFonts w:ascii="Times New Roman" w:eastAsia="Times New Roman" w:hAnsi="Times New Roman" w:cs="Times New Roman"/>
+          <w:sz w:val="24"/>
+          <w:szCs w:val="24"/>
+        </w:rPr>
+        <w:t>The optimal greedy rule consists of two parts:</w:t>
+      </w:r>
+    </w:p>
+    <w:p>
+      <w:pPr>
+        <w:numPr>
+          <w:ilvl w:val="0"/>
+          <w:numId w:val="22"/>
+        </w:numPr>
+        <w:spacing w:before="100" w:beforeAutospacing="1" w:after="100" w:afterAutospacing="1" w:line="240" w:lineRule="auto"/>
+        <w:rPr>
+          <w:rFonts w:ascii="Times New Roman" w:eastAsia="Times New Roman" w:hAnsi="Times New Roman" w:cs="Times New Roman"/>
+          <w:sz w:val="24"/>
+          <w:szCs w:val="24"/>
+        </w:rPr>
+      </w:pPr>
+      <w:r>
+        <w:rPr>
+          <w:rFonts w:ascii="Times New Roman" w:eastAsia="Times New Roman" w:hAnsi="Times New Roman" w:cs="Times New Roman"/>
+          <w:b/>
+          <w:bCs/>
+          <w:sz w:val="24"/>
+          <w:szCs w:val="24"/>
+        </w:rPr>
+        <w:t>Sort the jobs by profit in descending order.</w:t>
+      </w:r>
+      <w:r>
+        <w:rPr>
+          <w:rFonts w:ascii="Times New Roman" w:eastAsia="Times New Roman" w:hAnsi="Times New Roman" w:cs="Times New Roman"/>
+          <w:sz w:val="24"/>
+          <w:szCs w:val="24"/>
+        </w:rPr>
+        <w:t xml:space="preserve"> Always prioritize the most lucrative work first.</w:t>
+      </w:r>
+    </w:p>
+    <w:p>
+      <w:pPr>
+        <w:numPr>
+          <w:ilvl w:val="0"/>
+          <w:numId w:val="22"/>
+        </w:numPr>
+        <w:spacing w:before="100" w:beforeAutospacing="1" w:after="100" w:afterAutospacing="1" w:line="240" w:lineRule="auto"/>
+        <w:rPr>
+          <w:rFonts w:ascii="Times New Roman" w:eastAsia="Times New Roman" w:hAnsi="Times New Roman" w:cs="Times New Roman"/>
+          <w:sz w:val="24"/>
+          <w:szCs w:val="24"/>
+        </w:rPr>
+      </w:pPr>
+      <w:r>
+        <w:rPr>
+          <w:rFonts w:ascii="Times New Roman" w:eastAsia="Times New Roman" w:hAnsi="Times New Roman" w:cs="Times New Roman"/>
+          <w:b/>
+          <w:bCs/>
+          <w:sz w:val="24"/>
+          <w:szCs w:val="24"/>
+        </w:rPr>
+        <w:t>Schedule the selected job at the latest possible time slot before its deadline.</w:t>
+      </w:r>
+      <w:r>
+        <w:rPr>
+          <w:rFonts w:ascii="Times New Roman" w:eastAsia="Times New Roman" w:hAnsi="Times New Roman" w:cs="Times New Roman"/>
+          <w:sz w:val="24"/>
+          <w:szCs w:val="24"/>
+        </w:rPr>
+        <w:t xml:space="preserve"> By pushing a high-paying job as close to its deadline as possible, you keep the earlier time slots wide open for other jobs that might have tighter, earlier deadlines.</w:t>
+      </w:r>
+    </w:p>
+    <w:p>
+      <w:pPr>
+        <w:spacing w:before="100" w:beforeAutospacing="1" w:after="100" w:afterAutospacing="1" w:line="240" w:lineRule="auto"/>
+        <w:outlineLvl w:val="1"/>
+        <w:rPr>
+          <w:rFonts w:ascii="Times New Roman" w:eastAsia="Times New Roman" w:hAnsi="Times New Roman" w:cs="Times New Roman"/>
+          <w:b/>
+          <w:bCs/>
+          <w:sz w:val="36"/>
+          <w:szCs w:val="36"/>
+        </w:rPr>
+      </w:pPr>
+      <w:r>
+        <w:rPr>
+          <w:rFonts w:ascii="Times New Roman" w:eastAsia="Times New Roman" w:hAnsi="Times New Roman" w:cs="Times New Roman"/>
+          <w:b/>
+          <w:bCs/>
+          <w:sz w:val="36"/>
+          <w:szCs w:val="36"/>
+        </w:rPr>
+        <w:t>Step-by-Step Walkthrough</w:t>
+      </w:r>
+    </w:p>
+    <w:p>
+      <w:pPr>
+        <w:spacing w:before="100" w:beforeAutospacing="1" w:after="100" w:afterAutospacing="1" w:line="240" w:lineRule="auto"/>
+        <w:rPr>
+          <w:rFonts w:ascii="Times New Roman" w:eastAsia="Times New Roman" w:hAnsi="Times New Roman" w:cs="Times New Roman"/>
+          <w:sz w:val="24"/>
+          <w:szCs w:val="24"/>
+        </w:rPr>
+      </w:pPr>
+      <w:r>
+        <w:rPr>
+          <w:rFonts w:ascii="Times New Roman" w:eastAsia="Times New Roman" w:hAnsi="Times New Roman" w:cs="Times New Roman"/>
+          <w:sz w:val="24"/>
+          <w:szCs w:val="24"/>
+        </w:rPr>
+        <w:lastRenderedPageBreak/>
+        <w:t>Let’s look at a concrete example. Suppose we have 5 jobs, and the maximum deadline is 3 (meaning we only have 3 hours/slots available in total to work).</w:t>
+      </w:r>
+    </w:p>
+    <w:tbl>
+      <w:tblPr>
+        <w:tblW w:w="0" w:type="auto"/>
+        <w:tblCellSpacing w:w="15" w:type="dxa"/>
+        <w:tblCellMar>
+          <w:top w:w="15" w:type="dxa"/>
+          <w:left w:w="15" w:type="dxa"/>
+          <w:bottom w:w="15" w:type="dxa"/>
+          <w:right w:w="15" w:type="dxa"/>
+        </w:tblCellMar>
+        <w:tblLook w:val="04A0"/>
+      </w:tblPr>
+      <w:tblGrid>
+        <w:gridCol w:w="1006"/>
+        <w:gridCol w:w="1197"/>
+        <w:gridCol w:w="905"/>
+      </w:tblGrid>
+      <w:tr>
+        <w:trPr>
+          <w:tblHeader/>
+          <w:tblCellSpacing w:w="15" w:type="dxa"/>
+        </w:trPr>
+        <w:tc>
+          <w:tcPr>
+            <w:tcW w:w="0" w:type="auto"/>
+            <w:tcBorders>
+              <w:top w:val="single" w:sz="4" w:space="0" w:color="C4C7C5"/>
+              <w:left w:val="single" w:sz="4" w:space="0" w:color="C4C7C5"/>
+              <w:bottom w:val="single" w:sz="4" w:space="0" w:color="C4C7C5"/>
+              <w:right w:val="single" w:sz="4" w:space="0" w:color="C4C7C5"/>
+            </w:tcBorders>
+            <w:tcMar>
+              <w:top w:w="80" w:type="dxa"/>
+              <w:left w:w="120" w:type="dxa"/>
+              <w:bottom w:w="80" w:type="dxa"/>
+              <w:right w:w="120" w:type="dxa"/>
+            </w:tcMar>
+            <w:vAlign w:val="center"/>
+            <w:hideMark/>
+          </w:tcPr>
+          <w:p>
+            <w:pPr>
+              <w:spacing w:after="320" w:line="240" w:lineRule="auto"/>
+              <w:rPr>
+                <w:rFonts w:ascii="Times New Roman" w:eastAsia="Times New Roman" w:hAnsi="Times New Roman" w:cs="Times New Roman"/>
+                <w:sz w:val="24"/>
+                <w:szCs w:val="24"/>
+              </w:rPr>
+            </w:pPr>
+            <w:r>
+              <w:rPr>
+                <w:rFonts w:ascii="Times New Roman" w:eastAsia="Times New Roman" w:hAnsi="Times New Roman" w:cs="Times New Roman"/>
+                <w:b/>
+                <w:bCs/>
+                <w:sz w:val="24"/>
+                <w:szCs w:val="24"/>
+              </w:rPr>
+              <w:t>Job ID</w:t>
+            </w:r>
+          </w:p>
+        </w:tc>
+        <w:tc>
+          <w:tcPr>
+            <w:tcW w:w="0" w:type="auto"/>
+            <w:tcBorders>
+              <w:top w:val="single" w:sz="4" w:space="0" w:color="C4C7C5"/>
+              <w:left w:val="single" w:sz="4" w:space="0" w:color="C4C7C5"/>
+              <w:bottom w:val="single" w:sz="4" w:space="0" w:color="C4C7C5"/>
+              <w:right w:val="single" w:sz="4" w:space="0" w:color="C4C7C5"/>
+            </w:tcBorders>
+            <w:tcMar>
+              <w:top w:w="80" w:type="dxa"/>
+              <w:left w:w="120" w:type="dxa"/>
+              <w:bottom w:w="80" w:type="dxa"/>
+              <w:right w:w="120" w:type="dxa"/>
+            </w:tcMar>
+            <w:vAlign w:val="center"/>
+            <w:hideMark/>
+          </w:tcPr>
+          <w:p>
+            <w:pPr>
+              <w:spacing w:after="320" w:line="240" w:lineRule="auto"/>
+              <w:rPr>
+                <w:rFonts w:ascii="Times New Roman" w:eastAsia="Times New Roman" w:hAnsi="Times New Roman" w:cs="Times New Roman"/>
+                <w:sz w:val="24"/>
+                <w:szCs w:val="24"/>
+              </w:rPr>
+            </w:pPr>
+            <w:r>
+              <w:rPr>
+                <w:rFonts w:ascii="Times New Roman" w:eastAsia="Times New Roman" w:hAnsi="Times New Roman" w:cs="Times New Roman"/>
+                <w:b/>
+                <w:bCs/>
+                <w:sz w:val="24"/>
+                <w:szCs w:val="24"/>
+              </w:rPr>
+              <w:t>Deadline</w:t>
+            </w:r>
+          </w:p>
+        </w:tc>
+        <w:tc>
+          <w:tcPr>
+            <w:tcW w:w="0" w:type="auto"/>
+            <w:tcBorders>
+              <w:top w:val="single" w:sz="4" w:space="0" w:color="C4C7C5"/>
+              <w:left w:val="single" w:sz="4" w:space="0" w:color="C4C7C5"/>
+              <w:bottom w:val="single" w:sz="4" w:space="0" w:color="C4C7C5"/>
+              <w:right w:val="single" w:sz="4" w:space="0" w:color="C4C7C5"/>
+            </w:tcBorders>
+            <w:tcMar>
+              <w:top w:w="80" w:type="dxa"/>
+              <w:left w:w="120" w:type="dxa"/>
+              <w:bottom w:w="80" w:type="dxa"/>
+              <w:right w:w="120" w:type="dxa"/>
+            </w:tcMar>
+            <w:vAlign w:val="center"/>
+            <w:hideMark/>
+          </w:tcPr>
+          <w:p>
+            <w:pPr>
+              <w:spacing w:after="320" w:line="240" w:lineRule="auto"/>
+              <w:rPr>
+                <w:rFonts w:ascii="Times New Roman" w:eastAsia="Times New Roman" w:hAnsi="Times New Roman" w:cs="Times New Roman"/>
+                <w:sz w:val="24"/>
+                <w:szCs w:val="24"/>
+              </w:rPr>
+            </w:pPr>
+            <w:r>
+              <w:rPr>
+                <w:rFonts w:ascii="Times New Roman" w:eastAsia="Times New Roman" w:hAnsi="Times New Roman" w:cs="Times New Roman"/>
+                <w:b/>
+                <w:bCs/>
+                <w:sz w:val="24"/>
+                <w:szCs w:val="24"/>
+              </w:rPr>
+              <w:t>Profit</w:t>
+            </w:r>
+          </w:p>
+        </w:tc>
+      </w:tr>
+      <w:tr>
+        <w:trPr>
+          <w:tblCellSpacing w:w="15" w:type="dxa"/>
+        </w:trPr>
+        <w:tc>
+          <w:tcPr>
+            <w:tcW w:w="0" w:type="auto"/>
+            <w:tcBorders>
+              <w:top w:val="single" w:sz="4" w:space="0" w:color="C4C7C5"/>
+              <w:left w:val="single" w:sz="4" w:space="0" w:color="C4C7C5"/>
+              <w:bottom w:val="single" w:sz="4" w:space="0" w:color="C4C7C5"/>
+              <w:right w:val="single" w:sz="4" w:space="0" w:color="C4C7C5"/>
+            </w:tcBorders>
+            <w:tcMar>
+              <w:top w:w="80" w:type="dxa"/>
+              <w:left w:w="120" w:type="dxa"/>
+              <w:bottom w:w="80" w:type="dxa"/>
+              <w:right w:w="120" w:type="dxa"/>
+            </w:tcMar>
+            <w:vAlign w:val="center"/>
+            <w:hideMark/>
+          </w:tcPr>
+          <w:p>
+            <w:pPr>
+              <w:spacing w:after="320" w:line="240" w:lineRule="auto"/>
+              <w:rPr>
+                <w:rFonts w:ascii="Times New Roman" w:eastAsia="Times New Roman" w:hAnsi="Times New Roman" w:cs="Times New Roman"/>
+                <w:sz w:val="24"/>
+                <w:szCs w:val="24"/>
+              </w:rPr>
+            </w:pPr>
+            <w:r>
+              <w:rPr>
+                <w:rFonts w:ascii="Times New Roman" w:eastAsia="Times New Roman" w:hAnsi="Times New Roman" w:cs="Times New Roman"/>
+                <w:b/>
+                <w:bCs/>
+                <w:sz w:val="24"/>
+                <w:szCs w:val="24"/>
+              </w:rPr>
+              <w:t>J1</w:t>
+            </w:r>
+          </w:p>
+        </w:tc>
+        <w:tc>
+          <w:tcPr>
+            <w:tcW w:w="0" w:type="auto"/>
+            <w:tcBorders>
+              <w:top w:val="single" w:sz="4" w:space="0" w:color="C4C7C5"/>
+              <w:left w:val="single" w:sz="4" w:space="0" w:color="C4C7C5"/>
+              <w:bottom w:val="single" w:sz="4" w:space="0" w:color="C4C7C5"/>
+              <w:right w:val="single" w:sz="4" w:space="0" w:color="C4C7C5"/>
+            </w:tcBorders>
+            <w:tcMar>
+              <w:top w:w="80" w:type="dxa"/>
+              <w:left w:w="120" w:type="dxa"/>
+              <w:bottom w:w="80" w:type="dxa"/>
+              <w:right w:w="120" w:type="dxa"/>
+            </w:tcMar>
+            <w:vAlign w:val="center"/>
+            <w:hideMark/>
+          </w:tcPr>
+          <w:p>
+            <w:pPr>
+              <w:spacing w:after="320" w:line="240" w:lineRule="auto"/>
+              <w:rPr>
+                <w:rFonts w:ascii="Times New Roman" w:eastAsia="Times New Roman" w:hAnsi="Times New Roman" w:cs="Times New Roman"/>
+                <w:sz w:val="24"/>
+                <w:szCs w:val="24"/>
+              </w:rPr>
+            </w:pPr>
+            <w:r>
+              <w:rPr>
+                <w:rFonts w:ascii="Times New Roman" w:eastAsia="Times New Roman" w:hAnsi="Times New Roman" w:cs="Times New Roman"/>
+                <w:sz w:val="24"/>
+                <w:szCs w:val="24"/>
+              </w:rPr>
+              <w:t>2</w:t>
+            </w:r>
+          </w:p>
+        </w:tc>
+        <w:tc>
+          <w:tcPr>
+            <w:tcW w:w="0" w:type="auto"/>
+            <w:tcBorders>
+              <w:top w:val="single" w:sz="4" w:space="0" w:color="C4C7C5"/>
+              <w:left w:val="single" w:sz="4" w:space="0" w:color="C4C7C5"/>
+              <w:bottom w:val="single" w:sz="4" w:space="0" w:color="C4C7C5"/>
+              <w:right w:val="single" w:sz="4" w:space="0" w:color="C4C7C5"/>
+            </w:tcBorders>
+            <w:tcMar>
+              <w:top w:w="80" w:type="dxa"/>
+              <w:left w:w="120" w:type="dxa"/>
+              <w:bottom w:w="80" w:type="dxa"/>
+              <w:right w:w="120" w:type="dxa"/>
+            </w:tcMar>
+            <w:vAlign w:val="center"/>
+            <w:hideMark/>
+          </w:tcPr>
+          <w:p>
+            <w:pPr>
+              <w:spacing w:after="320" w:line="240" w:lineRule="auto"/>
+              <w:rPr>
+                <w:rFonts w:ascii="Times New Roman" w:eastAsia="Times New Roman" w:hAnsi="Times New Roman" w:cs="Times New Roman"/>
+                <w:sz w:val="24"/>
+                <w:szCs w:val="24"/>
+              </w:rPr>
+            </w:pPr>
+            <w:r>
+              <w:rPr>
+                <w:rFonts w:ascii="Times New Roman" w:eastAsia="Times New Roman" w:hAnsi="Times New Roman" w:cs="Times New Roman"/>
+                <w:sz w:val="24"/>
+                <w:szCs w:val="24"/>
+              </w:rPr>
+              <w:t>$100</w:t>
+            </w:r>
+          </w:p>
+        </w:tc>
+      </w:tr>
+      <w:tr>
+        <w:trPr>
+          <w:tblCellSpacing w:w="15" w:type="dxa"/>
+        </w:trPr>
+        <w:tc>
+          <w:tcPr>
+            <w:tcW w:w="0" w:type="auto"/>
+            <w:tcBorders>
+              <w:top w:val="single" w:sz="4" w:space="0" w:color="C4C7C5"/>
+              <w:left w:val="single" w:sz="4" w:space="0" w:color="C4C7C5"/>
+              <w:bottom w:val="single" w:sz="4" w:space="0" w:color="C4C7C5"/>
+              <w:right w:val="single" w:sz="4" w:space="0" w:color="C4C7C5"/>
+            </w:tcBorders>
+            <w:tcMar>
+              <w:top w:w="80" w:type="dxa"/>
+              <w:left w:w="120" w:type="dxa"/>
+              <w:bottom w:w="80" w:type="dxa"/>
+              <w:right w:w="120" w:type="dxa"/>
+            </w:tcMar>
+            <w:vAlign w:val="center"/>
+            <w:hideMark/>
+          </w:tcPr>
+          <w:p>
+            <w:pPr>
+              <w:spacing w:after="320" w:line="240" w:lineRule="auto"/>
+              <w:rPr>
+                <w:rFonts w:ascii="Times New Roman" w:eastAsia="Times New Roman" w:hAnsi="Times New Roman" w:cs="Times New Roman"/>
+                <w:sz w:val="24"/>
+                <w:szCs w:val="24"/>
+              </w:rPr>
+            </w:pPr>
+            <w:r>
+              <w:rPr>
+                <w:rFonts w:ascii="Times New Roman" w:eastAsia="Times New Roman" w:hAnsi="Times New Roman" w:cs="Times New Roman"/>
+                <w:b/>
+                <w:bCs/>
+                <w:sz w:val="24"/>
+                <w:szCs w:val="24"/>
+              </w:rPr>
+              <w:t>J2</w:t>
+            </w:r>
+          </w:p>
+        </w:tc>
+        <w:tc>
+          <w:tcPr>
+            <w:tcW w:w="0" w:type="auto"/>
+            <w:tcBorders>
+              <w:top w:val="single" w:sz="4" w:space="0" w:color="C4C7C5"/>
+              <w:left w:val="single" w:sz="4" w:space="0" w:color="C4C7C5"/>
+              <w:bottom w:val="single" w:sz="4" w:space="0" w:color="C4C7C5"/>
+              <w:right w:val="single" w:sz="4" w:space="0" w:color="C4C7C5"/>
+            </w:tcBorders>
+            <w:tcMar>
+              <w:top w:w="80" w:type="dxa"/>
+              <w:left w:w="120" w:type="dxa"/>
+              <w:bottom w:w="80" w:type="dxa"/>
+              <w:right w:w="120" w:type="dxa"/>
+            </w:tcMar>
+            <w:vAlign w:val="center"/>
+            <w:hideMark/>
+          </w:tcPr>
+          <w:p>
+            <w:pPr>
+              <w:spacing w:after="320" w:line="240" w:lineRule="auto"/>
+              <w:rPr>
+                <w:rFonts w:ascii="Times New Roman" w:eastAsia="Times New Roman" w:hAnsi="Times New Roman" w:cs="Times New Roman"/>
+                <w:sz w:val="24"/>
+                <w:szCs w:val="24"/>
+              </w:rPr>
+            </w:pPr>
+            <w:r>
+              <w:rPr>
+                <w:rFonts w:ascii="Times New Roman" w:eastAsia="Times New Roman" w:hAnsi="Times New Roman" w:cs="Times New Roman"/>
+                <w:sz w:val="24"/>
+                <w:szCs w:val="24"/>
+              </w:rPr>
+              <w:t>1</w:t>
+            </w:r>
+          </w:p>
+        </w:tc>
+        <w:tc>
+          <w:tcPr>
+            <w:tcW w:w="0" w:type="auto"/>
+            <w:tcBorders>
+              <w:top w:val="single" w:sz="4" w:space="0" w:color="C4C7C5"/>
+              <w:left w:val="single" w:sz="4" w:space="0" w:color="C4C7C5"/>
+              <w:bottom w:val="single" w:sz="4" w:space="0" w:color="C4C7C5"/>
+              <w:right w:val="single" w:sz="4" w:space="0" w:color="C4C7C5"/>
+            </w:tcBorders>
+            <w:tcMar>
+              <w:top w:w="80" w:type="dxa"/>
+              <w:left w:w="120" w:type="dxa"/>
+              <w:bottom w:w="80" w:type="dxa"/>
+              <w:right w:w="120" w:type="dxa"/>
+            </w:tcMar>
+            <w:vAlign w:val="center"/>
+            <w:hideMark/>
+          </w:tcPr>
+          <w:p>
+            <w:pPr>
+              <w:spacing w:after="320" w:line="240" w:lineRule="auto"/>
+              <w:rPr>
+                <w:rFonts w:ascii="Times New Roman" w:eastAsia="Times New Roman" w:hAnsi="Times New Roman" w:cs="Times New Roman"/>
+                <w:sz w:val="24"/>
+                <w:szCs w:val="24"/>
+              </w:rPr>
+            </w:pPr>
+            <w:r>
+              <w:rPr>
+                <w:rFonts w:ascii="Times New Roman" w:eastAsia="Times New Roman" w:hAnsi="Times New Roman" w:cs="Times New Roman"/>
+                <w:sz w:val="24"/>
+                <w:szCs w:val="24"/>
+              </w:rPr>
+              <w:t>$19</w:t>
+            </w:r>
+          </w:p>
+        </w:tc>
+      </w:tr>
+      <w:tr>
+        <w:trPr>
+          <w:tblCellSpacing w:w="15" w:type="dxa"/>
+        </w:trPr>
+        <w:tc>
+          <w:tcPr>
+            <w:tcW w:w="0" w:type="auto"/>
+            <w:tcBorders>
+              <w:top w:val="single" w:sz="4" w:space="0" w:color="C4C7C5"/>
+              <w:left w:val="single" w:sz="4" w:space="0" w:color="C4C7C5"/>
+              <w:bottom w:val="single" w:sz="4" w:space="0" w:color="C4C7C5"/>
+              <w:right w:val="single" w:sz="4" w:space="0" w:color="C4C7C5"/>
+            </w:tcBorders>
+            <w:tcMar>
+              <w:top w:w="80" w:type="dxa"/>
+              <w:left w:w="120" w:type="dxa"/>
+              <w:bottom w:w="80" w:type="dxa"/>
+              <w:right w:w="120" w:type="dxa"/>
+            </w:tcMar>
+            <w:vAlign w:val="center"/>
+            <w:hideMark/>
+          </w:tcPr>
+          <w:p>
+            <w:pPr>
+              <w:spacing w:after="320" w:line="240" w:lineRule="auto"/>
+              <w:rPr>
+                <w:rFonts w:ascii="Times New Roman" w:eastAsia="Times New Roman" w:hAnsi="Times New Roman" w:cs="Times New Roman"/>
+                <w:sz w:val="24"/>
+                <w:szCs w:val="24"/>
+              </w:rPr>
+            </w:pPr>
+            <w:r>
+              <w:rPr>
+                <w:rFonts w:ascii="Times New Roman" w:eastAsia="Times New Roman" w:hAnsi="Times New Roman" w:cs="Times New Roman"/>
+                <w:b/>
+                <w:bCs/>
+                <w:sz w:val="24"/>
+                <w:szCs w:val="24"/>
+              </w:rPr>
+              <w:t>J3</w:t>
+            </w:r>
+          </w:p>
+        </w:tc>
+        <w:tc>
+          <w:tcPr>
+            <w:tcW w:w="0" w:type="auto"/>
+            <w:tcBorders>
+              <w:top w:val="single" w:sz="4" w:space="0" w:color="C4C7C5"/>
+              <w:left w:val="single" w:sz="4" w:space="0" w:color="C4C7C5"/>
+              <w:bottom w:val="single" w:sz="4" w:space="0" w:color="C4C7C5"/>
+              <w:right w:val="single" w:sz="4" w:space="0" w:color="C4C7C5"/>
+            </w:tcBorders>
+            <w:tcMar>
+              <w:top w:w="80" w:type="dxa"/>
+              <w:left w:w="120" w:type="dxa"/>
+              <w:bottom w:w="80" w:type="dxa"/>
+              <w:right w:w="120" w:type="dxa"/>
+            </w:tcMar>
+            <w:vAlign w:val="center"/>
+            <w:hideMark/>
+          </w:tcPr>
+          <w:p>
+            <w:pPr>
+              <w:spacing w:after="320" w:line="240" w:lineRule="auto"/>
+              <w:rPr>
+                <w:rFonts w:ascii="Times New Roman" w:eastAsia="Times New Roman" w:hAnsi="Times New Roman" w:cs="Times New Roman"/>
+                <w:sz w:val="24"/>
+                <w:szCs w:val="24"/>
+              </w:rPr>
+            </w:pPr>
+            <w:r>
+              <w:rPr>
+                <w:rFonts w:ascii="Times New Roman" w:eastAsia="Times New Roman" w:hAnsi="Times New Roman" w:cs="Times New Roman"/>
+                <w:sz w:val="24"/>
+                <w:szCs w:val="24"/>
+              </w:rPr>
+              <w:t>2</w:t>
+            </w:r>
+          </w:p>
+        </w:tc>
+        <w:tc>
+          <w:tcPr>
+            <w:tcW w:w="0" w:type="auto"/>
+            <w:tcBorders>
+              <w:top w:val="single" w:sz="4" w:space="0" w:color="C4C7C5"/>
+              <w:left w:val="single" w:sz="4" w:space="0" w:color="C4C7C5"/>
+              <w:bottom w:val="single" w:sz="4" w:space="0" w:color="C4C7C5"/>
+              <w:right w:val="single" w:sz="4" w:space="0" w:color="C4C7C5"/>
+            </w:tcBorders>
+            <w:tcMar>
+              <w:top w:w="80" w:type="dxa"/>
+              <w:left w:w="120" w:type="dxa"/>
+              <w:bottom w:w="80" w:type="dxa"/>
+              <w:right w:w="120" w:type="dxa"/>
+            </w:tcMar>
+            <w:vAlign w:val="center"/>
+            <w:hideMark/>
+          </w:tcPr>
+          <w:p>
+            <w:pPr>
+              <w:spacing w:after="320" w:line="240" w:lineRule="auto"/>
+              <w:rPr>
+                <w:rFonts w:ascii="Times New Roman" w:eastAsia="Times New Roman" w:hAnsi="Times New Roman" w:cs="Times New Roman"/>
+                <w:sz w:val="24"/>
+                <w:szCs w:val="24"/>
+              </w:rPr>
+            </w:pPr>
+            <w:r>
+              <w:rPr>
+                <w:rFonts w:ascii="Times New Roman" w:eastAsia="Times New Roman" w:hAnsi="Times New Roman" w:cs="Times New Roman"/>
+                <w:sz w:val="24"/>
+                <w:szCs w:val="24"/>
+              </w:rPr>
+              <w:t>$27</w:t>
+            </w:r>
+          </w:p>
+        </w:tc>
+      </w:tr>
+      <w:tr>
+        <w:trPr>
+          <w:tblCellSpacing w:w="15" w:type="dxa"/>
+        </w:trPr>
+        <w:tc>
+          <w:tcPr>
+            <w:tcW w:w="0" w:type="auto"/>
+            <w:tcBorders>
+              <w:top w:val="single" w:sz="4" w:space="0" w:color="C4C7C5"/>
+              <w:left w:val="single" w:sz="4" w:space="0" w:color="C4C7C5"/>
+              <w:bottom w:val="single" w:sz="4" w:space="0" w:color="C4C7C5"/>
+              <w:right w:val="single" w:sz="4" w:space="0" w:color="C4C7C5"/>
+            </w:tcBorders>
+            <w:tcMar>
+              <w:top w:w="80" w:type="dxa"/>
+              <w:left w:w="120" w:type="dxa"/>
+              <w:bottom w:w="80" w:type="dxa"/>
+              <w:right w:w="120" w:type="dxa"/>
+            </w:tcMar>
+            <w:vAlign w:val="center"/>
+            <w:hideMark/>
+          </w:tcPr>
+          <w:p>
+            <w:pPr>
+              <w:spacing w:after="320" w:line="240" w:lineRule="auto"/>
+              <w:rPr>
+                <w:rFonts w:ascii="Times New Roman" w:eastAsia="Times New Roman" w:hAnsi="Times New Roman" w:cs="Times New Roman"/>
+                <w:sz w:val="24"/>
+                <w:szCs w:val="24"/>
+              </w:rPr>
+            </w:pPr>
+            <w:r>
+              <w:rPr>
+                <w:rFonts w:ascii="Times New Roman" w:eastAsia="Times New Roman" w:hAnsi="Times New Roman" w:cs="Times New Roman"/>
+                <w:b/>
+                <w:bCs/>
+                <w:sz w:val="24"/>
+                <w:szCs w:val="24"/>
+              </w:rPr>
+              <w:t>J4</w:t>
+            </w:r>
+          </w:p>
+        </w:tc>
+        <w:tc>
+          <w:tcPr>
+            <w:tcW w:w="0" w:type="auto"/>
+            <w:tcBorders>
+              <w:top w:val="single" w:sz="4" w:space="0" w:color="C4C7C5"/>
+              <w:left w:val="single" w:sz="4" w:space="0" w:color="C4C7C5"/>
+              <w:bottom w:val="single" w:sz="4" w:space="0" w:color="C4C7C5"/>
+              <w:right w:val="single" w:sz="4" w:space="0" w:color="C4C7C5"/>
+            </w:tcBorders>
+            <w:tcMar>
+              <w:top w:w="80" w:type="dxa"/>
+              <w:left w:w="120" w:type="dxa"/>
+              <w:bottom w:w="80" w:type="dxa"/>
+              <w:right w:w="120" w:type="dxa"/>
+            </w:tcMar>
+            <w:vAlign w:val="center"/>
+            <w:hideMark/>
+          </w:tcPr>
+          <w:p>
+            <w:pPr>
+              <w:spacing w:after="320" w:line="240" w:lineRule="auto"/>
+              <w:rPr>
+                <w:rFonts w:ascii="Times New Roman" w:eastAsia="Times New Roman" w:hAnsi="Times New Roman" w:cs="Times New Roman"/>
+                <w:sz w:val="24"/>
+                <w:szCs w:val="24"/>
+              </w:rPr>
+            </w:pPr>
+            <w:r>
+              <w:rPr>
+                <w:rFonts w:ascii="Times New Roman" w:eastAsia="Times New Roman" w:hAnsi="Times New Roman" w:cs="Times New Roman"/>
+                <w:sz w:val="24"/>
+                <w:szCs w:val="24"/>
+              </w:rPr>
+              <w:t>1</w:t>
+            </w:r>
+          </w:p>
+        </w:tc>
+        <w:tc>
+          <w:tcPr>
+            <w:tcW w:w="0" w:type="auto"/>
+            <w:tcBorders>
+              <w:top w:val="single" w:sz="4" w:space="0" w:color="C4C7C5"/>
+              <w:left w:val="single" w:sz="4" w:space="0" w:color="C4C7C5"/>
+              <w:bottom w:val="single" w:sz="4" w:space="0" w:color="C4C7C5"/>
+              <w:right w:val="single" w:sz="4" w:space="0" w:color="C4C7C5"/>
+            </w:tcBorders>
+            <w:tcMar>
+              <w:top w:w="80" w:type="dxa"/>
+              <w:left w:w="120" w:type="dxa"/>
+              <w:bottom w:w="80" w:type="dxa"/>
+              <w:right w:w="120" w:type="dxa"/>
+            </w:tcMar>
+            <w:vAlign w:val="center"/>
+            <w:hideMark/>
+          </w:tcPr>
+          <w:p>
+            <w:pPr>
+              <w:spacing w:after="320" w:line="240" w:lineRule="auto"/>
+              <w:rPr>
+                <w:rFonts w:ascii="Times New Roman" w:eastAsia="Times New Roman" w:hAnsi="Times New Roman" w:cs="Times New Roman"/>
+                <w:sz w:val="24"/>
+                <w:szCs w:val="24"/>
+              </w:rPr>
+            </w:pPr>
+            <w:r>
+              <w:rPr>
+                <w:rFonts w:ascii="Times New Roman" w:eastAsia="Times New Roman" w:hAnsi="Times New Roman" w:cs="Times New Roman"/>
+                <w:sz w:val="24"/>
+                <w:szCs w:val="24"/>
+              </w:rPr>
+              <w:t>$25</w:t>
+            </w:r>
+          </w:p>
+        </w:tc>
+      </w:tr>
+      <w:tr>
+        <w:trPr>
+          <w:tblCellSpacing w:w="15" w:type="dxa"/>
+        </w:trPr>
+        <w:tc>
+          <w:tcPr>
+            <w:tcW w:w="0" w:type="auto"/>
+            <w:tcBorders>
+              <w:top w:val="single" w:sz="4" w:space="0" w:color="C4C7C5"/>
+              <w:left w:val="single" w:sz="4" w:space="0" w:color="C4C7C5"/>
+              <w:bottom w:val="single" w:sz="4" w:space="0" w:color="C4C7C5"/>
+              <w:right w:val="single" w:sz="4" w:space="0" w:color="C4C7C5"/>
+            </w:tcBorders>
+            <w:tcMar>
+              <w:top w:w="80" w:type="dxa"/>
+              <w:left w:w="120" w:type="dxa"/>
+              <w:bottom w:w="80" w:type="dxa"/>
+              <w:right w:w="120" w:type="dxa"/>
+            </w:tcMar>
+            <w:vAlign w:val="center"/>
+            <w:hideMark/>
+          </w:tcPr>
+          <w:p>
+            <w:pPr>
+              <w:spacing w:after="320" w:line="240" w:lineRule="auto"/>
+              <w:rPr>
+                <w:rFonts w:ascii="Times New Roman" w:eastAsia="Times New Roman" w:hAnsi="Times New Roman" w:cs="Times New Roman"/>
+                <w:sz w:val="24"/>
+                <w:szCs w:val="24"/>
+              </w:rPr>
+            </w:pPr>
+            <w:r>
+              <w:rPr>
+                <w:rFonts w:ascii="Times New Roman" w:eastAsia="Times New Roman" w:hAnsi="Times New Roman" w:cs="Times New Roman"/>
+                <w:b/>
+                <w:bCs/>
+                <w:sz w:val="24"/>
+                <w:szCs w:val="24"/>
+              </w:rPr>
+              <w:t>J5</w:t>
+            </w:r>
+          </w:p>
+        </w:tc>
+        <w:tc>
+          <w:tcPr>
+            <w:tcW w:w="0" w:type="auto"/>
+            <w:tcBorders>
+              <w:top w:val="single" w:sz="4" w:space="0" w:color="C4C7C5"/>
+              <w:left w:val="single" w:sz="4" w:space="0" w:color="C4C7C5"/>
+              <w:bottom w:val="single" w:sz="4" w:space="0" w:color="C4C7C5"/>
+              <w:right w:val="single" w:sz="4" w:space="0" w:color="C4C7C5"/>
+            </w:tcBorders>
+            <w:tcMar>
+              <w:top w:w="80" w:type="dxa"/>
+              <w:left w:w="120" w:type="dxa"/>
+              <w:bottom w:w="80" w:type="dxa"/>
+              <w:right w:w="120" w:type="dxa"/>
+            </w:tcMar>
+            <w:vAlign w:val="center"/>
+            <w:hideMark/>
+          </w:tcPr>
+          <w:p>
+            <w:pPr>
+              <w:spacing w:after="320" w:line="240" w:lineRule="auto"/>
+              <w:rPr>
+                <w:rFonts w:ascii="Times New Roman" w:eastAsia="Times New Roman" w:hAnsi="Times New Roman" w:cs="Times New Roman"/>
+                <w:sz w:val="24"/>
+                <w:szCs w:val="24"/>
+              </w:rPr>
+            </w:pPr>
+            <w:r>
+              <w:rPr>
+                <w:rFonts w:ascii="Times New Roman" w:eastAsia="Times New Roman" w:hAnsi="Times New Roman" w:cs="Times New Roman"/>
+                <w:sz w:val="24"/>
+                <w:szCs w:val="24"/>
+              </w:rPr>
+              <w:t>3</w:t>
+            </w:r>
+          </w:p>
+        </w:tc>
+        <w:tc>
+          <w:tcPr>
+            <w:tcW w:w="0" w:type="auto"/>
+            <w:tcBorders>
+              <w:top w:val="single" w:sz="4" w:space="0" w:color="C4C7C5"/>
+              <w:left w:val="single" w:sz="4" w:space="0" w:color="C4C7C5"/>
+              <w:bottom w:val="single" w:sz="4" w:space="0" w:color="C4C7C5"/>
+              <w:right w:val="single" w:sz="4" w:space="0" w:color="C4C7C5"/>
+            </w:tcBorders>
+            <w:tcMar>
+              <w:top w:w="80" w:type="dxa"/>
+              <w:left w:w="120" w:type="dxa"/>
+              <w:bottom w:w="80" w:type="dxa"/>
+              <w:right w:w="120" w:type="dxa"/>
+            </w:tcMar>
+            <w:vAlign w:val="center"/>
+            <w:hideMark/>
+          </w:tcPr>
+          <w:p>
+            <w:pPr>
+              <w:spacing w:after="320" w:line="240" w:lineRule="auto"/>
+              <w:rPr>
+                <w:rFonts w:ascii="Times New Roman" w:eastAsia="Times New Roman" w:hAnsi="Times New Roman" w:cs="Times New Roman"/>
+                <w:sz w:val="24"/>
+                <w:szCs w:val="24"/>
+              </w:rPr>
+            </w:pPr>
+            <w:r>
+              <w:rPr>
+                <w:rFonts w:ascii="Times New Roman" w:eastAsia="Times New Roman" w:hAnsi="Times New Roman" w:cs="Times New Roman"/>
+                <w:sz w:val="24"/>
+                <w:szCs w:val="24"/>
+              </w:rPr>
+              <w:t>$15</w:t>
+            </w:r>
+          </w:p>
+        </w:tc>
+      </w:tr>
+    </w:tbl>
+    <w:p>
+      <w:pPr>
+        <w:spacing w:before="100" w:beforeAutospacing="1" w:after="100" w:afterAutospacing="1" w:line="240" w:lineRule="auto"/>
+        <w:outlineLvl w:val="2"/>
+        <w:rPr>
+          <w:rFonts w:ascii="Times New Roman" w:eastAsia="Times New Roman" w:hAnsi="Times New Roman" w:cs="Times New Roman"/>
+          <w:b/>
+          <w:bCs/>
+          <w:sz w:val="27"/>
+          <w:szCs w:val="27"/>
+        </w:rPr>
+      </w:pPr>
+      <w:r>
+        <w:rPr>
+          <w:rFonts w:ascii="Times New Roman" w:eastAsia="Times New Roman" w:hAnsi="Times New Roman" w:cs="Times New Roman"/>
+          <w:b/>
+          <w:bCs/>
+          <w:sz w:val="27"/>
+          <w:szCs w:val="27"/>
+        </w:rPr>
+        <w:t>Step 1: Sort by Profit</w:t>
+      </w:r>
+    </w:p>
+    <w:p>
+      <w:pPr>
+        <w:spacing w:before="100" w:beforeAutospacing="1" w:after="100" w:afterAutospacing="1" w:line="240" w:lineRule="auto"/>
+        <w:rPr>
+          <w:rFonts w:ascii="Times New Roman" w:eastAsia="Times New Roman" w:hAnsi="Times New Roman" w:cs="Times New Roman"/>
+          <w:sz w:val="24"/>
+          <w:szCs w:val="24"/>
+        </w:rPr>
+      </w:pPr>
+      <w:r>
+        <w:rPr>
+          <w:rFonts w:ascii="Times New Roman" w:eastAsia="Times New Roman" w:hAnsi="Times New Roman" w:cs="Times New Roman"/>
+          <w:sz w:val="24"/>
+          <w:szCs w:val="24"/>
+        </w:rPr>
+        <w:t>First, we sort our jobs from highest profit to lowest profit:</w:t>
+      </w:r>
+    </w:p>
+    <w:p>
+      <w:pPr>
+        <w:numPr>
+          <w:ilvl w:val="0"/>
+          <w:numId w:val="23"/>
+        </w:numPr>
+        <w:spacing w:before="100" w:beforeAutospacing="1" w:after="100" w:afterAutospacing="1" w:line="240" w:lineRule="auto"/>
+        <w:rPr>
+          <w:rFonts w:ascii="Times New Roman" w:eastAsia="Times New Roman" w:hAnsi="Times New Roman" w:cs="Times New Roman"/>
+          <w:sz w:val="24"/>
+          <w:szCs w:val="24"/>
+        </w:rPr>
+      </w:pPr>
+      <w:r>
+        <w:rPr>
+          <w:rFonts w:ascii="Times New Roman" w:eastAsia="Times New Roman" w:hAnsi="Times New Roman" w:cs="Times New Roman"/>
+          <w:b/>
+          <w:bCs/>
+          <w:sz w:val="24"/>
+          <w:szCs w:val="24"/>
+        </w:rPr>
+        <w:t>J1</w:t>
+      </w:r>
+      <w:r>
+        <w:rPr>
+          <w:rFonts w:ascii="Times New Roman" w:eastAsia="Times New Roman" w:hAnsi="Times New Roman" w:cs="Times New Roman"/>
+          <w:sz w:val="24"/>
+          <w:szCs w:val="24"/>
+        </w:rPr>
+        <w:t xml:space="preserve"> (Profit: $100, Deadline: 2)</w:t>
+      </w:r>
+    </w:p>
+    <w:p>
+      <w:pPr>
+        <w:numPr>
+          <w:ilvl w:val="0"/>
+          <w:numId w:val="23"/>
+        </w:numPr>
+        <w:spacing w:before="100" w:beforeAutospacing="1" w:after="100" w:afterAutospacing="1" w:line="240" w:lineRule="auto"/>
+        <w:rPr>
+          <w:rFonts w:ascii="Times New Roman" w:eastAsia="Times New Roman" w:hAnsi="Times New Roman" w:cs="Times New Roman"/>
+          <w:sz w:val="24"/>
+          <w:szCs w:val="24"/>
+        </w:rPr>
+      </w:pPr>
+      <w:r>
+        <w:rPr>
+          <w:rFonts w:ascii="Times New Roman" w:eastAsia="Times New Roman" w:hAnsi="Times New Roman" w:cs="Times New Roman"/>
+          <w:b/>
+          <w:bCs/>
+          <w:sz w:val="24"/>
+          <w:szCs w:val="24"/>
+        </w:rPr>
+        <w:t>J3</w:t>
+      </w:r>
+      <w:r>
+        <w:rPr>
+          <w:rFonts w:ascii="Times New Roman" w:eastAsia="Times New Roman" w:hAnsi="Times New Roman" w:cs="Times New Roman"/>
+          <w:sz w:val="24"/>
+          <w:szCs w:val="24"/>
+        </w:rPr>
+        <w:t xml:space="preserve"> (Profit: $27, Deadline: 2)</w:t>
+      </w:r>
+    </w:p>
+    <w:p>
+      <w:pPr>
+        <w:numPr>
+          <w:ilvl w:val="0"/>
+          <w:numId w:val="23"/>
+        </w:numPr>
+        <w:spacing w:before="100" w:beforeAutospacing="1" w:after="100" w:afterAutospacing="1" w:line="240" w:lineRule="auto"/>
+        <w:rPr>
+          <w:rFonts w:ascii="Times New Roman" w:eastAsia="Times New Roman" w:hAnsi="Times New Roman" w:cs="Times New Roman"/>
+          <w:sz w:val="24"/>
+          <w:szCs w:val="24"/>
+        </w:rPr>
+      </w:pPr>
+      <w:r>
+        <w:rPr>
+          <w:rFonts w:ascii="Times New Roman" w:eastAsia="Times New Roman" w:hAnsi="Times New Roman" w:cs="Times New Roman"/>
+          <w:b/>
+          <w:bCs/>
+          <w:sz w:val="24"/>
+          <w:szCs w:val="24"/>
+        </w:rPr>
+        <w:t>J4</w:t>
+      </w:r>
+      <w:r>
+        <w:rPr>
+          <w:rFonts w:ascii="Times New Roman" w:eastAsia="Times New Roman" w:hAnsi="Times New Roman" w:cs="Times New Roman"/>
+          <w:sz w:val="24"/>
+          <w:szCs w:val="24"/>
+        </w:rPr>
+        <w:t xml:space="preserve"> (Profit: $25, Deadline: 1)</w:t>
+      </w:r>
+    </w:p>
+    <w:p>
+      <w:pPr>
+        <w:numPr>
+          <w:ilvl w:val="0"/>
+          <w:numId w:val="23"/>
+        </w:numPr>
+        <w:spacing w:before="100" w:beforeAutospacing="1" w:after="100" w:afterAutospacing="1" w:line="240" w:lineRule="auto"/>
+        <w:rPr>
+          <w:rFonts w:ascii="Times New Roman" w:eastAsia="Times New Roman" w:hAnsi="Times New Roman" w:cs="Times New Roman"/>
+          <w:sz w:val="24"/>
+          <w:szCs w:val="24"/>
+        </w:rPr>
+      </w:pPr>
+      <w:r>
+        <w:rPr>
+          <w:rFonts w:ascii="Times New Roman" w:eastAsia="Times New Roman" w:hAnsi="Times New Roman" w:cs="Times New Roman"/>
+          <w:b/>
+          <w:bCs/>
+          <w:sz w:val="24"/>
+          <w:szCs w:val="24"/>
+        </w:rPr>
+        <w:t>J2</w:t>
+      </w:r>
+      <w:r>
+        <w:rPr>
+          <w:rFonts w:ascii="Times New Roman" w:eastAsia="Times New Roman" w:hAnsi="Times New Roman" w:cs="Times New Roman"/>
+          <w:sz w:val="24"/>
+          <w:szCs w:val="24"/>
+        </w:rPr>
+        <w:t xml:space="preserve"> (Profit: $19, Deadline: 1)</w:t>
+      </w:r>
+    </w:p>
+    <w:p>
+      <w:pPr>
+        <w:numPr>
+          <w:ilvl w:val="0"/>
+          <w:numId w:val="23"/>
+        </w:numPr>
+        <w:spacing w:before="100" w:beforeAutospacing="1" w:after="100" w:afterAutospacing="1" w:line="240" w:lineRule="auto"/>
+        <w:rPr>
+          <w:rFonts w:ascii="Times New Roman" w:eastAsia="Times New Roman" w:hAnsi="Times New Roman" w:cs="Times New Roman"/>
+          <w:sz w:val="24"/>
+          <w:szCs w:val="24"/>
+        </w:rPr>
+      </w:pPr>
+      <w:r>
+        <w:rPr>
+          <w:rFonts w:ascii="Times New Roman" w:eastAsia="Times New Roman" w:hAnsi="Times New Roman" w:cs="Times New Roman"/>
+          <w:b/>
+          <w:bCs/>
+          <w:sz w:val="24"/>
+          <w:szCs w:val="24"/>
+        </w:rPr>
+        <w:t>J5</w:t>
+      </w:r>
+      <w:r>
+        <w:rPr>
+          <w:rFonts w:ascii="Times New Roman" w:eastAsia="Times New Roman" w:hAnsi="Times New Roman" w:cs="Times New Roman"/>
+          <w:sz w:val="24"/>
+          <w:szCs w:val="24"/>
+        </w:rPr>
+        <w:t xml:space="preserve"> (Profit: $15, Deadline: 3)</w:t>
+      </w:r>
+    </w:p>
+    <w:p>
+      <w:pPr>
+        <w:spacing w:before="100" w:beforeAutospacing="1" w:after="100" w:afterAutospacing="1" w:line="240" w:lineRule="auto"/>
+        <w:outlineLvl w:val="2"/>
+        <w:rPr>
+          <w:rFonts w:ascii="Times New Roman" w:eastAsia="Times New Roman" w:hAnsi="Times New Roman" w:cs="Times New Roman"/>
+          <w:b/>
+          <w:bCs/>
+          <w:sz w:val="27"/>
+          <w:szCs w:val="27"/>
+        </w:rPr>
+      </w:pPr>
+      <w:r>
+        <w:rPr>
+          <w:rFonts w:ascii="Times New Roman" w:eastAsia="Times New Roman" w:hAnsi="Times New Roman" w:cs="Times New Roman"/>
+          <w:b/>
+          <w:bCs/>
+          <w:sz w:val="27"/>
+          <w:szCs w:val="27"/>
+        </w:rPr>
+        <w:t>Step 2: Allocate Slots Greedily</w:t>
+      </w:r>
+    </w:p>
+    <w:p>
+      <w:pPr>
+        <w:spacing w:before="100" w:beforeAutospacing="1" w:after="100" w:afterAutospacing="1" w:line="240" w:lineRule="auto"/>
+        <w:rPr>
+          <w:rFonts w:ascii="Times New Roman" w:eastAsia="Times New Roman" w:hAnsi="Times New Roman" w:cs="Times New Roman"/>
+          <w:sz w:val="24"/>
+          <w:szCs w:val="24"/>
+        </w:rPr>
+      </w:pPr>
+      <w:r>
+        <w:rPr>
+          <w:rFonts w:ascii="Times New Roman" w:eastAsia="Times New Roman" w:hAnsi="Times New Roman" w:cs="Times New Roman"/>
+          <w:sz w:val="24"/>
+          <w:szCs w:val="24"/>
+        </w:rPr>
+        <w:t xml:space="preserve">We create a timeline of available 1-hour slots up to our maximum deadline: </w:t>
+      </w:r>
+      <w:r>
+        <w:rPr>
+          <w:rFonts w:ascii="Courier New" w:eastAsia="Times New Roman" w:hAnsi="Courier New" w:cs="Courier New"/>
+          <w:sz w:val="20"/>
+        </w:rPr>
+        <w:t>[Slot 1, Slot 2, Slot 3]</w:t>
+      </w:r>
+      <w:r>
+        <w:rPr>
+          <w:rFonts w:ascii="Times New Roman" w:eastAsia="Times New Roman" w:hAnsi="Times New Roman" w:cs="Times New Roman"/>
+          <w:sz w:val="24"/>
+          <w:szCs w:val="24"/>
+        </w:rPr>
+        <w:t>.</w:t>
+      </w:r>
+    </w:p>
+    <w:p>
+      <w:pPr>
+        <w:spacing w:after="0" w:line="240" w:lineRule="auto"/>
+        <w:rPr>
+          <w:rFonts w:ascii="Times New Roman" w:eastAsia="Times New Roman" w:hAnsi="Times New Roman" w:cs="Times New Roman"/>
+          <w:sz w:val="24"/>
+          <w:szCs w:val="24"/>
+        </w:rPr>
+      </w:pPr>
+      <w:r>
+        <w:rPr>
+          <w:rFonts w:ascii="Times New Roman" w:eastAsia="Times New Roman" w:hAnsi="Times New Roman" w:cs="Times New Roman"/>
+          <w:b/>
+          <w:bCs/>
+          <w:sz w:val="24"/>
+          <w:szCs w:val="24"/>
+        </w:rPr>
+        <w:t>1.Evaluate J1 (Profit: $100, Deadline: 2):</w:t>
+      </w:r>
+      <w:r>
+        <w:rPr>
+          <w:rFonts w:ascii="Times New Roman" w:eastAsia="Times New Roman" w:hAnsi="Times New Roman" w:cs="Times New Roman"/>
+          <w:sz w:val="24"/>
+          <w:szCs w:val="24"/>
+        </w:rPr>
+        <w:t>Available slots: [1, 2, 3].</w:t>
+      </w:r>
+    </w:p>
+    <w:p>
+      <w:pPr>
+        <w:spacing w:before="100" w:beforeAutospacing="1" w:after="100" w:afterAutospacing="1" w:line="240" w:lineRule="auto"/>
+        <w:rPr>
+          <w:rFonts w:ascii="Times New Roman" w:eastAsia="Times New Roman" w:hAnsi="Times New Roman" w:cs="Times New Roman"/>
+          <w:sz w:val="24"/>
+          <w:szCs w:val="24"/>
+        </w:rPr>
+      </w:pPr>
+      <w:r>
+        <w:rPr>
+          <w:rFonts w:ascii="Times New Roman" w:eastAsia="Times New Roman" w:hAnsi="Times New Roman" w:cs="Times New Roman"/>
+          <w:sz w:val="24"/>
+          <w:szCs w:val="24"/>
+        </w:rPr>
+        <w:t xml:space="preserve">J1 needs to be done by hour 2. The latest available slot before or at hour 2 is </w:t>
+      </w:r>
+      <w:r>
+        <w:rPr>
+          <w:rFonts w:ascii="Times New Roman" w:eastAsia="Times New Roman" w:hAnsi="Times New Roman" w:cs="Times New Roman"/>
+          <w:b/>
+          <w:bCs/>
+          <w:sz w:val="24"/>
+          <w:szCs w:val="24"/>
+        </w:rPr>
+        <w:t>Slot 2</w:t>
+      </w:r>
+      <w:r>
+        <w:rPr>
+          <w:rFonts w:ascii="Times New Roman" w:eastAsia="Times New Roman" w:hAnsi="Times New Roman" w:cs="Times New Roman"/>
+          <w:sz w:val="24"/>
+          <w:szCs w:val="24"/>
+        </w:rPr>
+        <w:t>.</w:t>
+      </w:r>
+    </w:p>
+    <w:p>
+      <w:pPr>
+        <w:numPr>
+          <w:ilvl w:val="0"/>
+          <w:numId w:val="24"/>
+        </w:numPr>
+        <w:spacing w:before="100" w:beforeAutospacing="1" w:after="100" w:afterAutospacing="1" w:line="240" w:lineRule="auto"/>
+        <w:rPr>
+          <w:rFonts w:ascii="Times New Roman" w:eastAsia="Times New Roman" w:hAnsi="Times New Roman" w:cs="Times New Roman"/>
+          <w:sz w:val="24"/>
+          <w:szCs w:val="24"/>
+        </w:rPr>
+      </w:pPr>
+      <w:r>
+        <w:rPr>
+          <w:rFonts w:ascii="Times New Roman" w:eastAsia="Times New Roman" w:hAnsi="Times New Roman" w:cs="Times New Roman"/>
+          <w:i/>
+          <w:iCs/>
+          <w:sz w:val="24"/>
+          <w:szCs w:val="24"/>
+        </w:rPr>
+        <w:t>Action:</w:t>
+      </w:r>
+      <w:r>
+        <w:rPr>
+          <w:rFonts w:ascii="Times New Roman" w:eastAsia="Times New Roman" w:hAnsi="Times New Roman" w:cs="Times New Roman"/>
+          <w:sz w:val="24"/>
+          <w:szCs w:val="24"/>
+        </w:rPr>
+        <w:t xml:space="preserve"> Assign J1 to </w:t>
+      </w:r>
+      <w:r>
+        <w:rPr>
+          <w:rFonts w:ascii="Times New Roman" w:eastAsia="Times New Roman" w:hAnsi="Times New Roman" w:cs="Times New Roman"/>
+          <w:b/>
+          <w:bCs/>
+          <w:sz w:val="24"/>
+          <w:szCs w:val="24"/>
+        </w:rPr>
+        <w:t>Slot 2</w:t>
+      </w:r>
+      <w:r>
+        <w:rPr>
+          <w:rFonts w:ascii="Times New Roman" w:eastAsia="Times New Roman" w:hAnsi="Times New Roman" w:cs="Times New Roman"/>
+          <w:sz w:val="24"/>
+          <w:szCs w:val="24"/>
+        </w:rPr>
+        <w:t>.</w:t>
+      </w:r>
+    </w:p>
+    <w:p>
+      <w:pPr>
+        <w:numPr>
+          <w:ilvl w:val="0"/>
+          <w:numId w:val="24"/>
+        </w:numPr>
+        <w:spacing w:before="100" w:beforeAutospacing="1" w:after="100" w:afterAutospacing="1" w:line="240" w:lineRule="auto"/>
+        <w:rPr>
+          <w:rFonts w:ascii="Times New Roman" w:eastAsia="Times New Roman" w:hAnsi="Times New Roman" w:cs="Times New Roman"/>
+          <w:sz w:val="24"/>
+          <w:szCs w:val="24"/>
+        </w:rPr>
+      </w:pPr>
+      <w:r>
+        <w:rPr>
+          <w:rFonts w:ascii="Times New Roman" w:eastAsia="Times New Roman" w:hAnsi="Times New Roman" w:cs="Times New Roman"/>
+          <w:i/>
+          <w:iCs/>
+          <w:sz w:val="24"/>
+          <w:szCs w:val="24"/>
+        </w:rPr>
+        <w:t>Current Timeline:</w:t>
+      </w:r>
+      <w:r>
+        <w:rPr>
+          <w:rFonts w:ascii="Times New Roman" w:eastAsia="Times New Roman" w:hAnsi="Times New Roman" w:cs="Times New Roman"/>
+          <w:sz w:val="24"/>
+          <w:szCs w:val="24"/>
+        </w:rPr>
+        <w:t xml:space="preserve"> </w:t>
+      </w:r>
+      <w:r>
+        <w:rPr>
+          <w:rFonts w:ascii="Courier New" w:eastAsia="Times New Roman" w:hAnsi="Courier New" w:cs="Courier New"/>
+          <w:sz w:val="20"/>
+        </w:rPr>
+        <w:t>[Empty, J1, Empty]</w:t>
+      </w:r>
+    </w:p>
+    <w:p>
+      <w:pPr>
+        <w:spacing w:after="0" w:line="240" w:lineRule="auto"/>
+        <w:rPr>
+          <w:rFonts w:ascii="Times New Roman" w:eastAsia="Times New Roman" w:hAnsi="Times New Roman" w:cs="Times New Roman"/>
+          <w:sz w:val="24"/>
+          <w:szCs w:val="24"/>
+        </w:rPr>
+      </w:pPr>
+      <w:r>
+        <w:rPr>
+          <w:rFonts w:ascii="Times New Roman" w:eastAsia="Times New Roman" w:hAnsi="Times New Roman" w:cs="Times New Roman"/>
+          <w:b/>
+          <w:bCs/>
+          <w:sz w:val="24"/>
+          <w:szCs w:val="24"/>
+        </w:rPr>
+        <w:t>2.Evaluate J3 (Profit: $27, Deadline: 2):</w:t>
+      </w:r>
+      <w:r>
+        <w:rPr>
+          <w:rFonts w:ascii="Times New Roman" w:eastAsia="Times New Roman" w:hAnsi="Times New Roman" w:cs="Times New Roman"/>
+          <w:sz w:val="24"/>
+          <w:szCs w:val="24"/>
+        </w:rPr>
+        <w:t>Available slots: [1, 3].</w:t>
+      </w:r>
+    </w:p>
+    <w:p>
+      <w:pPr>
+        <w:spacing w:before="100" w:beforeAutospacing="1" w:after="100" w:afterAutospacing="1" w:line="240" w:lineRule="auto"/>
+        <w:rPr>
+          <w:rFonts w:ascii="Times New Roman" w:eastAsia="Times New Roman" w:hAnsi="Times New Roman" w:cs="Times New Roman"/>
+          <w:sz w:val="24"/>
+          <w:szCs w:val="24"/>
+        </w:rPr>
+      </w:pPr>
+      <w:r>
+        <w:rPr>
+          <w:rFonts w:ascii="Times New Roman" w:eastAsia="Times New Roman" w:hAnsi="Times New Roman" w:cs="Times New Roman"/>
+          <w:sz w:val="24"/>
+          <w:szCs w:val="24"/>
+        </w:rPr>
+        <w:lastRenderedPageBreak/>
+        <w:t xml:space="preserve">J3 needs to be done by hour 2. Slot 2 is taken! We look for the next latest available slot before hour 2, which is </w:t>
+      </w:r>
+      <w:r>
+        <w:rPr>
+          <w:rFonts w:ascii="Times New Roman" w:eastAsia="Times New Roman" w:hAnsi="Times New Roman" w:cs="Times New Roman"/>
+          <w:b/>
+          <w:bCs/>
+          <w:sz w:val="24"/>
+          <w:szCs w:val="24"/>
+        </w:rPr>
+        <w:t>Slot 1</w:t>
+      </w:r>
+      <w:r>
+        <w:rPr>
+          <w:rFonts w:ascii="Times New Roman" w:eastAsia="Times New Roman" w:hAnsi="Times New Roman" w:cs="Times New Roman"/>
+          <w:sz w:val="24"/>
+          <w:szCs w:val="24"/>
+        </w:rPr>
+        <w:t>.</w:t>
+      </w:r>
+    </w:p>
+    <w:p>
+      <w:pPr>
+        <w:numPr>
+          <w:ilvl w:val="0"/>
+          <w:numId w:val="25"/>
+        </w:numPr>
+        <w:spacing w:before="100" w:beforeAutospacing="1" w:after="100" w:afterAutospacing="1" w:line="240" w:lineRule="auto"/>
+        <w:rPr>
+          <w:rFonts w:ascii="Times New Roman" w:eastAsia="Times New Roman" w:hAnsi="Times New Roman" w:cs="Times New Roman"/>
+          <w:sz w:val="24"/>
+          <w:szCs w:val="24"/>
+        </w:rPr>
+      </w:pPr>
+      <w:r>
+        <w:rPr>
+          <w:rFonts w:ascii="Times New Roman" w:eastAsia="Times New Roman" w:hAnsi="Times New Roman" w:cs="Times New Roman"/>
+          <w:i/>
+          <w:iCs/>
+          <w:sz w:val="24"/>
+          <w:szCs w:val="24"/>
+        </w:rPr>
+        <w:t>Action:</w:t>
+      </w:r>
+      <w:r>
+        <w:rPr>
+          <w:rFonts w:ascii="Times New Roman" w:eastAsia="Times New Roman" w:hAnsi="Times New Roman" w:cs="Times New Roman"/>
+          <w:sz w:val="24"/>
+          <w:szCs w:val="24"/>
+        </w:rPr>
+        <w:t xml:space="preserve"> Assign J3 to </w:t>
+      </w:r>
+      <w:r>
+        <w:rPr>
+          <w:rFonts w:ascii="Times New Roman" w:eastAsia="Times New Roman" w:hAnsi="Times New Roman" w:cs="Times New Roman"/>
+          <w:b/>
+          <w:bCs/>
+          <w:sz w:val="24"/>
+          <w:szCs w:val="24"/>
+        </w:rPr>
+        <w:t>Slot 1</w:t>
+      </w:r>
+      <w:r>
+        <w:rPr>
+          <w:rFonts w:ascii="Times New Roman" w:eastAsia="Times New Roman" w:hAnsi="Times New Roman" w:cs="Times New Roman"/>
+          <w:sz w:val="24"/>
+          <w:szCs w:val="24"/>
+        </w:rPr>
+        <w:t>.</w:t>
+      </w:r>
+    </w:p>
+    <w:p>
+      <w:pPr>
+        <w:numPr>
+          <w:ilvl w:val="0"/>
+          <w:numId w:val="25"/>
+        </w:numPr>
+        <w:spacing w:before="100" w:beforeAutospacing="1" w:after="100" w:afterAutospacing="1" w:line="240" w:lineRule="auto"/>
+        <w:rPr>
+          <w:rFonts w:ascii="Times New Roman" w:eastAsia="Times New Roman" w:hAnsi="Times New Roman" w:cs="Times New Roman"/>
+          <w:sz w:val="24"/>
+          <w:szCs w:val="24"/>
+        </w:rPr>
+      </w:pPr>
+      <w:r>
+        <w:rPr>
+          <w:rFonts w:ascii="Times New Roman" w:eastAsia="Times New Roman" w:hAnsi="Times New Roman" w:cs="Times New Roman"/>
+          <w:i/>
+          <w:iCs/>
+          <w:sz w:val="24"/>
+          <w:szCs w:val="24"/>
+        </w:rPr>
+        <w:t>Current Timeline:</w:t>
+      </w:r>
+      <w:r>
+        <w:rPr>
+          <w:rFonts w:ascii="Times New Roman" w:eastAsia="Times New Roman" w:hAnsi="Times New Roman" w:cs="Times New Roman"/>
+          <w:sz w:val="24"/>
+          <w:szCs w:val="24"/>
+        </w:rPr>
+        <w:t xml:space="preserve"> </w:t>
+      </w:r>
+      <w:r>
+        <w:rPr>
+          <w:rFonts w:ascii="Courier New" w:eastAsia="Times New Roman" w:hAnsi="Courier New" w:cs="Courier New"/>
+          <w:sz w:val="20"/>
+        </w:rPr>
+        <w:t>[J3, J1, Empty]</w:t>
+      </w:r>
+    </w:p>
+    <w:p>
+      <w:pPr>
+        <w:spacing w:after="0" w:line="240" w:lineRule="auto"/>
+        <w:rPr>
+          <w:rFonts w:ascii="Times New Roman" w:eastAsia="Times New Roman" w:hAnsi="Times New Roman" w:cs="Times New Roman"/>
+          <w:sz w:val="24"/>
+          <w:szCs w:val="24"/>
+        </w:rPr>
+      </w:pPr>
+      <w:r>
+        <w:rPr>
+          <w:rFonts w:ascii="Times New Roman" w:eastAsia="Times New Roman" w:hAnsi="Times New Roman" w:cs="Times New Roman"/>
+          <w:b/>
+          <w:bCs/>
+          <w:sz w:val="24"/>
+          <w:szCs w:val="24"/>
+        </w:rPr>
+        <w:t>3.Evaluate J4 &amp; J2:</w:t>
+      </w:r>
+      <w:r>
+        <w:rPr>
+          <w:rFonts w:ascii="Times New Roman" w:eastAsia="Times New Roman" w:hAnsi="Times New Roman" w:cs="Times New Roman"/>
+          <w:sz w:val="24"/>
+          <w:szCs w:val="24"/>
+        </w:rPr>
+        <w:t>Available slots: [3].</w:t>
+      </w:r>
+    </w:p>
+    <w:p>
+      <w:pPr>
+        <w:numPr>
+          <w:ilvl w:val="0"/>
+          <w:numId w:val="26"/>
+        </w:numPr>
+        <w:spacing w:before="100" w:beforeAutospacing="1" w:after="100" w:afterAutospacing="1" w:line="240" w:lineRule="auto"/>
+        <w:rPr>
+          <w:rFonts w:ascii="Times New Roman" w:eastAsia="Times New Roman" w:hAnsi="Times New Roman" w:cs="Times New Roman"/>
+          <w:sz w:val="24"/>
+          <w:szCs w:val="24"/>
+        </w:rPr>
+      </w:pPr>
+      <w:r>
+        <w:rPr>
+          <w:rFonts w:ascii="Times New Roman" w:eastAsia="Times New Roman" w:hAnsi="Times New Roman" w:cs="Times New Roman"/>
+          <w:b/>
+          <w:bCs/>
+          <w:sz w:val="24"/>
+          <w:szCs w:val="24"/>
+        </w:rPr>
+        <w:t>J4</w:t>
+      </w:r>
+      <w:r>
+        <w:rPr>
+          <w:rFonts w:ascii="Times New Roman" w:eastAsia="Times New Roman" w:hAnsi="Times New Roman" w:cs="Times New Roman"/>
+          <w:sz w:val="24"/>
+          <w:szCs w:val="24"/>
+        </w:rPr>
+        <w:t xml:space="preserve"> (Deadline: 1): Needs Slot 1, but Slot 1 is taken by J3. </w:t>
+      </w:r>
+      <w:r>
+        <w:rPr>
+          <w:rFonts w:ascii="Times New Roman" w:eastAsia="Times New Roman" w:hAnsi="Times New Roman" w:cs="Times New Roman"/>
+          <w:b/>
+          <w:bCs/>
+          <w:sz w:val="24"/>
+          <w:szCs w:val="24"/>
+        </w:rPr>
+        <w:t>Skip it.</w:t>
+      </w:r>
+    </w:p>
+    <w:p>
+      <w:pPr>
+        <w:numPr>
+          <w:ilvl w:val="0"/>
+          <w:numId w:val="26"/>
+        </w:numPr>
+        <w:spacing w:before="100" w:beforeAutospacing="1" w:after="100" w:afterAutospacing="1" w:line="240" w:lineRule="auto"/>
+        <w:rPr>
+          <w:rFonts w:ascii="Times New Roman" w:eastAsia="Times New Roman" w:hAnsi="Times New Roman" w:cs="Times New Roman"/>
+          <w:sz w:val="24"/>
+          <w:szCs w:val="24"/>
+        </w:rPr>
+      </w:pPr>
+      <w:r>
+        <w:rPr>
+          <w:rFonts w:ascii="Times New Roman" w:eastAsia="Times New Roman" w:hAnsi="Times New Roman" w:cs="Times New Roman"/>
+          <w:b/>
+          <w:bCs/>
+          <w:sz w:val="24"/>
+          <w:szCs w:val="24"/>
+        </w:rPr>
+        <w:t>J2</w:t>
+      </w:r>
+      <w:r>
+        <w:rPr>
+          <w:rFonts w:ascii="Times New Roman" w:eastAsia="Times New Roman" w:hAnsi="Times New Roman" w:cs="Times New Roman"/>
+          <w:sz w:val="24"/>
+          <w:szCs w:val="24"/>
+        </w:rPr>
+        <w:t xml:space="preserve"> (Deadline: 1): Needs Slot 1, which is taken. </w:t>
+      </w:r>
+      <w:r>
+        <w:rPr>
+          <w:rFonts w:ascii="Times New Roman" w:eastAsia="Times New Roman" w:hAnsi="Times New Roman" w:cs="Times New Roman"/>
+          <w:b/>
+          <w:bCs/>
+          <w:sz w:val="24"/>
+          <w:szCs w:val="24"/>
+        </w:rPr>
+        <w:t>Skip it.</w:t>
+      </w:r>
+    </w:p>
+    <w:p>
+      <w:pPr>
+        <w:spacing w:after="0" w:line="240" w:lineRule="auto"/>
+        <w:rPr>
+          <w:rFonts w:ascii="Times New Roman" w:eastAsia="Times New Roman" w:hAnsi="Times New Roman" w:cs="Times New Roman"/>
+          <w:sz w:val="24"/>
+          <w:szCs w:val="24"/>
+        </w:rPr>
+      </w:pPr>
+      <w:r>
+        <w:rPr>
+          <w:rFonts w:ascii="Times New Roman" w:eastAsia="Times New Roman" w:hAnsi="Times New Roman" w:cs="Times New Roman"/>
+          <w:b/>
+          <w:bCs/>
+          <w:sz w:val="24"/>
+          <w:szCs w:val="24"/>
+        </w:rPr>
+        <w:t>4.Evaluate J5 (Profit: $15, Deadline: 3):</w:t>
+      </w:r>
+      <w:r>
+        <w:rPr>
+          <w:rFonts w:ascii="Times New Roman" w:eastAsia="Times New Roman" w:hAnsi="Times New Roman" w:cs="Times New Roman"/>
+          <w:sz w:val="24"/>
+          <w:szCs w:val="24"/>
+        </w:rPr>
+        <w:t>Available slots: [3].</w:t>
+      </w:r>
+    </w:p>
+    <w:p>
+      <w:pPr>
+        <w:spacing w:before="100" w:beforeAutospacing="1" w:after="100" w:afterAutospacing="1" w:line="240" w:lineRule="auto"/>
+        <w:rPr>
+          <w:rFonts w:ascii="Times New Roman" w:eastAsia="Times New Roman" w:hAnsi="Times New Roman" w:cs="Times New Roman"/>
+          <w:sz w:val="24"/>
+          <w:szCs w:val="24"/>
+        </w:rPr>
+      </w:pPr>
+      <w:r>
+        <w:rPr>
+          <w:rFonts w:ascii="Times New Roman" w:eastAsia="Times New Roman" w:hAnsi="Times New Roman" w:cs="Times New Roman"/>
+          <w:sz w:val="24"/>
+          <w:szCs w:val="24"/>
+        </w:rPr>
+        <w:t xml:space="preserve">J5 needs to be done by hour 3. The latest available slot before or at hour 3 is </w:t>
+      </w:r>
+      <w:r>
+        <w:rPr>
+          <w:rFonts w:ascii="Times New Roman" w:eastAsia="Times New Roman" w:hAnsi="Times New Roman" w:cs="Times New Roman"/>
+          <w:b/>
+          <w:bCs/>
+          <w:sz w:val="24"/>
+          <w:szCs w:val="24"/>
+        </w:rPr>
+        <w:t>Slot 3</w:t>
+      </w:r>
+      <w:r>
+        <w:rPr>
+          <w:rFonts w:ascii="Times New Roman" w:eastAsia="Times New Roman" w:hAnsi="Times New Roman" w:cs="Times New Roman"/>
+          <w:sz w:val="24"/>
+          <w:szCs w:val="24"/>
+        </w:rPr>
+        <w:t>, which is wide open.</w:t>
+      </w:r>
+    </w:p>
+    <w:p>
+      <w:pPr>
+        <w:numPr>
+          <w:ilvl w:val="0"/>
+          <w:numId w:val="27"/>
+        </w:numPr>
+        <w:spacing w:before="100" w:beforeAutospacing="1" w:after="100" w:afterAutospacing="1" w:line="240" w:lineRule="auto"/>
+        <w:rPr>
+          <w:rFonts w:ascii="Times New Roman" w:eastAsia="Times New Roman" w:hAnsi="Times New Roman" w:cs="Times New Roman"/>
+          <w:sz w:val="24"/>
+          <w:szCs w:val="24"/>
+        </w:rPr>
+      </w:pPr>
+      <w:r>
+        <w:rPr>
+          <w:rFonts w:ascii="Times New Roman" w:eastAsia="Times New Roman" w:hAnsi="Times New Roman" w:cs="Times New Roman"/>
+          <w:i/>
+          <w:iCs/>
+          <w:sz w:val="24"/>
+          <w:szCs w:val="24"/>
+        </w:rPr>
+        <w:t>Action:</w:t>
+      </w:r>
+      <w:r>
+        <w:rPr>
+          <w:rFonts w:ascii="Times New Roman" w:eastAsia="Times New Roman" w:hAnsi="Times New Roman" w:cs="Times New Roman"/>
+          <w:sz w:val="24"/>
+          <w:szCs w:val="24"/>
+        </w:rPr>
+        <w:t xml:space="preserve"> Assign J5 to </w:t>
+      </w:r>
+      <w:r>
+        <w:rPr>
+          <w:rFonts w:ascii="Times New Roman" w:eastAsia="Times New Roman" w:hAnsi="Times New Roman" w:cs="Times New Roman"/>
+          <w:b/>
+          <w:bCs/>
+          <w:sz w:val="24"/>
+          <w:szCs w:val="24"/>
+        </w:rPr>
+        <w:t>Slot 3</w:t>
+      </w:r>
+      <w:r>
+        <w:rPr>
+          <w:rFonts w:ascii="Times New Roman" w:eastAsia="Times New Roman" w:hAnsi="Times New Roman" w:cs="Times New Roman"/>
+          <w:sz w:val="24"/>
+          <w:szCs w:val="24"/>
+        </w:rPr>
+        <w:t>.</w:t>
+      </w:r>
+    </w:p>
+    <w:p>
+      <w:pPr>
+        <w:numPr>
+          <w:ilvl w:val="0"/>
+          <w:numId w:val="27"/>
+        </w:numPr>
+        <w:spacing w:before="100" w:beforeAutospacing="1" w:after="100" w:afterAutospacing="1" w:line="240" w:lineRule="auto"/>
+        <w:rPr>
+          <w:rFonts w:ascii="Times New Roman" w:eastAsia="Times New Roman" w:hAnsi="Times New Roman" w:cs="Times New Roman"/>
+          <w:sz w:val="24"/>
+          <w:szCs w:val="24"/>
+        </w:rPr>
+      </w:pPr>
+      <w:r>
+        <w:rPr>
+          <w:rFonts w:ascii="Times New Roman" w:eastAsia="Times New Roman" w:hAnsi="Times New Roman" w:cs="Times New Roman"/>
+          <w:i/>
+          <w:iCs/>
+          <w:sz w:val="24"/>
+          <w:szCs w:val="24"/>
+        </w:rPr>
+        <w:t>Final Timeline:</w:t>
+      </w:r>
+      <w:r>
+        <w:rPr>
+          <w:rFonts w:ascii="Times New Roman" w:eastAsia="Times New Roman" w:hAnsi="Times New Roman" w:cs="Times New Roman"/>
+          <w:sz w:val="24"/>
+          <w:szCs w:val="24"/>
+        </w:rPr>
+        <w:t xml:space="preserve"> </w:t>
+      </w:r>
+      <w:r>
+        <w:rPr>
+          <w:rFonts w:ascii="Courier New" w:eastAsia="Times New Roman" w:hAnsi="Courier New" w:cs="Courier New"/>
+          <w:sz w:val="20"/>
+        </w:rPr>
+        <w:t>[J3, J1, J5]</w:t>
+      </w:r>
+    </w:p>
+    <w:p>
+      <w:pPr>
+        <w:spacing w:before="100" w:beforeAutospacing="1" w:after="100" w:afterAutospacing="1" w:line="240" w:lineRule="auto"/>
+        <w:rPr>
+          <w:rFonts w:ascii="Times New Roman" w:eastAsia="Times New Roman" w:hAnsi="Times New Roman" w:cs="Times New Roman"/>
+          <w:sz w:val="24"/>
+          <w:szCs w:val="24"/>
+        </w:rPr>
+      </w:pPr>
+      <w:r>
+        <w:rPr>
+          <w:rFonts w:ascii="Times New Roman" w:eastAsia="Times New Roman" w:hAnsi="Times New Roman" w:cs="Times New Roman"/>
+          <w:b/>
+          <w:bCs/>
+          <w:sz w:val="24"/>
+          <w:szCs w:val="24"/>
+        </w:rPr>
+        <w:t>Optimal Job Sequence:</w:t>
+      </w:r>
+      <w:r>
+        <w:rPr>
+          <w:rFonts w:ascii="Times New Roman" w:eastAsia="Times New Roman" w:hAnsi="Times New Roman" w:cs="Times New Roman"/>
+          <w:sz w:val="24"/>
+          <w:szCs w:val="24"/>
+        </w:rPr>
+        <w:t xml:space="preserve"> </w:t>
+      </w:r>
+      <w:r>
+        <w:rPr>
+          <w:rFonts w:ascii="Courier New" w:eastAsia="Times New Roman" w:hAnsi="Courier New" w:cs="Courier New"/>
+          <w:sz w:val="20"/>
+        </w:rPr>
+        <w:t>[J3, J1, J5]</w:t>
+      </w:r>
+    </w:p>
+    <w:p>
+      <w:pPr>
+        <w:spacing w:before="100" w:beforeAutospacing="1" w:after="100" w:afterAutospacing="1" w:line="240" w:lineRule="auto"/>
+        <w:rPr>
+          <w:rFonts w:ascii="Times New Roman" w:eastAsia="Times New Roman" w:hAnsi="Times New Roman" w:cs="Times New Roman"/>
+          <w:sz w:val="24"/>
+          <w:szCs w:val="24"/>
+        </w:rPr>
+      </w:pPr>
+      <w:r>
+        <w:rPr>
+          <w:rFonts w:ascii="Times New Roman" w:eastAsia="Times New Roman" w:hAnsi="Times New Roman" w:cs="Times New Roman"/>
+          <w:b/>
+          <w:bCs/>
+          <w:sz w:val="24"/>
+          <w:szCs w:val="24"/>
+        </w:rPr>
+        <w:t>Maximum Profit Earned:</w:t>
+      </w:r>
+      <w:r>
+        <w:rPr>
+          <w:rFonts w:ascii="Times New Roman" w:eastAsia="Times New Roman" w:hAnsi="Times New Roman" w:cs="Times New Roman"/>
+          <w:sz w:val="24"/>
+          <w:szCs w:val="24"/>
+        </w:rPr>
+        <w:t xml:space="preserve"> $\$27 + \$100 + \$15 = \</w:t>
+      </w:r>
+      <w:proofErr w:type="spellStart"/>
+      <w:r>
+        <w:rPr>
+          <w:rFonts w:ascii="Times New Roman" w:eastAsia="Times New Roman" w:hAnsi="Times New Roman" w:cs="Times New Roman"/>
+          <w:sz w:val="24"/>
+          <w:szCs w:val="24"/>
+        </w:rPr>
+        <w:t>mathbf</w:t>
+      </w:r>
+      <w:proofErr w:type="spellEnd"/>
+      <w:r>
+        <w:rPr>
+          <w:rFonts w:ascii="Times New Roman" w:eastAsia="Times New Roman" w:hAnsi="Times New Roman" w:cs="Times New Roman"/>
+          <w:sz w:val="24"/>
+          <w:szCs w:val="24"/>
+        </w:rPr>
+        <w:t>{\$142}$</w:t>
+      </w:r>
+    </w:p>
+    <w:p>
+      <w:pPr>
+        <w:spacing w:before="100" w:beforeAutospacing="1" w:after="100" w:afterAutospacing="1" w:line="240" w:lineRule="auto"/>
+        <w:outlineLvl w:val="1"/>
+        <w:rPr>
+          <w:rFonts w:ascii="Times New Roman" w:eastAsia="Times New Roman" w:hAnsi="Times New Roman" w:cs="Times New Roman"/>
+          <w:b/>
+          <w:bCs/>
+          <w:sz w:val="36"/>
+          <w:szCs w:val="36"/>
+        </w:rPr>
+      </w:pPr>
+      <w:r>
+        <w:rPr>
+          <w:rFonts w:ascii="Times New Roman" w:eastAsia="Times New Roman" w:hAnsi="Times New Roman" w:cs="Times New Roman"/>
+          <w:b/>
+          <w:bCs/>
+          <w:sz w:val="36"/>
+          <w:szCs w:val="36"/>
+        </w:rPr>
+        <w:t>Complexity Analysis</w:t>
+      </w:r>
+    </w:p>
+    <w:p>
+      <w:pPr>
+        <w:numPr>
+          <w:ilvl w:val="0"/>
+          <w:numId w:val="28"/>
+        </w:numPr>
+        <w:spacing w:before="100" w:beforeAutospacing="1" w:after="100" w:afterAutospacing="1" w:line="240" w:lineRule="auto"/>
+        <w:rPr>
+          <w:rFonts w:ascii="Times New Roman" w:eastAsia="Times New Roman" w:hAnsi="Times New Roman" w:cs="Times New Roman"/>
+          <w:sz w:val="24"/>
+          <w:szCs w:val="24"/>
+        </w:rPr>
+      </w:pPr>
+      <w:r>
+        <w:rPr>
+          <w:rFonts w:ascii="Times New Roman" w:eastAsia="Times New Roman" w:hAnsi="Times New Roman" w:cs="Times New Roman"/>
+          <w:b/>
+          <w:bCs/>
+          <w:sz w:val="24"/>
+          <w:szCs w:val="24"/>
+        </w:rPr>
+        <w:t>Time Complexity:</w:t>
+      </w:r>
+      <w:r>
+        <w:rPr>
+          <w:rFonts w:ascii="Times New Roman" w:eastAsia="Times New Roman" w:hAnsi="Times New Roman" w:cs="Times New Roman"/>
+          <w:sz w:val="24"/>
+          <w:szCs w:val="24"/>
+        </w:rPr>
+        <w:t xml:space="preserve"> </w:t>
+      </w:r>
+      <w:r>
+        <w:rPr>
+          <w:rFonts w:ascii="Times New Roman" w:eastAsia="Times New Roman" w:hAnsi="Times New Roman" w:cs="Times New Roman"/>
+          <w:b/>
+          <w:bCs/>
+          <w:sz w:val="24"/>
+          <w:szCs w:val="24"/>
+        </w:rPr>
+        <w:t>$O(n^2)$</w:t>
+      </w:r>
+      <w:r>
+        <w:rPr>
+          <w:rFonts w:ascii="Times New Roman" w:eastAsia="Times New Roman" w:hAnsi="Times New Roman" w:cs="Times New Roman"/>
+          <w:sz w:val="24"/>
+          <w:szCs w:val="24"/>
+        </w:rPr>
+        <w:t xml:space="preserve"> in the worst-case scenario. Sorting takes $O(n \log n)$, but the nested loops (iterating through $n$ jobs and searching backward up to $n$ slots) can take $O(n^2)$ time if deadlines are large. </w:t>
+      </w:r>
+      <w:r>
+        <w:rPr>
+          <w:rFonts w:ascii="Times New Roman" w:eastAsia="Times New Roman" w:hAnsi="Times New Roman" w:cs="Times New Roman"/>
+          <w:i/>
+          <w:iCs/>
+          <w:sz w:val="24"/>
+          <w:szCs w:val="24"/>
+        </w:rPr>
+        <w:t>(Note: This can be optimized to $O(n \log n)$ using a Disjoint Set Data Structure (Union-Find) to find empty slots instantly).</w:t>
+      </w:r>
+    </w:p>
+    <w:p>
+      <w:pPr>
+        <w:numPr>
+          <w:ilvl w:val="0"/>
+          <w:numId w:val="28"/>
+        </w:numPr>
+        <w:spacing w:before="100" w:beforeAutospacing="1" w:after="100" w:afterAutospacing="1" w:line="240" w:lineRule="auto"/>
+        <w:rPr>
+          <w:rFonts w:ascii="Times New Roman" w:eastAsia="Times New Roman" w:hAnsi="Times New Roman" w:cs="Times New Roman"/>
+          <w:sz w:val="24"/>
+          <w:szCs w:val="24"/>
+        </w:rPr>
+      </w:pPr>
+      <w:r>
+        <w:rPr>
+          <w:rFonts w:ascii="Times New Roman" w:eastAsia="Times New Roman" w:hAnsi="Times New Roman" w:cs="Times New Roman"/>
+          <w:b/>
+          <w:bCs/>
+          <w:sz w:val="24"/>
+          <w:szCs w:val="24"/>
+        </w:rPr>
+        <w:t>Space Complexity:</w:t>
+      </w:r>
+      <w:r>
+        <w:rPr>
+          <w:rFonts w:ascii="Times New Roman" w:eastAsia="Times New Roman" w:hAnsi="Times New Roman" w:cs="Times New Roman"/>
+          <w:sz w:val="24"/>
+          <w:szCs w:val="24"/>
+        </w:rPr>
+        <w:t xml:space="preserve"> </w:t>
+      </w:r>
+      <w:r>
+        <w:rPr>
+          <w:rFonts w:ascii="Times New Roman" w:eastAsia="Times New Roman" w:hAnsi="Times New Roman" w:cs="Times New Roman"/>
+          <w:b/>
+          <w:bCs/>
+          <w:sz w:val="24"/>
+          <w:szCs w:val="24"/>
+        </w:rPr>
+        <w:t>$O(m)$</w:t>
+      </w:r>
+      <w:r>
+        <w:rPr>
+          <w:rFonts w:ascii="Times New Roman" w:eastAsia="Times New Roman" w:hAnsi="Times New Roman" w:cs="Times New Roman"/>
+          <w:sz w:val="24"/>
+          <w:szCs w:val="24"/>
+        </w:rPr>
+        <w:t xml:space="preserve"> where $m$ is the maximum deadline, used to store the timeline array.</w:t>
       </w:r>
     </w:p>
     <w:p>
@@ -8174,6 +10287,155 @@
 <file path=word/numbering.xml><?xml version="1.0" encoding="utf-8"?>
 <w:numbering xmlns:ve="http://schemas.openxmlformats.org/markup-compatibility/2006" xmlns:o="urn:schemas-microsoft-com:office:office" xmlns:r="http://schemas.openxmlformats.org/officeDocument/2006/relationships" xmlns:m="http://schemas.openxmlformats.org/officeDocument/2006/math" xmlns:v="urn:schemas-microsoft-com:vml" xmlns:wp="http://schemas.openxmlformats.org/drawingml/2006/wordprocessingDrawing" xmlns:w10="urn:schemas-microsoft-com:office:word" xmlns:w="http://schemas.openxmlformats.org/wordprocessingml/2006/main" xmlns:wne="http://schemas.microsoft.com/office/word/2006/wordml">
   <w:abstractNum w:abstractNumId="0">
+    <w:nsid w:val="050A781E"/>
+    <w:multiLevelType w:val="multilevel"/>
+    <w:tmpl w:val="C5141980"/>
+    <w:lvl w:ilvl="0">
+      <w:start w:val="1"/>
+      <w:numFmt w:val="bullet"/>
+      <w:lvlText w:val=""/>
+      <w:lvlJc w:val="left"/>
+      <w:pPr>
+        <w:tabs>
+          <w:tab w:val="num" w:pos="720"/>
+        </w:tabs>
+        <w:ind w:left="720" w:hanging="360"/>
+      </w:pPr>
+      <w:rPr>
+        <w:rFonts w:ascii="Symbol" w:hAnsi="Symbol" w:hint="default"/>
+        <w:sz w:val="20"/>
+      </w:rPr>
+    </w:lvl>
+    <w:lvl w:ilvl="1" w:tentative="1">
+      <w:start w:val="1"/>
+      <w:numFmt w:val="bullet"/>
+      <w:lvlText w:val="o"/>
+      <w:lvlJc w:val="left"/>
+      <w:pPr>
+        <w:tabs>
+          <w:tab w:val="num" w:pos="1440"/>
+        </w:tabs>
+        <w:ind w:left="1440" w:hanging="360"/>
+      </w:pPr>
+      <w:rPr>
+        <w:rFonts w:ascii="Courier New" w:hAnsi="Courier New" w:hint="default"/>
+        <w:sz w:val="20"/>
+      </w:rPr>
+    </w:lvl>
+    <w:lvl w:ilvl="2" w:tentative="1">
+      <w:start w:val="1"/>
+      <w:numFmt w:val="bullet"/>
+      <w:lvlText w:val=""/>
+      <w:lvlJc w:val="left"/>
+      <w:pPr>
+        <w:tabs>
+          <w:tab w:val="num" w:pos="2160"/>
+        </w:tabs>
+        <w:ind w:left="2160" w:hanging="360"/>
+      </w:pPr>
+      <w:rPr>
+        <w:rFonts w:ascii="Wingdings" w:hAnsi="Wingdings" w:hint="default"/>
+        <w:sz w:val="20"/>
+      </w:rPr>
+    </w:lvl>
+    <w:lvl w:ilvl="3" w:tentative="1">
+      <w:start w:val="1"/>
+      <w:numFmt w:val="bullet"/>
+      <w:lvlText w:val=""/>
+      <w:lvlJc w:val="left"/>
+      <w:pPr>
+        <w:tabs>
+          <w:tab w:val="num" w:pos="2880"/>
+        </w:tabs>
+        <w:ind w:left="2880" w:hanging="360"/>
+      </w:pPr>
+      <w:rPr>
+        <w:rFonts w:ascii="Wingdings" w:hAnsi="Wingdings" w:hint="default"/>
+        <w:sz w:val="20"/>
+      </w:rPr>
+    </w:lvl>
+    <w:lvl w:ilvl="4" w:tentative="1">
+      <w:start w:val="1"/>
+      <w:numFmt w:val="bullet"/>
+      <w:lvlText w:val=""/>
+      <w:lvlJc w:val="left"/>
+      <w:pPr>
+        <w:tabs>
+          <w:tab w:val="num" w:pos="3600"/>
+        </w:tabs>
+        <w:ind w:left="3600" w:hanging="360"/>
+      </w:pPr>
+      <w:rPr>
+        <w:rFonts w:ascii="Wingdings" w:hAnsi="Wingdings" w:hint="default"/>
+        <w:sz w:val="20"/>
+      </w:rPr>
+    </w:lvl>
+    <w:lvl w:ilvl="5" w:tentative="1">
+      <w:start w:val="1"/>
+      <w:numFmt w:val="bullet"/>
+      <w:lvlText w:val=""/>
+      <w:lvlJc w:val="left"/>
+      <w:pPr>
+        <w:tabs>
+          <w:tab w:val="num" w:pos="4320"/>
+        </w:tabs>
+        <w:ind w:left="4320" w:hanging="360"/>
+      </w:pPr>
+      <w:rPr>
+        <w:rFonts w:ascii="Wingdings" w:hAnsi="Wingdings" w:hint="default"/>
+        <w:sz w:val="20"/>
+      </w:rPr>
+    </w:lvl>
+    <w:lvl w:ilvl="6" w:tentative="1">
+      <w:start w:val="1"/>
+      <w:numFmt w:val="bullet"/>
+      <w:lvlText w:val=""/>
+      <w:lvlJc w:val="left"/>
+      <w:pPr>
+        <w:tabs>
+          <w:tab w:val="num" w:pos="5040"/>
+        </w:tabs>
+        <w:ind w:left="5040" w:hanging="360"/>
+      </w:pPr>
+      <w:rPr>
+        <w:rFonts w:ascii="Wingdings" w:hAnsi="Wingdings" w:hint="default"/>
+        <w:sz w:val="20"/>
+      </w:rPr>
+    </w:lvl>
+    <w:lvl w:ilvl="7" w:tentative="1">
+      <w:start w:val="1"/>
+      <w:numFmt w:val="bullet"/>
+      <w:lvlText w:val=""/>
+      <w:lvlJc w:val="left"/>
+      <w:pPr>
+        <w:tabs>
+          <w:tab w:val="num" w:pos="5760"/>
+        </w:tabs>
+        <w:ind w:left="5760" w:hanging="360"/>
+      </w:pPr>
+      <w:rPr>
+        <w:rFonts w:ascii="Wingdings" w:hAnsi="Wingdings" w:hint="default"/>
+        <w:sz w:val="20"/>
+      </w:rPr>
+    </w:lvl>
+    <w:lvl w:ilvl="8" w:tentative="1">
+      <w:start w:val="1"/>
+      <w:numFmt w:val="bullet"/>
+      <w:lvlText w:val=""/>
+      <w:lvlJc w:val="left"/>
+      <w:pPr>
+        <w:tabs>
+          <w:tab w:val="num" w:pos="6480"/>
+        </w:tabs>
+        <w:ind w:left="6480" w:hanging="360"/>
+      </w:pPr>
+      <w:rPr>
+        <w:rFonts w:ascii="Wingdings" w:hAnsi="Wingdings" w:hint="default"/>
+        <w:sz w:val="20"/>
+      </w:rPr>
+    </w:lvl>
+  </w:abstractNum>
+  <w:abstractNum w:abstractNumId="1">
     <w:nsid w:val="086E058D"/>
     <w:multiLevelType w:val="multilevel"/>
     <w:tmpl w:val="616E2E84"/>
@@ -8322,7 +10584,7 @@
       </w:rPr>
     </w:lvl>
   </w:abstractNum>
-  <w:abstractNum w:abstractNumId="1">
+  <w:abstractNum w:abstractNumId="2">
     <w:nsid w:val="0EA51486"/>
     <w:multiLevelType w:val="multilevel"/>
     <w:tmpl w:val="9BFE0522"/>
@@ -8471,7 +10733,418 @@
       </w:rPr>
     </w:lvl>
   </w:abstractNum>
-  <w:abstractNum w:abstractNumId="2">
+  <w:abstractNum w:abstractNumId="3">
+    <w:nsid w:val="114D66F0"/>
+    <w:multiLevelType w:val="multilevel"/>
+    <w:tmpl w:val="844CE2BA"/>
+    <w:lvl w:ilvl="0">
+      <w:start w:val="1"/>
+      <w:numFmt w:val="bullet"/>
+      <w:lvlText w:val=""/>
+      <w:lvlJc w:val="left"/>
+      <w:pPr>
+        <w:tabs>
+          <w:tab w:val="num" w:pos="720"/>
+        </w:tabs>
+        <w:ind w:left="720" w:hanging="360"/>
+      </w:pPr>
+      <w:rPr>
+        <w:rFonts w:ascii="Symbol" w:hAnsi="Symbol" w:hint="default"/>
+        <w:sz w:val="20"/>
+      </w:rPr>
+    </w:lvl>
+    <w:lvl w:ilvl="1" w:tentative="1">
+      <w:start w:val="1"/>
+      <w:numFmt w:val="bullet"/>
+      <w:lvlText w:val="o"/>
+      <w:lvlJc w:val="left"/>
+      <w:pPr>
+        <w:tabs>
+          <w:tab w:val="num" w:pos="1440"/>
+        </w:tabs>
+        <w:ind w:left="1440" w:hanging="360"/>
+      </w:pPr>
+      <w:rPr>
+        <w:rFonts w:ascii="Courier New" w:hAnsi="Courier New" w:hint="default"/>
+        <w:sz w:val="20"/>
+      </w:rPr>
+    </w:lvl>
+    <w:lvl w:ilvl="2" w:tentative="1">
+      <w:start w:val="1"/>
+      <w:numFmt w:val="bullet"/>
+      <w:lvlText w:val=""/>
+      <w:lvlJc w:val="left"/>
+      <w:pPr>
+        <w:tabs>
+          <w:tab w:val="num" w:pos="2160"/>
+        </w:tabs>
+        <w:ind w:left="2160" w:hanging="360"/>
+      </w:pPr>
+      <w:rPr>
+        <w:rFonts w:ascii="Wingdings" w:hAnsi="Wingdings" w:hint="default"/>
+        <w:sz w:val="20"/>
+      </w:rPr>
+    </w:lvl>
+    <w:lvl w:ilvl="3" w:tentative="1">
+      <w:start w:val="1"/>
+      <w:numFmt w:val="bullet"/>
+      <w:lvlText w:val=""/>
+      <w:lvlJc w:val="left"/>
+      <w:pPr>
+        <w:tabs>
+          <w:tab w:val="num" w:pos="2880"/>
+        </w:tabs>
+        <w:ind w:left="2880" w:hanging="360"/>
+      </w:pPr>
+      <w:rPr>
+        <w:rFonts w:ascii="Wingdings" w:hAnsi="Wingdings" w:hint="default"/>
+        <w:sz w:val="20"/>
+      </w:rPr>
+    </w:lvl>
+    <w:lvl w:ilvl="4" w:tentative="1">
+      <w:start w:val="1"/>
+      <w:numFmt w:val="bullet"/>
+      <w:lvlText w:val=""/>
+      <w:lvlJc w:val="left"/>
+      <w:pPr>
+        <w:tabs>
+          <w:tab w:val="num" w:pos="3600"/>
+        </w:tabs>
+        <w:ind w:left="3600" w:hanging="360"/>
+      </w:pPr>
+      <w:rPr>
+        <w:rFonts w:ascii="Wingdings" w:hAnsi="Wingdings" w:hint="default"/>
+        <w:sz w:val="20"/>
+      </w:rPr>
+    </w:lvl>
+    <w:lvl w:ilvl="5" w:tentative="1">
+      <w:start w:val="1"/>
+      <w:numFmt w:val="bullet"/>
+      <w:lvlText w:val=""/>
+      <w:lvlJc w:val="left"/>
+      <w:pPr>
+        <w:tabs>
+          <w:tab w:val="num" w:pos="4320"/>
+        </w:tabs>
+        <w:ind w:left="4320" w:hanging="360"/>
+      </w:pPr>
+      <w:rPr>
+        <w:rFonts w:ascii="Wingdings" w:hAnsi="Wingdings" w:hint="default"/>
+        <w:sz w:val="20"/>
+      </w:rPr>
+    </w:lvl>
+    <w:lvl w:ilvl="6" w:tentative="1">
+      <w:start w:val="1"/>
+      <w:numFmt w:val="bullet"/>
+      <w:lvlText w:val=""/>
+      <w:lvlJc w:val="left"/>
+      <w:pPr>
+        <w:tabs>
+          <w:tab w:val="num" w:pos="5040"/>
+        </w:tabs>
+        <w:ind w:left="5040" w:hanging="360"/>
+      </w:pPr>
+      <w:rPr>
+        <w:rFonts w:ascii="Wingdings" w:hAnsi="Wingdings" w:hint="default"/>
+        <w:sz w:val="20"/>
+      </w:rPr>
+    </w:lvl>
+    <w:lvl w:ilvl="7" w:tentative="1">
+      <w:start w:val="1"/>
+      <w:numFmt w:val="bullet"/>
+      <w:lvlText w:val=""/>
+      <w:lvlJc w:val="left"/>
+      <w:pPr>
+        <w:tabs>
+          <w:tab w:val="num" w:pos="5760"/>
+        </w:tabs>
+        <w:ind w:left="5760" w:hanging="360"/>
+      </w:pPr>
+      <w:rPr>
+        <w:rFonts w:ascii="Wingdings" w:hAnsi="Wingdings" w:hint="default"/>
+        <w:sz w:val="20"/>
+      </w:rPr>
+    </w:lvl>
+    <w:lvl w:ilvl="8" w:tentative="1">
+      <w:start w:val="1"/>
+      <w:numFmt w:val="bullet"/>
+      <w:lvlText w:val=""/>
+      <w:lvlJc w:val="left"/>
+      <w:pPr>
+        <w:tabs>
+          <w:tab w:val="num" w:pos="6480"/>
+        </w:tabs>
+        <w:ind w:left="6480" w:hanging="360"/>
+      </w:pPr>
+      <w:rPr>
+        <w:rFonts w:ascii="Wingdings" w:hAnsi="Wingdings" w:hint="default"/>
+        <w:sz w:val="20"/>
+      </w:rPr>
+    </w:lvl>
+  </w:abstractNum>
+  <w:abstractNum w:abstractNumId="4">
+    <w:nsid w:val="142512BF"/>
+    <w:multiLevelType w:val="multilevel"/>
+    <w:tmpl w:val="DC2E8218"/>
+    <w:lvl w:ilvl="0">
+      <w:start w:val="1"/>
+      <w:numFmt w:val="decimal"/>
+      <w:lvlText w:val="%1."/>
+      <w:lvlJc w:val="left"/>
+      <w:pPr>
+        <w:tabs>
+          <w:tab w:val="num" w:pos="720"/>
+        </w:tabs>
+        <w:ind w:left="720" w:hanging="360"/>
+      </w:pPr>
+    </w:lvl>
+    <w:lvl w:ilvl="1" w:tentative="1">
+      <w:start w:val="1"/>
+      <w:numFmt w:val="decimal"/>
+      <w:lvlText w:val="%2."/>
+      <w:lvlJc w:val="left"/>
+      <w:pPr>
+        <w:tabs>
+          <w:tab w:val="num" w:pos="1440"/>
+        </w:tabs>
+        <w:ind w:left="1440" w:hanging="360"/>
+      </w:pPr>
+    </w:lvl>
+    <w:lvl w:ilvl="2" w:tentative="1">
+      <w:start w:val="1"/>
+      <w:numFmt w:val="decimal"/>
+      <w:lvlText w:val="%3."/>
+      <w:lvlJc w:val="left"/>
+      <w:pPr>
+        <w:tabs>
+          <w:tab w:val="num" w:pos="2160"/>
+        </w:tabs>
+        <w:ind w:left="2160" w:hanging="360"/>
+      </w:pPr>
+    </w:lvl>
+    <w:lvl w:ilvl="3" w:tentative="1">
+      <w:start w:val="1"/>
+      <w:numFmt w:val="decimal"/>
+      <w:lvlText w:val="%4."/>
+      <w:lvlJc w:val="left"/>
+      <w:pPr>
+        <w:tabs>
+          <w:tab w:val="num" w:pos="2880"/>
+        </w:tabs>
+        <w:ind w:left="2880" w:hanging="360"/>
+      </w:pPr>
+    </w:lvl>
+    <w:lvl w:ilvl="4" w:tentative="1">
+      <w:start w:val="1"/>
+      <w:numFmt w:val="decimal"/>
+      <w:lvlText w:val="%5."/>
+      <w:lvlJc w:val="left"/>
+      <w:pPr>
+        <w:tabs>
+          <w:tab w:val="num" w:pos="3600"/>
+        </w:tabs>
+        <w:ind w:left="3600" w:hanging="360"/>
+      </w:pPr>
+    </w:lvl>
+    <w:lvl w:ilvl="5" w:tentative="1">
+      <w:start w:val="1"/>
+      <w:numFmt w:val="decimal"/>
+      <w:lvlText w:val="%6."/>
+      <w:lvlJc w:val="left"/>
+      <w:pPr>
+        <w:tabs>
+          <w:tab w:val="num" w:pos="4320"/>
+        </w:tabs>
+        <w:ind w:left="4320" w:hanging="360"/>
+      </w:pPr>
+    </w:lvl>
+    <w:lvl w:ilvl="6" w:tentative="1">
+      <w:start w:val="1"/>
+      <w:numFmt w:val="decimal"/>
+      <w:lvlText w:val="%7."/>
+      <w:lvlJc w:val="left"/>
+      <w:pPr>
+        <w:tabs>
+          <w:tab w:val="num" w:pos="5040"/>
+        </w:tabs>
+        <w:ind w:left="5040" w:hanging="360"/>
+      </w:pPr>
+    </w:lvl>
+    <w:lvl w:ilvl="7" w:tentative="1">
+      <w:start w:val="1"/>
+      <w:numFmt w:val="decimal"/>
+      <w:lvlText w:val="%8."/>
+      <w:lvlJc w:val="left"/>
+      <w:pPr>
+        <w:tabs>
+          <w:tab w:val="num" w:pos="5760"/>
+        </w:tabs>
+        <w:ind w:left="5760" w:hanging="360"/>
+      </w:pPr>
+    </w:lvl>
+    <w:lvl w:ilvl="8" w:tentative="1">
+      <w:start w:val="1"/>
+      <w:numFmt w:val="decimal"/>
+      <w:lvlText w:val="%9."/>
+      <w:lvlJc w:val="left"/>
+      <w:pPr>
+        <w:tabs>
+          <w:tab w:val="num" w:pos="6480"/>
+        </w:tabs>
+        <w:ind w:left="6480" w:hanging="360"/>
+      </w:pPr>
+    </w:lvl>
+  </w:abstractNum>
+  <w:abstractNum w:abstractNumId="5">
+    <w:nsid w:val="16127083"/>
+    <w:multiLevelType w:val="multilevel"/>
+    <w:tmpl w:val="5E5C5FF0"/>
+    <w:lvl w:ilvl="0">
+      <w:start w:val="1"/>
+      <w:numFmt w:val="bullet"/>
+      <w:lvlText w:val=""/>
+      <w:lvlJc w:val="left"/>
+      <w:pPr>
+        <w:tabs>
+          <w:tab w:val="num" w:pos="720"/>
+        </w:tabs>
+        <w:ind w:left="720" w:hanging="360"/>
+      </w:pPr>
+      <w:rPr>
+        <w:rFonts w:ascii="Symbol" w:hAnsi="Symbol" w:hint="default"/>
+        <w:sz w:val="20"/>
+      </w:rPr>
+    </w:lvl>
+    <w:lvl w:ilvl="1" w:tentative="1">
+      <w:start w:val="1"/>
+      <w:numFmt w:val="bullet"/>
+      <w:lvlText w:val="o"/>
+      <w:lvlJc w:val="left"/>
+      <w:pPr>
+        <w:tabs>
+          <w:tab w:val="num" w:pos="1440"/>
+        </w:tabs>
+        <w:ind w:left="1440" w:hanging="360"/>
+      </w:pPr>
+      <w:rPr>
+        <w:rFonts w:ascii="Courier New" w:hAnsi="Courier New" w:hint="default"/>
+        <w:sz w:val="20"/>
+      </w:rPr>
+    </w:lvl>
+    <w:lvl w:ilvl="2" w:tentative="1">
+      <w:start w:val="1"/>
+      <w:numFmt w:val="bullet"/>
+      <w:lvlText w:val=""/>
+      <w:lvlJc w:val="left"/>
+      <w:pPr>
+        <w:tabs>
+          <w:tab w:val="num" w:pos="2160"/>
+        </w:tabs>
+        <w:ind w:left="2160" w:hanging="360"/>
+      </w:pPr>
+      <w:rPr>
+        <w:rFonts w:ascii="Wingdings" w:hAnsi="Wingdings" w:hint="default"/>
+        <w:sz w:val="20"/>
+      </w:rPr>
+    </w:lvl>
+    <w:lvl w:ilvl="3" w:tentative="1">
+      <w:start w:val="1"/>
+      <w:numFmt w:val="bullet"/>
+      <w:lvlText w:val=""/>
+      <w:lvlJc w:val="left"/>
+      <w:pPr>
+        <w:tabs>
+          <w:tab w:val="num" w:pos="2880"/>
+        </w:tabs>
+        <w:ind w:left="2880" w:hanging="360"/>
+      </w:pPr>
+      <w:rPr>
+        <w:rFonts w:ascii="Wingdings" w:hAnsi="Wingdings" w:hint="default"/>
+        <w:sz w:val="20"/>
+      </w:rPr>
+    </w:lvl>
+    <w:lvl w:ilvl="4" w:tentative="1">
+      <w:start w:val="1"/>
+      <w:numFmt w:val="bullet"/>
+      <w:lvlText w:val=""/>
+      <w:lvlJc w:val="left"/>
+      <w:pPr>
+        <w:tabs>
+          <w:tab w:val="num" w:pos="3600"/>
+        </w:tabs>
+        <w:ind w:left="3600" w:hanging="360"/>
+      </w:pPr>
+      <w:rPr>
+        <w:rFonts w:ascii="Wingdings" w:hAnsi="Wingdings" w:hint="default"/>
+        <w:sz w:val="20"/>
+      </w:rPr>
+    </w:lvl>
+    <w:lvl w:ilvl="5" w:tentative="1">
+      <w:start w:val="1"/>
+      <w:numFmt w:val="bullet"/>
+      <w:lvlText w:val=""/>
+      <w:lvlJc w:val="left"/>
+      <w:pPr>
+        <w:tabs>
+          <w:tab w:val="num" w:pos="4320"/>
+        </w:tabs>
+        <w:ind w:left="4320" w:hanging="360"/>
+      </w:pPr>
+      <w:rPr>
+        <w:rFonts w:ascii="Wingdings" w:hAnsi="Wingdings" w:hint="default"/>
+        <w:sz w:val="20"/>
+      </w:rPr>
+    </w:lvl>
+    <w:lvl w:ilvl="6" w:tentative="1">
+      <w:start w:val="1"/>
+      <w:numFmt w:val="bullet"/>
+      <w:lvlText w:val=""/>
+      <w:lvlJc w:val="left"/>
+      <w:pPr>
+        <w:tabs>
+          <w:tab w:val="num" w:pos="5040"/>
+        </w:tabs>
+        <w:ind w:left="5040" w:hanging="360"/>
+      </w:pPr>
+      <w:rPr>
+        <w:rFonts w:ascii="Wingdings" w:hAnsi="Wingdings" w:hint="default"/>
+        <w:sz w:val="20"/>
+      </w:rPr>
+    </w:lvl>
+    <w:lvl w:ilvl="7" w:tentative="1">
+      <w:start w:val="1"/>
+      <w:numFmt w:val="bullet"/>
+      <w:lvlText w:val=""/>
+      <w:lvlJc w:val="left"/>
+      <w:pPr>
+        <w:tabs>
+          <w:tab w:val="num" w:pos="5760"/>
+        </w:tabs>
+        <w:ind w:left="5760" w:hanging="360"/>
+      </w:pPr>
+      <w:rPr>
+        <w:rFonts w:ascii="Wingdings" w:hAnsi="Wingdings" w:hint="default"/>
+        <w:sz w:val="20"/>
+      </w:rPr>
+    </w:lvl>
+    <w:lvl w:ilvl="8" w:tentative="1">
+      <w:start w:val="1"/>
+      <w:numFmt w:val="bullet"/>
+      <w:lvlText w:val=""/>
+      <w:lvlJc w:val="left"/>
+      <w:pPr>
+        <w:tabs>
+          <w:tab w:val="num" w:pos="6480"/>
+        </w:tabs>
+        <w:ind w:left="6480" w:hanging="360"/>
+      </w:pPr>
+      <w:rPr>
+        <w:rFonts w:ascii="Wingdings" w:hAnsi="Wingdings" w:hint="default"/>
+        <w:sz w:val="20"/>
+      </w:rPr>
+    </w:lvl>
+  </w:abstractNum>
+  <w:abstractNum w:abstractNumId="6">
     <w:nsid w:val="16CE1B9C"/>
     <w:multiLevelType w:val="multilevel"/>
     <w:tmpl w:val="EBE8BB9E"/>
@@ -8584,7 +11257,7 @@
       </w:pPr>
     </w:lvl>
   </w:abstractNum>
-  <w:abstractNum w:abstractNumId="3">
+  <w:abstractNum w:abstractNumId="7">
     <w:nsid w:val="19EA5019"/>
     <w:multiLevelType w:val="multilevel"/>
     <w:tmpl w:val="4EC44D20"/>
@@ -8733,7 +11406,156 @@
       </w:rPr>
     </w:lvl>
   </w:abstractNum>
-  <w:abstractNum w:abstractNumId="4">
+  <w:abstractNum w:abstractNumId="8">
+    <w:nsid w:val="1BF713D8"/>
+    <w:multiLevelType w:val="multilevel"/>
+    <w:tmpl w:val="D38E78EA"/>
+    <w:lvl w:ilvl="0">
+      <w:start w:val="1"/>
+      <w:numFmt w:val="bullet"/>
+      <w:lvlText w:val=""/>
+      <w:lvlJc w:val="left"/>
+      <w:pPr>
+        <w:tabs>
+          <w:tab w:val="num" w:pos="720"/>
+        </w:tabs>
+        <w:ind w:left="720" w:hanging="360"/>
+      </w:pPr>
+      <w:rPr>
+        <w:rFonts w:ascii="Symbol" w:hAnsi="Symbol" w:hint="default"/>
+        <w:sz w:val="20"/>
+      </w:rPr>
+    </w:lvl>
+    <w:lvl w:ilvl="1" w:tentative="1">
+      <w:start w:val="1"/>
+      <w:numFmt w:val="bullet"/>
+      <w:lvlText w:val="o"/>
+      <w:lvlJc w:val="left"/>
+      <w:pPr>
+        <w:tabs>
+          <w:tab w:val="num" w:pos="1440"/>
+        </w:tabs>
+        <w:ind w:left="1440" w:hanging="360"/>
+      </w:pPr>
+      <w:rPr>
+        <w:rFonts w:ascii="Courier New" w:hAnsi="Courier New" w:hint="default"/>
+        <w:sz w:val="20"/>
+      </w:rPr>
+    </w:lvl>
+    <w:lvl w:ilvl="2" w:tentative="1">
+      <w:start w:val="1"/>
+      <w:numFmt w:val="bullet"/>
+      <w:lvlText w:val=""/>
+      <w:lvlJc w:val="left"/>
+      <w:pPr>
+        <w:tabs>
+          <w:tab w:val="num" w:pos="2160"/>
+        </w:tabs>
+        <w:ind w:left="2160" w:hanging="360"/>
+      </w:pPr>
+      <w:rPr>
+        <w:rFonts w:ascii="Wingdings" w:hAnsi="Wingdings" w:hint="default"/>
+        <w:sz w:val="20"/>
+      </w:rPr>
+    </w:lvl>
+    <w:lvl w:ilvl="3" w:tentative="1">
+      <w:start w:val="1"/>
+      <w:numFmt w:val="bullet"/>
+      <w:lvlText w:val=""/>
+      <w:lvlJc w:val="left"/>
+      <w:pPr>
+        <w:tabs>
+          <w:tab w:val="num" w:pos="2880"/>
+        </w:tabs>
+        <w:ind w:left="2880" w:hanging="360"/>
+      </w:pPr>
+      <w:rPr>
+        <w:rFonts w:ascii="Wingdings" w:hAnsi="Wingdings" w:hint="default"/>
+        <w:sz w:val="20"/>
+      </w:rPr>
+    </w:lvl>
+    <w:lvl w:ilvl="4" w:tentative="1">
+      <w:start w:val="1"/>
+      <w:numFmt w:val="bullet"/>
+      <w:lvlText w:val=""/>
+      <w:lvlJc w:val="left"/>
+      <w:pPr>
+        <w:tabs>
+          <w:tab w:val="num" w:pos="3600"/>
+        </w:tabs>
+        <w:ind w:left="3600" w:hanging="360"/>
+      </w:pPr>
+      <w:rPr>
+        <w:rFonts w:ascii="Wingdings" w:hAnsi="Wingdings" w:hint="default"/>
+        <w:sz w:val="20"/>
+      </w:rPr>
+    </w:lvl>
+    <w:lvl w:ilvl="5" w:tentative="1">
+      <w:start w:val="1"/>
+      <w:numFmt w:val="bullet"/>
+      <w:lvlText w:val=""/>
+      <w:lvlJc w:val="left"/>
+      <w:pPr>
+        <w:tabs>
+          <w:tab w:val="num" w:pos="4320"/>
+        </w:tabs>
+        <w:ind w:left="4320" w:hanging="360"/>
+      </w:pPr>
+      <w:rPr>
+        <w:rFonts w:ascii="Wingdings" w:hAnsi="Wingdings" w:hint="default"/>
+        <w:sz w:val="20"/>
+      </w:rPr>
+    </w:lvl>
+    <w:lvl w:ilvl="6" w:tentative="1">
+      <w:start w:val="1"/>
+      <w:numFmt w:val="bullet"/>
+      <w:lvlText w:val=""/>
+      <w:lvlJc w:val="left"/>
+      <w:pPr>
+        <w:tabs>
+          <w:tab w:val="num" w:pos="5040"/>
+        </w:tabs>
+        <w:ind w:left="5040" w:hanging="360"/>
+      </w:pPr>
+      <w:rPr>
+        <w:rFonts w:ascii="Wingdings" w:hAnsi="Wingdings" w:hint="default"/>
+        <w:sz w:val="20"/>
+      </w:rPr>
+    </w:lvl>
+    <w:lvl w:ilvl="7" w:tentative="1">
+      <w:start w:val="1"/>
+      <w:numFmt w:val="bullet"/>
+      <w:lvlText w:val=""/>
+      <w:lvlJc w:val="left"/>
+      <w:pPr>
+        <w:tabs>
+          <w:tab w:val="num" w:pos="5760"/>
+        </w:tabs>
+        <w:ind w:left="5760" w:hanging="360"/>
+      </w:pPr>
+      <w:rPr>
+        <w:rFonts w:ascii="Wingdings" w:hAnsi="Wingdings" w:hint="default"/>
+        <w:sz w:val="20"/>
+      </w:rPr>
+    </w:lvl>
+    <w:lvl w:ilvl="8" w:tentative="1">
+      <w:start w:val="1"/>
+      <w:numFmt w:val="bullet"/>
+      <w:lvlText w:val=""/>
+      <w:lvlJc w:val="left"/>
+      <w:pPr>
+        <w:tabs>
+          <w:tab w:val="num" w:pos="6480"/>
+        </w:tabs>
+        <w:ind w:left="6480" w:hanging="360"/>
+      </w:pPr>
+      <w:rPr>
+        <w:rFonts w:ascii="Wingdings" w:hAnsi="Wingdings" w:hint="default"/>
+        <w:sz w:val="20"/>
+      </w:rPr>
+    </w:lvl>
+  </w:abstractNum>
+  <w:abstractNum w:abstractNumId="9">
     <w:nsid w:val="211026E1"/>
     <w:multiLevelType w:val="multilevel"/>
     <w:tmpl w:val="7CBE213C"/>
@@ -8882,7 +11704,7 @@
       </w:rPr>
     </w:lvl>
   </w:abstractNum>
-  <w:abstractNum w:abstractNumId="5">
+  <w:abstractNum w:abstractNumId="10">
     <w:nsid w:val="35B81BD5"/>
     <w:multiLevelType w:val="multilevel"/>
     <w:tmpl w:val="F55EB3C8"/>
@@ -9031,7 +11853,7 @@
       </w:rPr>
     </w:lvl>
   </w:abstractNum>
-  <w:abstractNum w:abstractNumId="6">
+  <w:abstractNum w:abstractNumId="11">
     <w:nsid w:val="39496B23"/>
     <w:multiLevelType w:val="multilevel"/>
     <w:tmpl w:val="C262B5DA"/>
@@ -9180,7 +12002,156 @@
       </w:rPr>
     </w:lvl>
   </w:abstractNum>
-  <w:abstractNum w:abstractNumId="7">
+  <w:abstractNum w:abstractNumId="12">
+    <w:nsid w:val="3B2079EF"/>
+    <w:multiLevelType w:val="multilevel"/>
+    <w:tmpl w:val="322639DC"/>
+    <w:lvl w:ilvl="0">
+      <w:start w:val="1"/>
+      <w:numFmt w:val="bullet"/>
+      <w:lvlText w:val=""/>
+      <w:lvlJc w:val="left"/>
+      <w:pPr>
+        <w:tabs>
+          <w:tab w:val="num" w:pos="720"/>
+        </w:tabs>
+        <w:ind w:left="720" w:hanging="360"/>
+      </w:pPr>
+      <w:rPr>
+        <w:rFonts w:ascii="Symbol" w:hAnsi="Symbol" w:hint="default"/>
+        <w:sz w:val="20"/>
+      </w:rPr>
+    </w:lvl>
+    <w:lvl w:ilvl="1" w:tentative="1">
+      <w:start w:val="1"/>
+      <w:numFmt w:val="bullet"/>
+      <w:lvlText w:val="o"/>
+      <w:lvlJc w:val="left"/>
+      <w:pPr>
+        <w:tabs>
+          <w:tab w:val="num" w:pos="1440"/>
+        </w:tabs>
+        <w:ind w:left="1440" w:hanging="360"/>
+      </w:pPr>
+      <w:rPr>
+        <w:rFonts w:ascii="Courier New" w:hAnsi="Courier New" w:hint="default"/>
+        <w:sz w:val="20"/>
+      </w:rPr>
+    </w:lvl>
+    <w:lvl w:ilvl="2" w:tentative="1">
+      <w:start w:val="1"/>
+      <w:numFmt w:val="bullet"/>
+      <w:lvlText w:val=""/>
+      <w:lvlJc w:val="left"/>
+      <w:pPr>
+        <w:tabs>
+          <w:tab w:val="num" w:pos="2160"/>
+        </w:tabs>
+        <w:ind w:left="2160" w:hanging="360"/>
+      </w:pPr>
+      <w:rPr>
+        <w:rFonts w:ascii="Wingdings" w:hAnsi="Wingdings" w:hint="default"/>
+        <w:sz w:val="20"/>
+      </w:rPr>
+    </w:lvl>
+    <w:lvl w:ilvl="3" w:tentative="1">
+      <w:start w:val="1"/>
+      <w:numFmt w:val="bullet"/>
+      <w:lvlText w:val=""/>
+      <w:lvlJc w:val="left"/>
+      <w:pPr>
+        <w:tabs>
+          <w:tab w:val="num" w:pos="2880"/>
+        </w:tabs>
+        <w:ind w:left="2880" w:hanging="360"/>
+      </w:pPr>
+      <w:rPr>
+        <w:rFonts w:ascii="Wingdings" w:hAnsi="Wingdings" w:hint="default"/>
+        <w:sz w:val="20"/>
+      </w:rPr>
+    </w:lvl>
+    <w:lvl w:ilvl="4" w:tentative="1">
+      <w:start w:val="1"/>
+      <w:numFmt w:val="bullet"/>
+      <w:lvlText w:val=""/>
+      <w:lvlJc w:val="left"/>
+      <w:pPr>
+        <w:tabs>
+          <w:tab w:val="num" w:pos="3600"/>
+        </w:tabs>
+        <w:ind w:left="3600" w:hanging="360"/>
+      </w:pPr>
+      <w:rPr>
+        <w:rFonts w:ascii="Wingdings" w:hAnsi="Wingdings" w:hint="default"/>
+        <w:sz w:val="20"/>
+      </w:rPr>
+    </w:lvl>
+    <w:lvl w:ilvl="5" w:tentative="1">
+      <w:start w:val="1"/>
+      <w:numFmt w:val="bullet"/>
+      <w:lvlText w:val=""/>
+      <w:lvlJc w:val="left"/>
+      <w:pPr>
+        <w:tabs>
+          <w:tab w:val="num" w:pos="4320"/>
+        </w:tabs>
+        <w:ind w:left="4320" w:hanging="360"/>
+      </w:pPr>
+      <w:rPr>
+        <w:rFonts w:ascii="Wingdings" w:hAnsi="Wingdings" w:hint="default"/>
+        <w:sz w:val="20"/>
+      </w:rPr>
+    </w:lvl>
+    <w:lvl w:ilvl="6" w:tentative="1">
+      <w:start w:val="1"/>
+      <w:numFmt w:val="bullet"/>
+      <w:lvlText w:val=""/>
+      <w:lvlJc w:val="left"/>
+      <w:pPr>
+        <w:tabs>
+          <w:tab w:val="num" w:pos="5040"/>
+        </w:tabs>
+        <w:ind w:left="5040" w:hanging="360"/>
+      </w:pPr>
+      <w:rPr>
+        <w:rFonts w:ascii="Wingdings" w:hAnsi="Wingdings" w:hint="default"/>
+        <w:sz w:val="20"/>
+      </w:rPr>
+    </w:lvl>
+    <w:lvl w:ilvl="7" w:tentative="1">
+      <w:start w:val="1"/>
+      <w:numFmt w:val="bullet"/>
+      <w:lvlText w:val=""/>
+      <w:lvlJc w:val="left"/>
+      <w:pPr>
+        <w:tabs>
+          <w:tab w:val="num" w:pos="5760"/>
+        </w:tabs>
+        <w:ind w:left="5760" w:hanging="360"/>
+      </w:pPr>
+      <w:rPr>
+        <w:rFonts w:ascii="Wingdings" w:hAnsi="Wingdings" w:hint="default"/>
+        <w:sz w:val="20"/>
+      </w:rPr>
+    </w:lvl>
+    <w:lvl w:ilvl="8" w:tentative="1">
+      <w:start w:val="1"/>
+      <w:numFmt w:val="bullet"/>
+      <w:lvlText w:val=""/>
+      <w:lvlJc w:val="left"/>
+      <w:pPr>
+        <w:tabs>
+          <w:tab w:val="num" w:pos="6480"/>
+        </w:tabs>
+        <w:ind w:left="6480" w:hanging="360"/>
+      </w:pPr>
+      <w:rPr>
+        <w:rFonts w:ascii="Wingdings" w:hAnsi="Wingdings" w:hint="default"/>
+        <w:sz w:val="20"/>
+      </w:rPr>
+    </w:lvl>
+  </w:abstractNum>
+  <w:abstractNum w:abstractNumId="13">
     <w:nsid w:val="3FB53A17"/>
     <w:multiLevelType w:val="multilevel"/>
     <w:tmpl w:val="6412A3A2"/>
@@ -9329,7 +12300,7 @@
       </w:rPr>
     </w:lvl>
   </w:abstractNum>
-  <w:abstractNum w:abstractNumId="8">
+  <w:abstractNum w:abstractNumId="14">
     <w:nsid w:val="41AB7285"/>
     <w:multiLevelType w:val="multilevel"/>
     <w:tmpl w:val="4062696C"/>
@@ -9478,7 +12449,120 @@
       </w:rPr>
     </w:lvl>
   </w:abstractNum>
-  <w:abstractNum w:abstractNumId="9">
+  <w:abstractNum w:abstractNumId="15">
+    <w:nsid w:val="44F4035C"/>
+    <w:multiLevelType w:val="multilevel"/>
+    <w:tmpl w:val="1BD63AE0"/>
+    <w:lvl w:ilvl="0">
+      <w:start w:val="1"/>
+      <w:numFmt w:val="decimal"/>
+      <w:lvlText w:val="%1."/>
+      <w:lvlJc w:val="left"/>
+      <w:pPr>
+        <w:tabs>
+          <w:tab w:val="num" w:pos="720"/>
+        </w:tabs>
+        <w:ind w:left="720" w:hanging="360"/>
+      </w:pPr>
+    </w:lvl>
+    <w:lvl w:ilvl="1" w:tentative="1">
+      <w:start w:val="1"/>
+      <w:numFmt w:val="decimal"/>
+      <w:lvlText w:val="%2."/>
+      <w:lvlJc w:val="left"/>
+      <w:pPr>
+        <w:tabs>
+          <w:tab w:val="num" w:pos="1440"/>
+        </w:tabs>
+        <w:ind w:left="1440" w:hanging="360"/>
+      </w:pPr>
+    </w:lvl>
+    <w:lvl w:ilvl="2" w:tentative="1">
+      <w:start w:val="1"/>
+      <w:numFmt w:val="decimal"/>
+      <w:lvlText w:val="%3."/>
+      <w:lvlJc w:val="left"/>
+      <w:pPr>
+        <w:tabs>
+          <w:tab w:val="num" w:pos="2160"/>
+        </w:tabs>
+        <w:ind w:left="2160" w:hanging="360"/>
+      </w:pPr>
+    </w:lvl>
+    <w:lvl w:ilvl="3" w:tentative="1">
+      <w:start w:val="1"/>
+      <w:numFmt w:val="decimal"/>
+      <w:lvlText w:val="%4."/>
+      <w:lvlJc w:val="left"/>
+      <w:pPr>
+        <w:tabs>
+          <w:tab w:val="num" w:pos="2880"/>
+        </w:tabs>
+        <w:ind w:left="2880" w:hanging="360"/>
+      </w:pPr>
+    </w:lvl>
+    <w:lvl w:ilvl="4" w:tentative="1">
+      <w:start w:val="1"/>
+      <w:numFmt w:val="decimal"/>
+      <w:lvlText w:val="%5."/>
+      <w:lvlJc w:val="left"/>
+      <w:pPr>
+        <w:tabs>
+          <w:tab w:val="num" w:pos="3600"/>
+        </w:tabs>
+        <w:ind w:left="3600" w:hanging="360"/>
+      </w:pPr>
+    </w:lvl>
+    <w:lvl w:ilvl="5" w:tentative="1">
+      <w:start w:val="1"/>
+      <w:numFmt w:val="decimal"/>
+      <w:lvlText w:val="%6."/>
+      <w:lvlJc w:val="left"/>
+      <w:pPr>
+        <w:tabs>
+          <w:tab w:val="num" w:pos="4320"/>
+        </w:tabs>
+        <w:ind w:left="4320" w:hanging="360"/>
+      </w:pPr>
+    </w:lvl>
+    <w:lvl w:ilvl="6" w:tentative="1">
+      <w:start w:val="1"/>
+      <w:numFmt w:val="decimal"/>
+      <w:lvlText w:val="%7."/>
+      <w:lvlJc w:val="left"/>
+      <w:pPr>
+        <w:tabs>
+          <w:tab w:val="num" w:pos="5040"/>
+        </w:tabs>
+        <w:ind w:left="5040" w:hanging="360"/>
+      </w:pPr>
+    </w:lvl>
+    <w:lvl w:ilvl="7" w:tentative="1">
+      <w:start w:val="1"/>
+      <w:numFmt w:val="decimal"/>
+      <w:lvlText w:val="%8."/>
+      <w:lvlJc w:val="left"/>
+      <w:pPr>
+        <w:tabs>
+          <w:tab w:val="num" w:pos="5760"/>
+        </w:tabs>
+        <w:ind w:left="5760" w:hanging="360"/>
+      </w:pPr>
+    </w:lvl>
+    <w:lvl w:ilvl="8" w:tentative="1">
+      <w:start w:val="1"/>
+      <w:numFmt w:val="decimal"/>
+      <w:lvlText w:val="%9."/>
+      <w:lvlJc w:val="left"/>
+      <w:pPr>
+        <w:tabs>
+          <w:tab w:val="num" w:pos="6480"/>
+        </w:tabs>
+        <w:ind w:left="6480" w:hanging="360"/>
+      </w:pPr>
+    </w:lvl>
+  </w:abstractNum>
+  <w:abstractNum w:abstractNumId="16">
     <w:nsid w:val="4D69709E"/>
     <w:multiLevelType w:val="multilevel"/>
     <w:tmpl w:val="3FEA5FC0"/>
@@ -9627,7 +12711,7 @@
       </w:rPr>
     </w:lvl>
   </w:abstractNum>
-  <w:abstractNum w:abstractNumId="10">
+  <w:abstractNum w:abstractNumId="17">
     <w:nsid w:val="4D8A6C53"/>
     <w:multiLevelType w:val="multilevel"/>
     <w:tmpl w:val="D3864012"/>
@@ -9776,7 +12860,7 @@
       </w:rPr>
     </w:lvl>
   </w:abstractNum>
-  <w:abstractNum w:abstractNumId="11">
+  <w:abstractNum w:abstractNumId="18">
     <w:nsid w:val="4E4901C2"/>
     <w:multiLevelType w:val="multilevel"/>
     <w:tmpl w:val="38DEE474"/>
@@ -9925,7 +13009,7 @@
       </w:rPr>
     </w:lvl>
   </w:abstractNum>
-  <w:abstractNum w:abstractNumId="12">
+  <w:abstractNum w:abstractNumId="19">
     <w:nsid w:val="5039734A"/>
     <w:multiLevelType w:val="multilevel"/>
     <w:tmpl w:val="66DC909E"/>
@@ -10074,7 +13158,7 @@
       </w:rPr>
     </w:lvl>
   </w:abstractNum>
-  <w:abstractNum w:abstractNumId="13">
+  <w:abstractNum w:abstractNumId="20">
     <w:nsid w:val="518A5285"/>
     <w:multiLevelType w:val="multilevel"/>
     <w:tmpl w:val="215661E4"/>
@@ -10223,7 +13307,7 @@
       </w:rPr>
     </w:lvl>
   </w:abstractNum>
-  <w:abstractNum w:abstractNumId="14">
+  <w:abstractNum w:abstractNumId="21">
     <w:nsid w:val="5198048F"/>
     <w:multiLevelType w:val="multilevel"/>
     <w:tmpl w:val="4184BF90"/>
@@ -10372,7 +13456,7 @@
       </w:rPr>
     </w:lvl>
   </w:abstractNum>
-  <w:abstractNum w:abstractNumId="15">
+  <w:abstractNum w:abstractNumId="22">
     <w:nsid w:val="52ED23CF"/>
     <w:multiLevelType w:val="multilevel"/>
     <w:tmpl w:val="F2DA4C10"/>
@@ -10521,7 +13605,7 @@
       </w:rPr>
     </w:lvl>
   </w:abstractNum>
-  <w:abstractNum w:abstractNumId="16">
+  <w:abstractNum w:abstractNumId="23">
     <w:nsid w:val="54AA33B3"/>
     <w:multiLevelType w:val="multilevel"/>
     <w:tmpl w:val="27F8DF3C"/>
@@ -10670,7 +13754,7 @@
       </w:rPr>
     </w:lvl>
   </w:abstractNum>
-  <w:abstractNum w:abstractNumId="17">
+  <w:abstractNum w:abstractNumId="24">
     <w:nsid w:val="5B11539B"/>
     <w:multiLevelType w:val="multilevel"/>
     <w:tmpl w:val="362A6400"/>
@@ -10819,7 +13903,7 @@
       </w:rPr>
     </w:lvl>
   </w:abstractNum>
-  <w:abstractNum w:abstractNumId="18">
+  <w:abstractNum w:abstractNumId="25">
     <w:nsid w:val="6C6F248E"/>
     <w:multiLevelType w:val="multilevel"/>
     <w:tmpl w:val="29201F7A"/>
@@ -10968,7 +14052,156 @@
       </w:rPr>
     </w:lvl>
   </w:abstractNum>
-  <w:abstractNum w:abstractNumId="19">
+  <w:abstractNum w:abstractNumId="26">
+    <w:nsid w:val="744D0B99"/>
+    <w:multiLevelType w:val="multilevel"/>
+    <w:tmpl w:val="1DEC6182"/>
+    <w:lvl w:ilvl="0">
+      <w:start w:val="1"/>
+      <w:numFmt w:val="bullet"/>
+      <w:lvlText w:val=""/>
+      <w:lvlJc w:val="left"/>
+      <w:pPr>
+        <w:tabs>
+          <w:tab w:val="num" w:pos="720"/>
+        </w:tabs>
+        <w:ind w:left="720" w:hanging="360"/>
+      </w:pPr>
+      <w:rPr>
+        <w:rFonts w:ascii="Symbol" w:hAnsi="Symbol" w:hint="default"/>
+        <w:sz w:val="20"/>
+      </w:rPr>
+    </w:lvl>
+    <w:lvl w:ilvl="1" w:tentative="1">
+      <w:start w:val="1"/>
+      <w:numFmt w:val="bullet"/>
+      <w:lvlText w:val="o"/>
+      <w:lvlJc w:val="left"/>
+      <w:pPr>
+        <w:tabs>
+          <w:tab w:val="num" w:pos="1440"/>
+        </w:tabs>
+        <w:ind w:left="1440" w:hanging="360"/>
+      </w:pPr>
+      <w:rPr>
+        <w:rFonts w:ascii="Courier New" w:hAnsi="Courier New" w:hint="default"/>
+        <w:sz w:val="20"/>
+      </w:rPr>
+    </w:lvl>
+    <w:lvl w:ilvl="2" w:tentative="1">
+      <w:start w:val="1"/>
+      <w:numFmt w:val="bullet"/>
+      <w:lvlText w:val=""/>
+      <w:lvlJc w:val="left"/>
+      <w:pPr>
+        <w:tabs>
+          <w:tab w:val="num" w:pos="2160"/>
+        </w:tabs>
+        <w:ind w:left="2160" w:hanging="360"/>
+      </w:pPr>
+      <w:rPr>
+        <w:rFonts w:ascii="Wingdings" w:hAnsi="Wingdings" w:hint="default"/>
+        <w:sz w:val="20"/>
+      </w:rPr>
+    </w:lvl>
+    <w:lvl w:ilvl="3" w:tentative="1">
+      <w:start w:val="1"/>
+      <w:numFmt w:val="bullet"/>
+      <w:lvlText w:val=""/>
+      <w:lvlJc w:val="left"/>
+      <w:pPr>
+        <w:tabs>
+          <w:tab w:val="num" w:pos="2880"/>
+        </w:tabs>
+        <w:ind w:left="2880" w:hanging="360"/>
+      </w:pPr>
+      <w:rPr>
+        <w:rFonts w:ascii="Wingdings" w:hAnsi="Wingdings" w:hint="default"/>
+        <w:sz w:val="20"/>
+      </w:rPr>
+    </w:lvl>
+    <w:lvl w:ilvl="4" w:tentative="1">
+      <w:start w:val="1"/>
+      <w:numFmt w:val="bullet"/>
+      <w:lvlText w:val=""/>
+      <w:lvlJc w:val="left"/>
+      <w:pPr>
+        <w:tabs>
+          <w:tab w:val="num" w:pos="3600"/>
+        </w:tabs>
+        <w:ind w:left="3600" w:hanging="360"/>
+      </w:pPr>
+      <w:rPr>
+        <w:rFonts w:ascii="Wingdings" w:hAnsi="Wingdings" w:hint="default"/>
+        <w:sz w:val="20"/>
+      </w:rPr>
+    </w:lvl>
+    <w:lvl w:ilvl="5" w:tentative="1">
+      <w:start w:val="1"/>
+      <w:numFmt w:val="bullet"/>
+      <w:lvlText w:val=""/>
+      <w:lvlJc w:val="left"/>
+      <w:pPr>
+        <w:tabs>
+          <w:tab w:val="num" w:pos="4320"/>
+        </w:tabs>
+        <w:ind w:left="4320" w:hanging="360"/>
+      </w:pPr>
+      <w:rPr>
+        <w:rFonts w:ascii="Wingdings" w:hAnsi="Wingdings" w:hint="default"/>
+        <w:sz w:val="20"/>
+      </w:rPr>
+    </w:lvl>
+    <w:lvl w:ilvl="6" w:tentative="1">
+      <w:start w:val="1"/>
+      <w:numFmt w:val="bullet"/>
+      <w:lvlText w:val=""/>
+      <w:lvlJc w:val="left"/>
+      <w:pPr>
+        <w:tabs>
+          <w:tab w:val="num" w:pos="5040"/>
+        </w:tabs>
+        <w:ind w:left="5040" w:hanging="360"/>
+      </w:pPr>
+      <w:rPr>
+        <w:rFonts w:ascii="Wingdings" w:hAnsi="Wingdings" w:hint="default"/>
+        <w:sz w:val="20"/>
+      </w:rPr>
+    </w:lvl>
+    <w:lvl w:ilvl="7" w:tentative="1">
+      <w:start w:val="1"/>
+      <w:numFmt w:val="bullet"/>
+      <w:lvlText w:val=""/>
+      <w:lvlJc w:val="left"/>
+      <w:pPr>
+        <w:tabs>
+          <w:tab w:val="num" w:pos="5760"/>
+        </w:tabs>
+        <w:ind w:left="5760" w:hanging="360"/>
+      </w:pPr>
+      <w:rPr>
+        <w:rFonts w:ascii="Wingdings" w:hAnsi="Wingdings" w:hint="default"/>
+        <w:sz w:val="20"/>
+      </w:rPr>
+    </w:lvl>
+    <w:lvl w:ilvl="8" w:tentative="1">
+      <w:start w:val="1"/>
+      <w:numFmt w:val="bullet"/>
+      <w:lvlText w:val=""/>
+      <w:lvlJc w:val="left"/>
+      <w:pPr>
+        <w:tabs>
+          <w:tab w:val="num" w:pos="6480"/>
+        </w:tabs>
+        <w:ind w:left="6480" w:hanging="360"/>
+      </w:pPr>
+      <w:rPr>
+        <w:rFonts w:ascii="Wingdings" w:hAnsi="Wingdings" w:hint="default"/>
+        <w:sz w:val="20"/>
+      </w:rPr>
+    </w:lvl>
+  </w:abstractNum>
+  <w:abstractNum w:abstractNumId="27">
     <w:nsid w:val="79354708"/>
     <w:multiLevelType w:val="multilevel"/>
     <w:tmpl w:val="7FC6629E"/>
@@ -11118,64 +14351,88 @@
     </w:lvl>
   </w:abstractNum>
   <w:num w:numId="1">
+    <w:abstractNumId w:val="2"/>
+  </w:num>
+  <w:num w:numId="2">
+    <w:abstractNumId w:val="6"/>
+  </w:num>
+  <w:num w:numId="3">
     <w:abstractNumId w:val="1"/>
   </w:num>
-  <w:num w:numId="2">
-    <w:abstractNumId w:val="2"/>
+  <w:num w:numId="4">
+    <w:abstractNumId w:val="25"/>
   </w:num>
-  <w:num w:numId="3">
+  <w:num w:numId="5">
+    <w:abstractNumId w:val="7"/>
+  </w:num>
+  <w:num w:numId="6">
+    <w:abstractNumId w:val="9"/>
+  </w:num>
+  <w:num w:numId="7">
+    <w:abstractNumId w:val="13"/>
+  </w:num>
+  <w:num w:numId="8">
+    <w:abstractNumId w:val="10"/>
+  </w:num>
+  <w:num w:numId="9">
+    <w:abstractNumId w:val="19"/>
+  </w:num>
+  <w:num w:numId="10">
+    <w:abstractNumId w:val="27"/>
+  </w:num>
+  <w:num w:numId="11">
+    <w:abstractNumId w:val="24"/>
+  </w:num>
+  <w:num w:numId="12">
+    <w:abstractNumId w:val="16"/>
+  </w:num>
+  <w:num w:numId="13">
+    <w:abstractNumId w:val="17"/>
+  </w:num>
+  <w:num w:numId="14">
+    <w:abstractNumId w:val="11"/>
+  </w:num>
+  <w:num w:numId="15">
+    <w:abstractNumId w:val="20"/>
+  </w:num>
+  <w:num w:numId="16">
+    <w:abstractNumId w:val="22"/>
+  </w:num>
+  <w:num w:numId="17">
+    <w:abstractNumId w:val="14"/>
+  </w:num>
+  <w:num w:numId="18">
+    <w:abstractNumId w:val="21"/>
+  </w:num>
+  <w:num w:numId="19">
+    <w:abstractNumId w:val="23"/>
+  </w:num>
+  <w:num w:numId="20">
+    <w:abstractNumId w:val="18"/>
+  </w:num>
+  <w:num w:numId="21">
     <w:abstractNumId w:val="0"/>
   </w:num>
-  <w:num w:numId="4">
-    <w:abstractNumId w:val="18"/>
+  <w:num w:numId="22">
+    <w:abstractNumId w:val="15"/>
   </w:num>
-  <w:num w:numId="5">
+  <w:num w:numId="23">
+    <w:abstractNumId w:val="4"/>
+  </w:num>
+  <w:num w:numId="24">
+    <w:abstractNumId w:val="12"/>
+  </w:num>
+  <w:num w:numId="25">
+    <w:abstractNumId w:val="5"/>
+  </w:num>
+  <w:num w:numId="26">
     <w:abstractNumId w:val="3"/>
   </w:num>
-  <w:num w:numId="6">
-    <w:abstractNumId w:val="4"/>
+  <w:num w:numId="27">
+    <w:abstractNumId w:val="26"/>
   </w:num>
-  <w:num w:numId="7">
-    <w:abstractNumId w:val="7"/>
-  </w:num>
-  <w:num w:numId="8">
-    <w:abstractNumId w:val="5"/>
-  </w:num>
-  <w:num w:numId="9">
-    <w:abstractNumId w:val="12"/>
-  </w:num>
-  <w:num w:numId="10">
-    <w:abstractNumId w:val="19"/>
-  </w:num>
-  <w:num w:numId="11">
-    <w:abstractNumId w:val="17"/>
-  </w:num>
-  <w:num w:numId="12">
-    <w:abstractNumId w:val="9"/>
-  </w:num>
-  <w:num w:numId="13">
-    <w:abstractNumId w:val="10"/>
-  </w:num>
-  <w:num w:numId="14">
-    <w:abstractNumId w:val="6"/>
-  </w:num>
-  <w:num w:numId="15">
-    <w:abstractNumId w:val="13"/>
-  </w:num>
-  <w:num w:numId="16">
-    <w:abstractNumId w:val="15"/>
-  </w:num>
-  <w:num w:numId="17">
+  <w:num w:numId="28">
     <w:abstractNumId w:val="8"/>
-  </w:num>
-  <w:num w:numId="18">
-    <w:abstractNumId w:val="14"/>
-  </w:num>
-  <w:num w:numId="19">
-    <w:abstractNumId w:val="16"/>
-  </w:num>
-  <w:num w:numId="20">
-    <w:abstractNumId w:val="11"/>
   </w:num>
 </w:numbering>
 </file>

</xml_diff>

<commit_message>
Adding Dijkstra's Greedy Algo
</commit_message>
<xml_diff>
--- a/Greedy Algorithms/Greedy.docx
+++ b/Greedy Algorithms/Greedy.docx
@@ -13307,6 +13307,2247 @@
         </w:rPr>
       </w:pPr>
     </w:p>
+    <w:p>
+      <w:pPr>
+        <w:jc w:val="center"/>
+        <w:rPr>
+          <w:b/>
+          <w:sz w:val="36"/>
+          <w:szCs w:val="36"/>
+        </w:rPr>
+      </w:pPr>
+    </w:p>
+    <w:p>
+      <w:pPr>
+        <w:jc w:val="center"/>
+        <w:rPr>
+          <w:b/>
+          <w:sz w:val="36"/>
+          <w:szCs w:val="36"/>
+        </w:rPr>
+      </w:pPr>
+      <w:proofErr w:type="spellStart"/>
+      <w:r>
+        <w:rPr>
+          <w:b/>
+          <w:sz w:val="36"/>
+          <w:szCs w:val="36"/>
+        </w:rPr>
+        <w:t>Dijkstra’s</w:t>
+      </w:r>
+      <w:proofErr w:type="spellEnd"/>
+      <w:r>
+        <w:rPr>
+          <w:b/>
+          <w:sz w:val="36"/>
+          <w:szCs w:val="36"/>
+        </w:rPr>
+        <w:t xml:space="preserve"> Algorithm</w:t>
+      </w:r>
+    </w:p>
+    <w:p>
+      <w:pPr>
+        <w:spacing w:before="100" w:beforeAutospacing="1" w:after="100" w:afterAutospacing="1" w:line="240" w:lineRule="auto"/>
+        <w:rPr>
+          <w:rFonts w:ascii="Times New Roman" w:eastAsia="Times New Roman" w:hAnsi="Times New Roman" w:cs="Times New Roman"/>
+          <w:sz w:val="24"/>
+          <w:szCs w:val="24"/>
+        </w:rPr>
+      </w:pPr>
+      <w:proofErr w:type="spellStart"/>
+      <w:r>
+        <w:rPr>
+          <w:rFonts w:ascii="Times New Roman" w:eastAsia="Times New Roman" w:hAnsi="Times New Roman" w:cs="Times New Roman"/>
+          <w:b/>
+          <w:bCs/>
+          <w:sz w:val="24"/>
+          <w:szCs w:val="24"/>
+        </w:rPr>
+        <w:t>Dijkstra's</w:t>
+      </w:r>
+      <w:proofErr w:type="spellEnd"/>
+      <w:r>
+        <w:rPr>
+          <w:rFonts w:ascii="Times New Roman" w:eastAsia="Times New Roman" w:hAnsi="Times New Roman" w:cs="Times New Roman"/>
+          <w:b/>
+          <w:bCs/>
+          <w:sz w:val="24"/>
+          <w:szCs w:val="24"/>
+        </w:rPr>
+        <w:t xml:space="preserve"> Algorithm</w:t>
+      </w:r>
+      <w:r>
+        <w:rPr>
+          <w:rFonts w:ascii="Times New Roman" w:eastAsia="Times New Roman" w:hAnsi="Times New Roman" w:cs="Times New Roman"/>
+          <w:sz w:val="24"/>
+          <w:szCs w:val="24"/>
+        </w:rPr>
+        <w:t xml:space="preserve"> is one of the most famous greedy algorithms in computer science. Invented by </w:t>
+      </w:r>
+      <w:proofErr w:type="spellStart"/>
+      <w:r>
+        <w:rPr>
+          <w:rFonts w:ascii="Times New Roman" w:eastAsia="Times New Roman" w:hAnsi="Times New Roman" w:cs="Times New Roman"/>
+          <w:sz w:val="24"/>
+          <w:szCs w:val="24"/>
+        </w:rPr>
+        <w:t>Edsger</w:t>
+      </w:r>
+      <w:proofErr w:type="spellEnd"/>
+      <w:r>
+        <w:rPr>
+          <w:rFonts w:ascii="Times New Roman" w:eastAsia="Times New Roman" w:hAnsi="Times New Roman" w:cs="Times New Roman"/>
+          <w:sz w:val="24"/>
+          <w:szCs w:val="24"/>
+        </w:rPr>
+        <w:t xml:space="preserve"> </w:t>
+      </w:r>
+      <w:proofErr w:type="spellStart"/>
+      <w:r>
+        <w:rPr>
+          <w:rFonts w:ascii="Times New Roman" w:eastAsia="Times New Roman" w:hAnsi="Times New Roman" w:cs="Times New Roman"/>
+          <w:sz w:val="24"/>
+          <w:szCs w:val="24"/>
+        </w:rPr>
+        <w:t>Dijkstra</w:t>
+      </w:r>
+      <w:proofErr w:type="spellEnd"/>
+      <w:r>
+        <w:rPr>
+          <w:rFonts w:ascii="Times New Roman" w:eastAsia="Times New Roman" w:hAnsi="Times New Roman" w:cs="Times New Roman"/>
+          <w:sz w:val="24"/>
+          <w:szCs w:val="24"/>
+        </w:rPr>
+        <w:t xml:space="preserve"> in 1956, it solves the </w:t>
+      </w:r>
+      <w:r>
+        <w:rPr>
+          <w:rFonts w:ascii="Times New Roman" w:eastAsia="Times New Roman" w:hAnsi="Times New Roman" w:cs="Times New Roman"/>
+          <w:b/>
+          <w:bCs/>
+          <w:sz w:val="24"/>
+          <w:szCs w:val="24"/>
+        </w:rPr>
+        <w:t>Single-Source Shortest Path problem</w:t>
+      </w:r>
+      <w:r>
+        <w:rPr>
+          <w:rFonts w:ascii="Times New Roman" w:eastAsia="Times New Roman" w:hAnsi="Times New Roman" w:cs="Times New Roman"/>
+          <w:sz w:val="24"/>
+          <w:szCs w:val="24"/>
+        </w:rPr>
+        <w:t xml:space="preserve"> for a graph with non-negative edge weights.</w:t>
+      </w:r>
+    </w:p>
+    <w:p>
+      <w:pPr>
+        <w:spacing w:before="100" w:beforeAutospacing="1" w:after="100" w:afterAutospacing="1" w:line="240" w:lineRule="auto"/>
+        <w:rPr>
+          <w:rFonts w:ascii="Times New Roman" w:eastAsia="Times New Roman" w:hAnsi="Times New Roman" w:cs="Times New Roman"/>
+          <w:sz w:val="24"/>
+          <w:szCs w:val="24"/>
+        </w:rPr>
+      </w:pPr>
+      <w:r>
+        <w:rPr>
+          <w:rFonts w:ascii="Times New Roman" w:eastAsia="Times New Roman" w:hAnsi="Times New Roman" w:cs="Times New Roman"/>
+          <w:sz w:val="24"/>
+          <w:szCs w:val="24"/>
+        </w:rPr>
+        <w:t xml:space="preserve">Think of it as the mathematical engine behind </w:t>
+      </w:r>
+      <w:r>
+        <w:rPr>
+          <w:rFonts w:ascii="Times New Roman" w:eastAsia="Times New Roman" w:hAnsi="Times New Roman" w:cs="Times New Roman"/>
+          <w:b/>
+          <w:bCs/>
+          <w:sz w:val="24"/>
+          <w:szCs w:val="24"/>
+        </w:rPr>
+        <w:t>Google Maps</w:t>
+      </w:r>
+      <w:r>
+        <w:rPr>
+          <w:rFonts w:ascii="Times New Roman" w:eastAsia="Times New Roman" w:hAnsi="Times New Roman" w:cs="Times New Roman"/>
+          <w:sz w:val="24"/>
+          <w:szCs w:val="24"/>
+        </w:rPr>
+        <w:t xml:space="preserve"> or </w:t>
+      </w:r>
+      <w:r>
+        <w:rPr>
+          <w:rFonts w:ascii="Times New Roman" w:eastAsia="Times New Roman" w:hAnsi="Times New Roman" w:cs="Times New Roman"/>
+          <w:b/>
+          <w:bCs/>
+          <w:sz w:val="24"/>
+          <w:szCs w:val="24"/>
+        </w:rPr>
+        <w:t>Apple Maps</w:t>
+      </w:r>
+      <w:r>
+        <w:rPr>
+          <w:rFonts w:ascii="Times New Roman" w:eastAsia="Times New Roman" w:hAnsi="Times New Roman" w:cs="Times New Roman"/>
+          <w:sz w:val="24"/>
+          <w:szCs w:val="24"/>
+        </w:rPr>
+        <w:t xml:space="preserve">. If you want to drive from your house (Source Node) to a destination across town, </w:t>
+      </w:r>
+      <w:proofErr w:type="spellStart"/>
+      <w:r>
+        <w:rPr>
+          <w:rFonts w:ascii="Times New Roman" w:eastAsia="Times New Roman" w:hAnsi="Times New Roman" w:cs="Times New Roman"/>
+          <w:sz w:val="24"/>
+          <w:szCs w:val="24"/>
+        </w:rPr>
+        <w:t>Dijkstra's</w:t>
+      </w:r>
+      <w:proofErr w:type="spellEnd"/>
+      <w:r>
+        <w:rPr>
+          <w:rFonts w:ascii="Times New Roman" w:eastAsia="Times New Roman" w:hAnsi="Times New Roman" w:cs="Times New Roman"/>
+          <w:sz w:val="24"/>
+          <w:szCs w:val="24"/>
+        </w:rPr>
+        <w:t xml:space="preserve"> algorithm finds the absolute fastest route by evaluating intersections (nodes) and road travel times (weights).</w:t>
+      </w:r>
+    </w:p>
+    <w:p>
+      <w:pPr>
+        <w:spacing w:before="100" w:beforeAutospacing="1" w:after="100" w:afterAutospacing="1" w:line="240" w:lineRule="auto"/>
+        <w:outlineLvl w:val="1"/>
+        <w:rPr>
+          <w:rFonts w:ascii="Times New Roman" w:eastAsia="Times New Roman" w:hAnsi="Times New Roman" w:cs="Times New Roman"/>
+          <w:b/>
+          <w:bCs/>
+          <w:sz w:val="36"/>
+          <w:szCs w:val="36"/>
+        </w:rPr>
+      </w:pPr>
+      <w:r>
+        <w:rPr>
+          <w:rFonts w:ascii="Times New Roman" w:eastAsia="Times New Roman" w:hAnsi="Times New Roman" w:cs="Times New Roman"/>
+          <w:b/>
+          <w:bCs/>
+          <w:sz w:val="36"/>
+          <w:szCs w:val="36"/>
+        </w:rPr>
+        <w:t>The Greedy Strategy: Closest Node First</w:t>
+      </w:r>
+    </w:p>
+    <w:p>
+      <w:pPr>
+        <w:spacing w:before="100" w:beforeAutospacing="1" w:after="100" w:afterAutospacing="1" w:line="240" w:lineRule="auto"/>
+        <w:rPr>
+          <w:rFonts w:ascii="Times New Roman" w:eastAsia="Times New Roman" w:hAnsi="Times New Roman" w:cs="Times New Roman"/>
+          <w:sz w:val="24"/>
+          <w:szCs w:val="24"/>
+        </w:rPr>
+      </w:pPr>
+      <w:proofErr w:type="spellStart"/>
+      <w:r>
+        <w:rPr>
+          <w:rFonts w:ascii="Times New Roman" w:eastAsia="Times New Roman" w:hAnsi="Times New Roman" w:cs="Times New Roman"/>
+          <w:sz w:val="24"/>
+          <w:szCs w:val="24"/>
+        </w:rPr>
+        <w:t>Dijkstra's</w:t>
+      </w:r>
+      <w:proofErr w:type="spellEnd"/>
+      <w:r>
+        <w:rPr>
+          <w:rFonts w:ascii="Times New Roman" w:eastAsia="Times New Roman" w:hAnsi="Times New Roman" w:cs="Times New Roman"/>
+          <w:sz w:val="24"/>
+          <w:szCs w:val="24"/>
+        </w:rPr>
+        <w:t xml:space="preserve"> algorithm works by maintaining a list of the shortest known distances from the starting point to every other node in the graph. Initially, we don't know any routes, so we set all distances to infinity ($\</w:t>
+      </w:r>
+      <w:proofErr w:type="spellStart"/>
+      <w:r>
+        <w:rPr>
+          <w:rFonts w:ascii="Times New Roman" w:eastAsia="Times New Roman" w:hAnsi="Times New Roman" w:cs="Times New Roman"/>
+          <w:sz w:val="24"/>
+          <w:szCs w:val="24"/>
+        </w:rPr>
+        <w:t>infty</w:t>
+      </w:r>
+      <w:proofErr w:type="spellEnd"/>
+      <w:r>
+        <w:rPr>
+          <w:rFonts w:ascii="Times New Roman" w:eastAsia="Times New Roman" w:hAnsi="Times New Roman" w:cs="Times New Roman"/>
+          <w:sz w:val="24"/>
+          <w:szCs w:val="24"/>
+        </w:rPr>
+        <w:t>$).</w:t>
+      </w:r>
+    </w:p>
+    <w:p>
+      <w:pPr>
+        <w:spacing w:before="100" w:beforeAutospacing="1" w:after="100" w:afterAutospacing="1" w:line="240" w:lineRule="auto"/>
+        <w:rPr>
+          <w:rFonts w:ascii="Times New Roman" w:eastAsia="Times New Roman" w:hAnsi="Times New Roman" w:cs="Times New Roman"/>
+          <w:sz w:val="24"/>
+          <w:szCs w:val="24"/>
+        </w:rPr>
+      </w:pPr>
+      <w:r>
+        <w:rPr>
+          <w:rFonts w:ascii="Times New Roman" w:eastAsia="Times New Roman" w:hAnsi="Times New Roman" w:cs="Times New Roman"/>
+          <w:sz w:val="24"/>
+          <w:szCs w:val="24"/>
+        </w:rPr>
+        <w:t xml:space="preserve">The core greedy rule is: </w:t>
+      </w:r>
+      <w:r>
+        <w:rPr>
+          <w:rFonts w:ascii="Times New Roman" w:eastAsia="Times New Roman" w:hAnsi="Times New Roman" w:cs="Times New Roman"/>
+          <w:b/>
+          <w:bCs/>
+          <w:sz w:val="24"/>
+          <w:szCs w:val="24"/>
+        </w:rPr>
+        <w:t>Always visit the unvisited node that currently has the absolute smallest tentative distance from the starting point.</w:t>
+      </w:r>
+    </w:p>
+    <w:p>
+      <w:pPr>
+        <w:spacing w:before="100" w:beforeAutospacing="1" w:after="100" w:afterAutospacing="1" w:line="240" w:lineRule="auto"/>
+        <w:rPr>
+          <w:rFonts w:ascii="Times New Roman" w:eastAsia="Times New Roman" w:hAnsi="Times New Roman" w:cs="Times New Roman"/>
+          <w:sz w:val="24"/>
+          <w:szCs w:val="24"/>
+        </w:rPr>
+      </w:pPr>
+      <w:r>
+        <w:rPr>
+          <w:rFonts w:ascii="Times New Roman" w:eastAsia="Times New Roman" w:hAnsi="Times New Roman" w:cs="Times New Roman"/>
+          <w:sz w:val="24"/>
+          <w:szCs w:val="24"/>
+        </w:rPr>
+        <w:t xml:space="preserve">Once we land on that closest node, we check all of its neighbors to see if traveling through this new node creates a shorter path to them than we had previously found. This updating step is called </w:t>
+      </w:r>
+      <w:r>
+        <w:rPr>
+          <w:rFonts w:ascii="Times New Roman" w:eastAsia="Times New Roman" w:hAnsi="Times New Roman" w:cs="Times New Roman"/>
+          <w:b/>
+          <w:bCs/>
+          <w:sz w:val="24"/>
+          <w:szCs w:val="24"/>
+        </w:rPr>
+        <w:t>relaxation</w:t>
+      </w:r>
+      <w:r>
+        <w:rPr>
+          <w:rFonts w:ascii="Times New Roman" w:eastAsia="Times New Roman" w:hAnsi="Times New Roman" w:cs="Times New Roman"/>
+          <w:sz w:val="24"/>
+          <w:szCs w:val="24"/>
+        </w:rPr>
+        <w:t>.</w:t>
+      </w:r>
+    </w:p>
+    <w:p>
+      <w:pPr>
+        <w:spacing w:before="100" w:beforeAutospacing="1" w:after="100" w:afterAutospacing="1" w:line="240" w:lineRule="auto"/>
+        <w:outlineLvl w:val="1"/>
+        <w:rPr>
+          <w:rFonts w:ascii="Times New Roman" w:eastAsia="Times New Roman" w:hAnsi="Times New Roman" w:cs="Times New Roman"/>
+          <w:b/>
+          <w:bCs/>
+          <w:sz w:val="36"/>
+          <w:szCs w:val="36"/>
+        </w:rPr>
+      </w:pPr>
+      <w:r>
+        <w:rPr>
+          <w:rFonts w:ascii="Times New Roman" w:eastAsia="Times New Roman" w:hAnsi="Times New Roman" w:cs="Times New Roman"/>
+          <w:b/>
+          <w:bCs/>
+          <w:sz w:val="36"/>
+          <w:szCs w:val="36"/>
+        </w:rPr>
+        <w:t>Step-by-Step Walkthrough</w:t>
+      </w:r>
+    </w:p>
+    <w:p>
+      <w:pPr>
+        <w:spacing w:before="100" w:beforeAutospacing="1" w:after="100" w:afterAutospacing="1" w:line="240" w:lineRule="auto"/>
+        <w:rPr>
+          <w:rFonts w:ascii="Times New Roman" w:eastAsia="Times New Roman" w:hAnsi="Times New Roman" w:cs="Times New Roman"/>
+          <w:sz w:val="24"/>
+          <w:szCs w:val="24"/>
+        </w:rPr>
+      </w:pPr>
+      <w:r>
+        <w:rPr>
+          <w:rFonts w:ascii="Times New Roman" w:eastAsia="Times New Roman" w:hAnsi="Times New Roman" w:cs="Times New Roman"/>
+          <w:sz w:val="24"/>
+          <w:szCs w:val="24"/>
+        </w:rPr>
+        <w:t xml:space="preserve">Let’s trace how the algorithm runs on a simple graph with 4 nodes: </w:t>
+      </w:r>
+      <w:r>
+        <w:rPr>
+          <w:rFonts w:ascii="Times New Roman" w:eastAsia="Times New Roman" w:hAnsi="Times New Roman" w:cs="Times New Roman"/>
+          <w:b/>
+          <w:bCs/>
+          <w:sz w:val="24"/>
+          <w:szCs w:val="24"/>
+        </w:rPr>
+        <w:t>A, B, C, D</w:t>
+      </w:r>
+      <w:r>
+        <w:rPr>
+          <w:rFonts w:ascii="Times New Roman" w:eastAsia="Times New Roman" w:hAnsi="Times New Roman" w:cs="Times New Roman"/>
+          <w:sz w:val="24"/>
+          <w:szCs w:val="24"/>
+        </w:rPr>
+        <w:t xml:space="preserve">. We want to find the shortest path from </w:t>
+      </w:r>
+      <w:r>
+        <w:rPr>
+          <w:rFonts w:ascii="Times New Roman" w:eastAsia="Times New Roman" w:hAnsi="Times New Roman" w:cs="Times New Roman"/>
+          <w:b/>
+          <w:bCs/>
+          <w:sz w:val="24"/>
+          <w:szCs w:val="24"/>
+        </w:rPr>
+        <w:t>A</w:t>
+      </w:r>
+      <w:r>
+        <w:rPr>
+          <w:rFonts w:ascii="Times New Roman" w:eastAsia="Times New Roman" w:hAnsi="Times New Roman" w:cs="Times New Roman"/>
+          <w:sz w:val="24"/>
+          <w:szCs w:val="24"/>
+        </w:rPr>
+        <w:t xml:space="preserve"> to all other nodes.</w:t>
+      </w:r>
+    </w:p>
+    <w:p>
+      <w:pPr>
+        <w:numPr>
+          <w:ilvl w:val="0"/>
+          <w:numId w:val="43"/>
+        </w:numPr>
+        <w:spacing w:before="100" w:beforeAutospacing="1" w:after="100" w:afterAutospacing="1" w:line="240" w:lineRule="auto"/>
+        <w:rPr>
+          <w:rFonts w:ascii="Times New Roman" w:eastAsia="Times New Roman" w:hAnsi="Times New Roman" w:cs="Times New Roman"/>
+          <w:sz w:val="24"/>
+          <w:szCs w:val="24"/>
+        </w:rPr>
+      </w:pPr>
+      <w:r>
+        <w:rPr>
+          <w:rFonts w:ascii="Times New Roman" w:eastAsia="Times New Roman" w:hAnsi="Times New Roman" w:cs="Times New Roman"/>
+          <w:sz w:val="24"/>
+          <w:szCs w:val="24"/>
+        </w:rPr>
+        <w:t>Edge A-B = 4</w:t>
+      </w:r>
+    </w:p>
+    <w:p>
+      <w:pPr>
+        <w:numPr>
+          <w:ilvl w:val="0"/>
+          <w:numId w:val="43"/>
+        </w:numPr>
+        <w:spacing w:before="100" w:beforeAutospacing="1" w:after="100" w:afterAutospacing="1" w:line="240" w:lineRule="auto"/>
+        <w:rPr>
+          <w:rFonts w:ascii="Times New Roman" w:eastAsia="Times New Roman" w:hAnsi="Times New Roman" w:cs="Times New Roman"/>
+          <w:sz w:val="24"/>
+          <w:szCs w:val="24"/>
+        </w:rPr>
+      </w:pPr>
+      <w:r>
+        <w:rPr>
+          <w:rFonts w:ascii="Times New Roman" w:eastAsia="Times New Roman" w:hAnsi="Times New Roman" w:cs="Times New Roman"/>
+          <w:sz w:val="24"/>
+          <w:szCs w:val="24"/>
+        </w:rPr>
+        <w:lastRenderedPageBreak/>
+        <w:t>Edge A-C = 1</w:t>
+      </w:r>
+    </w:p>
+    <w:p>
+      <w:pPr>
+        <w:numPr>
+          <w:ilvl w:val="0"/>
+          <w:numId w:val="43"/>
+        </w:numPr>
+        <w:spacing w:before="100" w:beforeAutospacing="1" w:after="100" w:afterAutospacing="1" w:line="240" w:lineRule="auto"/>
+        <w:rPr>
+          <w:rFonts w:ascii="Times New Roman" w:eastAsia="Times New Roman" w:hAnsi="Times New Roman" w:cs="Times New Roman"/>
+          <w:sz w:val="24"/>
+          <w:szCs w:val="24"/>
+        </w:rPr>
+      </w:pPr>
+      <w:r>
+        <w:rPr>
+          <w:rFonts w:ascii="Times New Roman" w:eastAsia="Times New Roman" w:hAnsi="Times New Roman" w:cs="Times New Roman"/>
+          <w:sz w:val="24"/>
+          <w:szCs w:val="24"/>
+        </w:rPr>
+        <w:t>Edge C-B = 2</w:t>
+      </w:r>
+    </w:p>
+    <w:p>
+      <w:pPr>
+        <w:numPr>
+          <w:ilvl w:val="0"/>
+          <w:numId w:val="43"/>
+        </w:numPr>
+        <w:spacing w:before="100" w:beforeAutospacing="1" w:after="100" w:afterAutospacing="1" w:line="240" w:lineRule="auto"/>
+        <w:rPr>
+          <w:rFonts w:ascii="Times New Roman" w:eastAsia="Times New Roman" w:hAnsi="Times New Roman" w:cs="Times New Roman"/>
+          <w:sz w:val="24"/>
+          <w:szCs w:val="24"/>
+        </w:rPr>
+      </w:pPr>
+      <w:r>
+        <w:rPr>
+          <w:rFonts w:ascii="Times New Roman" w:eastAsia="Times New Roman" w:hAnsi="Times New Roman" w:cs="Times New Roman"/>
+          <w:sz w:val="24"/>
+          <w:szCs w:val="24"/>
+        </w:rPr>
+        <w:t>Edge C-D = 6</w:t>
+      </w:r>
+    </w:p>
+    <w:p>
+      <w:pPr>
+        <w:numPr>
+          <w:ilvl w:val="0"/>
+          <w:numId w:val="43"/>
+        </w:numPr>
+        <w:spacing w:before="100" w:beforeAutospacing="1" w:after="100" w:afterAutospacing="1" w:line="240" w:lineRule="auto"/>
+        <w:rPr>
+          <w:rFonts w:ascii="Times New Roman" w:eastAsia="Times New Roman" w:hAnsi="Times New Roman" w:cs="Times New Roman"/>
+          <w:sz w:val="24"/>
+          <w:szCs w:val="24"/>
+        </w:rPr>
+      </w:pPr>
+      <w:r>
+        <w:rPr>
+          <w:rFonts w:ascii="Times New Roman" w:eastAsia="Times New Roman" w:hAnsi="Times New Roman" w:cs="Times New Roman"/>
+          <w:sz w:val="24"/>
+          <w:szCs w:val="24"/>
+        </w:rPr>
+        <w:t>Edge B-D = 3</w:t>
+      </w:r>
+    </w:p>
+    <w:p>
+      <w:pPr>
+        <w:spacing w:before="100" w:beforeAutospacing="1" w:after="100" w:afterAutospacing="1" w:line="240" w:lineRule="auto"/>
+        <w:outlineLvl w:val="2"/>
+        <w:rPr>
+          <w:rFonts w:ascii="Times New Roman" w:eastAsia="Times New Roman" w:hAnsi="Times New Roman" w:cs="Times New Roman"/>
+          <w:b/>
+          <w:bCs/>
+          <w:sz w:val="27"/>
+          <w:szCs w:val="27"/>
+        </w:rPr>
+      </w:pPr>
+      <w:r>
+        <w:rPr>
+          <w:rFonts w:ascii="Times New Roman" w:eastAsia="Times New Roman" w:hAnsi="Times New Roman" w:cs="Times New Roman"/>
+          <w:b/>
+          <w:bCs/>
+          <w:sz w:val="27"/>
+          <w:szCs w:val="27"/>
+        </w:rPr>
+        <w:t>Initialization</w:t>
+      </w:r>
+    </w:p>
+    <w:p>
+      <w:pPr>
+        <w:numPr>
+          <w:ilvl w:val="0"/>
+          <w:numId w:val="44"/>
+        </w:numPr>
+        <w:spacing w:before="100" w:beforeAutospacing="1" w:after="100" w:afterAutospacing="1" w:line="240" w:lineRule="auto"/>
+        <w:rPr>
+          <w:rFonts w:ascii="Times New Roman" w:eastAsia="Times New Roman" w:hAnsi="Times New Roman" w:cs="Times New Roman"/>
+          <w:sz w:val="24"/>
+          <w:szCs w:val="24"/>
+        </w:rPr>
+      </w:pPr>
+      <w:r>
+        <w:rPr>
+          <w:rFonts w:ascii="Times New Roman" w:eastAsia="Times New Roman" w:hAnsi="Times New Roman" w:cs="Times New Roman"/>
+          <w:sz w:val="24"/>
+          <w:szCs w:val="24"/>
+        </w:rPr>
+        <w:t xml:space="preserve">Distance Table: </w:t>
+      </w:r>
+      <w:r>
+        <w:rPr>
+          <w:rFonts w:ascii="Courier New" w:eastAsia="Times New Roman" w:hAnsi="Courier New" w:cs="Courier New"/>
+          <w:sz w:val="20"/>
+        </w:rPr>
+        <w:t>A: 0</w:t>
+      </w:r>
+      <w:r>
+        <w:rPr>
+          <w:rFonts w:ascii="Times New Roman" w:eastAsia="Times New Roman" w:hAnsi="Times New Roman" w:cs="Times New Roman"/>
+          <w:sz w:val="24"/>
+          <w:szCs w:val="24"/>
+        </w:rPr>
+        <w:t xml:space="preserve">, </w:t>
+      </w:r>
+      <w:r>
+        <w:rPr>
+          <w:rFonts w:ascii="Courier New" w:eastAsia="Times New Roman" w:hAnsi="Courier New" w:cs="Courier New"/>
+          <w:sz w:val="20"/>
+        </w:rPr>
+        <w:t>B: ∞</w:t>
+      </w:r>
+      <w:r>
+        <w:rPr>
+          <w:rFonts w:ascii="Times New Roman" w:eastAsia="Times New Roman" w:hAnsi="Times New Roman" w:cs="Times New Roman"/>
+          <w:sz w:val="24"/>
+          <w:szCs w:val="24"/>
+        </w:rPr>
+        <w:t xml:space="preserve">, </w:t>
+      </w:r>
+      <w:r>
+        <w:rPr>
+          <w:rFonts w:ascii="Courier New" w:eastAsia="Times New Roman" w:hAnsi="Courier New" w:cs="Courier New"/>
+          <w:sz w:val="20"/>
+        </w:rPr>
+        <w:t>C: ∞</w:t>
+      </w:r>
+      <w:r>
+        <w:rPr>
+          <w:rFonts w:ascii="Times New Roman" w:eastAsia="Times New Roman" w:hAnsi="Times New Roman" w:cs="Times New Roman"/>
+          <w:sz w:val="24"/>
+          <w:szCs w:val="24"/>
+        </w:rPr>
+        <w:t xml:space="preserve">, </w:t>
+      </w:r>
+      <w:r>
+        <w:rPr>
+          <w:rFonts w:ascii="Courier New" w:eastAsia="Times New Roman" w:hAnsi="Courier New" w:cs="Courier New"/>
+          <w:sz w:val="20"/>
+        </w:rPr>
+        <w:t>D: ∞</w:t>
+      </w:r>
+    </w:p>
+    <w:p>
+      <w:pPr>
+        <w:numPr>
+          <w:ilvl w:val="0"/>
+          <w:numId w:val="44"/>
+        </w:numPr>
+        <w:spacing w:before="100" w:beforeAutospacing="1" w:after="100" w:afterAutospacing="1" w:line="240" w:lineRule="auto"/>
+        <w:rPr>
+          <w:rFonts w:ascii="Times New Roman" w:eastAsia="Times New Roman" w:hAnsi="Times New Roman" w:cs="Times New Roman"/>
+          <w:sz w:val="24"/>
+          <w:szCs w:val="24"/>
+        </w:rPr>
+      </w:pPr>
+      <w:r>
+        <w:rPr>
+          <w:rFonts w:ascii="Times New Roman" w:eastAsia="Times New Roman" w:hAnsi="Times New Roman" w:cs="Times New Roman"/>
+          <w:sz w:val="24"/>
+          <w:szCs w:val="24"/>
+        </w:rPr>
+        <w:t xml:space="preserve">Unvisited Set: </w:t>
+      </w:r>
+      <w:r>
+        <w:rPr>
+          <w:rFonts w:ascii="Courier New" w:eastAsia="Times New Roman" w:hAnsi="Courier New" w:cs="Courier New"/>
+          <w:sz w:val="20"/>
+        </w:rPr>
+        <w:t>{A, B, C, D}</w:t>
+      </w:r>
+    </w:p>
+    <w:p>
+      <w:pPr>
+        <w:spacing w:after="0" w:line="240" w:lineRule="auto"/>
+        <w:rPr>
+          <w:rFonts w:ascii="Times New Roman" w:eastAsia="Times New Roman" w:hAnsi="Times New Roman" w:cs="Times New Roman"/>
+          <w:sz w:val="24"/>
+          <w:szCs w:val="24"/>
+        </w:rPr>
+      </w:pPr>
+      <w:proofErr w:type="gramStart"/>
+      <w:r>
+        <w:rPr>
+          <w:rFonts w:ascii="Times New Roman" w:eastAsia="Times New Roman" w:hAnsi="Times New Roman" w:cs="Times New Roman"/>
+          <w:b/>
+          <w:bCs/>
+          <w:sz w:val="24"/>
+          <w:szCs w:val="24"/>
+        </w:rPr>
+        <w:t>1.Step</w:t>
+      </w:r>
+      <w:proofErr w:type="gramEnd"/>
+      <w:r>
+        <w:rPr>
+          <w:rFonts w:ascii="Times New Roman" w:eastAsia="Times New Roman" w:hAnsi="Times New Roman" w:cs="Times New Roman"/>
+          <w:b/>
+          <w:bCs/>
+          <w:sz w:val="24"/>
+          <w:szCs w:val="24"/>
+        </w:rPr>
+        <w:t xml:space="preserve"> 1: Start at Node A:</w:t>
+      </w:r>
+      <w:r>
+        <w:rPr>
+          <w:rFonts w:ascii="Times New Roman" w:eastAsia="Times New Roman" w:hAnsi="Times New Roman" w:cs="Times New Roman"/>
+          <w:sz w:val="24"/>
+          <w:szCs w:val="24"/>
+        </w:rPr>
+        <w:t>Unvisited: {A, B, C, D}.</w:t>
+      </w:r>
+    </w:p>
+    <w:p>
+      <w:pPr>
+        <w:spacing w:before="100" w:beforeAutospacing="1" w:after="100" w:afterAutospacing="1" w:line="240" w:lineRule="auto"/>
+        <w:rPr>
+          <w:rFonts w:ascii="Times New Roman" w:eastAsia="Times New Roman" w:hAnsi="Times New Roman" w:cs="Times New Roman"/>
+          <w:sz w:val="24"/>
+          <w:szCs w:val="24"/>
+        </w:rPr>
+      </w:pPr>
+      <w:r>
+        <w:rPr>
+          <w:rFonts w:ascii="Times New Roman" w:eastAsia="Times New Roman" w:hAnsi="Times New Roman" w:cs="Times New Roman"/>
+          <w:sz w:val="24"/>
+          <w:szCs w:val="24"/>
+        </w:rPr>
+        <w:t xml:space="preserve">The node with the smallest distance is </w:t>
+      </w:r>
+      <w:proofErr w:type="gramStart"/>
+      <w:r>
+        <w:rPr>
+          <w:rFonts w:ascii="Times New Roman" w:eastAsia="Times New Roman" w:hAnsi="Times New Roman" w:cs="Times New Roman"/>
+          <w:b/>
+          <w:bCs/>
+          <w:sz w:val="24"/>
+          <w:szCs w:val="24"/>
+        </w:rPr>
+        <w:t>A</w:t>
+      </w:r>
+      <w:proofErr w:type="gramEnd"/>
+      <w:r>
+        <w:rPr>
+          <w:rFonts w:ascii="Times New Roman" w:eastAsia="Times New Roman" w:hAnsi="Times New Roman" w:cs="Times New Roman"/>
+          <w:b/>
+          <w:bCs/>
+          <w:sz w:val="24"/>
+          <w:szCs w:val="24"/>
+        </w:rPr>
+        <w:t xml:space="preserve"> (0)</w:t>
+      </w:r>
+      <w:r>
+        <w:rPr>
+          <w:rFonts w:ascii="Times New Roman" w:eastAsia="Times New Roman" w:hAnsi="Times New Roman" w:cs="Times New Roman"/>
+          <w:sz w:val="24"/>
+          <w:szCs w:val="24"/>
+        </w:rPr>
+        <w:t>. Visit A.</w:t>
+      </w:r>
+    </w:p>
+    <w:p>
+      <w:pPr>
+        <w:numPr>
+          <w:ilvl w:val="0"/>
+          <w:numId w:val="45"/>
+        </w:numPr>
+        <w:spacing w:before="100" w:beforeAutospacing="1" w:after="100" w:afterAutospacing="1" w:line="240" w:lineRule="auto"/>
+        <w:rPr>
+          <w:rFonts w:ascii="Times New Roman" w:eastAsia="Times New Roman" w:hAnsi="Times New Roman" w:cs="Times New Roman"/>
+          <w:sz w:val="24"/>
+          <w:szCs w:val="24"/>
+        </w:rPr>
+      </w:pPr>
+      <w:r>
+        <w:rPr>
+          <w:rFonts w:ascii="Times New Roman" w:eastAsia="Times New Roman" w:hAnsi="Times New Roman" w:cs="Times New Roman"/>
+          <w:i/>
+          <w:iCs/>
+          <w:sz w:val="24"/>
+          <w:szCs w:val="24"/>
+        </w:rPr>
+        <w:t>Relax Neighbors of A:</w:t>
+      </w:r>
+      <w:r>
+        <w:rPr>
+          <w:rFonts w:ascii="Times New Roman" w:eastAsia="Times New Roman" w:hAnsi="Times New Roman" w:cs="Times New Roman"/>
+          <w:sz w:val="24"/>
+          <w:szCs w:val="24"/>
+        </w:rPr>
+        <w:t xml:space="preserve"> * Distance to B could be $0 + 4 = 4$ (Better than $\</w:t>
+      </w:r>
+      <w:proofErr w:type="spellStart"/>
+      <w:r>
+        <w:rPr>
+          <w:rFonts w:ascii="Times New Roman" w:eastAsia="Times New Roman" w:hAnsi="Times New Roman" w:cs="Times New Roman"/>
+          <w:sz w:val="24"/>
+          <w:szCs w:val="24"/>
+        </w:rPr>
+        <w:t>infty</w:t>
+      </w:r>
+      <w:proofErr w:type="spellEnd"/>
+      <w:r>
+        <w:rPr>
+          <w:rFonts w:ascii="Times New Roman" w:eastAsia="Times New Roman" w:hAnsi="Times New Roman" w:cs="Times New Roman"/>
+          <w:sz w:val="24"/>
+          <w:szCs w:val="24"/>
+        </w:rPr>
+        <w:t xml:space="preserve">$). Update </w:t>
+      </w:r>
+      <w:r>
+        <w:rPr>
+          <w:rFonts w:ascii="Courier New" w:eastAsia="Times New Roman" w:hAnsi="Courier New" w:cs="Courier New"/>
+          <w:sz w:val="20"/>
+        </w:rPr>
+        <w:t>B: 4</w:t>
+      </w:r>
+      <w:r>
+        <w:rPr>
+          <w:rFonts w:ascii="Times New Roman" w:eastAsia="Times New Roman" w:hAnsi="Times New Roman" w:cs="Times New Roman"/>
+          <w:sz w:val="24"/>
+          <w:szCs w:val="24"/>
+        </w:rPr>
+        <w:t>.</w:t>
+      </w:r>
+    </w:p>
+    <w:p>
+      <w:pPr>
+        <w:numPr>
+          <w:ilvl w:val="1"/>
+          <w:numId w:val="45"/>
+        </w:numPr>
+        <w:spacing w:before="100" w:beforeAutospacing="1" w:after="100" w:afterAutospacing="1" w:line="240" w:lineRule="auto"/>
+        <w:rPr>
+          <w:rFonts w:ascii="Times New Roman" w:eastAsia="Times New Roman" w:hAnsi="Times New Roman" w:cs="Times New Roman"/>
+          <w:sz w:val="24"/>
+          <w:szCs w:val="24"/>
+        </w:rPr>
+      </w:pPr>
+      <w:r>
+        <w:rPr>
+          <w:rFonts w:ascii="Times New Roman" w:eastAsia="Times New Roman" w:hAnsi="Times New Roman" w:cs="Times New Roman"/>
+          <w:sz w:val="24"/>
+          <w:szCs w:val="24"/>
+        </w:rPr>
+        <w:t>Distance to C could be $0 + 1 = 1$ (Better than $\</w:t>
+      </w:r>
+      <w:proofErr w:type="spellStart"/>
+      <w:r>
+        <w:rPr>
+          <w:rFonts w:ascii="Times New Roman" w:eastAsia="Times New Roman" w:hAnsi="Times New Roman" w:cs="Times New Roman"/>
+          <w:sz w:val="24"/>
+          <w:szCs w:val="24"/>
+        </w:rPr>
+        <w:t>infty</w:t>
+      </w:r>
+      <w:proofErr w:type="spellEnd"/>
+      <w:r>
+        <w:rPr>
+          <w:rFonts w:ascii="Times New Roman" w:eastAsia="Times New Roman" w:hAnsi="Times New Roman" w:cs="Times New Roman"/>
+          <w:sz w:val="24"/>
+          <w:szCs w:val="24"/>
+        </w:rPr>
+        <w:t xml:space="preserve">$). Update </w:t>
+      </w:r>
+      <w:r>
+        <w:rPr>
+          <w:rFonts w:ascii="Courier New" w:eastAsia="Times New Roman" w:hAnsi="Courier New" w:cs="Courier New"/>
+          <w:sz w:val="20"/>
+        </w:rPr>
+        <w:t>C: 1</w:t>
+      </w:r>
+      <w:r>
+        <w:rPr>
+          <w:rFonts w:ascii="Times New Roman" w:eastAsia="Times New Roman" w:hAnsi="Times New Roman" w:cs="Times New Roman"/>
+          <w:sz w:val="24"/>
+          <w:szCs w:val="24"/>
+        </w:rPr>
+        <w:t>.</w:t>
+      </w:r>
+    </w:p>
+    <w:p>
+      <w:pPr>
+        <w:numPr>
+          <w:ilvl w:val="0"/>
+          <w:numId w:val="45"/>
+        </w:numPr>
+        <w:spacing w:before="100" w:beforeAutospacing="1" w:after="100" w:afterAutospacing="1" w:line="240" w:lineRule="auto"/>
+        <w:rPr>
+          <w:rFonts w:ascii="Times New Roman" w:eastAsia="Times New Roman" w:hAnsi="Times New Roman" w:cs="Times New Roman"/>
+          <w:sz w:val="24"/>
+          <w:szCs w:val="24"/>
+        </w:rPr>
+      </w:pPr>
+      <w:r>
+        <w:rPr>
+          <w:rFonts w:ascii="Times New Roman" w:eastAsia="Times New Roman" w:hAnsi="Times New Roman" w:cs="Times New Roman"/>
+          <w:i/>
+          <w:iCs/>
+          <w:sz w:val="24"/>
+          <w:szCs w:val="24"/>
+        </w:rPr>
+        <w:t>Distance Table:</w:t>
+      </w:r>
+      <w:r>
+        <w:rPr>
+          <w:rFonts w:ascii="Times New Roman" w:eastAsia="Times New Roman" w:hAnsi="Times New Roman" w:cs="Times New Roman"/>
+          <w:sz w:val="24"/>
+          <w:szCs w:val="24"/>
+        </w:rPr>
+        <w:t xml:space="preserve"> </w:t>
+      </w:r>
+      <w:r>
+        <w:rPr>
+          <w:rFonts w:ascii="Courier New" w:eastAsia="Times New Roman" w:hAnsi="Courier New" w:cs="Courier New"/>
+          <w:sz w:val="20"/>
+        </w:rPr>
+        <w:t>A: 0</w:t>
+      </w:r>
+      <w:r>
+        <w:rPr>
+          <w:rFonts w:ascii="Times New Roman" w:eastAsia="Times New Roman" w:hAnsi="Times New Roman" w:cs="Times New Roman"/>
+          <w:sz w:val="24"/>
+          <w:szCs w:val="24"/>
+        </w:rPr>
+        <w:t xml:space="preserve">, </w:t>
+      </w:r>
+      <w:r>
+        <w:rPr>
+          <w:rFonts w:ascii="Courier New" w:eastAsia="Times New Roman" w:hAnsi="Courier New" w:cs="Courier New"/>
+          <w:sz w:val="20"/>
+        </w:rPr>
+        <w:t>B: 4</w:t>
+      </w:r>
+      <w:r>
+        <w:rPr>
+          <w:rFonts w:ascii="Times New Roman" w:eastAsia="Times New Roman" w:hAnsi="Times New Roman" w:cs="Times New Roman"/>
+          <w:sz w:val="24"/>
+          <w:szCs w:val="24"/>
+        </w:rPr>
+        <w:t xml:space="preserve">, </w:t>
+      </w:r>
+      <w:r>
+        <w:rPr>
+          <w:rFonts w:ascii="Courier New" w:eastAsia="Times New Roman" w:hAnsi="Courier New" w:cs="Courier New"/>
+          <w:sz w:val="20"/>
+        </w:rPr>
+        <w:t>C: 1</w:t>
+      </w:r>
+      <w:r>
+        <w:rPr>
+          <w:rFonts w:ascii="Times New Roman" w:eastAsia="Times New Roman" w:hAnsi="Times New Roman" w:cs="Times New Roman"/>
+          <w:sz w:val="24"/>
+          <w:szCs w:val="24"/>
+        </w:rPr>
+        <w:t xml:space="preserve">, </w:t>
+      </w:r>
+      <w:r>
+        <w:rPr>
+          <w:rFonts w:ascii="Courier New" w:eastAsia="Times New Roman" w:hAnsi="Courier New" w:cs="Courier New"/>
+          <w:sz w:val="20"/>
+        </w:rPr>
+        <w:t>D: ∞</w:t>
+      </w:r>
+    </w:p>
+    <w:p>
+      <w:pPr>
+        <w:numPr>
+          <w:ilvl w:val="0"/>
+          <w:numId w:val="45"/>
+        </w:numPr>
+        <w:spacing w:before="100" w:beforeAutospacing="1" w:after="100" w:afterAutospacing="1" w:line="240" w:lineRule="auto"/>
+        <w:rPr>
+          <w:rFonts w:ascii="Times New Roman" w:eastAsia="Times New Roman" w:hAnsi="Times New Roman" w:cs="Times New Roman"/>
+          <w:sz w:val="24"/>
+          <w:szCs w:val="24"/>
+        </w:rPr>
+      </w:pPr>
+      <w:r>
+        <w:rPr>
+          <w:rFonts w:ascii="Times New Roman" w:eastAsia="Times New Roman" w:hAnsi="Times New Roman" w:cs="Times New Roman"/>
+          <w:i/>
+          <w:iCs/>
+          <w:sz w:val="24"/>
+          <w:szCs w:val="24"/>
+        </w:rPr>
+        <w:t>Remove A from unvisited.</w:t>
+      </w:r>
+    </w:p>
+    <w:p>
+      <w:pPr>
+        <w:spacing w:after="0" w:line="240" w:lineRule="auto"/>
+        <w:rPr>
+          <w:rFonts w:ascii="Times New Roman" w:eastAsia="Times New Roman" w:hAnsi="Times New Roman" w:cs="Times New Roman"/>
+          <w:sz w:val="24"/>
+          <w:szCs w:val="24"/>
+        </w:rPr>
+      </w:pPr>
+      <w:proofErr w:type="gramStart"/>
+      <w:r>
+        <w:rPr>
+          <w:rFonts w:ascii="Times New Roman" w:eastAsia="Times New Roman" w:hAnsi="Times New Roman" w:cs="Times New Roman"/>
+          <w:b/>
+          <w:bCs/>
+          <w:sz w:val="24"/>
+          <w:szCs w:val="24"/>
+        </w:rPr>
+        <w:t>2.Step</w:t>
+      </w:r>
+      <w:proofErr w:type="gramEnd"/>
+      <w:r>
+        <w:rPr>
+          <w:rFonts w:ascii="Times New Roman" w:eastAsia="Times New Roman" w:hAnsi="Times New Roman" w:cs="Times New Roman"/>
+          <w:b/>
+          <w:bCs/>
+          <w:sz w:val="24"/>
+          <w:szCs w:val="24"/>
+        </w:rPr>
+        <w:t xml:space="preserve"> 2: Greedily pick the next </w:t>
+      </w:r>
+      <w:proofErr w:type="spellStart"/>
+      <w:r>
+        <w:rPr>
+          <w:rFonts w:ascii="Times New Roman" w:eastAsia="Times New Roman" w:hAnsi="Times New Roman" w:cs="Times New Roman"/>
+          <w:b/>
+          <w:bCs/>
+          <w:sz w:val="24"/>
+          <w:szCs w:val="24"/>
+        </w:rPr>
+        <w:t>closest:</w:t>
+      </w:r>
+      <w:r>
+        <w:rPr>
+          <w:rFonts w:ascii="Times New Roman" w:eastAsia="Times New Roman" w:hAnsi="Times New Roman" w:cs="Times New Roman"/>
+          <w:sz w:val="24"/>
+          <w:szCs w:val="24"/>
+        </w:rPr>
+        <w:t>Unvisited</w:t>
+      </w:r>
+      <w:proofErr w:type="spellEnd"/>
+      <w:r>
+        <w:rPr>
+          <w:rFonts w:ascii="Times New Roman" w:eastAsia="Times New Roman" w:hAnsi="Times New Roman" w:cs="Times New Roman"/>
+          <w:sz w:val="24"/>
+          <w:szCs w:val="24"/>
+        </w:rPr>
+        <w:t>: {B, C, D}.</w:t>
+      </w:r>
+    </w:p>
+    <w:p>
+      <w:pPr>
+        <w:spacing w:before="100" w:beforeAutospacing="1" w:after="100" w:afterAutospacing="1" w:line="240" w:lineRule="auto"/>
+        <w:rPr>
+          <w:rFonts w:ascii="Times New Roman" w:eastAsia="Times New Roman" w:hAnsi="Times New Roman" w:cs="Times New Roman"/>
+          <w:sz w:val="24"/>
+          <w:szCs w:val="24"/>
+        </w:rPr>
+      </w:pPr>
+      <w:r>
+        <w:rPr>
+          <w:rFonts w:ascii="Times New Roman" w:eastAsia="Times New Roman" w:hAnsi="Times New Roman" w:cs="Times New Roman"/>
+          <w:sz w:val="24"/>
+          <w:szCs w:val="24"/>
+        </w:rPr>
+        <w:t xml:space="preserve">The closest unvisited node is now </w:t>
+      </w:r>
+      <w:r>
+        <w:rPr>
+          <w:rFonts w:ascii="Times New Roman" w:eastAsia="Times New Roman" w:hAnsi="Times New Roman" w:cs="Times New Roman"/>
+          <w:b/>
+          <w:bCs/>
+          <w:sz w:val="24"/>
+          <w:szCs w:val="24"/>
+        </w:rPr>
+        <w:t>C (1)</w:t>
+      </w:r>
+      <w:r>
+        <w:rPr>
+          <w:rFonts w:ascii="Times New Roman" w:eastAsia="Times New Roman" w:hAnsi="Times New Roman" w:cs="Times New Roman"/>
+          <w:sz w:val="24"/>
+          <w:szCs w:val="24"/>
+        </w:rPr>
+        <w:t>. Visit C.</w:t>
+      </w:r>
+    </w:p>
+    <w:p>
+      <w:pPr>
+        <w:numPr>
+          <w:ilvl w:val="0"/>
+          <w:numId w:val="46"/>
+        </w:numPr>
+        <w:spacing w:before="100" w:beforeAutospacing="1" w:after="100" w:afterAutospacing="1" w:line="240" w:lineRule="auto"/>
+        <w:rPr>
+          <w:rFonts w:ascii="Times New Roman" w:eastAsia="Times New Roman" w:hAnsi="Times New Roman" w:cs="Times New Roman"/>
+          <w:sz w:val="24"/>
+          <w:szCs w:val="24"/>
+        </w:rPr>
+      </w:pPr>
+      <w:r>
+        <w:rPr>
+          <w:rFonts w:ascii="Times New Roman" w:eastAsia="Times New Roman" w:hAnsi="Times New Roman" w:cs="Times New Roman"/>
+          <w:i/>
+          <w:iCs/>
+          <w:sz w:val="24"/>
+          <w:szCs w:val="24"/>
+        </w:rPr>
+        <w:t>Relax Neighbors of C:</w:t>
+      </w:r>
+    </w:p>
+    <w:p>
+      <w:pPr>
+        <w:numPr>
+          <w:ilvl w:val="1"/>
+          <w:numId w:val="46"/>
+        </w:numPr>
+        <w:spacing w:before="100" w:beforeAutospacing="1" w:after="100" w:afterAutospacing="1" w:line="240" w:lineRule="auto"/>
+        <w:rPr>
+          <w:rFonts w:ascii="Times New Roman" w:eastAsia="Times New Roman" w:hAnsi="Times New Roman" w:cs="Times New Roman"/>
+          <w:sz w:val="24"/>
+          <w:szCs w:val="24"/>
+        </w:rPr>
+      </w:pPr>
+      <w:r>
+        <w:rPr>
+          <w:rFonts w:ascii="Times New Roman" w:eastAsia="Times New Roman" w:hAnsi="Times New Roman" w:cs="Times New Roman"/>
+          <w:sz w:val="24"/>
+          <w:szCs w:val="24"/>
+        </w:rPr>
+        <w:t>Distance to B through C is $\</w:t>
+      </w:r>
+      <w:proofErr w:type="gramStart"/>
+      <w:r>
+        <w:rPr>
+          <w:rFonts w:ascii="Times New Roman" w:eastAsia="Times New Roman" w:hAnsi="Times New Roman" w:cs="Times New Roman"/>
+          <w:sz w:val="24"/>
+          <w:szCs w:val="24"/>
+        </w:rPr>
+        <w:t>text{</w:t>
+      </w:r>
+      <w:proofErr w:type="gramEnd"/>
+      <w:r>
+        <w:rPr>
+          <w:rFonts w:ascii="Times New Roman" w:eastAsia="Times New Roman" w:hAnsi="Times New Roman" w:cs="Times New Roman"/>
+          <w:sz w:val="24"/>
+          <w:szCs w:val="24"/>
+        </w:rPr>
+        <w:t xml:space="preserve">Dist}(C) + \text{Edge}(C\text{-}B) = 1 + 2 = 3$. </w:t>
+      </w:r>
+      <w:proofErr w:type="gramStart"/>
+      <w:r>
+        <w:rPr>
+          <w:rFonts w:ascii="Times New Roman" w:eastAsia="Times New Roman" w:hAnsi="Times New Roman" w:cs="Times New Roman"/>
+          <w:sz w:val="24"/>
+          <w:szCs w:val="24"/>
+        </w:rPr>
+        <w:t>Is</w:t>
+      </w:r>
+      <w:proofErr w:type="gramEnd"/>
+      <w:r>
+        <w:rPr>
+          <w:rFonts w:ascii="Times New Roman" w:eastAsia="Times New Roman" w:hAnsi="Times New Roman" w:cs="Times New Roman"/>
+          <w:sz w:val="24"/>
+          <w:szCs w:val="24"/>
+        </w:rPr>
+        <w:t xml:space="preserve"> 3 better than our existing </w:t>
+      </w:r>
+      <w:r>
+        <w:rPr>
+          <w:rFonts w:ascii="Courier New" w:eastAsia="Times New Roman" w:hAnsi="Courier New" w:cs="Courier New"/>
+          <w:sz w:val="20"/>
+        </w:rPr>
+        <w:t>B: 4</w:t>
+      </w:r>
+      <w:r>
+        <w:rPr>
+          <w:rFonts w:ascii="Times New Roman" w:eastAsia="Times New Roman" w:hAnsi="Times New Roman" w:cs="Times New Roman"/>
+          <w:sz w:val="24"/>
+          <w:szCs w:val="24"/>
+        </w:rPr>
+        <w:t xml:space="preserve">? </w:t>
+      </w:r>
+      <w:r>
+        <w:rPr>
+          <w:rFonts w:ascii="Times New Roman" w:eastAsia="Times New Roman" w:hAnsi="Times New Roman" w:cs="Times New Roman"/>
+          <w:b/>
+          <w:bCs/>
+          <w:sz w:val="24"/>
+          <w:szCs w:val="24"/>
+        </w:rPr>
+        <w:t>Yes!</w:t>
+      </w:r>
+      <w:r>
+        <w:rPr>
+          <w:rFonts w:ascii="Times New Roman" w:eastAsia="Times New Roman" w:hAnsi="Times New Roman" w:cs="Times New Roman"/>
+          <w:sz w:val="24"/>
+          <w:szCs w:val="24"/>
+        </w:rPr>
+        <w:t xml:space="preserve"> Update </w:t>
+      </w:r>
+      <w:r>
+        <w:rPr>
+          <w:rFonts w:ascii="Courier New" w:eastAsia="Times New Roman" w:hAnsi="Courier New" w:cs="Courier New"/>
+          <w:sz w:val="20"/>
+        </w:rPr>
+        <w:t>B: 3</w:t>
+      </w:r>
+      <w:r>
+        <w:rPr>
+          <w:rFonts w:ascii="Times New Roman" w:eastAsia="Times New Roman" w:hAnsi="Times New Roman" w:cs="Times New Roman"/>
+          <w:sz w:val="24"/>
+          <w:szCs w:val="24"/>
+        </w:rPr>
+        <w:t>.</w:t>
+      </w:r>
+    </w:p>
+    <w:p>
+      <w:pPr>
+        <w:numPr>
+          <w:ilvl w:val="1"/>
+          <w:numId w:val="46"/>
+        </w:numPr>
+        <w:spacing w:before="100" w:beforeAutospacing="1" w:after="100" w:afterAutospacing="1" w:line="240" w:lineRule="auto"/>
+        <w:rPr>
+          <w:rFonts w:ascii="Times New Roman" w:eastAsia="Times New Roman" w:hAnsi="Times New Roman" w:cs="Times New Roman"/>
+          <w:sz w:val="24"/>
+          <w:szCs w:val="24"/>
+        </w:rPr>
+      </w:pPr>
+      <w:r>
+        <w:rPr>
+          <w:rFonts w:ascii="Times New Roman" w:eastAsia="Times New Roman" w:hAnsi="Times New Roman" w:cs="Times New Roman"/>
+          <w:sz w:val="24"/>
+          <w:szCs w:val="24"/>
+        </w:rPr>
+        <w:t>Distance to D through C is $1 + 6 = 7$. Better than $\</w:t>
+      </w:r>
+      <w:proofErr w:type="spellStart"/>
+      <w:r>
+        <w:rPr>
+          <w:rFonts w:ascii="Times New Roman" w:eastAsia="Times New Roman" w:hAnsi="Times New Roman" w:cs="Times New Roman"/>
+          <w:sz w:val="24"/>
+          <w:szCs w:val="24"/>
+        </w:rPr>
+        <w:t>infty</w:t>
+      </w:r>
+      <w:proofErr w:type="spellEnd"/>
+      <w:r>
+        <w:rPr>
+          <w:rFonts w:ascii="Times New Roman" w:eastAsia="Times New Roman" w:hAnsi="Times New Roman" w:cs="Times New Roman"/>
+          <w:sz w:val="24"/>
+          <w:szCs w:val="24"/>
+        </w:rPr>
+        <w:t xml:space="preserve">$. Update </w:t>
+      </w:r>
+      <w:r>
+        <w:rPr>
+          <w:rFonts w:ascii="Courier New" w:eastAsia="Times New Roman" w:hAnsi="Courier New" w:cs="Courier New"/>
+          <w:sz w:val="20"/>
+        </w:rPr>
+        <w:t>D: 7</w:t>
+      </w:r>
+      <w:r>
+        <w:rPr>
+          <w:rFonts w:ascii="Times New Roman" w:eastAsia="Times New Roman" w:hAnsi="Times New Roman" w:cs="Times New Roman"/>
+          <w:sz w:val="24"/>
+          <w:szCs w:val="24"/>
+        </w:rPr>
+        <w:t>.</w:t>
+      </w:r>
+    </w:p>
+    <w:p>
+      <w:pPr>
+        <w:numPr>
+          <w:ilvl w:val="0"/>
+          <w:numId w:val="46"/>
+        </w:numPr>
+        <w:spacing w:before="100" w:beforeAutospacing="1" w:after="100" w:afterAutospacing="1" w:line="240" w:lineRule="auto"/>
+        <w:rPr>
+          <w:rFonts w:ascii="Times New Roman" w:eastAsia="Times New Roman" w:hAnsi="Times New Roman" w:cs="Times New Roman"/>
+          <w:sz w:val="24"/>
+          <w:szCs w:val="24"/>
+        </w:rPr>
+      </w:pPr>
+      <w:r>
+        <w:rPr>
+          <w:rFonts w:ascii="Times New Roman" w:eastAsia="Times New Roman" w:hAnsi="Times New Roman" w:cs="Times New Roman"/>
+          <w:i/>
+          <w:iCs/>
+          <w:sz w:val="24"/>
+          <w:szCs w:val="24"/>
+        </w:rPr>
+        <w:t>Distance Table:</w:t>
+      </w:r>
+      <w:r>
+        <w:rPr>
+          <w:rFonts w:ascii="Times New Roman" w:eastAsia="Times New Roman" w:hAnsi="Times New Roman" w:cs="Times New Roman"/>
+          <w:sz w:val="24"/>
+          <w:szCs w:val="24"/>
+        </w:rPr>
+        <w:t xml:space="preserve"> </w:t>
+      </w:r>
+      <w:r>
+        <w:rPr>
+          <w:rFonts w:ascii="Courier New" w:eastAsia="Times New Roman" w:hAnsi="Courier New" w:cs="Courier New"/>
+          <w:sz w:val="20"/>
+        </w:rPr>
+        <w:t>A: 0</w:t>
+      </w:r>
+      <w:r>
+        <w:rPr>
+          <w:rFonts w:ascii="Times New Roman" w:eastAsia="Times New Roman" w:hAnsi="Times New Roman" w:cs="Times New Roman"/>
+          <w:sz w:val="24"/>
+          <w:szCs w:val="24"/>
+        </w:rPr>
+        <w:t xml:space="preserve">, </w:t>
+      </w:r>
+      <w:r>
+        <w:rPr>
+          <w:rFonts w:ascii="Courier New" w:eastAsia="Times New Roman" w:hAnsi="Courier New" w:cs="Courier New"/>
+          <w:sz w:val="20"/>
+        </w:rPr>
+        <w:t>B: 3</w:t>
+      </w:r>
+      <w:r>
+        <w:rPr>
+          <w:rFonts w:ascii="Times New Roman" w:eastAsia="Times New Roman" w:hAnsi="Times New Roman" w:cs="Times New Roman"/>
+          <w:sz w:val="24"/>
+          <w:szCs w:val="24"/>
+        </w:rPr>
+        <w:t xml:space="preserve">, </w:t>
+      </w:r>
+      <w:r>
+        <w:rPr>
+          <w:rFonts w:ascii="Courier New" w:eastAsia="Times New Roman" w:hAnsi="Courier New" w:cs="Courier New"/>
+          <w:sz w:val="20"/>
+        </w:rPr>
+        <w:t>C: 1</w:t>
+      </w:r>
+      <w:r>
+        <w:rPr>
+          <w:rFonts w:ascii="Times New Roman" w:eastAsia="Times New Roman" w:hAnsi="Times New Roman" w:cs="Times New Roman"/>
+          <w:sz w:val="24"/>
+          <w:szCs w:val="24"/>
+        </w:rPr>
+        <w:t xml:space="preserve">, </w:t>
+      </w:r>
+      <w:r>
+        <w:rPr>
+          <w:rFonts w:ascii="Courier New" w:eastAsia="Times New Roman" w:hAnsi="Courier New" w:cs="Courier New"/>
+          <w:sz w:val="20"/>
+        </w:rPr>
+        <w:t>D: 7</w:t>
+      </w:r>
+    </w:p>
+    <w:p>
+      <w:pPr>
+        <w:numPr>
+          <w:ilvl w:val="0"/>
+          <w:numId w:val="46"/>
+        </w:numPr>
+        <w:spacing w:before="100" w:beforeAutospacing="1" w:after="100" w:afterAutospacing="1" w:line="240" w:lineRule="auto"/>
+        <w:rPr>
+          <w:rFonts w:ascii="Times New Roman" w:eastAsia="Times New Roman" w:hAnsi="Times New Roman" w:cs="Times New Roman"/>
+          <w:sz w:val="24"/>
+          <w:szCs w:val="24"/>
+        </w:rPr>
+      </w:pPr>
+      <w:r>
+        <w:rPr>
+          <w:rFonts w:ascii="Times New Roman" w:eastAsia="Times New Roman" w:hAnsi="Times New Roman" w:cs="Times New Roman"/>
+          <w:i/>
+          <w:iCs/>
+          <w:sz w:val="24"/>
+          <w:szCs w:val="24"/>
+        </w:rPr>
+        <w:t>Remove C from unvisited.</w:t>
+      </w:r>
+    </w:p>
+    <w:p>
+      <w:pPr>
+        <w:spacing w:after="0" w:line="240" w:lineRule="auto"/>
+        <w:rPr>
+          <w:rFonts w:ascii="Times New Roman" w:eastAsia="Times New Roman" w:hAnsi="Times New Roman" w:cs="Times New Roman"/>
+          <w:sz w:val="24"/>
+          <w:szCs w:val="24"/>
+        </w:rPr>
+      </w:pPr>
+      <w:proofErr w:type="gramStart"/>
+      <w:r>
+        <w:rPr>
+          <w:rFonts w:ascii="Times New Roman" w:eastAsia="Times New Roman" w:hAnsi="Times New Roman" w:cs="Times New Roman"/>
+          <w:b/>
+          <w:bCs/>
+          <w:sz w:val="24"/>
+          <w:szCs w:val="24"/>
+        </w:rPr>
+        <w:t>3.Step</w:t>
+      </w:r>
+      <w:proofErr w:type="gramEnd"/>
+      <w:r>
+        <w:rPr>
+          <w:rFonts w:ascii="Times New Roman" w:eastAsia="Times New Roman" w:hAnsi="Times New Roman" w:cs="Times New Roman"/>
+          <w:b/>
+          <w:bCs/>
+          <w:sz w:val="24"/>
+          <w:szCs w:val="24"/>
+        </w:rPr>
+        <w:t xml:space="preserve"> 3: Pick the next </w:t>
+      </w:r>
+      <w:proofErr w:type="spellStart"/>
+      <w:r>
+        <w:rPr>
+          <w:rFonts w:ascii="Times New Roman" w:eastAsia="Times New Roman" w:hAnsi="Times New Roman" w:cs="Times New Roman"/>
+          <w:b/>
+          <w:bCs/>
+          <w:sz w:val="24"/>
+          <w:szCs w:val="24"/>
+        </w:rPr>
+        <w:t>closest:</w:t>
+      </w:r>
+      <w:r>
+        <w:rPr>
+          <w:rFonts w:ascii="Times New Roman" w:eastAsia="Times New Roman" w:hAnsi="Times New Roman" w:cs="Times New Roman"/>
+          <w:sz w:val="24"/>
+          <w:szCs w:val="24"/>
+        </w:rPr>
+        <w:t>Unvisited</w:t>
+      </w:r>
+      <w:proofErr w:type="spellEnd"/>
+      <w:r>
+        <w:rPr>
+          <w:rFonts w:ascii="Times New Roman" w:eastAsia="Times New Roman" w:hAnsi="Times New Roman" w:cs="Times New Roman"/>
+          <w:sz w:val="24"/>
+          <w:szCs w:val="24"/>
+        </w:rPr>
+        <w:t>: {B, D}.</w:t>
+      </w:r>
+    </w:p>
+    <w:p>
+      <w:pPr>
+        <w:spacing w:before="100" w:beforeAutospacing="1" w:after="100" w:afterAutospacing="1" w:line="240" w:lineRule="auto"/>
+        <w:rPr>
+          <w:rFonts w:ascii="Times New Roman" w:eastAsia="Times New Roman" w:hAnsi="Times New Roman" w:cs="Times New Roman"/>
+          <w:sz w:val="24"/>
+          <w:szCs w:val="24"/>
+        </w:rPr>
+      </w:pPr>
+      <w:r>
+        <w:rPr>
+          <w:rFonts w:ascii="Times New Roman" w:eastAsia="Times New Roman" w:hAnsi="Times New Roman" w:cs="Times New Roman"/>
+          <w:sz w:val="24"/>
+          <w:szCs w:val="24"/>
+        </w:rPr>
+        <w:t xml:space="preserve">The closest unvisited node is now </w:t>
+      </w:r>
+      <w:r>
+        <w:rPr>
+          <w:rFonts w:ascii="Times New Roman" w:eastAsia="Times New Roman" w:hAnsi="Times New Roman" w:cs="Times New Roman"/>
+          <w:b/>
+          <w:bCs/>
+          <w:sz w:val="24"/>
+          <w:szCs w:val="24"/>
+        </w:rPr>
+        <w:t>B (3)</w:t>
+      </w:r>
+      <w:r>
+        <w:rPr>
+          <w:rFonts w:ascii="Times New Roman" w:eastAsia="Times New Roman" w:hAnsi="Times New Roman" w:cs="Times New Roman"/>
+          <w:sz w:val="24"/>
+          <w:szCs w:val="24"/>
+        </w:rPr>
+        <w:t>. Visit B.</w:t>
+      </w:r>
+    </w:p>
+    <w:p>
+      <w:pPr>
+        <w:numPr>
+          <w:ilvl w:val="0"/>
+          <w:numId w:val="47"/>
+        </w:numPr>
+        <w:spacing w:before="100" w:beforeAutospacing="1" w:after="100" w:afterAutospacing="1" w:line="240" w:lineRule="auto"/>
+        <w:rPr>
+          <w:rFonts w:ascii="Times New Roman" w:eastAsia="Times New Roman" w:hAnsi="Times New Roman" w:cs="Times New Roman"/>
+          <w:sz w:val="24"/>
+          <w:szCs w:val="24"/>
+        </w:rPr>
+      </w:pPr>
+      <w:r>
+        <w:rPr>
+          <w:rFonts w:ascii="Times New Roman" w:eastAsia="Times New Roman" w:hAnsi="Times New Roman" w:cs="Times New Roman"/>
+          <w:i/>
+          <w:iCs/>
+          <w:sz w:val="24"/>
+          <w:szCs w:val="24"/>
+        </w:rPr>
+        <w:t>Relax Neighbors of B:</w:t>
+      </w:r>
+    </w:p>
+    <w:p>
+      <w:pPr>
+        <w:numPr>
+          <w:ilvl w:val="1"/>
+          <w:numId w:val="47"/>
+        </w:numPr>
+        <w:spacing w:before="100" w:beforeAutospacing="1" w:after="100" w:afterAutospacing="1" w:line="240" w:lineRule="auto"/>
+        <w:rPr>
+          <w:rFonts w:ascii="Times New Roman" w:eastAsia="Times New Roman" w:hAnsi="Times New Roman" w:cs="Times New Roman"/>
+          <w:sz w:val="24"/>
+          <w:szCs w:val="24"/>
+        </w:rPr>
+      </w:pPr>
+      <w:r>
+        <w:rPr>
+          <w:rFonts w:ascii="Times New Roman" w:eastAsia="Times New Roman" w:hAnsi="Times New Roman" w:cs="Times New Roman"/>
+          <w:sz w:val="24"/>
+          <w:szCs w:val="24"/>
+        </w:rPr>
+        <w:t>Distance to D through B is $\</w:t>
+      </w:r>
+      <w:proofErr w:type="gramStart"/>
+      <w:r>
+        <w:rPr>
+          <w:rFonts w:ascii="Times New Roman" w:eastAsia="Times New Roman" w:hAnsi="Times New Roman" w:cs="Times New Roman"/>
+          <w:sz w:val="24"/>
+          <w:szCs w:val="24"/>
+        </w:rPr>
+        <w:t>text{</w:t>
+      </w:r>
+      <w:proofErr w:type="gramEnd"/>
+      <w:r>
+        <w:rPr>
+          <w:rFonts w:ascii="Times New Roman" w:eastAsia="Times New Roman" w:hAnsi="Times New Roman" w:cs="Times New Roman"/>
+          <w:sz w:val="24"/>
+          <w:szCs w:val="24"/>
+        </w:rPr>
+        <w:t xml:space="preserve">Dist}(B) + \text{Edge}(B\text{-}D) = 3 + 3 = 6$. </w:t>
+      </w:r>
+      <w:proofErr w:type="gramStart"/>
+      <w:r>
+        <w:rPr>
+          <w:rFonts w:ascii="Times New Roman" w:eastAsia="Times New Roman" w:hAnsi="Times New Roman" w:cs="Times New Roman"/>
+          <w:sz w:val="24"/>
+          <w:szCs w:val="24"/>
+        </w:rPr>
+        <w:t>Is</w:t>
+      </w:r>
+      <w:proofErr w:type="gramEnd"/>
+      <w:r>
+        <w:rPr>
+          <w:rFonts w:ascii="Times New Roman" w:eastAsia="Times New Roman" w:hAnsi="Times New Roman" w:cs="Times New Roman"/>
+          <w:sz w:val="24"/>
+          <w:szCs w:val="24"/>
+        </w:rPr>
+        <w:t xml:space="preserve"> 6 better than our existing </w:t>
+      </w:r>
+      <w:r>
+        <w:rPr>
+          <w:rFonts w:ascii="Courier New" w:eastAsia="Times New Roman" w:hAnsi="Courier New" w:cs="Courier New"/>
+          <w:sz w:val="20"/>
+        </w:rPr>
+        <w:t>D: 7</w:t>
+      </w:r>
+      <w:r>
+        <w:rPr>
+          <w:rFonts w:ascii="Times New Roman" w:eastAsia="Times New Roman" w:hAnsi="Times New Roman" w:cs="Times New Roman"/>
+          <w:sz w:val="24"/>
+          <w:szCs w:val="24"/>
+        </w:rPr>
+        <w:t xml:space="preserve">? </w:t>
+      </w:r>
+      <w:r>
+        <w:rPr>
+          <w:rFonts w:ascii="Times New Roman" w:eastAsia="Times New Roman" w:hAnsi="Times New Roman" w:cs="Times New Roman"/>
+          <w:b/>
+          <w:bCs/>
+          <w:sz w:val="24"/>
+          <w:szCs w:val="24"/>
+        </w:rPr>
+        <w:t>Yes!</w:t>
+      </w:r>
+      <w:r>
+        <w:rPr>
+          <w:rFonts w:ascii="Times New Roman" w:eastAsia="Times New Roman" w:hAnsi="Times New Roman" w:cs="Times New Roman"/>
+          <w:sz w:val="24"/>
+          <w:szCs w:val="24"/>
+        </w:rPr>
+        <w:t xml:space="preserve"> Update </w:t>
+      </w:r>
+      <w:r>
+        <w:rPr>
+          <w:rFonts w:ascii="Courier New" w:eastAsia="Times New Roman" w:hAnsi="Courier New" w:cs="Courier New"/>
+          <w:sz w:val="20"/>
+        </w:rPr>
+        <w:t>D: 6</w:t>
+      </w:r>
+      <w:r>
+        <w:rPr>
+          <w:rFonts w:ascii="Times New Roman" w:eastAsia="Times New Roman" w:hAnsi="Times New Roman" w:cs="Times New Roman"/>
+          <w:sz w:val="24"/>
+          <w:szCs w:val="24"/>
+        </w:rPr>
+        <w:t>.</w:t>
+      </w:r>
+    </w:p>
+    <w:p>
+      <w:pPr>
+        <w:numPr>
+          <w:ilvl w:val="0"/>
+          <w:numId w:val="47"/>
+        </w:numPr>
+        <w:spacing w:before="100" w:beforeAutospacing="1" w:after="100" w:afterAutospacing="1" w:line="240" w:lineRule="auto"/>
+        <w:rPr>
+          <w:rFonts w:ascii="Times New Roman" w:eastAsia="Times New Roman" w:hAnsi="Times New Roman" w:cs="Times New Roman"/>
+          <w:sz w:val="24"/>
+          <w:szCs w:val="24"/>
+        </w:rPr>
+      </w:pPr>
+      <w:r>
+        <w:rPr>
+          <w:rFonts w:ascii="Times New Roman" w:eastAsia="Times New Roman" w:hAnsi="Times New Roman" w:cs="Times New Roman"/>
+          <w:i/>
+          <w:iCs/>
+          <w:sz w:val="24"/>
+          <w:szCs w:val="24"/>
+        </w:rPr>
+        <w:t>Distance Table:</w:t>
+      </w:r>
+      <w:r>
+        <w:rPr>
+          <w:rFonts w:ascii="Times New Roman" w:eastAsia="Times New Roman" w:hAnsi="Times New Roman" w:cs="Times New Roman"/>
+          <w:sz w:val="24"/>
+          <w:szCs w:val="24"/>
+        </w:rPr>
+        <w:t xml:space="preserve"> </w:t>
+      </w:r>
+      <w:r>
+        <w:rPr>
+          <w:rFonts w:ascii="Courier New" w:eastAsia="Times New Roman" w:hAnsi="Courier New" w:cs="Courier New"/>
+          <w:sz w:val="20"/>
+        </w:rPr>
+        <w:t>A: 0</w:t>
+      </w:r>
+      <w:r>
+        <w:rPr>
+          <w:rFonts w:ascii="Times New Roman" w:eastAsia="Times New Roman" w:hAnsi="Times New Roman" w:cs="Times New Roman"/>
+          <w:sz w:val="24"/>
+          <w:szCs w:val="24"/>
+        </w:rPr>
+        <w:t xml:space="preserve">, </w:t>
+      </w:r>
+      <w:r>
+        <w:rPr>
+          <w:rFonts w:ascii="Courier New" w:eastAsia="Times New Roman" w:hAnsi="Courier New" w:cs="Courier New"/>
+          <w:sz w:val="20"/>
+        </w:rPr>
+        <w:t>B: 3</w:t>
+      </w:r>
+      <w:r>
+        <w:rPr>
+          <w:rFonts w:ascii="Times New Roman" w:eastAsia="Times New Roman" w:hAnsi="Times New Roman" w:cs="Times New Roman"/>
+          <w:sz w:val="24"/>
+          <w:szCs w:val="24"/>
+        </w:rPr>
+        <w:t xml:space="preserve">, </w:t>
+      </w:r>
+      <w:r>
+        <w:rPr>
+          <w:rFonts w:ascii="Courier New" w:eastAsia="Times New Roman" w:hAnsi="Courier New" w:cs="Courier New"/>
+          <w:sz w:val="20"/>
+        </w:rPr>
+        <w:t>C: 1</w:t>
+      </w:r>
+      <w:r>
+        <w:rPr>
+          <w:rFonts w:ascii="Times New Roman" w:eastAsia="Times New Roman" w:hAnsi="Times New Roman" w:cs="Times New Roman"/>
+          <w:sz w:val="24"/>
+          <w:szCs w:val="24"/>
+        </w:rPr>
+        <w:t xml:space="preserve">, </w:t>
+      </w:r>
+      <w:r>
+        <w:rPr>
+          <w:rFonts w:ascii="Courier New" w:eastAsia="Times New Roman" w:hAnsi="Courier New" w:cs="Courier New"/>
+          <w:sz w:val="20"/>
+        </w:rPr>
+        <w:t>D: 6</w:t>
+      </w:r>
+    </w:p>
+    <w:p>
+      <w:pPr>
+        <w:numPr>
+          <w:ilvl w:val="0"/>
+          <w:numId w:val="47"/>
+        </w:numPr>
+        <w:spacing w:before="100" w:beforeAutospacing="1" w:after="100" w:afterAutospacing="1" w:line="240" w:lineRule="auto"/>
+        <w:rPr>
+          <w:rFonts w:ascii="Times New Roman" w:eastAsia="Times New Roman" w:hAnsi="Times New Roman" w:cs="Times New Roman"/>
+          <w:sz w:val="24"/>
+          <w:szCs w:val="24"/>
+        </w:rPr>
+      </w:pPr>
+      <w:r>
+        <w:rPr>
+          <w:rFonts w:ascii="Times New Roman" w:eastAsia="Times New Roman" w:hAnsi="Times New Roman" w:cs="Times New Roman"/>
+          <w:i/>
+          <w:iCs/>
+          <w:sz w:val="24"/>
+          <w:szCs w:val="24"/>
+        </w:rPr>
+        <w:t>Remove B from unvisited.</w:t>
+      </w:r>
+    </w:p>
+    <w:p>
+      <w:pPr>
+        <w:spacing w:after="0" w:line="240" w:lineRule="auto"/>
+        <w:rPr>
+          <w:rFonts w:ascii="Times New Roman" w:eastAsia="Times New Roman" w:hAnsi="Times New Roman" w:cs="Times New Roman"/>
+          <w:sz w:val="24"/>
+          <w:szCs w:val="24"/>
+        </w:rPr>
+      </w:pPr>
+      <w:proofErr w:type="gramStart"/>
+      <w:r>
+        <w:rPr>
+          <w:rFonts w:ascii="Times New Roman" w:eastAsia="Times New Roman" w:hAnsi="Times New Roman" w:cs="Times New Roman"/>
+          <w:b/>
+          <w:bCs/>
+          <w:sz w:val="24"/>
+          <w:szCs w:val="24"/>
+        </w:rPr>
+        <w:t>4.Step</w:t>
+      </w:r>
+      <w:proofErr w:type="gramEnd"/>
+      <w:r>
+        <w:rPr>
+          <w:rFonts w:ascii="Times New Roman" w:eastAsia="Times New Roman" w:hAnsi="Times New Roman" w:cs="Times New Roman"/>
+          <w:b/>
+          <w:bCs/>
+          <w:sz w:val="24"/>
+          <w:szCs w:val="24"/>
+        </w:rPr>
+        <w:t xml:space="preserve"> 4: Final </w:t>
+      </w:r>
+      <w:proofErr w:type="spellStart"/>
+      <w:r>
+        <w:rPr>
+          <w:rFonts w:ascii="Times New Roman" w:eastAsia="Times New Roman" w:hAnsi="Times New Roman" w:cs="Times New Roman"/>
+          <w:b/>
+          <w:bCs/>
+          <w:sz w:val="24"/>
+          <w:szCs w:val="24"/>
+        </w:rPr>
+        <w:t>Node:</w:t>
+      </w:r>
+      <w:r>
+        <w:rPr>
+          <w:rFonts w:ascii="Times New Roman" w:eastAsia="Times New Roman" w:hAnsi="Times New Roman" w:cs="Times New Roman"/>
+          <w:sz w:val="24"/>
+          <w:szCs w:val="24"/>
+        </w:rPr>
+        <w:t>Unvisited</w:t>
+      </w:r>
+      <w:proofErr w:type="spellEnd"/>
+      <w:r>
+        <w:rPr>
+          <w:rFonts w:ascii="Times New Roman" w:eastAsia="Times New Roman" w:hAnsi="Times New Roman" w:cs="Times New Roman"/>
+          <w:sz w:val="24"/>
+          <w:szCs w:val="24"/>
+        </w:rPr>
+        <w:t>: {D}.</w:t>
+      </w:r>
+    </w:p>
+    <w:p>
+      <w:pPr>
+        <w:spacing w:before="100" w:beforeAutospacing="1" w:after="100" w:afterAutospacing="1" w:line="240" w:lineRule="auto"/>
+        <w:rPr>
+          <w:rFonts w:ascii="Times New Roman" w:eastAsia="Times New Roman" w:hAnsi="Times New Roman" w:cs="Times New Roman"/>
+          <w:sz w:val="24"/>
+          <w:szCs w:val="24"/>
+        </w:rPr>
+      </w:pPr>
+      <w:r>
+        <w:rPr>
+          <w:rFonts w:ascii="Times New Roman" w:eastAsia="Times New Roman" w:hAnsi="Times New Roman" w:cs="Times New Roman"/>
+          <w:sz w:val="24"/>
+          <w:szCs w:val="24"/>
+        </w:rPr>
+        <w:t xml:space="preserve">Only </w:t>
+      </w:r>
+      <w:r>
+        <w:rPr>
+          <w:rFonts w:ascii="Times New Roman" w:eastAsia="Times New Roman" w:hAnsi="Times New Roman" w:cs="Times New Roman"/>
+          <w:b/>
+          <w:bCs/>
+          <w:sz w:val="24"/>
+          <w:szCs w:val="24"/>
+        </w:rPr>
+        <w:t>D (6)</w:t>
+      </w:r>
+      <w:r>
+        <w:rPr>
+          <w:rFonts w:ascii="Times New Roman" w:eastAsia="Times New Roman" w:hAnsi="Times New Roman" w:cs="Times New Roman"/>
+          <w:sz w:val="24"/>
+          <w:szCs w:val="24"/>
+        </w:rPr>
+        <w:t xml:space="preserve"> is left. It has no unvisited neighbors to check. </w:t>
+      </w:r>
+      <w:proofErr w:type="gramStart"/>
+      <w:r>
+        <w:rPr>
+          <w:rFonts w:ascii="Times New Roman" w:eastAsia="Times New Roman" w:hAnsi="Times New Roman" w:cs="Times New Roman"/>
+          <w:sz w:val="24"/>
+          <w:szCs w:val="24"/>
+        </w:rPr>
+        <w:t>Remove D.</w:t>
+      </w:r>
+      <w:proofErr w:type="gramEnd"/>
+    </w:p>
+    <w:p>
+      <w:pPr>
+        <w:spacing w:before="100" w:beforeAutospacing="1" w:after="100" w:afterAutospacing="1" w:line="240" w:lineRule="auto"/>
+        <w:rPr>
+          <w:rFonts w:ascii="Times New Roman" w:eastAsia="Times New Roman" w:hAnsi="Times New Roman" w:cs="Times New Roman"/>
+          <w:sz w:val="24"/>
+          <w:szCs w:val="24"/>
+        </w:rPr>
+      </w:pPr>
+      <w:r>
+        <w:rPr>
+          <w:rFonts w:ascii="Times New Roman" w:eastAsia="Times New Roman" w:hAnsi="Times New Roman" w:cs="Times New Roman"/>
+          <w:b/>
+          <w:bCs/>
+          <w:sz w:val="24"/>
+          <w:szCs w:val="24"/>
+        </w:rPr>
+        <w:t>Final Shortest Distances from A:</w:t>
+      </w:r>
+      <w:r>
+        <w:rPr>
+          <w:rFonts w:ascii="Times New Roman" w:eastAsia="Times New Roman" w:hAnsi="Times New Roman" w:cs="Times New Roman"/>
+          <w:sz w:val="24"/>
+          <w:szCs w:val="24"/>
+        </w:rPr>
+        <w:t xml:space="preserve"> * To </w:t>
+      </w:r>
+      <w:r>
+        <w:rPr>
+          <w:rFonts w:ascii="Times New Roman" w:eastAsia="Times New Roman" w:hAnsi="Times New Roman" w:cs="Times New Roman"/>
+          <w:b/>
+          <w:bCs/>
+          <w:sz w:val="24"/>
+          <w:szCs w:val="24"/>
+        </w:rPr>
+        <w:t>B</w:t>
+      </w:r>
+      <w:r>
+        <w:rPr>
+          <w:rFonts w:ascii="Times New Roman" w:eastAsia="Times New Roman" w:hAnsi="Times New Roman" w:cs="Times New Roman"/>
+          <w:sz w:val="24"/>
+          <w:szCs w:val="24"/>
+        </w:rPr>
+        <w:t>: 3 (via A $\</w:t>
+      </w:r>
+      <w:proofErr w:type="spellStart"/>
+      <w:r>
+        <w:rPr>
+          <w:rFonts w:ascii="Times New Roman" w:eastAsia="Times New Roman" w:hAnsi="Times New Roman" w:cs="Times New Roman"/>
+          <w:sz w:val="24"/>
+          <w:szCs w:val="24"/>
+        </w:rPr>
+        <w:t>rightarrow</w:t>
+      </w:r>
+      <w:proofErr w:type="spellEnd"/>
+      <w:r>
+        <w:rPr>
+          <w:rFonts w:ascii="Times New Roman" w:eastAsia="Times New Roman" w:hAnsi="Times New Roman" w:cs="Times New Roman"/>
+          <w:sz w:val="24"/>
+          <w:szCs w:val="24"/>
+        </w:rPr>
+        <w:t>$ C $\</w:t>
+      </w:r>
+      <w:proofErr w:type="spellStart"/>
+      <w:r>
+        <w:rPr>
+          <w:rFonts w:ascii="Times New Roman" w:eastAsia="Times New Roman" w:hAnsi="Times New Roman" w:cs="Times New Roman"/>
+          <w:sz w:val="24"/>
+          <w:szCs w:val="24"/>
+        </w:rPr>
+        <w:t>rightarrow</w:t>
+      </w:r>
+      <w:proofErr w:type="spellEnd"/>
+      <w:r>
+        <w:rPr>
+          <w:rFonts w:ascii="Times New Roman" w:eastAsia="Times New Roman" w:hAnsi="Times New Roman" w:cs="Times New Roman"/>
+          <w:sz w:val="24"/>
+          <w:szCs w:val="24"/>
+        </w:rPr>
+        <w:t>$ B)</w:t>
+      </w:r>
+    </w:p>
+    <w:p>
+      <w:pPr>
+        <w:numPr>
+          <w:ilvl w:val="0"/>
+          <w:numId w:val="48"/>
+        </w:numPr>
+        <w:spacing w:before="100" w:beforeAutospacing="1" w:after="100" w:afterAutospacing="1" w:line="240" w:lineRule="auto"/>
+        <w:rPr>
+          <w:rFonts w:ascii="Times New Roman" w:eastAsia="Times New Roman" w:hAnsi="Times New Roman" w:cs="Times New Roman"/>
+          <w:sz w:val="24"/>
+          <w:szCs w:val="24"/>
+        </w:rPr>
+      </w:pPr>
+      <w:r>
+        <w:rPr>
+          <w:rFonts w:ascii="Times New Roman" w:eastAsia="Times New Roman" w:hAnsi="Times New Roman" w:cs="Times New Roman"/>
+          <w:sz w:val="24"/>
+          <w:szCs w:val="24"/>
+        </w:rPr>
+        <w:lastRenderedPageBreak/>
+        <w:t xml:space="preserve">To </w:t>
+      </w:r>
+      <w:r>
+        <w:rPr>
+          <w:rFonts w:ascii="Times New Roman" w:eastAsia="Times New Roman" w:hAnsi="Times New Roman" w:cs="Times New Roman"/>
+          <w:b/>
+          <w:bCs/>
+          <w:sz w:val="24"/>
+          <w:szCs w:val="24"/>
+        </w:rPr>
+        <w:t>C</w:t>
+      </w:r>
+      <w:r>
+        <w:rPr>
+          <w:rFonts w:ascii="Times New Roman" w:eastAsia="Times New Roman" w:hAnsi="Times New Roman" w:cs="Times New Roman"/>
+          <w:sz w:val="24"/>
+          <w:szCs w:val="24"/>
+        </w:rPr>
+        <w:t>: 1 (via A $\</w:t>
+      </w:r>
+      <w:proofErr w:type="spellStart"/>
+      <w:r>
+        <w:rPr>
+          <w:rFonts w:ascii="Times New Roman" w:eastAsia="Times New Roman" w:hAnsi="Times New Roman" w:cs="Times New Roman"/>
+          <w:sz w:val="24"/>
+          <w:szCs w:val="24"/>
+        </w:rPr>
+        <w:t>rightarrow</w:t>
+      </w:r>
+      <w:proofErr w:type="spellEnd"/>
+      <w:r>
+        <w:rPr>
+          <w:rFonts w:ascii="Times New Roman" w:eastAsia="Times New Roman" w:hAnsi="Times New Roman" w:cs="Times New Roman"/>
+          <w:sz w:val="24"/>
+          <w:szCs w:val="24"/>
+        </w:rPr>
+        <w:t>$ C)</w:t>
+      </w:r>
+    </w:p>
+    <w:p>
+      <w:pPr>
+        <w:numPr>
+          <w:ilvl w:val="0"/>
+          <w:numId w:val="48"/>
+        </w:numPr>
+        <w:spacing w:before="100" w:beforeAutospacing="1" w:after="100" w:afterAutospacing="1" w:line="240" w:lineRule="auto"/>
+        <w:rPr>
+          <w:rFonts w:ascii="Times New Roman" w:eastAsia="Times New Roman" w:hAnsi="Times New Roman" w:cs="Times New Roman"/>
+          <w:sz w:val="24"/>
+          <w:szCs w:val="24"/>
+        </w:rPr>
+      </w:pPr>
+      <w:r>
+        <w:rPr>
+          <w:rFonts w:ascii="Times New Roman" w:eastAsia="Times New Roman" w:hAnsi="Times New Roman" w:cs="Times New Roman"/>
+          <w:sz w:val="24"/>
+          <w:szCs w:val="24"/>
+        </w:rPr>
+        <w:t xml:space="preserve">To </w:t>
+      </w:r>
+      <w:r>
+        <w:rPr>
+          <w:rFonts w:ascii="Times New Roman" w:eastAsia="Times New Roman" w:hAnsi="Times New Roman" w:cs="Times New Roman"/>
+          <w:b/>
+          <w:bCs/>
+          <w:sz w:val="24"/>
+          <w:szCs w:val="24"/>
+        </w:rPr>
+        <w:t>D</w:t>
+      </w:r>
+      <w:r>
+        <w:rPr>
+          <w:rFonts w:ascii="Times New Roman" w:eastAsia="Times New Roman" w:hAnsi="Times New Roman" w:cs="Times New Roman"/>
+          <w:sz w:val="24"/>
+          <w:szCs w:val="24"/>
+        </w:rPr>
+        <w:t>: 6 (via A $\</w:t>
+      </w:r>
+      <w:proofErr w:type="spellStart"/>
+      <w:r>
+        <w:rPr>
+          <w:rFonts w:ascii="Times New Roman" w:eastAsia="Times New Roman" w:hAnsi="Times New Roman" w:cs="Times New Roman"/>
+          <w:sz w:val="24"/>
+          <w:szCs w:val="24"/>
+        </w:rPr>
+        <w:t>rightarrow</w:t>
+      </w:r>
+      <w:proofErr w:type="spellEnd"/>
+      <w:r>
+        <w:rPr>
+          <w:rFonts w:ascii="Times New Roman" w:eastAsia="Times New Roman" w:hAnsi="Times New Roman" w:cs="Times New Roman"/>
+          <w:sz w:val="24"/>
+          <w:szCs w:val="24"/>
+        </w:rPr>
+        <w:t>$ C $\</w:t>
+      </w:r>
+      <w:proofErr w:type="spellStart"/>
+      <w:r>
+        <w:rPr>
+          <w:rFonts w:ascii="Times New Roman" w:eastAsia="Times New Roman" w:hAnsi="Times New Roman" w:cs="Times New Roman"/>
+          <w:sz w:val="24"/>
+          <w:szCs w:val="24"/>
+        </w:rPr>
+        <w:t>rightarrow</w:t>
+      </w:r>
+      <w:proofErr w:type="spellEnd"/>
+      <w:r>
+        <w:rPr>
+          <w:rFonts w:ascii="Times New Roman" w:eastAsia="Times New Roman" w:hAnsi="Times New Roman" w:cs="Times New Roman"/>
+          <w:sz w:val="24"/>
+          <w:szCs w:val="24"/>
+        </w:rPr>
+        <w:t>$ B $\</w:t>
+      </w:r>
+      <w:proofErr w:type="spellStart"/>
+      <w:r>
+        <w:rPr>
+          <w:rFonts w:ascii="Times New Roman" w:eastAsia="Times New Roman" w:hAnsi="Times New Roman" w:cs="Times New Roman"/>
+          <w:sz w:val="24"/>
+          <w:szCs w:val="24"/>
+        </w:rPr>
+        <w:t>rightarrow</w:t>
+      </w:r>
+      <w:proofErr w:type="spellEnd"/>
+      <w:r>
+        <w:rPr>
+          <w:rFonts w:ascii="Times New Roman" w:eastAsia="Times New Roman" w:hAnsi="Times New Roman" w:cs="Times New Roman"/>
+          <w:sz w:val="24"/>
+          <w:szCs w:val="24"/>
+        </w:rPr>
+        <w:t>$ D)</w:t>
+      </w:r>
+    </w:p>
+    <w:p>
+      <w:pPr>
+        <w:spacing w:before="100" w:beforeAutospacing="1" w:after="100" w:afterAutospacing="1" w:line="240" w:lineRule="auto"/>
+        <w:outlineLvl w:val="1"/>
+        <w:rPr>
+          <w:rFonts w:ascii="Times New Roman" w:eastAsia="Times New Roman" w:hAnsi="Times New Roman" w:cs="Times New Roman"/>
+          <w:b/>
+          <w:bCs/>
+          <w:sz w:val="36"/>
+          <w:szCs w:val="36"/>
+        </w:rPr>
+      </w:pPr>
+      <w:r>
+        <w:rPr>
+          <w:rFonts w:ascii="Times New Roman" w:eastAsia="Times New Roman" w:hAnsi="Times New Roman" w:cs="Times New Roman"/>
+          <w:b/>
+          <w:bCs/>
+          <w:sz w:val="36"/>
+          <w:szCs w:val="36"/>
+        </w:rPr>
+        <w:t>Complexity Analysis</w:t>
+      </w:r>
+    </w:p>
+    <w:p>
+      <w:pPr>
+        <w:numPr>
+          <w:ilvl w:val="0"/>
+          <w:numId w:val="49"/>
+        </w:numPr>
+        <w:spacing w:before="100" w:beforeAutospacing="1" w:after="100" w:afterAutospacing="1" w:line="240" w:lineRule="auto"/>
+        <w:rPr>
+          <w:rFonts w:ascii="Times New Roman" w:eastAsia="Times New Roman" w:hAnsi="Times New Roman" w:cs="Times New Roman"/>
+          <w:sz w:val="24"/>
+          <w:szCs w:val="24"/>
+        </w:rPr>
+      </w:pPr>
+      <w:r>
+        <w:rPr>
+          <w:rFonts w:ascii="Times New Roman" w:eastAsia="Times New Roman" w:hAnsi="Times New Roman" w:cs="Times New Roman"/>
+          <w:b/>
+          <w:bCs/>
+          <w:sz w:val="24"/>
+          <w:szCs w:val="24"/>
+        </w:rPr>
+        <w:t>Time Complexity:</w:t>
+      </w:r>
+      <w:r>
+        <w:rPr>
+          <w:rFonts w:ascii="Times New Roman" w:eastAsia="Times New Roman" w:hAnsi="Times New Roman" w:cs="Times New Roman"/>
+          <w:sz w:val="24"/>
+          <w:szCs w:val="24"/>
+        </w:rPr>
+        <w:t xml:space="preserve"> </w:t>
+      </w:r>
+      <w:r>
+        <w:rPr>
+          <w:rFonts w:ascii="Times New Roman" w:eastAsia="Times New Roman" w:hAnsi="Times New Roman" w:cs="Times New Roman"/>
+          <w:b/>
+          <w:bCs/>
+          <w:sz w:val="24"/>
+          <w:szCs w:val="24"/>
+        </w:rPr>
+        <w:t>$</w:t>
+      </w:r>
+      <w:proofErr w:type="gramStart"/>
+      <w:r>
+        <w:rPr>
+          <w:rFonts w:ascii="Times New Roman" w:eastAsia="Times New Roman" w:hAnsi="Times New Roman" w:cs="Times New Roman"/>
+          <w:b/>
+          <w:bCs/>
+          <w:sz w:val="24"/>
+          <w:szCs w:val="24"/>
+        </w:rPr>
+        <w:t>O(</w:t>
+      </w:r>
+      <w:proofErr w:type="gramEnd"/>
+      <w:r>
+        <w:rPr>
+          <w:rFonts w:ascii="Times New Roman" w:eastAsia="Times New Roman" w:hAnsi="Times New Roman" w:cs="Times New Roman"/>
+          <w:b/>
+          <w:bCs/>
+          <w:sz w:val="24"/>
+          <w:szCs w:val="24"/>
+        </w:rPr>
+        <w:t>(V + E) \log V)$</w:t>
+      </w:r>
+      <w:r>
+        <w:rPr>
+          <w:rFonts w:ascii="Times New Roman" w:eastAsia="Times New Roman" w:hAnsi="Times New Roman" w:cs="Times New Roman"/>
+          <w:sz w:val="24"/>
+          <w:szCs w:val="24"/>
+        </w:rPr>
+        <w:t xml:space="preserve"> when using a binary min-heap, where $V$ is the number of vertices and $E$ is the number of edges. Extracting the minimum node takes $</w:t>
+      </w:r>
+      <w:proofErr w:type="gramStart"/>
+      <w:r>
+        <w:rPr>
+          <w:rFonts w:ascii="Times New Roman" w:eastAsia="Times New Roman" w:hAnsi="Times New Roman" w:cs="Times New Roman"/>
+          <w:sz w:val="24"/>
+          <w:szCs w:val="24"/>
+        </w:rPr>
+        <w:t>O(</w:t>
+      </w:r>
+      <w:proofErr w:type="gramEnd"/>
+      <w:r>
+        <w:rPr>
+          <w:rFonts w:ascii="Times New Roman" w:eastAsia="Times New Roman" w:hAnsi="Times New Roman" w:cs="Times New Roman"/>
+          <w:sz w:val="24"/>
+          <w:szCs w:val="24"/>
+        </w:rPr>
+        <w:t>\log V)$ and we can relax up to $E$ edges total across the run.</w:t>
+      </w:r>
+    </w:p>
+    <w:p>
+      <w:pPr>
+        <w:numPr>
+          <w:ilvl w:val="0"/>
+          <w:numId w:val="49"/>
+        </w:numPr>
+        <w:spacing w:before="100" w:beforeAutospacing="1" w:after="100" w:afterAutospacing="1" w:line="240" w:lineRule="auto"/>
+        <w:rPr>
+          <w:rFonts w:ascii="Times New Roman" w:eastAsia="Times New Roman" w:hAnsi="Times New Roman" w:cs="Times New Roman"/>
+          <w:sz w:val="24"/>
+          <w:szCs w:val="24"/>
+        </w:rPr>
+      </w:pPr>
+      <w:r>
+        <w:rPr>
+          <w:rFonts w:ascii="Times New Roman" w:eastAsia="Times New Roman" w:hAnsi="Times New Roman" w:cs="Times New Roman"/>
+          <w:b/>
+          <w:bCs/>
+          <w:sz w:val="24"/>
+          <w:szCs w:val="24"/>
+        </w:rPr>
+        <w:t>Space Complexity:</w:t>
+      </w:r>
+      <w:r>
+        <w:rPr>
+          <w:rFonts w:ascii="Times New Roman" w:eastAsia="Times New Roman" w:hAnsi="Times New Roman" w:cs="Times New Roman"/>
+          <w:sz w:val="24"/>
+          <w:szCs w:val="24"/>
+        </w:rPr>
+        <w:t xml:space="preserve"> </w:t>
+      </w:r>
+      <w:r>
+        <w:rPr>
+          <w:rFonts w:ascii="Times New Roman" w:eastAsia="Times New Roman" w:hAnsi="Times New Roman" w:cs="Times New Roman"/>
+          <w:b/>
+          <w:bCs/>
+          <w:sz w:val="24"/>
+          <w:szCs w:val="24"/>
+        </w:rPr>
+        <w:t>$</w:t>
+      </w:r>
+      <w:proofErr w:type="gramStart"/>
+      <w:r>
+        <w:rPr>
+          <w:rFonts w:ascii="Times New Roman" w:eastAsia="Times New Roman" w:hAnsi="Times New Roman" w:cs="Times New Roman"/>
+          <w:b/>
+          <w:bCs/>
+          <w:sz w:val="24"/>
+          <w:szCs w:val="24"/>
+        </w:rPr>
+        <w:t>O(</w:t>
+      </w:r>
+      <w:proofErr w:type="gramEnd"/>
+      <w:r>
+        <w:rPr>
+          <w:rFonts w:ascii="Times New Roman" w:eastAsia="Times New Roman" w:hAnsi="Times New Roman" w:cs="Times New Roman"/>
+          <w:b/>
+          <w:bCs/>
+          <w:sz w:val="24"/>
+          <w:szCs w:val="24"/>
+        </w:rPr>
+        <w:t>V + E)$</w:t>
+      </w:r>
+      <w:r>
+        <w:rPr>
+          <w:rFonts w:ascii="Times New Roman" w:eastAsia="Times New Roman" w:hAnsi="Times New Roman" w:cs="Times New Roman"/>
+          <w:sz w:val="24"/>
+          <w:szCs w:val="24"/>
+        </w:rPr>
+        <w:t xml:space="preserve"> to map the graph structure and maintain the </w:t>
+      </w:r>
+      <w:r>
+        <w:rPr>
+          <w:rFonts w:ascii="Courier New" w:eastAsia="Times New Roman" w:hAnsi="Courier New" w:cs="Courier New"/>
+          <w:sz w:val="20"/>
+        </w:rPr>
+        <w:t>distances</w:t>
+      </w:r>
+      <w:r>
+        <w:rPr>
+          <w:rFonts w:ascii="Times New Roman" w:eastAsia="Times New Roman" w:hAnsi="Times New Roman" w:cs="Times New Roman"/>
+          <w:sz w:val="24"/>
+          <w:szCs w:val="24"/>
+        </w:rPr>
+        <w:t xml:space="preserve"> array tracking infrastructure.</w:t>
+      </w:r>
+    </w:p>
+    <w:p>
+      <w:pPr>
+        <w:jc w:val="center"/>
+        <w:rPr>
+          <w:b/>
+          <w:sz w:val="36"/>
+          <w:szCs w:val="36"/>
+        </w:rPr>
+      </w:pPr>
+    </w:p>
     <w:sectPr>
       <w:pgSz w:w="12240" w:h="15840"/>
       <w:pgMar w:top="1440" w:right="1440" w:bottom="1440" w:left="1440" w:header="720" w:footer="720" w:gutter="0"/>
@@ -14738,6 +16979,155 @@
     </w:lvl>
   </w:abstractNum>
   <w:abstractNum w:abstractNumId="10">
+    <w:nsid w:val="1DF14C25"/>
+    <w:multiLevelType w:val="multilevel"/>
+    <w:tmpl w:val="DFDEC914"/>
+    <w:lvl w:ilvl="0">
+      <w:start w:val="1"/>
+      <w:numFmt w:val="bullet"/>
+      <w:lvlText w:val=""/>
+      <w:lvlJc w:val="left"/>
+      <w:pPr>
+        <w:tabs>
+          <w:tab w:val="num" w:pos="720"/>
+        </w:tabs>
+        <w:ind w:left="720" w:hanging="360"/>
+      </w:pPr>
+      <w:rPr>
+        <w:rFonts w:ascii="Symbol" w:hAnsi="Symbol" w:hint="default"/>
+        <w:sz w:val="20"/>
+      </w:rPr>
+    </w:lvl>
+    <w:lvl w:ilvl="1" w:tentative="1">
+      <w:start w:val="1"/>
+      <w:numFmt w:val="bullet"/>
+      <w:lvlText w:val="o"/>
+      <w:lvlJc w:val="left"/>
+      <w:pPr>
+        <w:tabs>
+          <w:tab w:val="num" w:pos="1440"/>
+        </w:tabs>
+        <w:ind w:left="1440" w:hanging="360"/>
+      </w:pPr>
+      <w:rPr>
+        <w:rFonts w:ascii="Courier New" w:hAnsi="Courier New" w:hint="default"/>
+        <w:sz w:val="20"/>
+      </w:rPr>
+    </w:lvl>
+    <w:lvl w:ilvl="2" w:tentative="1">
+      <w:start w:val="1"/>
+      <w:numFmt w:val="bullet"/>
+      <w:lvlText w:val=""/>
+      <w:lvlJc w:val="left"/>
+      <w:pPr>
+        <w:tabs>
+          <w:tab w:val="num" w:pos="2160"/>
+        </w:tabs>
+        <w:ind w:left="2160" w:hanging="360"/>
+      </w:pPr>
+      <w:rPr>
+        <w:rFonts w:ascii="Wingdings" w:hAnsi="Wingdings" w:hint="default"/>
+        <w:sz w:val="20"/>
+      </w:rPr>
+    </w:lvl>
+    <w:lvl w:ilvl="3" w:tentative="1">
+      <w:start w:val="1"/>
+      <w:numFmt w:val="bullet"/>
+      <w:lvlText w:val=""/>
+      <w:lvlJc w:val="left"/>
+      <w:pPr>
+        <w:tabs>
+          <w:tab w:val="num" w:pos="2880"/>
+        </w:tabs>
+        <w:ind w:left="2880" w:hanging="360"/>
+      </w:pPr>
+      <w:rPr>
+        <w:rFonts w:ascii="Wingdings" w:hAnsi="Wingdings" w:hint="default"/>
+        <w:sz w:val="20"/>
+      </w:rPr>
+    </w:lvl>
+    <w:lvl w:ilvl="4" w:tentative="1">
+      <w:start w:val="1"/>
+      <w:numFmt w:val="bullet"/>
+      <w:lvlText w:val=""/>
+      <w:lvlJc w:val="left"/>
+      <w:pPr>
+        <w:tabs>
+          <w:tab w:val="num" w:pos="3600"/>
+        </w:tabs>
+        <w:ind w:left="3600" w:hanging="360"/>
+      </w:pPr>
+      <w:rPr>
+        <w:rFonts w:ascii="Wingdings" w:hAnsi="Wingdings" w:hint="default"/>
+        <w:sz w:val="20"/>
+      </w:rPr>
+    </w:lvl>
+    <w:lvl w:ilvl="5" w:tentative="1">
+      <w:start w:val="1"/>
+      <w:numFmt w:val="bullet"/>
+      <w:lvlText w:val=""/>
+      <w:lvlJc w:val="left"/>
+      <w:pPr>
+        <w:tabs>
+          <w:tab w:val="num" w:pos="4320"/>
+        </w:tabs>
+        <w:ind w:left="4320" w:hanging="360"/>
+      </w:pPr>
+      <w:rPr>
+        <w:rFonts w:ascii="Wingdings" w:hAnsi="Wingdings" w:hint="default"/>
+        <w:sz w:val="20"/>
+      </w:rPr>
+    </w:lvl>
+    <w:lvl w:ilvl="6" w:tentative="1">
+      <w:start w:val="1"/>
+      <w:numFmt w:val="bullet"/>
+      <w:lvlText w:val=""/>
+      <w:lvlJc w:val="left"/>
+      <w:pPr>
+        <w:tabs>
+          <w:tab w:val="num" w:pos="5040"/>
+        </w:tabs>
+        <w:ind w:left="5040" w:hanging="360"/>
+      </w:pPr>
+      <w:rPr>
+        <w:rFonts w:ascii="Wingdings" w:hAnsi="Wingdings" w:hint="default"/>
+        <w:sz w:val="20"/>
+      </w:rPr>
+    </w:lvl>
+    <w:lvl w:ilvl="7" w:tentative="1">
+      <w:start w:val="1"/>
+      <w:numFmt w:val="bullet"/>
+      <w:lvlText w:val=""/>
+      <w:lvlJc w:val="left"/>
+      <w:pPr>
+        <w:tabs>
+          <w:tab w:val="num" w:pos="5760"/>
+        </w:tabs>
+        <w:ind w:left="5760" w:hanging="360"/>
+      </w:pPr>
+      <w:rPr>
+        <w:rFonts w:ascii="Wingdings" w:hAnsi="Wingdings" w:hint="default"/>
+        <w:sz w:val="20"/>
+      </w:rPr>
+    </w:lvl>
+    <w:lvl w:ilvl="8" w:tentative="1">
+      <w:start w:val="1"/>
+      <w:numFmt w:val="bullet"/>
+      <w:lvlText w:val=""/>
+      <w:lvlJc w:val="left"/>
+      <w:pPr>
+        <w:tabs>
+          <w:tab w:val="num" w:pos="6480"/>
+        </w:tabs>
+        <w:ind w:left="6480" w:hanging="360"/>
+      </w:pPr>
+      <w:rPr>
+        <w:rFonts w:ascii="Wingdings" w:hAnsi="Wingdings" w:hint="default"/>
+        <w:sz w:val="20"/>
+      </w:rPr>
+    </w:lvl>
+  </w:abstractNum>
+  <w:abstractNum w:abstractNumId="11">
     <w:nsid w:val="1E0D074A"/>
     <w:multiLevelType w:val="multilevel"/>
     <w:tmpl w:val="8F0C20B6"/>
@@ -14886,7 +17276,7 @@
       </w:rPr>
     </w:lvl>
   </w:abstractNum>
-  <w:abstractNum w:abstractNumId="11">
+  <w:abstractNum w:abstractNumId="12">
     <w:nsid w:val="1E641BBE"/>
     <w:multiLevelType w:val="multilevel"/>
     <w:tmpl w:val="00449832"/>
@@ -15035,7 +17425,156 @@
       </w:rPr>
     </w:lvl>
   </w:abstractNum>
-  <w:abstractNum w:abstractNumId="12">
+  <w:abstractNum w:abstractNumId="13">
+    <w:nsid w:val="1FC90720"/>
+    <w:multiLevelType w:val="multilevel"/>
+    <w:tmpl w:val="2FFAFD74"/>
+    <w:lvl w:ilvl="0">
+      <w:start w:val="1"/>
+      <w:numFmt w:val="bullet"/>
+      <w:lvlText w:val=""/>
+      <w:lvlJc w:val="left"/>
+      <w:pPr>
+        <w:tabs>
+          <w:tab w:val="num" w:pos="720"/>
+        </w:tabs>
+        <w:ind w:left="720" w:hanging="360"/>
+      </w:pPr>
+      <w:rPr>
+        <w:rFonts w:ascii="Symbol" w:hAnsi="Symbol" w:hint="default"/>
+        <w:sz w:val="20"/>
+      </w:rPr>
+    </w:lvl>
+    <w:lvl w:ilvl="1">
+      <w:start w:val="1"/>
+      <w:numFmt w:val="bullet"/>
+      <w:lvlText w:val="o"/>
+      <w:lvlJc w:val="left"/>
+      <w:pPr>
+        <w:tabs>
+          <w:tab w:val="num" w:pos="1440"/>
+        </w:tabs>
+        <w:ind w:left="1440" w:hanging="360"/>
+      </w:pPr>
+      <w:rPr>
+        <w:rFonts w:ascii="Courier New" w:hAnsi="Courier New" w:hint="default"/>
+        <w:sz w:val="20"/>
+      </w:rPr>
+    </w:lvl>
+    <w:lvl w:ilvl="2" w:tentative="1">
+      <w:start w:val="1"/>
+      <w:numFmt w:val="bullet"/>
+      <w:lvlText w:val=""/>
+      <w:lvlJc w:val="left"/>
+      <w:pPr>
+        <w:tabs>
+          <w:tab w:val="num" w:pos="2160"/>
+        </w:tabs>
+        <w:ind w:left="2160" w:hanging="360"/>
+      </w:pPr>
+      <w:rPr>
+        <w:rFonts w:ascii="Wingdings" w:hAnsi="Wingdings" w:hint="default"/>
+        <w:sz w:val="20"/>
+      </w:rPr>
+    </w:lvl>
+    <w:lvl w:ilvl="3" w:tentative="1">
+      <w:start w:val="1"/>
+      <w:numFmt w:val="bullet"/>
+      <w:lvlText w:val=""/>
+      <w:lvlJc w:val="left"/>
+      <w:pPr>
+        <w:tabs>
+          <w:tab w:val="num" w:pos="2880"/>
+        </w:tabs>
+        <w:ind w:left="2880" w:hanging="360"/>
+      </w:pPr>
+      <w:rPr>
+        <w:rFonts w:ascii="Wingdings" w:hAnsi="Wingdings" w:hint="default"/>
+        <w:sz w:val="20"/>
+      </w:rPr>
+    </w:lvl>
+    <w:lvl w:ilvl="4" w:tentative="1">
+      <w:start w:val="1"/>
+      <w:numFmt w:val="bullet"/>
+      <w:lvlText w:val=""/>
+      <w:lvlJc w:val="left"/>
+      <w:pPr>
+        <w:tabs>
+          <w:tab w:val="num" w:pos="3600"/>
+        </w:tabs>
+        <w:ind w:left="3600" w:hanging="360"/>
+      </w:pPr>
+      <w:rPr>
+        <w:rFonts w:ascii="Wingdings" w:hAnsi="Wingdings" w:hint="default"/>
+        <w:sz w:val="20"/>
+      </w:rPr>
+    </w:lvl>
+    <w:lvl w:ilvl="5" w:tentative="1">
+      <w:start w:val="1"/>
+      <w:numFmt w:val="bullet"/>
+      <w:lvlText w:val=""/>
+      <w:lvlJc w:val="left"/>
+      <w:pPr>
+        <w:tabs>
+          <w:tab w:val="num" w:pos="4320"/>
+        </w:tabs>
+        <w:ind w:left="4320" w:hanging="360"/>
+      </w:pPr>
+      <w:rPr>
+        <w:rFonts w:ascii="Wingdings" w:hAnsi="Wingdings" w:hint="default"/>
+        <w:sz w:val="20"/>
+      </w:rPr>
+    </w:lvl>
+    <w:lvl w:ilvl="6" w:tentative="1">
+      <w:start w:val="1"/>
+      <w:numFmt w:val="bullet"/>
+      <w:lvlText w:val=""/>
+      <w:lvlJc w:val="left"/>
+      <w:pPr>
+        <w:tabs>
+          <w:tab w:val="num" w:pos="5040"/>
+        </w:tabs>
+        <w:ind w:left="5040" w:hanging="360"/>
+      </w:pPr>
+      <w:rPr>
+        <w:rFonts w:ascii="Wingdings" w:hAnsi="Wingdings" w:hint="default"/>
+        <w:sz w:val="20"/>
+      </w:rPr>
+    </w:lvl>
+    <w:lvl w:ilvl="7" w:tentative="1">
+      <w:start w:val="1"/>
+      <w:numFmt w:val="bullet"/>
+      <w:lvlText w:val=""/>
+      <w:lvlJc w:val="left"/>
+      <w:pPr>
+        <w:tabs>
+          <w:tab w:val="num" w:pos="5760"/>
+        </w:tabs>
+        <w:ind w:left="5760" w:hanging="360"/>
+      </w:pPr>
+      <w:rPr>
+        <w:rFonts w:ascii="Wingdings" w:hAnsi="Wingdings" w:hint="default"/>
+        <w:sz w:val="20"/>
+      </w:rPr>
+    </w:lvl>
+    <w:lvl w:ilvl="8" w:tentative="1">
+      <w:start w:val="1"/>
+      <w:numFmt w:val="bullet"/>
+      <w:lvlText w:val=""/>
+      <w:lvlJc w:val="left"/>
+      <w:pPr>
+        <w:tabs>
+          <w:tab w:val="num" w:pos="6480"/>
+        </w:tabs>
+        <w:ind w:left="6480" w:hanging="360"/>
+      </w:pPr>
+      <w:rPr>
+        <w:rFonts w:ascii="Wingdings" w:hAnsi="Wingdings" w:hint="default"/>
+        <w:sz w:val="20"/>
+      </w:rPr>
+    </w:lvl>
+  </w:abstractNum>
+  <w:abstractNum w:abstractNumId="14">
     <w:nsid w:val="211026E1"/>
     <w:multiLevelType w:val="multilevel"/>
     <w:tmpl w:val="7CBE213C"/>
@@ -15184,7 +17723,7 @@
       </w:rPr>
     </w:lvl>
   </w:abstractNum>
-  <w:abstractNum w:abstractNumId="13">
+  <w:abstractNum w:abstractNumId="15">
     <w:nsid w:val="24CD0398"/>
     <w:multiLevelType w:val="multilevel"/>
     <w:tmpl w:val="38F806EA"/>
@@ -15333,7 +17872,7 @@
       </w:rPr>
     </w:lvl>
   </w:abstractNum>
-  <w:abstractNum w:abstractNumId="14">
+  <w:abstractNum w:abstractNumId="16">
     <w:nsid w:val="271F1988"/>
     <w:multiLevelType w:val="multilevel"/>
     <w:tmpl w:val="40F0CA2C"/>
@@ -15482,7 +18021,7 @@
       </w:rPr>
     </w:lvl>
   </w:abstractNum>
-  <w:abstractNum w:abstractNumId="15">
+  <w:abstractNum w:abstractNumId="17">
     <w:nsid w:val="35B81BD5"/>
     <w:multiLevelType w:val="multilevel"/>
     <w:tmpl w:val="F55EB3C8"/>
@@ -15631,7 +18170,7 @@
       </w:rPr>
     </w:lvl>
   </w:abstractNum>
-  <w:abstractNum w:abstractNumId="16">
+  <w:abstractNum w:abstractNumId="18">
     <w:nsid w:val="38BF2FEB"/>
     <w:multiLevelType w:val="multilevel"/>
     <w:tmpl w:val="FFC26ED2"/>
@@ -15780,7 +18319,7 @@
       </w:rPr>
     </w:lvl>
   </w:abstractNum>
-  <w:abstractNum w:abstractNumId="17">
+  <w:abstractNum w:abstractNumId="19">
     <w:nsid w:val="39496B23"/>
     <w:multiLevelType w:val="multilevel"/>
     <w:tmpl w:val="C262B5DA"/>
@@ -15929,7 +18468,7 @@
       </w:rPr>
     </w:lvl>
   </w:abstractNum>
-  <w:abstractNum w:abstractNumId="18">
+  <w:abstractNum w:abstractNumId="20">
     <w:nsid w:val="3B2079EF"/>
     <w:multiLevelType w:val="multilevel"/>
     <w:tmpl w:val="322639DC"/>
@@ -16078,7 +18617,7 @@
       </w:rPr>
     </w:lvl>
   </w:abstractNum>
-  <w:abstractNum w:abstractNumId="19">
+  <w:abstractNum w:abstractNumId="21">
     <w:nsid w:val="3FB53A17"/>
     <w:multiLevelType w:val="multilevel"/>
     <w:tmpl w:val="6412A3A2"/>
@@ -16227,7 +18766,7 @@
       </w:rPr>
     </w:lvl>
   </w:abstractNum>
-  <w:abstractNum w:abstractNumId="20">
+  <w:abstractNum w:abstractNumId="22">
     <w:nsid w:val="41AB7285"/>
     <w:multiLevelType w:val="multilevel"/>
     <w:tmpl w:val="4062696C"/>
@@ -16376,7 +18915,7 @@
       </w:rPr>
     </w:lvl>
   </w:abstractNum>
-  <w:abstractNum w:abstractNumId="21">
+  <w:abstractNum w:abstractNumId="23">
     <w:nsid w:val="44F4035C"/>
     <w:multiLevelType w:val="multilevel"/>
     <w:tmpl w:val="1BD63AE0"/>
@@ -16489,7 +19028,156 @@
       </w:pPr>
     </w:lvl>
   </w:abstractNum>
-  <w:abstractNum w:abstractNumId="22">
+  <w:abstractNum w:abstractNumId="24">
+    <w:nsid w:val="456F6991"/>
+    <w:multiLevelType w:val="multilevel"/>
+    <w:tmpl w:val="7C9CCC80"/>
+    <w:lvl w:ilvl="0">
+      <w:start w:val="1"/>
+      <w:numFmt w:val="bullet"/>
+      <w:lvlText w:val=""/>
+      <w:lvlJc w:val="left"/>
+      <w:pPr>
+        <w:tabs>
+          <w:tab w:val="num" w:pos="720"/>
+        </w:tabs>
+        <w:ind w:left="720" w:hanging="360"/>
+      </w:pPr>
+      <w:rPr>
+        <w:rFonts w:ascii="Symbol" w:hAnsi="Symbol" w:hint="default"/>
+        <w:sz w:val="20"/>
+      </w:rPr>
+    </w:lvl>
+    <w:lvl w:ilvl="1">
+      <w:start w:val="1"/>
+      <w:numFmt w:val="bullet"/>
+      <w:lvlText w:val="o"/>
+      <w:lvlJc w:val="left"/>
+      <w:pPr>
+        <w:tabs>
+          <w:tab w:val="num" w:pos="1440"/>
+        </w:tabs>
+        <w:ind w:left="1440" w:hanging="360"/>
+      </w:pPr>
+      <w:rPr>
+        <w:rFonts w:ascii="Courier New" w:hAnsi="Courier New" w:hint="default"/>
+        <w:sz w:val="20"/>
+      </w:rPr>
+    </w:lvl>
+    <w:lvl w:ilvl="2" w:tentative="1">
+      <w:start w:val="1"/>
+      <w:numFmt w:val="bullet"/>
+      <w:lvlText w:val=""/>
+      <w:lvlJc w:val="left"/>
+      <w:pPr>
+        <w:tabs>
+          <w:tab w:val="num" w:pos="2160"/>
+        </w:tabs>
+        <w:ind w:left="2160" w:hanging="360"/>
+      </w:pPr>
+      <w:rPr>
+        <w:rFonts w:ascii="Wingdings" w:hAnsi="Wingdings" w:hint="default"/>
+        <w:sz w:val="20"/>
+      </w:rPr>
+    </w:lvl>
+    <w:lvl w:ilvl="3" w:tentative="1">
+      <w:start w:val="1"/>
+      <w:numFmt w:val="bullet"/>
+      <w:lvlText w:val=""/>
+      <w:lvlJc w:val="left"/>
+      <w:pPr>
+        <w:tabs>
+          <w:tab w:val="num" w:pos="2880"/>
+        </w:tabs>
+        <w:ind w:left="2880" w:hanging="360"/>
+      </w:pPr>
+      <w:rPr>
+        <w:rFonts w:ascii="Wingdings" w:hAnsi="Wingdings" w:hint="default"/>
+        <w:sz w:val="20"/>
+      </w:rPr>
+    </w:lvl>
+    <w:lvl w:ilvl="4" w:tentative="1">
+      <w:start w:val="1"/>
+      <w:numFmt w:val="bullet"/>
+      <w:lvlText w:val=""/>
+      <w:lvlJc w:val="left"/>
+      <w:pPr>
+        <w:tabs>
+          <w:tab w:val="num" w:pos="3600"/>
+        </w:tabs>
+        <w:ind w:left="3600" w:hanging="360"/>
+      </w:pPr>
+      <w:rPr>
+        <w:rFonts w:ascii="Wingdings" w:hAnsi="Wingdings" w:hint="default"/>
+        <w:sz w:val="20"/>
+      </w:rPr>
+    </w:lvl>
+    <w:lvl w:ilvl="5" w:tentative="1">
+      <w:start w:val="1"/>
+      <w:numFmt w:val="bullet"/>
+      <w:lvlText w:val=""/>
+      <w:lvlJc w:val="left"/>
+      <w:pPr>
+        <w:tabs>
+          <w:tab w:val="num" w:pos="4320"/>
+        </w:tabs>
+        <w:ind w:left="4320" w:hanging="360"/>
+      </w:pPr>
+      <w:rPr>
+        <w:rFonts w:ascii="Wingdings" w:hAnsi="Wingdings" w:hint="default"/>
+        <w:sz w:val="20"/>
+      </w:rPr>
+    </w:lvl>
+    <w:lvl w:ilvl="6" w:tentative="1">
+      <w:start w:val="1"/>
+      <w:numFmt w:val="bullet"/>
+      <w:lvlText w:val=""/>
+      <w:lvlJc w:val="left"/>
+      <w:pPr>
+        <w:tabs>
+          <w:tab w:val="num" w:pos="5040"/>
+        </w:tabs>
+        <w:ind w:left="5040" w:hanging="360"/>
+      </w:pPr>
+      <w:rPr>
+        <w:rFonts w:ascii="Wingdings" w:hAnsi="Wingdings" w:hint="default"/>
+        <w:sz w:val="20"/>
+      </w:rPr>
+    </w:lvl>
+    <w:lvl w:ilvl="7" w:tentative="1">
+      <w:start w:val="1"/>
+      <w:numFmt w:val="bullet"/>
+      <w:lvlText w:val=""/>
+      <w:lvlJc w:val="left"/>
+      <w:pPr>
+        <w:tabs>
+          <w:tab w:val="num" w:pos="5760"/>
+        </w:tabs>
+        <w:ind w:left="5760" w:hanging="360"/>
+      </w:pPr>
+      <w:rPr>
+        <w:rFonts w:ascii="Wingdings" w:hAnsi="Wingdings" w:hint="default"/>
+        <w:sz w:val="20"/>
+      </w:rPr>
+    </w:lvl>
+    <w:lvl w:ilvl="8" w:tentative="1">
+      <w:start w:val="1"/>
+      <w:numFmt w:val="bullet"/>
+      <w:lvlText w:val=""/>
+      <w:lvlJc w:val="left"/>
+      <w:pPr>
+        <w:tabs>
+          <w:tab w:val="num" w:pos="6480"/>
+        </w:tabs>
+        <w:ind w:left="6480" w:hanging="360"/>
+      </w:pPr>
+      <w:rPr>
+        <w:rFonts w:ascii="Wingdings" w:hAnsi="Wingdings" w:hint="default"/>
+        <w:sz w:val="20"/>
+      </w:rPr>
+    </w:lvl>
+  </w:abstractNum>
+  <w:abstractNum w:abstractNumId="25">
     <w:nsid w:val="499F2D41"/>
     <w:multiLevelType w:val="multilevel"/>
     <w:tmpl w:val="981CD33C"/>
@@ -16638,7 +19326,7 @@
       </w:rPr>
     </w:lvl>
   </w:abstractNum>
-  <w:abstractNum w:abstractNumId="23">
+  <w:abstractNum w:abstractNumId="26">
     <w:nsid w:val="4C493F08"/>
     <w:multiLevelType w:val="multilevel"/>
     <w:tmpl w:val="B6BA76F4"/>
@@ -16787,7 +19475,7 @@
       </w:rPr>
     </w:lvl>
   </w:abstractNum>
-  <w:abstractNum w:abstractNumId="24">
+  <w:abstractNum w:abstractNumId="27">
     <w:nsid w:val="4D69709E"/>
     <w:multiLevelType w:val="multilevel"/>
     <w:tmpl w:val="3FEA5FC0"/>
@@ -16936,7 +19624,7 @@
       </w:rPr>
     </w:lvl>
   </w:abstractNum>
-  <w:abstractNum w:abstractNumId="25">
+  <w:abstractNum w:abstractNumId="28">
     <w:nsid w:val="4D8A6C53"/>
     <w:multiLevelType w:val="multilevel"/>
     <w:tmpl w:val="D3864012"/>
@@ -17085,7 +19773,7 @@
       </w:rPr>
     </w:lvl>
   </w:abstractNum>
-  <w:abstractNum w:abstractNumId="26">
+  <w:abstractNum w:abstractNumId="29">
     <w:nsid w:val="4E4901C2"/>
     <w:multiLevelType w:val="multilevel"/>
     <w:tmpl w:val="38DEE474"/>
@@ -17234,7 +19922,7 @@
       </w:rPr>
     </w:lvl>
   </w:abstractNum>
-  <w:abstractNum w:abstractNumId="27">
+  <w:abstractNum w:abstractNumId="30">
     <w:nsid w:val="5039734A"/>
     <w:multiLevelType w:val="multilevel"/>
     <w:tmpl w:val="66DC909E"/>
@@ -17383,7 +20071,7 @@
       </w:rPr>
     </w:lvl>
   </w:abstractNum>
-  <w:abstractNum w:abstractNumId="28">
+  <w:abstractNum w:abstractNumId="31">
     <w:nsid w:val="518A5285"/>
     <w:multiLevelType w:val="multilevel"/>
     <w:tmpl w:val="215661E4"/>
@@ -17532,7 +20220,7 @@
       </w:rPr>
     </w:lvl>
   </w:abstractNum>
-  <w:abstractNum w:abstractNumId="29">
+  <w:abstractNum w:abstractNumId="32">
     <w:nsid w:val="5198048F"/>
     <w:multiLevelType w:val="multilevel"/>
     <w:tmpl w:val="4184BF90"/>
@@ -17681,7 +20369,7 @@
       </w:rPr>
     </w:lvl>
   </w:abstractNum>
-  <w:abstractNum w:abstractNumId="30">
+  <w:abstractNum w:abstractNumId="33">
     <w:nsid w:val="52ED23CF"/>
     <w:multiLevelType w:val="multilevel"/>
     <w:tmpl w:val="F2DA4C10"/>
@@ -17830,7 +20518,156 @@
       </w:rPr>
     </w:lvl>
   </w:abstractNum>
-  <w:abstractNum w:abstractNumId="31">
+  <w:abstractNum w:abstractNumId="34">
+    <w:nsid w:val="53731A9A"/>
+    <w:multiLevelType w:val="multilevel"/>
+    <w:tmpl w:val="58588888"/>
+    <w:lvl w:ilvl="0">
+      <w:start w:val="1"/>
+      <w:numFmt w:val="bullet"/>
+      <w:lvlText w:val=""/>
+      <w:lvlJc w:val="left"/>
+      <w:pPr>
+        <w:tabs>
+          <w:tab w:val="num" w:pos="720"/>
+        </w:tabs>
+        <w:ind w:left="720" w:hanging="360"/>
+      </w:pPr>
+      <w:rPr>
+        <w:rFonts w:ascii="Symbol" w:hAnsi="Symbol" w:hint="default"/>
+        <w:sz w:val="20"/>
+      </w:rPr>
+    </w:lvl>
+    <w:lvl w:ilvl="1" w:tentative="1">
+      <w:start w:val="1"/>
+      <w:numFmt w:val="bullet"/>
+      <w:lvlText w:val="o"/>
+      <w:lvlJc w:val="left"/>
+      <w:pPr>
+        <w:tabs>
+          <w:tab w:val="num" w:pos="1440"/>
+        </w:tabs>
+        <w:ind w:left="1440" w:hanging="360"/>
+      </w:pPr>
+      <w:rPr>
+        <w:rFonts w:ascii="Courier New" w:hAnsi="Courier New" w:hint="default"/>
+        <w:sz w:val="20"/>
+      </w:rPr>
+    </w:lvl>
+    <w:lvl w:ilvl="2" w:tentative="1">
+      <w:start w:val="1"/>
+      <w:numFmt w:val="bullet"/>
+      <w:lvlText w:val=""/>
+      <w:lvlJc w:val="left"/>
+      <w:pPr>
+        <w:tabs>
+          <w:tab w:val="num" w:pos="2160"/>
+        </w:tabs>
+        <w:ind w:left="2160" w:hanging="360"/>
+      </w:pPr>
+      <w:rPr>
+        <w:rFonts w:ascii="Wingdings" w:hAnsi="Wingdings" w:hint="default"/>
+        <w:sz w:val="20"/>
+      </w:rPr>
+    </w:lvl>
+    <w:lvl w:ilvl="3" w:tentative="1">
+      <w:start w:val="1"/>
+      <w:numFmt w:val="bullet"/>
+      <w:lvlText w:val=""/>
+      <w:lvlJc w:val="left"/>
+      <w:pPr>
+        <w:tabs>
+          <w:tab w:val="num" w:pos="2880"/>
+        </w:tabs>
+        <w:ind w:left="2880" w:hanging="360"/>
+      </w:pPr>
+      <w:rPr>
+        <w:rFonts w:ascii="Wingdings" w:hAnsi="Wingdings" w:hint="default"/>
+        <w:sz w:val="20"/>
+      </w:rPr>
+    </w:lvl>
+    <w:lvl w:ilvl="4" w:tentative="1">
+      <w:start w:val="1"/>
+      <w:numFmt w:val="bullet"/>
+      <w:lvlText w:val=""/>
+      <w:lvlJc w:val="left"/>
+      <w:pPr>
+        <w:tabs>
+          <w:tab w:val="num" w:pos="3600"/>
+        </w:tabs>
+        <w:ind w:left="3600" w:hanging="360"/>
+      </w:pPr>
+      <w:rPr>
+        <w:rFonts w:ascii="Wingdings" w:hAnsi="Wingdings" w:hint="default"/>
+        <w:sz w:val="20"/>
+      </w:rPr>
+    </w:lvl>
+    <w:lvl w:ilvl="5" w:tentative="1">
+      <w:start w:val="1"/>
+      <w:numFmt w:val="bullet"/>
+      <w:lvlText w:val=""/>
+      <w:lvlJc w:val="left"/>
+      <w:pPr>
+        <w:tabs>
+          <w:tab w:val="num" w:pos="4320"/>
+        </w:tabs>
+        <w:ind w:left="4320" w:hanging="360"/>
+      </w:pPr>
+      <w:rPr>
+        <w:rFonts w:ascii="Wingdings" w:hAnsi="Wingdings" w:hint="default"/>
+        <w:sz w:val="20"/>
+      </w:rPr>
+    </w:lvl>
+    <w:lvl w:ilvl="6" w:tentative="1">
+      <w:start w:val="1"/>
+      <w:numFmt w:val="bullet"/>
+      <w:lvlText w:val=""/>
+      <w:lvlJc w:val="left"/>
+      <w:pPr>
+        <w:tabs>
+          <w:tab w:val="num" w:pos="5040"/>
+        </w:tabs>
+        <w:ind w:left="5040" w:hanging="360"/>
+      </w:pPr>
+      <w:rPr>
+        <w:rFonts w:ascii="Wingdings" w:hAnsi="Wingdings" w:hint="default"/>
+        <w:sz w:val="20"/>
+      </w:rPr>
+    </w:lvl>
+    <w:lvl w:ilvl="7" w:tentative="1">
+      <w:start w:val="1"/>
+      <w:numFmt w:val="bullet"/>
+      <w:lvlText w:val=""/>
+      <w:lvlJc w:val="left"/>
+      <w:pPr>
+        <w:tabs>
+          <w:tab w:val="num" w:pos="5760"/>
+        </w:tabs>
+        <w:ind w:left="5760" w:hanging="360"/>
+      </w:pPr>
+      <w:rPr>
+        <w:rFonts w:ascii="Wingdings" w:hAnsi="Wingdings" w:hint="default"/>
+        <w:sz w:val="20"/>
+      </w:rPr>
+    </w:lvl>
+    <w:lvl w:ilvl="8" w:tentative="1">
+      <w:start w:val="1"/>
+      <w:numFmt w:val="bullet"/>
+      <w:lvlText w:val=""/>
+      <w:lvlJc w:val="left"/>
+      <w:pPr>
+        <w:tabs>
+          <w:tab w:val="num" w:pos="6480"/>
+        </w:tabs>
+        <w:ind w:left="6480" w:hanging="360"/>
+      </w:pPr>
+      <w:rPr>
+        <w:rFonts w:ascii="Wingdings" w:hAnsi="Wingdings" w:hint="default"/>
+        <w:sz w:val="20"/>
+      </w:rPr>
+    </w:lvl>
+  </w:abstractNum>
+  <w:abstractNum w:abstractNumId="35">
     <w:nsid w:val="54AA33B3"/>
     <w:multiLevelType w:val="multilevel"/>
     <w:tmpl w:val="27F8DF3C"/>
@@ -17979,7 +20816,7 @@
       </w:rPr>
     </w:lvl>
   </w:abstractNum>
-  <w:abstractNum w:abstractNumId="32">
+  <w:abstractNum w:abstractNumId="36">
     <w:nsid w:val="56B64412"/>
     <w:multiLevelType w:val="multilevel"/>
     <w:tmpl w:val="3EF6B952"/>
@@ -18128,7 +20965,156 @@
       </w:rPr>
     </w:lvl>
   </w:abstractNum>
-  <w:abstractNum w:abstractNumId="33">
+  <w:abstractNum w:abstractNumId="37">
+    <w:nsid w:val="56CE7190"/>
+    <w:multiLevelType w:val="multilevel"/>
+    <w:tmpl w:val="08A4C90A"/>
+    <w:lvl w:ilvl="0">
+      <w:start w:val="1"/>
+      <w:numFmt w:val="bullet"/>
+      <w:lvlText w:val=""/>
+      <w:lvlJc w:val="left"/>
+      <w:pPr>
+        <w:tabs>
+          <w:tab w:val="num" w:pos="720"/>
+        </w:tabs>
+        <w:ind w:left="720" w:hanging="360"/>
+      </w:pPr>
+      <w:rPr>
+        <w:rFonts w:ascii="Symbol" w:hAnsi="Symbol" w:hint="default"/>
+        <w:sz w:val="20"/>
+      </w:rPr>
+    </w:lvl>
+    <w:lvl w:ilvl="1" w:tentative="1">
+      <w:start w:val="1"/>
+      <w:numFmt w:val="bullet"/>
+      <w:lvlText w:val="o"/>
+      <w:lvlJc w:val="left"/>
+      <w:pPr>
+        <w:tabs>
+          <w:tab w:val="num" w:pos="1440"/>
+        </w:tabs>
+        <w:ind w:left="1440" w:hanging="360"/>
+      </w:pPr>
+      <w:rPr>
+        <w:rFonts w:ascii="Courier New" w:hAnsi="Courier New" w:hint="default"/>
+        <w:sz w:val="20"/>
+      </w:rPr>
+    </w:lvl>
+    <w:lvl w:ilvl="2" w:tentative="1">
+      <w:start w:val="1"/>
+      <w:numFmt w:val="bullet"/>
+      <w:lvlText w:val=""/>
+      <w:lvlJc w:val="left"/>
+      <w:pPr>
+        <w:tabs>
+          <w:tab w:val="num" w:pos="2160"/>
+        </w:tabs>
+        <w:ind w:left="2160" w:hanging="360"/>
+      </w:pPr>
+      <w:rPr>
+        <w:rFonts w:ascii="Wingdings" w:hAnsi="Wingdings" w:hint="default"/>
+        <w:sz w:val="20"/>
+      </w:rPr>
+    </w:lvl>
+    <w:lvl w:ilvl="3" w:tentative="1">
+      <w:start w:val="1"/>
+      <w:numFmt w:val="bullet"/>
+      <w:lvlText w:val=""/>
+      <w:lvlJc w:val="left"/>
+      <w:pPr>
+        <w:tabs>
+          <w:tab w:val="num" w:pos="2880"/>
+        </w:tabs>
+        <w:ind w:left="2880" w:hanging="360"/>
+      </w:pPr>
+      <w:rPr>
+        <w:rFonts w:ascii="Wingdings" w:hAnsi="Wingdings" w:hint="default"/>
+        <w:sz w:val="20"/>
+      </w:rPr>
+    </w:lvl>
+    <w:lvl w:ilvl="4" w:tentative="1">
+      <w:start w:val="1"/>
+      <w:numFmt w:val="bullet"/>
+      <w:lvlText w:val=""/>
+      <w:lvlJc w:val="left"/>
+      <w:pPr>
+        <w:tabs>
+          <w:tab w:val="num" w:pos="3600"/>
+        </w:tabs>
+        <w:ind w:left="3600" w:hanging="360"/>
+      </w:pPr>
+      <w:rPr>
+        <w:rFonts w:ascii="Wingdings" w:hAnsi="Wingdings" w:hint="default"/>
+        <w:sz w:val="20"/>
+      </w:rPr>
+    </w:lvl>
+    <w:lvl w:ilvl="5" w:tentative="1">
+      <w:start w:val="1"/>
+      <w:numFmt w:val="bullet"/>
+      <w:lvlText w:val=""/>
+      <w:lvlJc w:val="left"/>
+      <w:pPr>
+        <w:tabs>
+          <w:tab w:val="num" w:pos="4320"/>
+        </w:tabs>
+        <w:ind w:left="4320" w:hanging="360"/>
+      </w:pPr>
+      <w:rPr>
+        <w:rFonts w:ascii="Wingdings" w:hAnsi="Wingdings" w:hint="default"/>
+        <w:sz w:val="20"/>
+      </w:rPr>
+    </w:lvl>
+    <w:lvl w:ilvl="6" w:tentative="1">
+      <w:start w:val="1"/>
+      <w:numFmt w:val="bullet"/>
+      <w:lvlText w:val=""/>
+      <w:lvlJc w:val="left"/>
+      <w:pPr>
+        <w:tabs>
+          <w:tab w:val="num" w:pos="5040"/>
+        </w:tabs>
+        <w:ind w:left="5040" w:hanging="360"/>
+      </w:pPr>
+      <w:rPr>
+        <w:rFonts w:ascii="Wingdings" w:hAnsi="Wingdings" w:hint="default"/>
+        <w:sz w:val="20"/>
+      </w:rPr>
+    </w:lvl>
+    <w:lvl w:ilvl="7" w:tentative="1">
+      <w:start w:val="1"/>
+      <w:numFmt w:val="bullet"/>
+      <w:lvlText w:val=""/>
+      <w:lvlJc w:val="left"/>
+      <w:pPr>
+        <w:tabs>
+          <w:tab w:val="num" w:pos="5760"/>
+        </w:tabs>
+        <w:ind w:left="5760" w:hanging="360"/>
+      </w:pPr>
+      <w:rPr>
+        <w:rFonts w:ascii="Wingdings" w:hAnsi="Wingdings" w:hint="default"/>
+        <w:sz w:val="20"/>
+      </w:rPr>
+    </w:lvl>
+    <w:lvl w:ilvl="8" w:tentative="1">
+      <w:start w:val="1"/>
+      <w:numFmt w:val="bullet"/>
+      <w:lvlText w:val=""/>
+      <w:lvlJc w:val="left"/>
+      <w:pPr>
+        <w:tabs>
+          <w:tab w:val="num" w:pos="6480"/>
+        </w:tabs>
+        <w:ind w:left="6480" w:hanging="360"/>
+      </w:pPr>
+      <w:rPr>
+        <w:rFonts w:ascii="Wingdings" w:hAnsi="Wingdings" w:hint="default"/>
+        <w:sz w:val="20"/>
+      </w:rPr>
+    </w:lvl>
+  </w:abstractNum>
+  <w:abstractNum w:abstractNumId="38">
     <w:nsid w:val="5B11539B"/>
     <w:multiLevelType w:val="multilevel"/>
     <w:tmpl w:val="362A6400"/>
@@ -18277,7 +21263,7 @@
       </w:rPr>
     </w:lvl>
   </w:abstractNum>
-  <w:abstractNum w:abstractNumId="34">
+  <w:abstractNum w:abstractNumId="39">
     <w:nsid w:val="5CEF0D85"/>
     <w:multiLevelType w:val="multilevel"/>
     <w:tmpl w:val="BA88A118"/>
@@ -18390,7 +21376,7 @@
       </w:pPr>
     </w:lvl>
   </w:abstractNum>
-  <w:abstractNum w:abstractNumId="35">
+  <w:abstractNum w:abstractNumId="40">
     <w:nsid w:val="60B41190"/>
     <w:multiLevelType w:val="multilevel"/>
     <w:tmpl w:val="F0E884D2"/>
@@ -18539,7 +21525,156 @@
       </w:rPr>
     </w:lvl>
   </w:abstractNum>
-  <w:abstractNum w:abstractNumId="36">
+  <w:abstractNum w:abstractNumId="41">
+    <w:nsid w:val="6239015C"/>
+    <w:multiLevelType w:val="multilevel"/>
+    <w:tmpl w:val="BE5EAB4A"/>
+    <w:lvl w:ilvl="0">
+      <w:start w:val="1"/>
+      <w:numFmt w:val="bullet"/>
+      <w:lvlText w:val=""/>
+      <w:lvlJc w:val="left"/>
+      <w:pPr>
+        <w:tabs>
+          <w:tab w:val="num" w:pos="720"/>
+        </w:tabs>
+        <w:ind w:left="720" w:hanging="360"/>
+      </w:pPr>
+      <w:rPr>
+        <w:rFonts w:ascii="Symbol" w:hAnsi="Symbol" w:hint="default"/>
+        <w:sz w:val="20"/>
+      </w:rPr>
+    </w:lvl>
+    <w:lvl w:ilvl="1" w:tentative="1">
+      <w:start w:val="1"/>
+      <w:numFmt w:val="bullet"/>
+      <w:lvlText w:val="o"/>
+      <w:lvlJc w:val="left"/>
+      <w:pPr>
+        <w:tabs>
+          <w:tab w:val="num" w:pos="1440"/>
+        </w:tabs>
+        <w:ind w:left="1440" w:hanging="360"/>
+      </w:pPr>
+      <w:rPr>
+        <w:rFonts w:ascii="Courier New" w:hAnsi="Courier New" w:hint="default"/>
+        <w:sz w:val="20"/>
+      </w:rPr>
+    </w:lvl>
+    <w:lvl w:ilvl="2" w:tentative="1">
+      <w:start w:val="1"/>
+      <w:numFmt w:val="bullet"/>
+      <w:lvlText w:val=""/>
+      <w:lvlJc w:val="left"/>
+      <w:pPr>
+        <w:tabs>
+          <w:tab w:val="num" w:pos="2160"/>
+        </w:tabs>
+        <w:ind w:left="2160" w:hanging="360"/>
+      </w:pPr>
+      <w:rPr>
+        <w:rFonts w:ascii="Wingdings" w:hAnsi="Wingdings" w:hint="default"/>
+        <w:sz w:val="20"/>
+      </w:rPr>
+    </w:lvl>
+    <w:lvl w:ilvl="3" w:tentative="1">
+      <w:start w:val="1"/>
+      <w:numFmt w:val="bullet"/>
+      <w:lvlText w:val=""/>
+      <w:lvlJc w:val="left"/>
+      <w:pPr>
+        <w:tabs>
+          <w:tab w:val="num" w:pos="2880"/>
+        </w:tabs>
+        <w:ind w:left="2880" w:hanging="360"/>
+      </w:pPr>
+      <w:rPr>
+        <w:rFonts w:ascii="Wingdings" w:hAnsi="Wingdings" w:hint="default"/>
+        <w:sz w:val="20"/>
+      </w:rPr>
+    </w:lvl>
+    <w:lvl w:ilvl="4" w:tentative="1">
+      <w:start w:val="1"/>
+      <w:numFmt w:val="bullet"/>
+      <w:lvlText w:val=""/>
+      <w:lvlJc w:val="left"/>
+      <w:pPr>
+        <w:tabs>
+          <w:tab w:val="num" w:pos="3600"/>
+        </w:tabs>
+        <w:ind w:left="3600" w:hanging="360"/>
+      </w:pPr>
+      <w:rPr>
+        <w:rFonts w:ascii="Wingdings" w:hAnsi="Wingdings" w:hint="default"/>
+        <w:sz w:val="20"/>
+      </w:rPr>
+    </w:lvl>
+    <w:lvl w:ilvl="5" w:tentative="1">
+      <w:start w:val="1"/>
+      <w:numFmt w:val="bullet"/>
+      <w:lvlText w:val=""/>
+      <w:lvlJc w:val="left"/>
+      <w:pPr>
+        <w:tabs>
+          <w:tab w:val="num" w:pos="4320"/>
+        </w:tabs>
+        <w:ind w:left="4320" w:hanging="360"/>
+      </w:pPr>
+      <w:rPr>
+        <w:rFonts w:ascii="Wingdings" w:hAnsi="Wingdings" w:hint="default"/>
+        <w:sz w:val="20"/>
+      </w:rPr>
+    </w:lvl>
+    <w:lvl w:ilvl="6" w:tentative="1">
+      <w:start w:val="1"/>
+      <w:numFmt w:val="bullet"/>
+      <w:lvlText w:val=""/>
+      <w:lvlJc w:val="left"/>
+      <w:pPr>
+        <w:tabs>
+          <w:tab w:val="num" w:pos="5040"/>
+        </w:tabs>
+        <w:ind w:left="5040" w:hanging="360"/>
+      </w:pPr>
+      <w:rPr>
+        <w:rFonts w:ascii="Wingdings" w:hAnsi="Wingdings" w:hint="default"/>
+        <w:sz w:val="20"/>
+      </w:rPr>
+    </w:lvl>
+    <w:lvl w:ilvl="7" w:tentative="1">
+      <w:start w:val="1"/>
+      <w:numFmt w:val="bullet"/>
+      <w:lvlText w:val=""/>
+      <w:lvlJc w:val="left"/>
+      <w:pPr>
+        <w:tabs>
+          <w:tab w:val="num" w:pos="5760"/>
+        </w:tabs>
+        <w:ind w:left="5760" w:hanging="360"/>
+      </w:pPr>
+      <w:rPr>
+        <w:rFonts w:ascii="Wingdings" w:hAnsi="Wingdings" w:hint="default"/>
+        <w:sz w:val="20"/>
+      </w:rPr>
+    </w:lvl>
+    <w:lvl w:ilvl="8" w:tentative="1">
+      <w:start w:val="1"/>
+      <w:numFmt w:val="bullet"/>
+      <w:lvlText w:val=""/>
+      <w:lvlJc w:val="left"/>
+      <w:pPr>
+        <w:tabs>
+          <w:tab w:val="num" w:pos="6480"/>
+        </w:tabs>
+        <w:ind w:left="6480" w:hanging="360"/>
+      </w:pPr>
+      <w:rPr>
+        <w:rFonts w:ascii="Wingdings" w:hAnsi="Wingdings" w:hint="default"/>
+        <w:sz w:val="20"/>
+      </w:rPr>
+    </w:lvl>
+  </w:abstractNum>
+  <w:abstractNum w:abstractNumId="42">
     <w:nsid w:val="630C06C2"/>
     <w:multiLevelType w:val="multilevel"/>
     <w:tmpl w:val="F9C8F4C6"/>
@@ -18688,7 +21823,7 @@
       </w:rPr>
     </w:lvl>
   </w:abstractNum>
-  <w:abstractNum w:abstractNumId="37">
+  <w:abstractNum w:abstractNumId="43">
     <w:nsid w:val="6C6F248E"/>
     <w:multiLevelType w:val="multilevel"/>
     <w:tmpl w:val="29201F7A"/>
@@ -18837,7 +21972,7 @@
       </w:rPr>
     </w:lvl>
   </w:abstractNum>
-  <w:abstractNum w:abstractNumId="38">
+  <w:abstractNum w:abstractNumId="44">
     <w:nsid w:val="744D0B99"/>
     <w:multiLevelType w:val="multilevel"/>
     <w:tmpl w:val="1DEC6182"/>
@@ -18986,7 +22121,156 @@
       </w:rPr>
     </w:lvl>
   </w:abstractNum>
-  <w:abstractNum w:abstractNumId="39">
+  <w:abstractNum w:abstractNumId="45">
+    <w:nsid w:val="75DB2A72"/>
+    <w:multiLevelType w:val="multilevel"/>
+    <w:tmpl w:val="42A89502"/>
+    <w:lvl w:ilvl="0">
+      <w:start w:val="1"/>
+      <w:numFmt w:val="bullet"/>
+      <w:lvlText w:val=""/>
+      <w:lvlJc w:val="left"/>
+      <w:pPr>
+        <w:tabs>
+          <w:tab w:val="num" w:pos="720"/>
+        </w:tabs>
+        <w:ind w:left="720" w:hanging="360"/>
+      </w:pPr>
+      <w:rPr>
+        <w:rFonts w:ascii="Symbol" w:hAnsi="Symbol" w:hint="default"/>
+        <w:sz w:val="20"/>
+      </w:rPr>
+    </w:lvl>
+    <w:lvl w:ilvl="1">
+      <w:start w:val="1"/>
+      <w:numFmt w:val="bullet"/>
+      <w:lvlText w:val="o"/>
+      <w:lvlJc w:val="left"/>
+      <w:pPr>
+        <w:tabs>
+          <w:tab w:val="num" w:pos="1440"/>
+        </w:tabs>
+        <w:ind w:left="1440" w:hanging="360"/>
+      </w:pPr>
+      <w:rPr>
+        <w:rFonts w:ascii="Courier New" w:hAnsi="Courier New" w:hint="default"/>
+        <w:sz w:val="20"/>
+      </w:rPr>
+    </w:lvl>
+    <w:lvl w:ilvl="2" w:tentative="1">
+      <w:start w:val="1"/>
+      <w:numFmt w:val="bullet"/>
+      <w:lvlText w:val=""/>
+      <w:lvlJc w:val="left"/>
+      <w:pPr>
+        <w:tabs>
+          <w:tab w:val="num" w:pos="2160"/>
+        </w:tabs>
+        <w:ind w:left="2160" w:hanging="360"/>
+      </w:pPr>
+      <w:rPr>
+        <w:rFonts w:ascii="Wingdings" w:hAnsi="Wingdings" w:hint="default"/>
+        <w:sz w:val="20"/>
+      </w:rPr>
+    </w:lvl>
+    <w:lvl w:ilvl="3" w:tentative="1">
+      <w:start w:val="1"/>
+      <w:numFmt w:val="bullet"/>
+      <w:lvlText w:val=""/>
+      <w:lvlJc w:val="left"/>
+      <w:pPr>
+        <w:tabs>
+          <w:tab w:val="num" w:pos="2880"/>
+        </w:tabs>
+        <w:ind w:left="2880" w:hanging="360"/>
+      </w:pPr>
+      <w:rPr>
+        <w:rFonts w:ascii="Wingdings" w:hAnsi="Wingdings" w:hint="default"/>
+        <w:sz w:val="20"/>
+      </w:rPr>
+    </w:lvl>
+    <w:lvl w:ilvl="4" w:tentative="1">
+      <w:start w:val="1"/>
+      <w:numFmt w:val="bullet"/>
+      <w:lvlText w:val=""/>
+      <w:lvlJc w:val="left"/>
+      <w:pPr>
+        <w:tabs>
+          <w:tab w:val="num" w:pos="3600"/>
+        </w:tabs>
+        <w:ind w:left="3600" w:hanging="360"/>
+      </w:pPr>
+      <w:rPr>
+        <w:rFonts w:ascii="Wingdings" w:hAnsi="Wingdings" w:hint="default"/>
+        <w:sz w:val="20"/>
+      </w:rPr>
+    </w:lvl>
+    <w:lvl w:ilvl="5" w:tentative="1">
+      <w:start w:val="1"/>
+      <w:numFmt w:val="bullet"/>
+      <w:lvlText w:val=""/>
+      <w:lvlJc w:val="left"/>
+      <w:pPr>
+        <w:tabs>
+          <w:tab w:val="num" w:pos="4320"/>
+        </w:tabs>
+        <w:ind w:left="4320" w:hanging="360"/>
+      </w:pPr>
+      <w:rPr>
+        <w:rFonts w:ascii="Wingdings" w:hAnsi="Wingdings" w:hint="default"/>
+        <w:sz w:val="20"/>
+      </w:rPr>
+    </w:lvl>
+    <w:lvl w:ilvl="6" w:tentative="1">
+      <w:start w:val="1"/>
+      <w:numFmt w:val="bullet"/>
+      <w:lvlText w:val=""/>
+      <w:lvlJc w:val="left"/>
+      <w:pPr>
+        <w:tabs>
+          <w:tab w:val="num" w:pos="5040"/>
+        </w:tabs>
+        <w:ind w:left="5040" w:hanging="360"/>
+      </w:pPr>
+      <w:rPr>
+        <w:rFonts w:ascii="Wingdings" w:hAnsi="Wingdings" w:hint="default"/>
+        <w:sz w:val="20"/>
+      </w:rPr>
+    </w:lvl>
+    <w:lvl w:ilvl="7" w:tentative="1">
+      <w:start w:val="1"/>
+      <w:numFmt w:val="bullet"/>
+      <w:lvlText w:val=""/>
+      <w:lvlJc w:val="left"/>
+      <w:pPr>
+        <w:tabs>
+          <w:tab w:val="num" w:pos="5760"/>
+        </w:tabs>
+        <w:ind w:left="5760" w:hanging="360"/>
+      </w:pPr>
+      <w:rPr>
+        <w:rFonts w:ascii="Wingdings" w:hAnsi="Wingdings" w:hint="default"/>
+        <w:sz w:val="20"/>
+      </w:rPr>
+    </w:lvl>
+    <w:lvl w:ilvl="8" w:tentative="1">
+      <w:start w:val="1"/>
+      <w:numFmt w:val="bullet"/>
+      <w:lvlText w:val=""/>
+      <w:lvlJc w:val="left"/>
+      <w:pPr>
+        <w:tabs>
+          <w:tab w:val="num" w:pos="6480"/>
+        </w:tabs>
+        <w:ind w:left="6480" w:hanging="360"/>
+      </w:pPr>
+      <w:rPr>
+        <w:rFonts w:ascii="Wingdings" w:hAnsi="Wingdings" w:hint="default"/>
+        <w:sz w:val="20"/>
+      </w:rPr>
+    </w:lvl>
+  </w:abstractNum>
+  <w:abstractNum w:abstractNumId="46">
     <w:nsid w:val="78175598"/>
     <w:multiLevelType w:val="multilevel"/>
     <w:tmpl w:val="C42C432C"/>
@@ -19135,7 +22419,7 @@
       </w:rPr>
     </w:lvl>
   </w:abstractNum>
-  <w:abstractNum w:abstractNumId="40">
+  <w:abstractNum w:abstractNumId="47">
     <w:nsid w:val="79354708"/>
     <w:multiLevelType w:val="multilevel"/>
     <w:tmpl w:val="7FC6629E"/>
@@ -19284,7 +22568,7 @@
       </w:rPr>
     </w:lvl>
   </w:abstractNum>
-  <w:abstractNum w:abstractNumId="41">
+  <w:abstractNum w:abstractNumId="48">
     <w:nsid w:val="7A392056"/>
     <w:multiLevelType w:val="multilevel"/>
     <w:tmpl w:val="5344D7B8"/>
@@ -19407,67 +22691,67 @@
     <w:abstractNumId w:val="1"/>
   </w:num>
   <w:num w:numId="4">
-    <w:abstractNumId w:val="37"/>
+    <w:abstractNumId w:val="43"/>
   </w:num>
   <w:num w:numId="5">
     <w:abstractNumId w:val="8"/>
   </w:num>
   <w:num w:numId="6">
-    <w:abstractNumId w:val="12"/>
+    <w:abstractNumId w:val="14"/>
   </w:num>
   <w:num w:numId="7">
+    <w:abstractNumId w:val="21"/>
+  </w:num>
+  <w:num w:numId="8">
+    <w:abstractNumId w:val="17"/>
+  </w:num>
+  <w:num w:numId="9">
+    <w:abstractNumId w:val="30"/>
+  </w:num>
+  <w:num w:numId="10">
+    <w:abstractNumId w:val="47"/>
+  </w:num>
+  <w:num w:numId="11">
+    <w:abstractNumId w:val="38"/>
+  </w:num>
+  <w:num w:numId="12">
+    <w:abstractNumId w:val="27"/>
+  </w:num>
+  <w:num w:numId="13">
+    <w:abstractNumId w:val="28"/>
+  </w:num>
+  <w:num w:numId="14">
     <w:abstractNumId w:val="19"/>
   </w:num>
-  <w:num w:numId="8">
-    <w:abstractNumId w:val="15"/>
+  <w:num w:numId="15">
+    <w:abstractNumId w:val="31"/>
   </w:num>
-  <w:num w:numId="9">
-    <w:abstractNumId w:val="27"/>
-  </w:num>
-  <w:num w:numId="10">
-    <w:abstractNumId w:val="40"/>
-  </w:num>
-  <w:num w:numId="11">
+  <w:num w:numId="16">
     <w:abstractNumId w:val="33"/>
   </w:num>
-  <w:num w:numId="12">
-    <w:abstractNumId w:val="24"/>
-  </w:num>
-  <w:num w:numId="13">
-    <w:abstractNumId w:val="25"/>
-  </w:num>
-  <w:num w:numId="14">
-    <w:abstractNumId w:val="17"/>
-  </w:num>
-  <w:num w:numId="15">
-    <w:abstractNumId w:val="28"/>
-  </w:num>
-  <w:num w:numId="16">
-    <w:abstractNumId w:val="30"/>
-  </w:num>
   <w:num w:numId="17">
-    <w:abstractNumId w:val="20"/>
+    <w:abstractNumId w:val="22"/>
   </w:num>
   <w:num w:numId="18">
-    <w:abstractNumId w:val="29"/>
+    <w:abstractNumId w:val="32"/>
   </w:num>
   <w:num w:numId="19">
-    <w:abstractNumId w:val="31"/>
+    <w:abstractNumId w:val="35"/>
   </w:num>
   <w:num w:numId="20">
-    <w:abstractNumId w:val="26"/>
+    <w:abstractNumId w:val="29"/>
   </w:num>
   <w:num w:numId="21">
     <w:abstractNumId w:val="0"/>
   </w:num>
   <w:num w:numId="22">
-    <w:abstractNumId w:val="21"/>
+    <w:abstractNumId w:val="23"/>
   </w:num>
   <w:num w:numId="23">
     <w:abstractNumId w:val="4"/>
   </w:num>
   <w:num w:numId="24">
-    <w:abstractNumId w:val="18"/>
+    <w:abstractNumId w:val="20"/>
   </w:num>
   <w:num w:numId="25">
     <w:abstractNumId w:val="5"/>
@@ -19476,52 +22760,73 @@
     <w:abstractNumId w:val="3"/>
   </w:num>
   <w:num w:numId="27">
-    <w:abstractNumId w:val="38"/>
+    <w:abstractNumId w:val="44"/>
   </w:num>
   <w:num w:numId="28">
     <w:abstractNumId w:val="9"/>
   </w:num>
   <w:num w:numId="29">
-    <w:abstractNumId w:val="22"/>
+    <w:abstractNumId w:val="25"/>
   </w:num>
   <w:num w:numId="30">
-    <w:abstractNumId w:val="10"/>
+    <w:abstractNumId w:val="11"/>
   </w:num>
   <w:num w:numId="31">
-    <w:abstractNumId w:val="13"/>
+    <w:abstractNumId w:val="15"/>
   </w:num>
   <w:num w:numId="32">
-    <w:abstractNumId w:val="35"/>
+    <w:abstractNumId w:val="40"/>
   </w:num>
   <w:num w:numId="33">
-    <w:abstractNumId w:val="23"/>
+    <w:abstractNumId w:val="26"/>
   </w:num>
   <w:num w:numId="34">
     <w:abstractNumId w:val="7"/>
   </w:num>
   <w:num w:numId="35">
+    <w:abstractNumId w:val="39"/>
+  </w:num>
+  <w:num w:numId="36">
+    <w:abstractNumId w:val="42"/>
+  </w:num>
+  <w:num w:numId="37">
+    <w:abstractNumId w:val="48"/>
+  </w:num>
+  <w:num w:numId="38">
+    <w:abstractNumId w:val="16"/>
+  </w:num>
+  <w:num w:numId="39">
+    <w:abstractNumId w:val="18"/>
+  </w:num>
+  <w:num w:numId="40">
+    <w:abstractNumId w:val="12"/>
+  </w:num>
+  <w:num w:numId="41">
+    <w:abstractNumId w:val="36"/>
+  </w:num>
+  <w:num w:numId="42">
+    <w:abstractNumId w:val="46"/>
+  </w:num>
+  <w:num w:numId="43">
+    <w:abstractNumId w:val="10"/>
+  </w:num>
+  <w:num w:numId="44">
     <w:abstractNumId w:val="34"/>
   </w:num>
-  <w:num w:numId="36">
-    <w:abstractNumId w:val="36"/>
+  <w:num w:numId="45">
+    <w:abstractNumId w:val="13"/>
   </w:num>
-  <w:num w:numId="37">
+  <w:num w:numId="46">
+    <w:abstractNumId w:val="24"/>
+  </w:num>
+  <w:num w:numId="47">
+    <w:abstractNumId w:val="45"/>
+  </w:num>
+  <w:num w:numId="48">
+    <w:abstractNumId w:val="37"/>
+  </w:num>
+  <w:num w:numId="49">
     <w:abstractNumId w:val="41"/>
-  </w:num>
-  <w:num w:numId="38">
-    <w:abstractNumId w:val="14"/>
-  </w:num>
-  <w:num w:numId="39">
-    <w:abstractNumId w:val="16"/>
-  </w:num>
-  <w:num w:numId="40">
-    <w:abstractNumId w:val="11"/>
-  </w:num>
-  <w:num w:numId="41">
-    <w:abstractNumId w:val="32"/>
-  </w:num>
-  <w:num w:numId="42">
-    <w:abstractNumId w:val="39"/>
   </w:num>
 </w:numbering>
 </file>

</xml_diff>